<commit_message>
[SRS 2/4] Add resource workflows, AI features and reporting requirements
Adds pages 9–14 of the revised Phase 3 SRS, version 1.1.

Co-Authored-By: Claude Opus 5.5 <noreply@anthropic.com>
</commit_message>
<xml_diff>
--- a/docs/phase-3/COSC336_Group6_Phase3_SRS_v1.1 part1.docx
+++ b/docs/phase-3/COSC336_Group6_Phase3_SRS_v1.1 part1.docx
@@ -1,6 +1,6 @@
 
 <file path=word/document.xml><?xml version="1.0" encoding="utf-8"?>
-<w:document xmlns:wpc="http://schemas.microsoft.com/office/word/2010/wordprocessingCanvas" xmlns:cx="http://schemas.microsoft.com/office/drawing/2014/chartex" xmlns:cx1="http://schemas.microsoft.com/office/drawing/2015/9/8/chartex" xmlns:cx2="http://schemas.microsoft.com/office/drawing/2015/10/21/chartex" xmlns:cx3="http://schemas.microsoft.com/office/drawing/2016/5/9/chartex" xmlns:cx4="http://schemas.microsoft.com/office/drawing/2016/5/10/chartex" xmlns:cx5="http://schemas.microsoft.com/office/drawing/2016/5/11/chartex" xmlns:cx6="http://schemas.microsoft.com/office/drawing/2016/5/12/chartex" xmlns:cx7="http://schemas.microsoft.com/office/drawing/2016/5/13/chartex" xmlns:cx8="http://schemas.microsoft.com/office/drawing/2016/5/14/chartex" xmlns:mc="http://schemas.openxmlformats.org/markup-compatibility/2006" xmlns:aink="http://schemas.microsoft.com/office/drawing/2016/ink" xmlns:am3d="http://schemas.microsoft.com/office/drawing/2017/model3d" xmlns:o="urn:schemas-microsoft-com:office:office" xmlns:oel="http://schemas.microsoft.com/office/2019/extlst" xmlns:r="http://schemas.openxmlformats.org/officeDocument/2006/relationships" xmlns:m="http://schemas.openxmlformats.org/officeDocument/2006/math" xmlns:v="urn:schemas-microsoft-com:vml" xmlns:wp14="http://schemas.microsoft.com/office/word/2010/wordprocessingDrawing" xmlns:wp="http://schemas.openxmlformats.org/drawingml/2006/wordprocessingDrawing" xmlns:w10="urn:schemas-microsoft-com:office:word" xmlns:w="http://schemas.openxmlformats.org/wordprocessingml/2006/main" xmlns:w14="http://schemas.microsoft.com/office/word/2010/wordml" xmlns:w15="http://schemas.microsoft.com/office/word/2012/wordml" xmlns:w16cex="http://schemas.microsoft.com/office/word/2018/wordml/cex" xmlns:w16cid="http://schemas.microsoft.com/office/word/2016/wordml/cid" xmlns:w16="http://schemas.microsoft.com/office/word/2018/wordml" xmlns:w16du="http://schemas.microsoft.com/office/word/2023/wordml/word16du" xmlns:w16sdtdh="http://schemas.microsoft.com/office/word/2020/wordml/sdtdatahash" xmlns:w16sdtfl="http://schemas.microsoft.com/office/word/2024/wordml/sdtformatlock" xmlns:w16se="http://schemas.microsoft.com/office/word/2015/wordml/symex" xmlns:wpg="http://schemas.microsoft.com/office/word/2010/wordprocessingGroup" xmlns:wpi="http://schemas.microsoft.com/office/word/2010/wordprocessingInk" xmlns:wne="http://schemas.microsoft.com/office/word/2006/wordml" xmlns:wps="http://schemas.microsoft.com/office/word/2010/wordprocessingShape" mc:Ignorable="w14 w15 w16se w16cid w16 w16cex w16sdtdh w16sdtfl w16du wp14">
+<w:document xmlns:wpc="http://schemas.microsoft.com/office/word/2010/wordprocessingCanvas" xmlns:cx="http://schemas.microsoft.com/office/drawing/2014/chartex" xmlns:cx1="http://schemas.microsoft.com/office/drawing/2015/9/8/chartex" xmlns:cx2="http://schemas.microsoft.com/office/drawing/2015/10/21/chartex" xmlns:cx3="http://schemas.microsoft.com/office/drawing/2016/5/9/chartex" xmlns:cx4="http://schemas.microsoft.com/office/drawing/2016/5/10/chartex" xmlns:cx5="http://schemas.microsoft.com/office/drawing/2016/5/11/chartex" xmlns:cx6="http://schemas.microsoft.com/office/drawing/2016/5/12/chartex" xmlns:cx7="http://schemas.microsoft.com/office/drawing/2016/5/13/chartex" xmlns:cx8="http://schemas.microsoft.com/office/drawing/2016/5/14/chartex" xmlns:mc="http://schemas.openxmlformats.org/markup-compatibility/2006" xmlns:m="http://schemas.openxmlformats.org/officeDocument/2006/math" xmlns:aink="http://schemas.microsoft.com/office/drawing/2016/ink" xmlns:am3d="http://schemas.microsoft.com/office/drawing/2017/model3d" xmlns:oel="http://schemas.microsoft.com/office/2019/extlst" xmlns:r="http://schemas.openxmlformats.org/officeDocument/2006/relationships" xmlns:wp14="http://schemas.microsoft.com/office/word/2010/wordprocessingDrawing" xmlns:wp="http://schemas.openxmlformats.org/drawingml/2006/wordprocessingDrawing" xmlns:wpg="http://schemas.microsoft.com/office/word/2010/wordprocessingGroup" xmlns:wpi="http://schemas.microsoft.com/office/word/2010/wordprocessingInk" xmlns:wps="http://schemas.microsoft.com/office/word/2010/wordprocessingShape" xmlns:o="urn:schemas-microsoft-com:office:office" xmlns:v="urn:schemas-microsoft-com:vml" xmlns:w10="urn:schemas-microsoft-com:office:word" xmlns:w="http://schemas.openxmlformats.org/wordprocessingml/2006/main" xmlns:w14="http://schemas.microsoft.com/office/word/2010/wordml" xmlns:w15="http://schemas.microsoft.com/office/word/2012/wordml" xmlns:w16cex="http://schemas.microsoft.com/office/word/2018/wordml/cex" xmlns:w16cid="http://schemas.microsoft.com/office/word/2016/wordml/cid" xmlns:w16="http://schemas.microsoft.com/office/word/2018/wordml" xmlns:w16sdtdh="http://schemas.microsoft.com/office/word/2020/wordml/sdtdatahash" xmlns:w16sdtfl="http://schemas.microsoft.com/office/word/2024/wordml/sdtformatlock" xmlns:w16se="http://schemas.microsoft.com/office/word/2015/wordml/symex" xmlns:w16du="http://schemas.microsoft.com/office/word/2023/wordml/word16du" xmlns:wne="http://schemas.microsoft.com/office/word/2006/wordml" mc:Ignorable="w14 w15 w16se w16cid w16 w16cex w16sdtdh w16sdtfl w16du wp14">
   <w:body>
     <w:p>
       <w:pPr>
@@ -6989,6 +6989,9 @@
     <w:p>
       <w:pPr>
         <w:spacing w:after="60" w:line="240" w:lineRule="exact"/>
+        <w:rPr>
+          <w:sz w:val="21"/>
+        </w:rPr>
       </w:pPr>
       <w:r>
         <w:rPr>
@@ -7017,6 +7020,4212 @@
         </w:rPr>
         <w:t>A referred issue appears for the Business Administrator with its history.</w:t>
       </w:r>
+    </w:p>
+    <w:p>
+      <w:pPr>
+        <w:spacing w:after="60" w:line="240" w:lineRule="exact"/>
+        <w:rPr>
+          <w:sz w:val="21"/>
+        </w:rPr>
+      </w:pPr>
+    </w:p>
+    <w:p>
+      <w:pPr>
+        <w:pStyle w:val="Heading2"/>
+      </w:pPr>
+      <w:bookmarkStart w:id="25" w:name="SRS_1025"/>
+      <w:r>
+        <w:t>4.6 Inspection Maintenance Repair and Life Cycle Tracking</w:t>
+      </w:r>
+      <w:bookmarkEnd w:id="25"/>
+    </w:p>
+    <w:p>
+      <w:pPr>
+        <w:pStyle w:val="level4"/>
+        <w:keepNext/>
+        <w:keepLines/>
+        <w:spacing w:before="80" w:after="40" w:line="260" w:lineRule="exact"/>
+        <w:ind w:left="288"/>
+      </w:pPr>
+      <w:r>
+        <w:rPr>
+          <w:b/>
+          <w:sz w:val="22"/>
+        </w:rPr>
+        <w:t>4.6.1 Description and Priority</w:t>
+      </w:r>
+    </w:p>
+    <w:p>
+      <w:pPr>
+        <w:spacing w:after="60" w:line="260" w:lineRule="exact"/>
+      </w:pPr>
+      <w:r>
+        <w:rPr>
+          <w:sz w:val="22"/>
+        </w:rPr>
+        <w:t>Priority: High. Retain life-cycle history and assessed condition, including repair and end-of-life decisions (Phase 1, Section 4.5).</w:t>
+      </w:r>
+    </w:p>
+    <w:p>
+      <w:pPr>
+        <w:pStyle w:val="level4"/>
+        <w:keepNext/>
+        <w:keepLines/>
+        <w:spacing w:before="80" w:after="40" w:line="260" w:lineRule="exact"/>
+        <w:ind w:left="288"/>
+      </w:pPr>
+      <w:r>
+        <w:rPr>
+          <w:b/>
+          <w:sz w:val="22"/>
+        </w:rPr>
+        <w:t>4.6.2 Stimulus/Response Sequences</w:t>
+      </w:r>
+    </w:p>
+    <w:p>
+      <w:pPr>
+        <w:spacing w:after="60" w:line="260" w:lineRule="exact"/>
+      </w:pPr>
+      <w:r>
+        <w:rPr>
+          <w:sz w:val="22"/>
+        </w:rPr>
+        <w:t>User reports defect → maintenance inspect/service → authorized assessment restores service or records Unfit. End-of-life rejection restores the appropriate prior state. See UC-09/10.</w:t>
+      </w:r>
+    </w:p>
+    <w:p>
+      <w:pPr>
+        <w:pStyle w:val="level4"/>
+        <w:keepNext/>
+        <w:keepLines/>
+        <w:spacing w:before="80" w:after="40" w:line="260" w:lineRule="exact"/>
+        <w:ind w:left="288"/>
+      </w:pPr>
+      <w:r>
+        <w:rPr>
+          <w:b/>
+          <w:sz w:val="22"/>
+        </w:rPr>
+        <w:t>4.6.3 Functional Requirements</w:t>
+      </w:r>
+    </w:p>
+    <w:p>
+      <w:pPr>
+        <w:spacing w:after="60" w:line="240" w:lineRule="exact"/>
+      </w:pPr>
+      <w:r>
+        <w:rPr>
+          <w:b/>
+          <w:sz w:val="21"/>
+        </w:rPr>
+        <w:t>FR-MAINT-001 [</w:t>
+      </w:r>
+      <w:proofErr w:type="gramStart"/>
+      <w:r>
+        <w:rPr>
+          <w:b/>
+          <w:sz w:val="21"/>
+        </w:rPr>
+        <w:t xml:space="preserve">Must]  </w:t>
+      </w:r>
+      <w:r>
+        <w:rPr>
+          <w:sz w:val="21"/>
+        </w:rPr>
+        <w:t>The</w:t>
+      </w:r>
+      <w:proofErr w:type="gramEnd"/>
+      <w:r>
+        <w:rPr>
+          <w:sz w:val="21"/>
+        </w:rPr>
+        <w:t xml:space="preserve"> system shall maintain a chronological history of acquisition, allocation, utilization, inspection, maintenance, repair, transfer, refurbishment, donation, component recovery, recycling, retirement, and disposal events, identifying the date and responsible user.</w:t>
+      </w:r>
+      <w:r>
+        <w:rPr>
+          <w:b/>
+          <w:sz w:val="21"/>
+        </w:rPr>
+        <w:t xml:space="preserve"> Acceptance: </w:t>
+      </w:r>
+      <w:r>
+        <w:rPr>
+          <w:sz w:val="21"/>
+        </w:rPr>
+        <w:t>Each event type appears in the asset history in date order.</w:t>
+      </w:r>
+    </w:p>
+    <w:p>
+      <w:pPr>
+        <w:spacing w:after="60" w:line="240" w:lineRule="exact"/>
+      </w:pPr>
+      <w:r>
+        <w:rPr>
+          <w:b/>
+          <w:sz w:val="21"/>
+        </w:rPr>
+        <w:t>FR-MAINT-002 [</w:t>
+      </w:r>
+      <w:proofErr w:type="gramStart"/>
+      <w:r>
+        <w:rPr>
+          <w:b/>
+          <w:sz w:val="21"/>
+        </w:rPr>
+        <w:t xml:space="preserve">Must]  </w:t>
+      </w:r>
+      <w:r>
+        <w:rPr>
+          <w:sz w:val="21"/>
+        </w:rPr>
+        <w:t>The</w:t>
+      </w:r>
+      <w:proofErr w:type="gramEnd"/>
+      <w:r>
+        <w:rPr>
+          <w:sz w:val="21"/>
+        </w:rPr>
+        <w:t xml:space="preserve"> system shall allow authorized users to report defects, request inspection or repair, and track the status of those requests against the asset.</w:t>
+      </w:r>
+      <w:r>
+        <w:rPr>
+          <w:b/>
+          <w:sz w:val="21"/>
+        </w:rPr>
+        <w:t xml:space="preserve"> Acceptance: </w:t>
+      </w:r>
+      <w:r>
+        <w:rPr>
+          <w:sz w:val="21"/>
+        </w:rPr>
+        <w:t xml:space="preserve">A defect report is </w:t>
+      </w:r>
+      <w:proofErr w:type="gramStart"/>
+      <w:r>
+        <w:rPr>
+          <w:sz w:val="21"/>
+        </w:rPr>
+        <w:t>created</w:t>
+      </w:r>
+      <w:proofErr w:type="gramEnd"/>
+      <w:r>
+        <w:rPr>
+          <w:sz w:val="21"/>
+        </w:rPr>
+        <w:t xml:space="preserve"> and its status can be followed.</w:t>
+      </w:r>
+    </w:p>
+    <w:p>
+      <w:pPr>
+        <w:spacing w:after="60" w:line="240" w:lineRule="exact"/>
+      </w:pPr>
+      <w:r>
+        <w:rPr>
+          <w:b/>
+          <w:sz w:val="21"/>
+        </w:rPr>
+        <w:t>FR-MAINT-003 [</w:t>
+      </w:r>
+      <w:proofErr w:type="gramStart"/>
+      <w:r>
+        <w:rPr>
+          <w:b/>
+          <w:sz w:val="21"/>
+        </w:rPr>
+        <w:t xml:space="preserve">Must]  </w:t>
+      </w:r>
+      <w:r>
+        <w:rPr>
+          <w:sz w:val="21"/>
+        </w:rPr>
+        <w:t>The</w:t>
+      </w:r>
+      <w:proofErr w:type="gramEnd"/>
+      <w:r>
+        <w:rPr>
+          <w:sz w:val="21"/>
+        </w:rPr>
+        <w:t xml:space="preserve"> system shall allow maintenance staff to record inspection findings, maintenance, repair, or refurbishment actions, associated costs, outcomes, and the asset’s condition after service.</w:t>
+      </w:r>
+      <w:r>
+        <w:rPr>
+          <w:b/>
+          <w:sz w:val="21"/>
+        </w:rPr>
+        <w:t xml:space="preserve"> Acceptance: </w:t>
+      </w:r>
+      <w:r>
+        <w:rPr>
+          <w:sz w:val="21"/>
+        </w:rPr>
+        <w:t>Completed work order shows findings, actions, costs, and new condition.</w:t>
+      </w:r>
+    </w:p>
+    <w:p>
+      <w:pPr>
+        <w:spacing w:after="60" w:line="240" w:lineRule="exact"/>
+      </w:pPr>
+      <w:r>
+        <w:rPr>
+          <w:b/>
+          <w:sz w:val="21"/>
+        </w:rPr>
+        <w:t>FR-MAINT-004 [</w:t>
+      </w:r>
+      <w:proofErr w:type="gramStart"/>
+      <w:r>
+        <w:rPr>
+          <w:b/>
+          <w:sz w:val="21"/>
+        </w:rPr>
+        <w:t xml:space="preserve">Must]  </w:t>
+      </w:r>
+      <w:r>
+        <w:rPr>
+          <w:sz w:val="21"/>
+        </w:rPr>
+        <w:t>The</w:t>
+      </w:r>
+      <w:proofErr w:type="gramEnd"/>
+      <w:r>
+        <w:rPr>
+          <w:sz w:val="21"/>
+        </w:rPr>
+        <w:t xml:space="preserve"> system shall keep assets recorded as unfit for ordinary use unavailable for ordinary-use reservation until an authorized condition update establishes suitability. Returning an asset to service shall not override an existing reservation or transfer. Rejection of an end-of-life proposal shall restore the appropriate prior state, including Unfit or Retired, and shall not establish suitability for use.</w:t>
+      </w:r>
+      <w:r>
+        <w:rPr>
+          <w:b/>
+          <w:sz w:val="21"/>
+        </w:rPr>
+        <w:t xml:space="preserve"> Acceptance: </w:t>
+      </w:r>
+      <w:r>
+        <w:rPr>
+          <w:sz w:val="21"/>
+        </w:rPr>
+        <w:t>An Unfit asset remains Unfit after end-of-life rejection and cannot be reserved. Return to service requires a suitable condition assessment and preserves any active allocation.</w:t>
+      </w:r>
+    </w:p>
+    <w:p>
+      <w:pPr>
+        <w:spacing w:after="60" w:line="240" w:lineRule="exact"/>
+      </w:pPr>
+      <w:r>
+        <w:rPr>
+          <w:b/>
+          <w:sz w:val="21"/>
+        </w:rPr>
+        <w:t>FR-MAINT-005 [</w:t>
+      </w:r>
+      <w:proofErr w:type="gramStart"/>
+      <w:r>
+        <w:rPr>
+          <w:b/>
+          <w:sz w:val="21"/>
+        </w:rPr>
+        <w:t xml:space="preserve">Must]  </w:t>
+      </w:r>
+      <w:r>
+        <w:rPr>
+          <w:sz w:val="21"/>
+        </w:rPr>
+        <w:t>The</w:t>
+      </w:r>
+      <w:proofErr w:type="gramEnd"/>
+      <w:r>
+        <w:rPr>
+          <w:sz w:val="21"/>
+        </w:rPr>
+        <w:t xml:space="preserve"> system shall require authorized approval before recording donation, component recovery, recycling, or disposal as completed, and retain the decision, reason, date, responsible personnel, and supporting records.</w:t>
+      </w:r>
+      <w:r>
+        <w:rPr>
+          <w:b/>
+          <w:sz w:val="21"/>
+        </w:rPr>
+        <w:t xml:space="preserve"> Acceptance: </w:t>
+      </w:r>
+      <w:r>
+        <w:rPr>
+          <w:sz w:val="21"/>
+        </w:rPr>
+        <w:t>Completion cannot be recorded without approval.</w:t>
+      </w:r>
+    </w:p>
+    <w:p>
+      <w:pPr>
+        <w:spacing w:after="60" w:line="240" w:lineRule="exact"/>
+      </w:pPr>
+      <w:r>
+        <w:rPr>
+          <w:b/>
+          <w:sz w:val="21"/>
+        </w:rPr>
+        <w:t>FR-MAINT-006 [</w:t>
+      </w:r>
+      <w:proofErr w:type="gramStart"/>
+      <w:r>
+        <w:rPr>
+          <w:b/>
+          <w:sz w:val="21"/>
+        </w:rPr>
+        <w:t xml:space="preserve">Must]  </w:t>
+      </w:r>
+      <w:r>
+        <w:rPr>
+          <w:sz w:val="21"/>
+        </w:rPr>
+        <w:t>The</w:t>
+      </w:r>
+      <w:proofErr w:type="gramEnd"/>
+      <w:r>
+        <w:rPr>
+          <w:sz w:val="21"/>
+        </w:rPr>
+        <w:t xml:space="preserve"> system shall exclude retired or disposed assets from availability while retaining their history for authorized review and reporting.</w:t>
+      </w:r>
+      <w:r>
+        <w:rPr>
+          <w:b/>
+          <w:sz w:val="21"/>
+        </w:rPr>
+        <w:t xml:space="preserve"> Acceptance: </w:t>
+      </w:r>
+      <w:r>
+        <w:rPr>
+          <w:sz w:val="21"/>
+        </w:rPr>
+        <w:t>Disposed asset is unavailable but its history remains viewable.</w:t>
+      </w:r>
+    </w:p>
+    <w:p>
+      <w:pPr>
+        <w:pStyle w:val="Heading2"/>
+      </w:pPr>
+      <w:bookmarkStart w:id="26" w:name="SRS_1026"/>
+      <w:r>
+        <w:t>4.7 AI Assisted Asset Classification</w:t>
+      </w:r>
+      <w:bookmarkEnd w:id="26"/>
+    </w:p>
+    <w:p>
+      <w:pPr>
+        <w:pStyle w:val="level4"/>
+        <w:keepNext/>
+        <w:keepLines/>
+        <w:spacing w:before="80" w:after="40" w:line="260" w:lineRule="exact"/>
+        <w:ind w:left="288"/>
+      </w:pPr>
+      <w:r>
+        <w:rPr>
+          <w:b/>
+          <w:sz w:val="22"/>
+        </w:rPr>
+        <w:t>4.7.1 Description and Priority</w:t>
+      </w:r>
+    </w:p>
+    <w:p>
+      <w:pPr>
+        <w:spacing w:after="60" w:line="260" w:lineRule="exact"/>
+      </w:pPr>
+      <w:r>
+        <w:rPr>
+          <w:sz w:val="22"/>
+        </w:rPr>
+        <w:t>Priority: High. Suggest metadata for human confirmation (Phase 1, Section 4.6).</w:t>
+      </w:r>
+    </w:p>
+    <w:p>
+      <w:pPr>
+        <w:pStyle w:val="level4"/>
+        <w:keepNext/>
+        <w:keepLines/>
+        <w:spacing w:before="80" w:after="40" w:line="260" w:lineRule="exact"/>
+        <w:ind w:left="288"/>
+      </w:pPr>
+      <w:r>
+        <w:rPr>
+          <w:b/>
+          <w:sz w:val="22"/>
+        </w:rPr>
+        <w:t>4.7.2 Stimulus/Response Sequences</w:t>
+      </w:r>
+    </w:p>
+    <w:p>
+      <w:pPr>
+        <w:spacing w:after="60" w:line="260" w:lineRule="exact"/>
+      </w:pPr>
+      <w:r>
+        <w:rPr>
+          <w:sz w:val="22"/>
+        </w:rPr>
+        <w:t>User supplies text/files → AI suggests metadata/uncertainty → user reviews → confirmed values and review history are saved. Failure permits manual completion. See UC-02.</w:t>
+      </w:r>
+    </w:p>
+    <w:p>
+      <w:pPr>
+        <w:pStyle w:val="level4"/>
+        <w:keepNext/>
+        <w:keepLines/>
+        <w:spacing w:before="80" w:after="40" w:line="260" w:lineRule="exact"/>
+        <w:ind w:left="288"/>
+      </w:pPr>
+      <w:r>
+        <w:rPr>
+          <w:b/>
+          <w:sz w:val="22"/>
+        </w:rPr>
+        <w:t>4.7.3 Functional Requirements</w:t>
+      </w:r>
+    </w:p>
+    <w:p>
+      <w:pPr>
+        <w:spacing w:after="60" w:line="240" w:lineRule="exact"/>
+      </w:pPr>
+      <w:r>
+        <w:rPr>
+          <w:b/>
+          <w:sz w:val="21"/>
+        </w:rPr>
+        <w:t>FR-AI-CLASS-001 [</w:t>
+      </w:r>
+      <w:proofErr w:type="gramStart"/>
+      <w:r>
+        <w:rPr>
+          <w:b/>
+          <w:sz w:val="21"/>
+        </w:rPr>
+        <w:t xml:space="preserve">Must]  </w:t>
+      </w:r>
+      <w:r>
+        <w:rPr>
+          <w:sz w:val="21"/>
+        </w:rPr>
+        <w:t>The</w:t>
+      </w:r>
+      <w:proofErr w:type="gramEnd"/>
+      <w:r>
+        <w:rPr>
+          <w:sz w:val="21"/>
+        </w:rPr>
+        <w:t xml:space="preserve"> system shall analyze supplied asset titles, descriptions, specifications, images, and documents to recommend categories, subcategories, standardized tags and descriptions, and </w:t>
+      </w:r>
+      <w:r>
+        <w:rPr>
+          <w:sz w:val="21"/>
+        </w:rPr>
+        <w:lastRenderedPageBreak/>
+        <w:t>possible material types, and identify missing metadata.</w:t>
+      </w:r>
+      <w:r>
+        <w:rPr>
+          <w:b/>
+          <w:sz w:val="21"/>
+        </w:rPr>
+        <w:t xml:space="preserve"> Acceptance: </w:t>
+      </w:r>
+      <w:r>
+        <w:rPr>
+          <w:sz w:val="21"/>
+        </w:rPr>
+        <w:t>Representative test assets receive suggestions for each listed item.</w:t>
+      </w:r>
+    </w:p>
+    <w:p>
+      <w:pPr>
+        <w:spacing w:after="60" w:line="240" w:lineRule="exact"/>
+      </w:pPr>
+      <w:r>
+        <w:rPr>
+          <w:b/>
+          <w:sz w:val="21"/>
+        </w:rPr>
+        <w:t>FR-AI-CLASS-002 [</w:t>
+      </w:r>
+      <w:proofErr w:type="gramStart"/>
+      <w:r>
+        <w:rPr>
+          <w:b/>
+          <w:sz w:val="21"/>
+        </w:rPr>
+        <w:t xml:space="preserve">Must]  </w:t>
+      </w:r>
+      <w:r>
+        <w:rPr>
+          <w:sz w:val="21"/>
+        </w:rPr>
+        <w:t>The</w:t>
+      </w:r>
+      <w:proofErr w:type="gramEnd"/>
+      <w:r>
+        <w:rPr>
+          <w:sz w:val="21"/>
+        </w:rPr>
+        <w:t xml:space="preserve"> system shall allow authorized users to accept, correct, or reject suggested metadata within the registration or editing workflow, and shall not overwrite confirmed information without user acceptance.</w:t>
+      </w:r>
+      <w:r>
+        <w:rPr>
+          <w:b/>
+          <w:sz w:val="21"/>
+        </w:rPr>
+        <w:t xml:space="preserve"> Acceptance: </w:t>
+      </w:r>
+      <w:r>
+        <w:rPr>
+          <w:sz w:val="21"/>
+        </w:rPr>
+        <w:t xml:space="preserve">Rejecting a </w:t>
+      </w:r>
+      <w:proofErr w:type="gramStart"/>
+      <w:r>
+        <w:rPr>
+          <w:sz w:val="21"/>
+        </w:rPr>
+        <w:t>suggestion leaves</w:t>
+      </w:r>
+      <w:proofErr w:type="gramEnd"/>
+      <w:r>
+        <w:rPr>
+          <w:sz w:val="21"/>
+        </w:rPr>
+        <w:t xml:space="preserve"> confirmed metadata unchanged; the suggestion and review decision remain in the AI audit record.</w:t>
+      </w:r>
+    </w:p>
+    <w:p>
+      <w:pPr>
+        <w:spacing w:after="60" w:line="240" w:lineRule="exact"/>
+      </w:pPr>
+      <w:r>
+        <w:rPr>
+          <w:b/>
+          <w:sz w:val="21"/>
+        </w:rPr>
+        <w:t>FR-AI-CLASS-003 [</w:t>
+      </w:r>
+      <w:proofErr w:type="gramStart"/>
+      <w:r>
+        <w:rPr>
+          <w:b/>
+          <w:sz w:val="21"/>
+        </w:rPr>
+        <w:t xml:space="preserve">Must]  </w:t>
+      </w:r>
+      <w:r>
+        <w:rPr>
+          <w:sz w:val="21"/>
+        </w:rPr>
+        <w:t>The</w:t>
+      </w:r>
+      <w:proofErr w:type="gramEnd"/>
+      <w:r>
+        <w:rPr>
+          <w:sz w:val="21"/>
+        </w:rPr>
+        <w:t xml:space="preserve"> system shall identify uncertain or unsupported suggestions.</w:t>
+      </w:r>
+      <w:r>
+        <w:rPr>
+          <w:b/>
+          <w:sz w:val="21"/>
+        </w:rPr>
+        <w:t xml:space="preserve"> Acceptance: </w:t>
+      </w:r>
+      <w:r>
+        <w:rPr>
+          <w:sz w:val="21"/>
+        </w:rPr>
+        <w:t>Low-certainty test cases are visibly marked.</w:t>
+      </w:r>
+    </w:p>
+    <w:p>
+      <w:pPr>
+        <w:spacing w:after="60" w:line="240" w:lineRule="exact"/>
+      </w:pPr>
+      <w:r>
+        <w:rPr>
+          <w:b/>
+          <w:sz w:val="21"/>
+        </w:rPr>
+        <w:t>FR-AI-CLASS-004 [</w:t>
+      </w:r>
+      <w:proofErr w:type="gramStart"/>
+      <w:r>
+        <w:rPr>
+          <w:b/>
+          <w:sz w:val="21"/>
+        </w:rPr>
+        <w:t xml:space="preserve">Must]  </w:t>
+      </w:r>
+      <w:r>
+        <w:rPr>
+          <w:sz w:val="21"/>
+        </w:rPr>
+        <w:t>If</w:t>
+      </w:r>
+      <w:proofErr w:type="gramEnd"/>
+      <w:r>
+        <w:rPr>
+          <w:sz w:val="21"/>
+        </w:rPr>
+        <w:t xml:space="preserve"> classification fails or cannot produce a usable suggestion, the system shall say that assistance is unavailable and allow manual entry without losing supplied information.</w:t>
+      </w:r>
+      <w:r>
+        <w:rPr>
+          <w:b/>
+          <w:sz w:val="21"/>
+        </w:rPr>
+        <w:t xml:space="preserve"> Acceptance: </w:t>
+      </w:r>
+      <w:r>
+        <w:rPr>
+          <w:sz w:val="21"/>
+        </w:rPr>
+        <w:t>With the AI service disabled, manual registration succeeds with no data lost.</w:t>
+      </w:r>
+    </w:p>
+    <w:p>
+      <w:pPr>
+        <w:pStyle w:val="Heading2"/>
+      </w:pPr>
+      <w:bookmarkStart w:id="27" w:name="SRS_1027"/>
+      <w:r>
+        <w:t>4.8 AI Resource Matching Ranking and Explanations</w:t>
+      </w:r>
+      <w:bookmarkEnd w:id="27"/>
+    </w:p>
+    <w:p>
+      <w:pPr>
+        <w:pStyle w:val="level4"/>
+        <w:keepNext/>
+        <w:keepLines/>
+        <w:spacing w:before="80" w:after="40" w:line="260" w:lineRule="exact"/>
+        <w:ind w:left="288"/>
+      </w:pPr>
+      <w:r>
+        <w:rPr>
+          <w:b/>
+          <w:sz w:val="22"/>
+        </w:rPr>
+        <w:t>4.8.1 Description and Priority</w:t>
+      </w:r>
+    </w:p>
+    <w:p>
+      <w:pPr>
+        <w:spacing w:after="60" w:line="260" w:lineRule="exact"/>
+      </w:pPr>
+      <w:r>
+        <w:rPr>
+          <w:sz w:val="22"/>
+        </w:rPr>
+        <w:t>Priority: High. Find, rank and explain semantic matches without authorizing transactions (Phase 1, Section 4.7).</w:t>
+      </w:r>
+    </w:p>
+    <w:p>
+      <w:pPr>
+        <w:pStyle w:val="level4"/>
+        <w:keepNext/>
+        <w:keepLines/>
+        <w:spacing w:before="80" w:after="40" w:line="260" w:lineRule="exact"/>
+        <w:ind w:left="288"/>
+      </w:pPr>
+      <w:r>
+        <w:rPr>
+          <w:b/>
+          <w:sz w:val="22"/>
+        </w:rPr>
+        <w:t>4.8.2 Stimulus/Response Sequences</w:t>
+      </w:r>
+    </w:p>
+    <w:p>
+      <w:pPr>
+        <w:spacing w:after="60" w:line="260" w:lineRule="exact"/>
+      </w:pPr>
+      <w:r>
+        <w:rPr>
+          <w:sz w:val="22"/>
+        </w:rPr>
+        <w:t>Active need/listing triggers matching → system checks constraints, scores and explains → user selects interest only. Failure offers conventional search; remaining need stays active. See UC-06.</w:t>
+      </w:r>
+    </w:p>
+    <w:p>
+      <w:pPr>
+        <w:pStyle w:val="level4"/>
+        <w:keepNext/>
+        <w:keepLines/>
+        <w:spacing w:before="80" w:after="40" w:line="260" w:lineRule="exact"/>
+        <w:ind w:left="288"/>
+      </w:pPr>
+      <w:r>
+        <w:rPr>
+          <w:b/>
+          <w:sz w:val="22"/>
+        </w:rPr>
+        <w:t>4.8.3 Functional Requirements</w:t>
+      </w:r>
+    </w:p>
+    <w:p>
+      <w:pPr>
+        <w:spacing w:after="60" w:line="240" w:lineRule="exact"/>
+      </w:pPr>
+      <w:r>
+        <w:rPr>
+          <w:b/>
+          <w:sz w:val="21"/>
+        </w:rPr>
+        <w:t>FR-AI-MATCH-001 [</w:t>
+      </w:r>
+      <w:proofErr w:type="gramStart"/>
+      <w:r>
+        <w:rPr>
+          <w:b/>
+          <w:sz w:val="21"/>
+        </w:rPr>
+        <w:t xml:space="preserve">Must]  </w:t>
+      </w:r>
+      <w:r>
+        <w:rPr>
+          <w:sz w:val="21"/>
+        </w:rPr>
+        <w:t>The</w:t>
+      </w:r>
+      <w:proofErr w:type="gramEnd"/>
+      <w:r>
+        <w:rPr>
+          <w:sz w:val="21"/>
+        </w:rPr>
+        <w:t xml:space="preserve"> system shall match departmental requests with available listings using semantic meaning rather than relying only on identical keywords.</w:t>
+      </w:r>
+      <w:r>
+        <w:rPr>
+          <w:b/>
+          <w:sz w:val="21"/>
+        </w:rPr>
+        <w:t xml:space="preserve"> Acceptance: </w:t>
+      </w:r>
+      <w:r>
+        <w:rPr>
+          <w:sz w:val="21"/>
+        </w:rPr>
+        <w:t>Synonym test cases (e.g., “display” and “monitor”) are matched.</w:t>
+      </w:r>
+    </w:p>
+    <w:p>
+      <w:pPr>
+        <w:spacing w:after="60" w:line="240" w:lineRule="exact"/>
+      </w:pPr>
+      <w:r>
+        <w:rPr>
+          <w:b/>
+          <w:sz w:val="21"/>
+        </w:rPr>
+        <w:t>FR-AI-MATCH-002 [</w:t>
+      </w:r>
+      <w:proofErr w:type="gramStart"/>
+      <w:r>
+        <w:rPr>
+          <w:b/>
+          <w:sz w:val="21"/>
+        </w:rPr>
+        <w:t xml:space="preserve">Must]  </w:t>
+      </w:r>
+      <w:r>
+        <w:rPr>
+          <w:sz w:val="21"/>
+        </w:rPr>
+        <w:t>Matching</w:t>
+      </w:r>
+      <w:proofErr w:type="gramEnd"/>
+      <w:r>
+        <w:rPr>
+          <w:sz w:val="21"/>
+        </w:rPr>
+        <w:t xml:space="preserve"> shall consider category compatibility, functional purpose, technical specifications, quantity, asset condition, requested condition, location, urgency, required date, transfer cost, and repair cost.</w:t>
+      </w:r>
+      <w:r>
+        <w:rPr>
+          <w:b/>
+          <w:sz w:val="21"/>
+        </w:rPr>
+        <w:t xml:space="preserve"> Acceptance: </w:t>
+      </w:r>
+      <w:r>
+        <w:rPr>
+          <w:sz w:val="21"/>
+        </w:rPr>
+        <w:t>On prelabelled cases, each factor is used in suitability checking or scoring as specified by the documented scoring rules; mandatory incompatibility is blocked and missing mandatory data is flagged. See TBD-004.</w:t>
+      </w:r>
+    </w:p>
+    <w:p>
+      <w:pPr>
+        <w:spacing w:after="60" w:line="240" w:lineRule="exact"/>
+      </w:pPr>
+      <w:r>
+        <w:rPr>
+          <w:b/>
+          <w:sz w:val="21"/>
+        </w:rPr>
+        <w:t>FR-AI-MATCH-003 [</w:t>
+      </w:r>
+      <w:proofErr w:type="gramStart"/>
+      <w:r>
+        <w:rPr>
+          <w:b/>
+          <w:sz w:val="21"/>
+        </w:rPr>
+        <w:t xml:space="preserve">Must]  </w:t>
+      </w:r>
+      <w:r>
+        <w:rPr>
+          <w:sz w:val="21"/>
+        </w:rPr>
+        <w:t>The</w:t>
+      </w:r>
+      <w:proofErr w:type="gramEnd"/>
+      <w:r>
+        <w:rPr>
+          <w:sz w:val="21"/>
+        </w:rPr>
+        <w:t xml:space="preserve"> system shall generate a compatibility score for each recommended asset-request combination.</w:t>
+      </w:r>
+      <w:r>
+        <w:rPr>
+          <w:b/>
+          <w:sz w:val="21"/>
+        </w:rPr>
+        <w:t xml:space="preserve"> Acceptance: </w:t>
+      </w:r>
+      <w:r>
+        <w:rPr>
+          <w:sz w:val="21"/>
+        </w:rPr>
+        <w:t>Every recommendation displays a score.</w:t>
+      </w:r>
+    </w:p>
+    <w:p>
+      <w:pPr>
+        <w:spacing w:after="60" w:line="240" w:lineRule="exact"/>
+      </w:pPr>
+      <w:r>
+        <w:rPr>
+          <w:b/>
+          <w:sz w:val="21"/>
+        </w:rPr>
+        <w:t>FR-AI-MATCH-004 [</w:t>
+      </w:r>
+      <w:proofErr w:type="gramStart"/>
+      <w:r>
+        <w:rPr>
+          <w:b/>
+          <w:sz w:val="21"/>
+        </w:rPr>
+        <w:t xml:space="preserve">Must]  </w:t>
+      </w:r>
+      <w:r>
+        <w:rPr>
+          <w:sz w:val="21"/>
+        </w:rPr>
+        <w:t>The</w:t>
+      </w:r>
+      <w:proofErr w:type="gramEnd"/>
+      <w:r>
+        <w:rPr>
+          <w:sz w:val="21"/>
+        </w:rPr>
+        <w:t xml:space="preserve"> system shall rank suitable matches by functional suitability, urgency, transfer cost, repair requirements, waste-diversion benefit, and estimated carbon-emission reduction.</w:t>
+      </w:r>
+      <w:r>
+        <w:rPr>
+          <w:b/>
+          <w:sz w:val="21"/>
+        </w:rPr>
+        <w:t xml:space="preserve"> Acceptance: </w:t>
+      </w:r>
+      <w:r>
+        <w:rPr>
+          <w:sz w:val="21"/>
+        </w:rPr>
+        <w:t>Use prelabelled ranking cases and documented weights (TBD-004); scores and order agree with the selected rules, and sustainability benefits do not override mandatory suitability.</w:t>
+      </w:r>
+    </w:p>
+    <w:p>
+      <w:pPr>
+        <w:spacing w:after="60" w:line="240" w:lineRule="exact"/>
+      </w:pPr>
+      <w:r>
+        <w:rPr>
+          <w:b/>
+          <w:sz w:val="21"/>
+        </w:rPr>
+        <w:t>FR-AI-MATCH-005 [</w:t>
+      </w:r>
+      <w:proofErr w:type="gramStart"/>
+      <w:r>
+        <w:rPr>
+          <w:b/>
+          <w:sz w:val="21"/>
+        </w:rPr>
+        <w:t xml:space="preserve">Must]  </w:t>
+      </w:r>
+      <w:r>
+        <w:rPr>
+          <w:sz w:val="21"/>
+        </w:rPr>
+        <w:t>Each</w:t>
+      </w:r>
+      <w:proofErr w:type="gramEnd"/>
+      <w:r>
+        <w:rPr>
+          <w:sz w:val="21"/>
+        </w:rPr>
+        <w:t xml:space="preserve"> recommendation shall include a readable explanation of the main factors that influenced it, including any uncertainty or missing information.</w:t>
+      </w:r>
+      <w:r>
+        <w:rPr>
+          <w:b/>
+          <w:sz w:val="21"/>
+        </w:rPr>
+        <w:t xml:space="preserve"> Acceptance: </w:t>
+      </w:r>
+      <w:r>
+        <w:rPr>
+          <w:sz w:val="21"/>
+        </w:rPr>
+        <w:t>Reviewers confirm that explanations agree with the underlying data.</w:t>
+      </w:r>
+    </w:p>
+    <w:p>
+      <w:pPr>
+        <w:spacing w:after="60" w:line="240" w:lineRule="exact"/>
+      </w:pPr>
+      <w:r>
+        <w:rPr>
+          <w:b/>
+          <w:sz w:val="21"/>
+        </w:rPr>
+        <w:t>FR-AI-MATCH-006 [</w:t>
+      </w:r>
+      <w:proofErr w:type="gramStart"/>
+      <w:r>
+        <w:rPr>
+          <w:b/>
+          <w:sz w:val="21"/>
+        </w:rPr>
+        <w:t xml:space="preserve">Must]  </w:t>
+      </w:r>
+      <w:r>
+        <w:rPr>
+          <w:sz w:val="21"/>
+        </w:rPr>
+        <w:t>Listings</w:t>
+      </w:r>
+      <w:proofErr w:type="gramEnd"/>
+      <w:r>
+        <w:rPr>
+          <w:sz w:val="21"/>
+        </w:rPr>
+        <w:t xml:space="preserve"> with a confirmed incompatibility with a mandatory requirement shall not be presented as fully suitable matches.</w:t>
+      </w:r>
+      <w:r>
+        <w:rPr>
+          <w:b/>
+          <w:sz w:val="21"/>
+        </w:rPr>
+        <w:t xml:space="preserve"> Acceptance: </w:t>
+      </w:r>
+      <w:r>
+        <w:rPr>
+          <w:sz w:val="21"/>
+        </w:rPr>
+        <w:t>Incompatible test listings are excluded or labelled unsuitable.</w:t>
+      </w:r>
+    </w:p>
+    <w:p>
+      <w:pPr>
+        <w:spacing w:after="60" w:line="240" w:lineRule="exact"/>
+      </w:pPr>
+      <w:r>
+        <w:rPr>
+          <w:b/>
+          <w:sz w:val="21"/>
+        </w:rPr>
+        <w:t>FR-AI-MATCH-007 [</w:t>
+      </w:r>
+      <w:proofErr w:type="gramStart"/>
+      <w:r>
+        <w:rPr>
+          <w:b/>
+          <w:sz w:val="21"/>
+        </w:rPr>
+        <w:t xml:space="preserve">Must]  </w:t>
+      </w:r>
+      <w:r>
+        <w:rPr>
+          <w:sz w:val="21"/>
+        </w:rPr>
+        <w:t>Missing</w:t>
+      </w:r>
+      <w:proofErr w:type="gramEnd"/>
+      <w:r>
+        <w:rPr>
+          <w:sz w:val="21"/>
+        </w:rPr>
+        <w:t xml:space="preserve"> mandatory information shall be shown as uncertain and shall not be treated as a confirmed match.</w:t>
+      </w:r>
+      <w:r>
+        <w:rPr>
+          <w:b/>
+          <w:sz w:val="21"/>
+        </w:rPr>
+        <w:t xml:space="preserve"> Acceptance: </w:t>
+      </w:r>
+      <w:r>
+        <w:rPr>
+          <w:sz w:val="21"/>
+        </w:rPr>
+        <w:t>Listings missing mandatory data are flagged as unconfirmed.</w:t>
+      </w:r>
+    </w:p>
+    <w:p>
+      <w:pPr>
+        <w:spacing w:after="60" w:line="240" w:lineRule="exact"/>
+      </w:pPr>
+      <w:r>
+        <w:rPr>
+          <w:b/>
+          <w:sz w:val="21"/>
+        </w:rPr>
+        <w:t>FR-AI-MATCH-008 [</w:t>
+      </w:r>
+      <w:proofErr w:type="gramStart"/>
+      <w:r>
+        <w:rPr>
+          <w:b/>
+          <w:sz w:val="21"/>
+        </w:rPr>
+        <w:t xml:space="preserve">Must]  </w:t>
+      </w:r>
+      <w:r>
+        <w:rPr>
+          <w:sz w:val="21"/>
+        </w:rPr>
+        <w:t>The</w:t>
+      </w:r>
+      <w:proofErr w:type="gramEnd"/>
+      <w:r>
+        <w:rPr>
+          <w:sz w:val="21"/>
+        </w:rPr>
+        <w:t xml:space="preserve"> system shall allow users to accept or reject recommendations and retain the recommendation and the review outcome.</w:t>
+      </w:r>
+      <w:r>
+        <w:rPr>
+          <w:b/>
+          <w:sz w:val="21"/>
+        </w:rPr>
+        <w:t xml:space="preserve"> Acceptance: </w:t>
+      </w:r>
+      <w:r>
+        <w:rPr>
+          <w:sz w:val="21"/>
+        </w:rPr>
+        <w:t>Accept and reject decisions are stored with the recommendation.</w:t>
+      </w:r>
+    </w:p>
+    <w:p>
+      <w:pPr>
+        <w:spacing w:after="60" w:line="240" w:lineRule="exact"/>
+      </w:pPr>
+      <w:r>
+        <w:rPr>
+          <w:b/>
+          <w:sz w:val="21"/>
+        </w:rPr>
+        <w:t>FR-AI-MATCH-009 [</w:t>
+      </w:r>
+      <w:proofErr w:type="gramStart"/>
+      <w:r>
+        <w:rPr>
+          <w:b/>
+          <w:sz w:val="21"/>
+        </w:rPr>
+        <w:t xml:space="preserve">Must]  </w:t>
+      </w:r>
+      <w:r>
+        <w:rPr>
+          <w:sz w:val="21"/>
+        </w:rPr>
+        <w:t>Selecting</w:t>
+      </w:r>
+      <w:proofErr w:type="gramEnd"/>
+      <w:r>
+        <w:rPr>
+          <w:sz w:val="21"/>
+        </w:rPr>
+        <w:t xml:space="preserve"> a recommendation shall not bypass reservation, availability, or approval rules.</w:t>
+      </w:r>
+      <w:r>
+        <w:rPr>
+          <w:b/>
+          <w:sz w:val="21"/>
+        </w:rPr>
+        <w:t xml:space="preserve"> Acceptance: </w:t>
+      </w:r>
+      <w:r>
+        <w:rPr>
+          <w:sz w:val="21"/>
+        </w:rPr>
+        <w:t>Accepting a match only creates an expression of interest.</w:t>
+      </w:r>
+    </w:p>
+    <w:p>
+      <w:pPr>
+        <w:spacing w:after="60" w:line="240" w:lineRule="exact"/>
+      </w:pPr>
+      <w:r>
+        <w:rPr>
+          <w:b/>
+          <w:sz w:val="21"/>
+        </w:rPr>
+        <w:lastRenderedPageBreak/>
+        <w:t>FR-AI-MATCH-010 [</w:t>
+      </w:r>
+      <w:proofErr w:type="gramStart"/>
+      <w:r>
+        <w:rPr>
+          <w:b/>
+          <w:sz w:val="21"/>
+        </w:rPr>
+        <w:t xml:space="preserve">Must]  </w:t>
+      </w:r>
+      <w:r>
+        <w:rPr>
+          <w:sz w:val="21"/>
+        </w:rPr>
+        <w:t>If</w:t>
+      </w:r>
+      <w:proofErr w:type="gramEnd"/>
+      <w:r>
+        <w:rPr>
+          <w:sz w:val="21"/>
+        </w:rPr>
+        <w:t xml:space="preserve"> no suitable match is found or the matching service is unavailable, the system shall explain the outcome and allow conventional search without closing the request.</w:t>
+      </w:r>
+      <w:r>
+        <w:rPr>
+          <w:b/>
+          <w:sz w:val="21"/>
+        </w:rPr>
+        <w:t xml:space="preserve"> Acceptance: </w:t>
+      </w:r>
+      <w:r>
+        <w:rPr>
+          <w:sz w:val="21"/>
+        </w:rPr>
+        <w:t>With AI disabled, the request stays open and keyword search works.</w:t>
+      </w:r>
+    </w:p>
+    <w:p>
+      <w:pPr>
+        <w:spacing w:after="60" w:line="240" w:lineRule="exact"/>
+      </w:pPr>
+      <w:r>
+        <w:rPr>
+          <w:b/>
+          <w:sz w:val="21"/>
+        </w:rPr>
+        <w:t>FR-AI-MATCH-011 [</w:t>
+      </w:r>
+      <w:proofErr w:type="gramStart"/>
+      <w:r>
+        <w:rPr>
+          <w:b/>
+          <w:sz w:val="21"/>
+        </w:rPr>
+        <w:t xml:space="preserve">Must]  </w:t>
+      </w:r>
+      <w:r>
+        <w:rPr>
+          <w:sz w:val="21"/>
+        </w:rPr>
+        <w:t>The</w:t>
+      </w:r>
+      <w:proofErr w:type="gramEnd"/>
+      <w:r>
+        <w:rPr>
+          <w:sz w:val="21"/>
+        </w:rPr>
+        <w:t xml:space="preserve"> system shall notify requesters when a newly published listing matches an active request with unallocated outstanding need, including Reserved or Partially Fulfilled requests (Phase 1, Req. 53).</w:t>
+      </w:r>
+      <w:r>
+        <w:rPr>
+          <w:b/>
+          <w:sz w:val="21"/>
+        </w:rPr>
+        <w:t xml:space="preserve"> Acceptance: </w:t>
+      </w:r>
+      <w:r>
+        <w:rPr>
+          <w:sz w:val="21"/>
+        </w:rPr>
+        <w:t>A matching publication notifies the requester for remaining unallocated demand; closed, cancelled and fully fulfilled requests receive no match notification.</w:t>
+      </w:r>
+    </w:p>
+    <w:p>
+      <w:pPr>
+        <w:pStyle w:val="Heading2"/>
+      </w:pPr>
+      <w:bookmarkStart w:id="28" w:name="SRS_1028"/>
+      <w:r>
+        <w:t>4.9 Sustainable Action Recommendations</w:t>
+      </w:r>
+      <w:bookmarkEnd w:id="28"/>
+    </w:p>
+    <w:p>
+      <w:pPr>
+        <w:pStyle w:val="level4"/>
+        <w:keepNext/>
+        <w:keepLines/>
+        <w:spacing w:before="80" w:after="40" w:line="260" w:lineRule="exact"/>
+        <w:ind w:left="288"/>
+      </w:pPr>
+      <w:r>
+        <w:rPr>
+          <w:b/>
+          <w:sz w:val="22"/>
+        </w:rPr>
+        <w:t>4.9.1 Description and Priority</w:t>
+      </w:r>
+    </w:p>
+    <w:p>
+      <w:pPr>
+        <w:spacing w:after="60" w:line="260" w:lineRule="exact"/>
+      </w:pPr>
+      <w:r>
+        <w:rPr>
+          <w:sz w:val="22"/>
+        </w:rPr>
+        <w:t>Priority: Medium. Advise on sustainable next actions for human decision (Phase 1, Section 4.8).</w:t>
+      </w:r>
+    </w:p>
+    <w:p>
+      <w:pPr>
+        <w:pStyle w:val="level4"/>
+        <w:keepNext/>
+        <w:keepLines/>
+        <w:spacing w:before="80" w:after="40" w:line="260" w:lineRule="exact"/>
+        <w:ind w:left="288"/>
+      </w:pPr>
+      <w:r>
+        <w:rPr>
+          <w:b/>
+          <w:sz w:val="22"/>
+        </w:rPr>
+        <w:t>4.9.2 Stimulus/Response Sequences</w:t>
+      </w:r>
+    </w:p>
+    <w:p>
+      <w:pPr>
+        <w:spacing w:after="60" w:line="260" w:lineRule="exact"/>
+      </w:pPr>
+      <w:r>
+        <w:rPr>
+          <w:sz w:val="22"/>
+        </w:rPr>
+        <w:t>Custodian requests advice → AI assesses records/uncertainty → user reviews/overrides → retain, transfer, maintenance or approved end-of-life workflow follows. See UC-10.</w:t>
+      </w:r>
+    </w:p>
+    <w:p>
+      <w:pPr>
+        <w:pStyle w:val="level4"/>
+        <w:keepNext/>
+        <w:keepLines/>
+        <w:spacing w:before="80" w:after="40" w:line="260" w:lineRule="exact"/>
+        <w:ind w:left="288"/>
+      </w:pPr>
+      <w:r>
+        <w:rPr>
+          <w:b/>
+          <w:sz w:val="22"/>
+        </w:rPr>
+        <w:t>4.9.3 Functional Requirements</w:t>
+      </w:r>
+    </w:p>
+    <w:p>
+      <w:pPr>
+        <w:spacing w:after="60" w:line="240" w:lineRule="exact"/>
+      </w:pPr>
+      <w:r>
+        <w:rPr>
+          <w:b/>
+          <w:sz w:val="21"/>
+        </w:rPr>
+        <w:t>FR-AI-SUST-001 [</w:t>
+      </w:r>
+      <w:proofErr w:type="gramStart"/>
+      <w:r>
+        <w:rPr>
+          <w:b/>
+          <w:sz w:val="21"/>
+        </w:rPr>
+        <w:t xml:space="preserve">Must]  </w:t>
+      </w:r>
+      <w:r>
+        <w:rPr>
+          <w:sz w:val="21"/>
+        </w:rPr>
+        <w:t>The</w:t>
+      </w:r>
+      <w:proofErr w:type="gramEnd"/>
+      <w:r>
+        <w:rPr>
+          <w:sz w:val="21"/>
+        </w:rPr>
+        <w:t xml:space="preserve"> system shall recommend retention, transfer, repair, refurbishment, donation, component recovery, recycling, or retirement, with disposal considered only as a final option.</w:t>
+      </w:r>
+      <w:r>
+        <w:rPr>
+          <w:b/>
+          <w:sz w:val="21"/>
+        </w:rPr>
+        <w:t xml:space="preserve"> Acceptance: </w:t>
+      </w:r>
+      <w:r>
+        <w:rPr>
+          <w:sz w:val="21"/>
+        </w:rPr>
+        <w:t>Test assets receive one of these actions; disposal is never preferred while a feasible alternative exists.</w:t>
+      </w:r>
+    </w:p>
+    <w:p>
+      <w:pPr>
+        <w:spacing w:after="60" w:line="240" w:lineRule="exact"/>
+      </w:pPr>
+      <w:r>
+        <w:rPr>
+          <w:b/>
+          <w:sz w:val="21"/>
+        </w:rPr>
+        <w:t>FR-AI-SUST-002 [</w:t>
+      </w:r>
+      <w:proofErr w:type="gramStart"/>
+      <w:r>
+        <w:rPr>
+          <w:b/>
+          <w:sz w:val="21"/>
+        </w:rPr>
+        <w:t xml:space="preserve">Must]  </w:t>
+      </w:r>
+      <w:r>
+        <w:rPr>
+          <w:sz w:val="21"/>
+        </w:rPr>
+        <w:t>Recommendations</w:t>
+      </w:r>
+      <w:proofErr w:type="gramEnd"/>
+      <w:r>
+        <w:rPr>
+          <w:sz w:val="21"/>
+        </w:rPr>
+        <w:t xml:space="preserve"> shall consider recorded condition, maintenance history, departmental demand, transfer and repair costs, and potential financial and environmental benefits.</w:t>
+      </w:r>
+      <w:r>
+        <w:rPr>
+          <w:b/>
+          <w:sz w:val="21"/>
+        </w:rPr>
+        <w:t xml:space="preserve"> Acceptance: </w:t>
+      </w:r>
+      <w:r>
+        <w:rPr>
+          <w:sz w:val="21"/>
+        </w:rPr>
+        <w:t>Prelabelled cases verify that each recorded factor appears in the assessment; infeasible actions are rejected and missing essential inputs produce a review warning. The reviewer checks the explanation against the records.</w:t>
+      </w:r>
+    </w:p>
+    <w:p>
+      <w:pPr>
+        <w:spacing w:after="60" w:line="240" w:lineRule="exact"/>
+      </w:pPr>
+      <w:r>
+        <w:rPr>
+          <w:b/>
+          <w:sz w:val="21"/>
+        </w:rPr>
+        <w:t>FR-AI-SUST-003 [</w:t>
+      </w:r>
+      <w:proofErr w:type="gramStart"/>
+      <w:r>
+        <w:rPr>
+          <w:b/>
+          <w:sz w:val="21"/>
+        </w:rPr>
+        <w:t xml:space="preserve">Must]  </w:t>
+      </w:r>
+      <w:r>
+        <w:rPr>
+          <w:sz w:val="21"/>
+        </w:rPr>
+        <w:t>The</w:t>
+      </w:r>
+      <w:proofErr w:type="gramEnd"/>
+      <w:r>
+        <w:rPr>
+          <w:sz w:val="21"/>
+        </w:rPr>
+        <w:t xml:space="preserve"> system shall explain each recommendation, identifying supporting information, assumptions, and uncertainties. When essential information is missing, it shall indicate the need for further review instead of a definitive recommendation.</w:t>
+      </w:r>
+      <w:r>
+        <w:rPr>
+          <w:b/>
+          <w:sz w:val="21"/>
+        </w:rPr>
+        <w:t xml:space="preserve"> Acceptance: </w:t>
+      </w:r>
+      <w:r>
+        <w:rPr>
+          <w:sz w:val="21"/>
+        </w:rPr>
+        <w:t>An asset with missing data returns “needs review”.</w:t>
+      </w:r>
+    </w:p>
+    <w:p>
+      <w:pPr>
+        <w:spacing w:after="60" w:line="240" w:lineRule="exact"/>
+      </w:pPr>
+      <w:r>
+        <w:rPr>
+          <w:b/>
+          <w:sz w:val="21"/>
+        </w:rPr>
+        <w:t>FR-AI-SUST-004 [</w:t>
+      </w:r>
+      <w:proofErr w:type="gramStart"/>
+      <w:r>
+        <w:rPr>
+          <w:b/>
+          <w:sz w:val="21"/>
+        </w:rPr>
+        <w:t xml:space="preserve">Must]  </w:t>
+      </w:r>
+      <w:r>
+        <w:rPr>
+          <w:sz w:val="21"/>
+        </w:rPr>
+        <w:t>The</w:t>
+      </w:r>
+      <w:proofErr w:type="gramEnd"/>
+      <w:r>
+        <w:rPr>
+          <w:sz w:val="21"/>
+        </w:rPr>
+        <w:t xml:space="preserve"> system shall allow authorized users to accept, reject, or override a recommendation and record their decision and reason. Accepting a recommendation shall not execute the action or bypass its approvals.</w:t>
+      </w:r>
+      <w:r>
+        <w:rPr>
+          <w:b/>
+          <w:sz w:val="21"/>
+        </w:rPr>
+        <w:t xml:space="preserve"> Acceptance: </w:t>
+      </w:r>
+      <w:r>
+        <w:rPr>
+          <w:sz w:val="21"/>
+        </w:rPr>
+        <w:t>Acceptance records the decision and opens the applicable workflow. Retention leaves the current state unchanged; repair/refurbishment uses maintenance; end-of-life completion remains blocked until approval.</w:t>
+      </w:r>
+    </w:p>
+    <w:p>
+      <w:pPr>
+        <w:pStyle w:val="Heading2"/>
+      </w:pPr>
+      <w:bookmarkStart w:id="29" w:name="SRS_1029"/>
+      <w:r>
+        <w:t>4.10 Natural Language Assistant</w:t>
+      </w:r>
+      <w:bookmarkEnd w:id="29"/>
+    </w:p>
+    <w:p>
+      <w:pPr>
+        <w:pStyle w:val="level4"/>
+        <w:keepNext/>
+        <w:keepLines/>
+        <w:spacing w:before="80" w:after="40" w:line="260" w:lineRule="exact"/>
+        <w:ind w:left="288"/>
+      </w:pPr>
+      <w:r>
+        <w:rPr>
+          <w:b/>
+          <w:sz w:val="22"/>
+        </w:rPr>
+        <w:t>4.10.1 Description and Priority</w:t>
+      </w:r>
+    </w:p>
+    <w:p>
+      <w:pPr>
+        <w:spacing w:after="60" w:line="260" w:lineRule="exact"/>
+      </w:pPr>
+      <w:r>
+        <w:rPr>
+          <w:sz w:val="22"/>
+        </w:rPr>
+        <w:t>Priority: Medium. Provide permitted natural-language guidance and request preparation (Phase 1, Section 4.9).</w:t>
+      </w:r>
+    </w:p>
+    <w:p>
+      <w:pPr>
+        <w:pStyle w:val="level4"/>
+        <w:keepNext/>
+        <w:keepLines/>
+        <w:spacing w:before="80" w:after="40" w:line="260" w:lineRule="exact"/>
+        <w:ind w:left="288"/>
+      </w:pPr>
+      <w:r>
+        <w:rPr>
+          <w:b/>
+          <w:sz w:val="22"/>
+        </w:rPr>
+        <w:t>4.10.2 Stimulus/Response Sequences</w:t>
+      </w:r>
+    </w:p>
+    <w:p>
+      <w:pPr>
+        <w:spacing w:after="60" w:line="260" w:lineRule="exact"/>
+      </w:pPr>
+      <w:r>
+        <w:rPr>
+          <w:sz w:val="22"/>
+        </w:rPr>
+        <w:t>User asks → assistant uses accessible records/policy → answers or prepares a draft → user reviews before normal submission. Transactions use authorized workflows; outage offers conventional pages. See UC-11.</w:t>
+      </w:r>
+    </w:p>
+    <w:p>
+      <w:pPr>
+        <w:pStyle w:val="level4"/>
+        <w:keepNext/>
+        <w:keepLines/>
+        <w:spacing w:before="80" w:after="40" w:line="260" w:lineRule="exact"/>
+        <w:ind w:left="288"/>
+      </w:pPr>
+      <w:r>
+        <w:rPr>
+          <w:b/>
+          <w:sz w:val="22"/>
+        </w:rPr>
+        <w:t>4.10.3 Functional Requirements</w:t>
+      </w:r>
+    </w:p>
+    <w:p>
+      <w:pPr>
+        <w:spacing w:after="60" w:line="240" w:lineRule="exact"/>
+      </w:pPr>
+      <w:r>
+        <w:rPr>
+          <w:b/>
+          <w:sz w:val="21"/>
+        </w:rPr>
+        <w:t>FR-ASSIST-001 [</w:t>
+      </w:r>
+      <w:proofErr w:type="gramStart"/>
+      <w:r>
+        <w:rPr>
+          <w:b/>
+          <w:sz w:val="21"/>
+        </w:rPr>
+        <w:t xml:space="preserve">Must]  </w:t>
+      </w:r>
+      <w:r>
+        <w:rPr>
+          <w:sz w:val="21"/>
+        </w:rPr>
+        <w:t>The</w:t>
+      </w:r>
+      <w:proofErr w:type="gramEnd"/>
+      <w:r>
+        <w:rPr>
+          <w:sz w:val="21"/>
+        </w:rPr>
+        <w:t xml:space="preserve"> assistant shall support natural-language resource search, request preparation, questions about asset history and request status, policy guidance, sustainability information, and navigation to system functions.</w:t>
+      </w:r>
+      <w:r>
+        <w:rPr>
+          <w:b/>
+          <w:sz w:val="21"/>
+        </w:rPr>
+        <w:t xml:space="preserve"> Acceptance: </w:t>
+      </w:r>
+      <w:r>
+        <w:rPr>
+          <w:sz w:val="21"/>
+        </w:rPr>
+        <w:t>A scripted set of questions in each category is answered.</w:t>
+      </w:r>
+    </w:p>
+    <w:p>
+      <w:pPr>
+        <w:spacing w:after="60" w:line="240" w:lineRule="exact"/>
+      </w:pPr>
+      <w:r>
+        <w:rPr>
+          <w:b/>
+          <w:sz w:val="21"/>
+        </w:rPr>
+        <w:lastRenderedPageBreak/>
+        <w:t>FR-ASSIST-002 [</w:t>
+      </w:r>
+      <w:proofErr w:type="gramStart"/>
+      <w:r>
+        <w:rPr>
+          <w:b/>
+          <w:sz w:val="21"/>
+        </w:rPr>
+        <w:t xml:space="preserve">Must]  </w:t>
+      </w:r>
+      <w:r>
+        <w:rPr>
+          <w:sz w:val="21"/>
+        </w:rPr>
+        <w:t>When</w:t>
+      </w:r>
+      <w:proofErr w:type="gramEnd"/>
+      <w:r>
+        <w:rPr>
+          <w:sz w:val="21"/>
+        </w:rPr>
+        <w:t xml:space="preserve"> preparing a request, the assistant shall let the user review and correct the interpreted details before submission through the standard request workflow.</w:t>
+      </w:r>
+      <w:r>
+        <w:rPr>
+          <w:b/>
+          <w:sz w:val="21"/>
+        </w:rPr>
+        <w:t xml:space="preserve"> Acceptance: </w:t>
+      </w:r>
+      <w:r>
+        <w:rPr>
+          <w:sz w:val="21"/>
+        </w:rPr>
+        <w:t>An assistant-prepared request opens in the normal form for review.</w:t>
+      </w:r>
+    </w:p>
+    <w:p>
+      <w:pPr>
+        <w:spacing w:after="60" w:line="240" w:lineRule="exact"/>
+      </w:pPr>
+      <w:r>
+        <w:rPr>
+          <w:b/>
+          <w:sz w:val="21"/>
+        </w:rPr>
+        <w:t>FR-ASSIST-003 [</w:t>
+      </w:r>
+      <w:proofErr w:type="gramStart"/>
+      <w:r>
+        <w:rPr>
+          <w:b/>
+          <w:sz w:val="21"/>
+        </w:rPr>
+        <w:t xml:space="preserve">Must]  </w:t>
+      </w:r>
+      <w:r>
+        <w:rPr>
+          <w:sz w:val="21"/>
+        </w:rPr>
+        <w:t>The</w:t>
+      </w:r>
+      <w:proofErr w:type="gramEnd"/>
+      <w:r>
+        <w:rPr>
+          <w:sz w:val="21"/>
+        </w:rPr>
+        <w:t xml:space="preserve"> assistant shall base factual answers on records accessible to the user and policy information supplied to the </w:t>
+      </w:r>
+      <w:proofErr w:type="gramStart"/>
+      <w:r>
+        <w:rPr>
+          <w:sz w:val="21"/>
+        </w:rPr>
+        <w:t>system, and</w:t>
+      </w:r>
+      <w:proofErr w:type="gramEnd"/>
+      <w:r>
+        <w:rPr>
+          <w:sz w:val="21"/>
+        </w:rPr>
+        <w:t xml:space="preserve"> shall say when information is unavailable or insufficient.</w:t>
+      </w:r>
+      <w:r>
+        <w:rPr>
+          <w:b/>
+          <w:sz w:val="21"/>
+        </w:rPr>
+        <w:t xml:space="preserve"> Acceptance: </w:t>
+      </w:r>
+      <w:r>
+        <w:rPr>
+          <w:sz w:val="21"/>
+        </w:rPr>
+        <w:t>Questions about restricted or missing records do not reveal data and state that no answer is available.</w:t>
+      </w:r>
+    </w:p>
+    <w:p>
+      <w:pPr>
+        <w:spacing w:after="60" w:line="240" w:lineRule="exact"/>
+      </w:pPr>
+      <w:r>
+        <w:rPr>
+          <w:b/>
+          <w:sz w:val="21"/>
+        </w:rPr>
+        <w:t>FR-ASSIST-004 [</w:t>
+      </w:r>
+      <w:proofErr w:type="gramStart"/>
+      <w:r>
+        <w:rPr>
+          <w:b/>
+          <w:sz w:val="21"/>
+        </w:rPr>
+        <w:t xml:space="preserve">Must]  </w:t>
+      </w:r>
+      <w:r>
+        <w:rPr>
+          <w:sz w:val="21"/>
+        </w:rPr>
+        <w:t>The</w:t>
+      </w:r>
+      <w:proofErr w:type="gramEnd"/>
+      <w:r>
+        <w:rPr>
+          <w:sz w:val="21"/>
+        </w:rPr>
+        <w:t xml:space="preserve"> assistant shall not approve, reserve, transfer, or dispose of assets; such actions shall remain in the normal workflows (BR-002).</w:t>
+      </w:r>
+      <w:r>
+        <w:rPr>
+          <w:b/>
+          <w:sz w:val="21"/>
+        </w:rPr>
+        <w:t xml:space="preserve"> Acceptance: </w:t>
+      </w:r>
+      <w:r>
+        <w:rPr>
+          <w:sz w:val="21"/>
+        </w:rPr>
+        <w:t>Requests to approve or transfer are declined with a link to the workflow.</w:t>
+      </w:r>
+    </w:p>
+    <w:p>
+      <w:pPr>
+        <w:spacing w:after="60" w:line="240" w:lineRule="exact"/>
+      </w:pPr>
+      <w:r>
+        <w:rPr>
+          <w:b/>
+          <w:sz w:val="21"/>
+        </w:rPr>
+        <w:t>FR-ASSIST-005 [</w:t>
+      </w:r>
+      <w:proofErr w:type="gramStart"/>
+      <w:r>
+        <w:rPr>
+          <w:b/>
+          <w:sz w:val="21"/>
+        </w:rPr>
+        <w:t xml:space="preserve">Must]  </w:t>
+      </w:r>
+      <w:r>
+        <w:rPr>
+          <w:sz w:val="21"/>
+        </w:rPr>
+        <w:t>If</w:t>
+      </w:r>
+      <w:proofErr w:type="gramEnd"/>
+      <w:r>
+        <w:rPr>
+          <w:sz w:val="21"/>
+        </w:rPr>
+        <w:t xml:space="preserve"> the assistant is unavailable or cannot complete a task, the system shall allow the user to continue through conventional search, forms, and status pages.</w:t>
+      </w:r>
+      <w:r>
+        <w:rPr>
+          <w:b/>
+          <w:sz w:val="21"/>
+        </w:rPr>
+        <w:t xml:space="preserve"> Acceptance: </w:t>
+      </w:r>
+      <w:r>
+        <w:rPr>
+          <w:sz w:val="21"/>
+        </w:rPr>
+        <w:t>With the assistant disabled, all tasks remain possible.</w:t>
+      </w:r>
+    </w:p>
+    <w:p>
+      <w:pPr>
+        <w:pStyle w:val="Heading2"/>
+      </w:pPr>
+      <w:bookmarkStart w:id="30" w:name="SRS_1030"/>
+      <w:r>
+        <w:t>4.11 Reporting Notifications and Auditability</w:t>
+      </w:r>
+      <w:bookmarkEnd w:id="30"/>
+    </w:p>
+    <w:p>
+      <w:pPr>
+        <w:pStyle w:val="level4"/>
+        <w:keepNext/>
+        <w:keepLines/>
+        <w:spacing w:before="80" w:after="40" w:line="260" w:lineRule="exact"/>
+        <w:ind w:left="288"/>
+      </w:pPr>
+      <w:r>
+        <w:rPr>
+          <w:b/>
+          <w:sz w:val="22"/>
+        </w:rPr>
+        <w:t>4.11.1 Description and Priority</w:t>
+      </w:r>
+    </w:p>
+    <w:p>
+      <w:pPr>
+        <w:spacing w:after="60" w:line="260" w:lineRule="exact"/>
+      </w:pPr>
+      <w:r>
+        <w:rPr>
+          <w:sz w:val="22"/>
+        </w:rPr>
+        <w:t>Priority: Medium. Provide reports, AI summaries, notifications and auditability (Phase 1, Sections 4.10/4.11).</w:t>
+      </w:r>
+    </w:p>
+    <w:p>
+      <w:pPr>
+        <w:pStyle w:val="level4"/>
+        <w:keepNext/>
+        <w:keepLines/>
+        <w:spacing w:before="80" w:after="40" w:line="260" w:lineRule="exact"/>
+        <w:ind w:left="288"/>
+      </w:pPr>
+      <w:r>
+        <w:rPr>
+          <w:b/>
+          <w:sz w:val="22"/>
+        </w:rPr>
+        <w:t>4.11.2 Stimulus/Response Sequences</w:t>
+      </w:r>
+    </w:p>
+    <w:p>
+      <w:pPr>
+        <w:spacing w:after="60" w:line="260" w:lineRule="exact"/>
+      </w:pPr>
+      <w:r>
+        <w:rPr>
+          <w:sz w:val="22"/>
+        </w:rPr>
+        <w:t>User chooses permitted filters → system calculates totals/estimates → AI summarizes the same figures. Events create permitted notifications/audit records. Missing inputs are identified. See UC-12 and Section 6.2.</w:t>
+      </w:r>
+    </w:p>
+    <w:p>
+      <w:pPr>
+        <w:pStyle w:val="level4"/>
+        <w:keepNext/>
+        <w:keepLines/>
+        <w:spacing w:before="80" w:after="40" w:line="260" w:lineRule="exact"/>
+        <w:ind w:left="288"/>
+      </w:pPr>
+      <w:r>
+        <w:rPr>
+          <w:b/>
+          <w:sz w:val="22"/>
+        </w:rPr>
+        <w:t>4.11.3 Functional Requirements</w:t>
+      </w:r>
+    </w:p>
+    <w:p>
+      <w:pPr>
+        <w:spacing w:after="60" w:line="240" w:lineRule="exact"/>
+      </w:pPr>
+      <w:r>
+        <w:rPr>
+          <w:b/>
+          <w:sz w:val="21"/>
+        </w:rPr>
+        <w:t>FR-REPORT-001 [</w:t>
+      </w:r>
+      <w:proofErr w:type="gramStart"/>
+      <w:r>
+        <w:rPr>
+          <w:b/>
+          <w:sz w:val="21"/>
+        </w:rPr>
+        <w:t xml:space="preserve">Must]  </w:t>
+      </w:r>
+      <w:r>
+        <w:rPr>
+          <w:sz w:val="21"/>
+        </w:rPr>
+        <w:t>The</w:t>
+      </w:r>
+      <w:proofErr w:type="gramEnd"/>
+      <w:r>
+        <w:rPr>
+          <w:sz w:val="21"/>
+        </w:rPr>
+        <w:t xml:space="preserve"> system shall provide operational reports on available assets, outstanding requests, reservations, completed transfers, maintenance activity, ownership changes, and approvals, filterable by department, category, and reporting period.</w:t>
+      </w:r>
+      <w:r>
+        <w:rPr>
+          <w:b/>
+          <w:sz w:val="21"/>
+        </w:rPr>
+        <w:t xml:space="preserve"> Acceptance: </w:t>
+      </w:r>
+      <w:r>
+        <w:rPr>
+          <w:sz w:val="21"/>
+        </w:rPr>
+        <w:t>Report totals match the test data for each filter.</w:t>
+      </w:r>
+    </w:p>
+    <w:p>
+      <w:pPr>
+        <w:spacing w:after="60" w:line="240" w:lineRule="exact"/>
+      </w:pPr>
+      <w:r>
+        <w:rPr>
+          <w:b/>
+          <w:sz w:val="21"/>
+        </w:rPr>
+        <w:t>FR-REPORT-002 [</w:t>
+      </w:r>
+      <w:proofErr w:type="gramStart"/>
+      <w:r>
+        <w:rPr>
+          <w:b/>
+          <w:sz w:val="21"/>
+        </w:rPr>
+        <w:t xml:space="preserve">Must]  </w:t>
+      </w:r>
+      <w:r>
+        <w:rPr>
+          <w:sz w:val="21"/>
+        </w:rPr>
+        <w:t>Reports</w:t>
+      </w:r>
+      <w:proofErr w:type="gramEnd"/>
+      <w:r>
+        <w:rPr>
+          <w:sz w:val="21"/>
+        </w:rPr>
+        <w:t xml:space="preserve"> shall distinguish completed activities from pending or cancelled actions.</w:t>
+      </w:r>
+      <w:r>
+        <w:rPr>
+          <w:b/>
+          <w:sz w:val="21"/>
+        </w:rPr>
+        <w:t xml:space="preserve"> Acceptance: </w:t>
+      </w:r>
+      <w:r>
+        <w:rPr>
+          <w:sz w:val="21"/>
+        </w:rPr>
+        <w:t>Cancelled test transfers are not counted as completed.</w:t>
+      </w:r>
+    </w:p>
+    <w:p>
+      <w:pPr>
+        <w:spacing w:after="60" w:line="240" w:lineRule="exact"/>
+      </w:pPr>
+      <w:r>
+        <w:rPr>
+          <w:b/>
+          <w:sz w:val="21"/>
+        </w:rPr>
+        <w:t>FR-REPORT-003 [</w:t>
+      </w:r>
+      <w:proofErr w:type="gramStart"/>
+      <w:r>
+        <w:rPr>
+          <w:b/>
+          <w:sz w:val="21"/>
+        </w:rPr>
+        <w:t xml:space="preserve">Must]  </w:t>
+      </w:r>
+      <w:r>
+        <w:rPr>
+          <w:sz w:val="21"/>
+        </w:rPr>
+        <w:t>The</w:t>
+      </w:r>
+      <w:proofErr w:type="gramEnd"/>
+      <w:r>
+        <w:rPr>
+          <w:sz w:val="21"/>
+        </w:rPr>
+        <w:t xml:space="preserve"> system shall display the sustainability indicators defined in Section 6.2 by department, category, and reporting period.</w:t>
+      </w:r>
+      <w:r>
+        <w:rPr>
+          <w:b/>
+          <w:sz w:val="21"/>
+        </w:rPr>
+        <w:t xml:space="preserve"> Acceptance: </w:t>
+      </w:r>
+      <w:r>
+        <w:rPr>
+          <w:sz w:val="21"/>
+        </w:rPr>
+        <w:t>Dashboard counts, rates and estimates match independently worked examples, including zero denominators, missing inputs and duplicate activity records.</w:t>
+      </w:r>
+    </w:p>
+    <w:p>
+      <w:pPr>
+        <w:spacing w:after="60" w:line="240" w:lineRule="exact"/>
+      </w:pPr>
+      <w:r>
+        <w:rPr>
+          <w:b/>
+          <w:sz w:val="21"/>
+        </w:rPr>
+        <w:t>FR-REPORT-004 [</w:t>
+      </w:r>
+      <w:proofErr w:type="gramStart"/>
+      <w:r>
+        <w:rPr>
+          <w:b/>
+          <w:sz w:val="21"/>
+        </w:rPr>
+        <w:t xml:space="preserve">Must]  </w:t>
+      </w:r>
+      <w:r>
+        <w:rPr>
+          <w:sz w:val="21"/>
+        </w:rPr>
+        <w:t>The</w:t>
+      </w:r>
+      <w:proofErr w:type="gramEnd"/>
+      <w:r>
+        <w:rPr>
+          <w:sz w:val="21"/>
+        </w:rPr>
+        <w:t xml:space="preserve"> system shall generate AI-assisted summaries of asset utilization, reuse activity, maintenance trends, departmental demand, estimated savings, and sustainability outcomes.</w:t>
+      </w:r>
+      <w:r>
+        <w:rPr>
+          <w:b/>
+          <w:sz w:val="21"/>
+        </w:rPr>
+        <w:t xml:space="preserve"> Acceptance: </w:t>
+      </w:r>
+      <w:r>
+        <w:rPr>
+          <w:sz w:val="21"/>
+        </w:rPr>
+        <w:t>A summary is produced for a selected period.</w:t>
+      </w:r>
+    </w:p>
+    <w:p>
+      <w:pPr>
+        <w:spacing w:after="60" w:line="240" w:lineRule="exact"/>
+      </w:pPr>
+      <w:r>
+        <w:rPr>
+          <w:b/>
+          <w:sz w:val="21"/>
+        </w:rPr>
+        <w:t>FR-REPORT-005 [</w:t>
+      </w:r>
+      <w:proofErr w:type="gramStart"/>
+      <w:r>
+        <w:rPr>
+          <w:b/>
+          <w:sz w:val="21"/>
+        </w:rPr>
+        <w:t xml:space="preserve">Must]  </w:t>
+      </w:r>
+      <w:r>
+        <w:rPr>
+          <w:sz w:val="21"/>
+        </w:rPr>
+        <w:t>Numerical</w:t>
+      </w:r>
+      <w:proofErr w:type="gramEnd"/>
+      <w:r>
+        <w:rPr>
+          <w:sz w:val="21"/>
+        </w:rPr>
+        <w:t xml:space="preserve"> values in AI-generated reports shall agree with the underlying calculations. Reports shall identify their reporting period, data basis, and model version, and distinguish recorded outcomes from estimates.</w:t>
+      </w:r>
+      <w:r>
+        <w:rPr>
+          <w:b/>
+          <w:sz w:val="21"/>
+        </w:rPr>
+        <w:t xml:space="preserve"> Acceptance: </w:t>
+      </w:r>
+      <w:r>
+        <w:rPr>
+          <w:sz w:val="21"/>
+        </w:rPr>
+        <w:t>Every number in a generated report is checked against the source figures.</w:t>
+      </w:r>
+    </w:p>
+    <w:p>
+      <w:pPr>
+        <w:spacing w:after="60" w:line="240" w:lineRule="exact"/>
+      </w:pPr>
+      <w:r>
+        <w:rPr>
+          <w:b/>
+          <w:sz w:val="21"/>
+        </w:rPr>
+        <w:t>FR-REPORT-006 [</w:t>
+      </w:r>
+      <w:proofErr w:type="gramStart"/>
+      <w:r>
+        <w:rPr>
+          <w:b/>
+          <w:sz w:val="21"/>
+        </w:rPr>
+        <w:t xml:space="preserve">Must]  </w:t>
+      </w:r>
+      <w:r>
+        <w:rPr>
+          <w:sz w:val="21"/>
+        </w:rPr>
+        <w:t>The</w:t>
+      </w:r>
+      <w:proofErr w:type="gramEnd"/>
+      <w:r>
+        <w:rPr>
+          <w:sz w:val="21"/>
+        </w:rPr>
+        <w:t xml:space="preserve"> system shall provide in-application notifications about new matches, pending approvals, request and reservation status changes, transfer arrangements, ownership changes, and maintenance updates.</w:t>
+      </w:r>
+      <w:r>
+        <w:rPr>
+          <w:b/>
+          <w:sz w:val="21"/>
+        </w:rPr>
+        <w:t xml:space="preserve"> Acceptance: </w:t>
+      </w:r>
+      <w:r>
+        <w:rPr>
+          <w:sz w:val="21"/>
+        </w:rPr>
+        <w:t>Each event type produces a notification for the right user.</w:t>
+      </w:r>
+    </w:p>
+    <w:p>
+      <w:pPr>
+        <w:spacing w:after="60" w:line="240" w:lineRule="exact"/>
+      </w:pPr>
+      <w:r>
+        <w:rPr>
+          <w:b/>
+          <w:sz w:val="21"/>
+        </w:rPr>
+        <w:t>FR-REPORT-007 [</w:t>
+      </w:r>
+      <w:proofErr w:type="gramStart"/>
+      <w:r>
+        <w:rPr>
+          <w:b/>
+          <w:sz w:val="21"/>
+        </w:rPr>
+        <w:t xml:space="preserve">Must]  </w:t>
+      </w:r>
+      <w:r>
+        <w:rPr>
+          <w:sz w:val="21"/>
+        </w:rPr>
+        <w:t>Each</w:t>
+      </w:r>
+      <w:proofErr w:type="gramEnd"/>
+      <w:r>
+        <w:rPr>
+          <w:sz w:val="21"/>
+        </w:rPr>
+        <w:t xml:space="preserve"> notification shall identify the event, the related asset or request, and any required action, and link to the corresponding record or permitted workflow step.</w:t>
+      </w:r>
+      <w:r>
+        <w:rPr>
+          <w:b/>
+          <w:sz w:val="21"/>
+        </w:rPr>
+        <w:t xml:space="preserve"> Acceptance: </w:t>
+      </w:r>
+      <w:r>
+        <w:rPr>
+          <w:sz w:val="21"/>
+        </w:rPr>
+        <w:t>Opening a notification leads to the correct record.</w:t>
+      </w:r>
+    </w:p>
+    <w:p>
+      <w:pPr>
+        <w:spacing w:after="60" w:line="240" w:lineRule="exact"/>
+      </w:pPr>
+      <w:r>
+        <w:rPr>
+          <w:b/>
+          <w:sz w:val="21"/>
+        </w:rPr>
+        <w:t>FR-REPORT-008 [</w:t>
+      </w:r>
+      <w:proofErr w:type="gramStart"/>
+      <w:r>
+        <w:rPr>
+          <w:b/>
+          <w:sz w:val="21"/>
+        </w:rPr>
+        <w:t xml:space="preserve">Must]  </w:t>
+      </w:r>
+      <w:r>
+        <w:rPr>
+          <w:sz w:val="21"/>
+        </w:rPr>
+        <w:t>Notification</w:t>
+      </w:r>
+      <w:proofErr w:type="gramEnd"/>
+      <w:r>
+        <w:rPr>
+          <w:sz w:val="21"/>
+        </w:rPr>
+        <w:t xml:space="preserve"> visibility shall respect the recipient’s permissions, and failure to deliver a notification shall not alter the underlying record.</w:t>
+      </w:r>
+      <w:r>
+        <w:rPr>
+          <w:b/>
+          <w:sz w:val="21"/>
+        </w:rPr>
+        <w:t xml:space="preserve"> Acceptance: </w:t>
+      </w:r>
+      <w:r>
+        <w:rPr>
+          <w:sz w:val="21"/>
+        </w:rPr>
+        <w:t>A simulated delivery failure leaves the record unchanged.</w:t>
+      </w:r>
+    </w:p>
+    <w:p>
+      <w:pPr>
+        <w:spacing w:after="60" w:line="240" w:lineRule="exact"/>
+      </w:pPr>
+      <w:r>
+        <w:rPr>
+          <w:b/>
+          <w:sz w:val="21"/>
+        </w:rPr>
+        <w:lastRenderedPageBreak/>
+        <w:t>FR-REPORT-009 [</w:t>
+      </w:r>
+      <w:proofErr w:type="gramStart"/>
+      <w:r>
+        <w:rPr>
+          <w:b/>
+          <w:sz w:val="21"/>
+        </w:rPr>
+        <w:t xml:space="preserve">Must]  </w:t>
+      </w:r>
+      <w:r>
+        <w:rPr>
+          <w:sz w:val="21"/>
+        </w:rPr>
+        <w:t>The</w:t>
+      </w:r>
+      <w:proofErr w:type="gramEnd"/>
+      <w:r>
+        <w:rPr>
+          <w:sz w:val="21"/>
+        </w:rPr>
+        <w:t xml:space="preserve"> system shall maintain an audit trail of approvals, ownership and custody changes, and decisions on AI recommendations, which authorized users can review.</w:t>
+      </w:r>
+      <w:r>
+        <w:rPr>
+          <w:b/>
+          <w:sz w:val="21"/>
+        </w:rPr>
+        <w:t xml:space="preserve"> Acceptance: </w:t>
+      </w:r>
+      <w:r>
+        <w:rPr>
+          <w:sz w:val="21"/>
+        </w:rPr>
+        <w:t>Account, approval, formal custody, physical handover and AI review events are visible to authorized reviewers with actor, time and before/after values where applicable.</w:t>
+      </w:r>
+    </w:p>
+    <w:p>
+      <w:pPr>
+        <w:pStyle w:val="Heading1"/>
+      </w:pPr>
+      <w:bookmarkStart w:id="31" w:name="SRS_1031"/>
+      <w:r>
+        <w:t>5 Other Nonfunctional Requirements</w:t>
+      </w:r>
+      <w:bookmarkEnd w:id="31"/>
+    </w:p>
+    <w:p>
+      <w:pPr>
+        <w:pStyle w:val="Heading2"/>
+      </w:pPr>
+      <w:bookmarkStart w:id="32" w:name="SRS_1032"/>
+      <w:r>
+        <w:t>5.1 Performance Requirements</w:t>
+      </w:r>
+      <w:bookmarkEnd w:id="32"/>
+    </w:p>
+    <w:p>
+      <w:pPr>
+        <w:spacing w:after="60" w:line="240" w:lineRule="exact"/>
+      </w:pPr>
+      <w:r>
+        <w:rPr>
+          <w:b/>
+          <w:sz w:val="21"/>
+        </w:rPr>
+        <w:t>NFR-PERF-</w:t>
+      </w:r>
+      <w:proofErr w:type="gramStart"/>
+      <w:r>
+        <w:rPr>
+          <w:b/>
+          <w:sz w:val="21"/>
+        </w:rPr>
+        <w:t xml:space="preserve">001  </w:t>
+      </w:r>
+      <w:r>
+        <w:rPr>
+          <w:sz w:val="21"/>
+        </w:rPr>
+        <w:t>Ordinary</w:t>
+      </w:r>
+      <w:proofErr w:type="gramEnd"/>
+      <w:r>
+        <w:rPr>
+          <w:sz w:val="21"/>
+        </w:rPr>
+        <w:t xml:space="preserve"> filtered searches shall complete within 2 seconds for at least 95% of measured requests with five simultaneous user sessions (Phase 1, Req. 56). The test shall declare dataset size, query mix, network, browser and hosting environment; the Phase 2 planning dataset is approximately 5,000 asset records, including 500 published listings.</w:t>
+      </w:r>
+      <w:r>
+        <w:rPr>
+          <w:b/>
+          <w:sz w:val="21"/>
+        </w:rPr>
+        <w:t xml:space="preserve"> Verification: </w:t>
+      </w:r>
+      <w:r>
+        <w:rPr>
+          <w:sz w:val="21"/>
+        </w:rPr>
+        <w:t>Load test with recorded samples and percentile calculation on the declared synthetic dataset.</w:t>
+      </w:r>
+    </w:p>
+    <w:p>
+      <w:pPr>
+        <w:spacing w:after="60" w:line="240" w:lineRule="exact"/>
+      </w:pPr>
+      <w:r>
+        <w:rPr>
+          <w:b/>
+          <w:sz w:val="21"/>
+        </w:rPr>
+        <w:t>NFR-PERF-</w:t>
+      </w:r>
+      <w:proofErr w:type="gramStart"/>
+      <w:r>
+        <w:rPr>
+          <w:b/>
+          <w:sz w:val="21"/>
+        </w:rPr>
+        <w:t xml:space="preserve">002  </w:t>
+      </w:r>
+      <w:r>
+        <w:rPr>
+          <w:sz w:val="21"/>
+        </w:rPr>
+        <w:t>Longer</w:t>
+      </w:r>
+      <w:proofErr w:type="gramEnd"/>
+      <w:r>
+        <w:rPr>
+          <w:sz w:val="21"/>
+        </w:rPr>
+        <w:t xml:space="preserve"> AI operations shall display a processing status while the user waits (Phase 1, Req. 61). Target: Status shown for every AI operation that is not immediate.</w:t>
+      </w:r>
+      <w:r>
+        <w:rPr>
+          <w:b/>
+          <w:sz w:val="21"/>
+        </w:rPr>
+        <w:t xml:space="preserve"> Verification: </w:t>
+      </w:r>
+      <w:r>
+        <w:rPr>
+          <w:sz w:val="21"/>
+        </w:rPr>
+        <w:t>System test</w:t>
+      </w:r>
+    </w:p>
+    <w:p>
+      <w:pPr>
+        <w:spacing w:after="60" w:line="240" w:lineRule="exact"/>
+      </w:pPr>
+      <w:r>
+        <w:rPr>
+          <w:b/>
+          <w:sz w:val="21"/>
+        </w:rPr>
+        <w:t>NFR-PERF-</w:t>
+      </w:r>
+      <w:proofErr w:type="gramStart"/>
+      <w:r>
+        <w:rPr>
+          <w:b/>
+          <w:sz w:val="21"/>
+        </w:rPr>
+        <w:t xml:space="preserve">003  </w:t>
+      </w:r>
+      <w:r>
+        <w:rPr>
+          <w:sz w:val="21"/>
+        </w:rPr>
+        <w:t>Response</w:t>
+      </w:r>
+      <w:proofErr w:type="gramEnd"/>
+      <w:r>
+        <w:rPr>
+          <w:sz w:val="21"/>
+        </w:rPr>
+        <w:t>-time targets for AI-assisted operations shall be set after prototype technical checks; see TBD-005.</w:t>
+      </w:r>
+      <w:r>
+        <w:rPr>
+          <w:b/>
+          <w:sz w:val="21"/>
+        </w:rPr>
+        <w:t xml:space="preserve"> Verification: </w:t>
+      </w:r>
+      <w:r>
+        <w:rPr>
+          <w:sz w:val="21"/>
+        </w:rPr>
+        <w:t>Measured during implementation</w:t>
+      </w:r>
+    </w:p>
+    <w:p>
+      <w:pPr>
+        <w:pStyle w:val="Heading2"/>
+      </w:pPr>
+      <w:bookmarkStart w:id="33" w:name="SRS_1033"/>
+      <w:r>
+        <w:t>5.2 Safety Requirements</w:t>
+      </w:r>
+      <w:bookmarkEnd w:id="33"/>
+    </w:p>
+    <w:p>
+      <w:pPr>
+        <w:spacing w:after="60" w:line="240" w:lineRule="exact"/>
+      </w:pPr>
+      <w:r>
+        <w:rPr>
+          <w:b/>
+          <w:sz w:val="21"/>
+        </w:rPr>
+        <w:t>NFR-SAFE-</w:t>
+      </w:r>
+      <w:proofErr w:type="gramStart"/>
+      <w:r>
+        <w:rPr>
+          <w:b/>
+          <w:sz w:val="21"/>
+        </w:rPr>
+        <w:t xml:space="preserve">001  </w:t>
+      </w:r>
+      <w:r>
+        <w:rPr>
+          <w:sz w:val="21"/>
+        </w:rPr>
+        <w:t>The</w:t>
+      </w:r>
+      <w:proofErr w:type="gramEnd"/>
+      <w:r>
+        <w:rPr>
+          <w:sz w:val="21"/>
+        </w:rPr>
+        <w:t xml:space="preserve"> system shall not automatically authorize physical transfers, disposal, or recycling.</w:t>
+      </w:r>
+      <w:r>
+        <w:rPr>
+          <w:b/>
+          <w:sz w:val="21"/>
+        </w:rPr>
+        <w:t xml:space="preserve"> Verification: </w:t>
+      </w:r>
+      <w:r>
+        <w:rPr>
+          <w:sz w:val="21"/>
+        </w:rPr>
+        <w:t>Workflow test</w:t>
+      </w:r>
+    </w:p>
+    <w:p>
+      <w:pPr>
+        <w:spacing w:after="60" w:line="240" w:lineRule="exact"/>
+      </w:pPr>
+      <w:r>
+        <w:rPr>
+          <w:b/>
+          <w:sz w:val="21"/>
+        </w:rPr>
+        <w:t>NFR-SAFE-</w:t>
+      </w:r>
+      <w:proofErr w:type="gramStart"/>
+      <w:r>
+        <w:rPr>
+          <w:b/>
+          <w:sz w:val="21"/>
+        </w:rPr>
+        <w:t xml:space="preserve">002  </w:t>
+      </w:r>
+      <w:r>
+        <w:rPr>
+          <w:sz w:val="21"/>
+        </w:rPr>
+        <w:t>Tests</w:t>
+      </w:r>
+      <w:proofErr w:type="gramEnd"/>
+      <w:r>
+        <w:rPr>
+          <w:sz w:val="21"/>
+        </w:rPr>
+        <w:t xml:space="preserve"> involving assets recorded as unfit or incompatible with mandatory requirements shall confirm that ordinary-use reservation or release is prevented. AI assistance shall not bypass these checks (Phase 1, Req. 57).</w:t>
+      </w:r>
+      <w:r>
+        <w:rPr>
+          <w:b/>
+          <w:sz w:val="21"/>
+        </w:rPr>
+        <w:t xml:space="preserve"> Verification: </w:t>
+      </w:r>
+      <w:r>
+        <w:rPr>
+          <w:sz w:val="21"/>
+        </w:rPr>
+        <w:t>Workflow test with unfit and incompatible test assets</w:t>
+      </w:r>
+    </w:p>
+    <w:p>
+      <w:pPr>
+        <w:pStyle w:val="Heading2"/>
+      </w:pPr>
+      <w:bookmarkStart w:id="34" w:name="SRS_1034"/>
+      <w:r>
+        <w:t>5.3 Security Requirements</w:t>
+      </w:r>
+      <w:bookmarkEnd w:id="34"/>
+    </w:p>
+    <w:p>
+      <w:pPr>
+        <w:spacing w:after="60" w:line="240" w:lineRule="exact"/>
+      </w:pPr>
+      <w:r>
+        <w:rPr>
+          <w:b/>
+          <w:sz w:val="21"/>
+        </w:rPr>
+        <w:t>NFR-SEC-</w:t>
+      </w:r>
+      <w:proofErr w:type="gramStart"/>
+      <w:r>
+        <w:rPr>
+          <w:b/>
+          <w:sz w:val="21"/>
+        </w:rPr>
+        <w:t xml:space="preserve">001  </w:t>
+      </w:r>
+      <w:r>
+        <w:rPr>
+          <w:sz w:val="21"/>
+        </w:rPr>
+        <w:t>The</w:t>
+      </w:r>
+      <w:proofErr w:type="gramEnd"/>
+      <w:r>
+        <w:rPr>
+          <w:sz w:val="21"/>
+        </w:rPr>
+        <w:t xml:space="preserve"> system shall enforce role-based authorization for every protected request, including direct access attempts and assistant interactions (Phase 1, Req. 58).</w:t>
+      </w:r>
+      <w:r>
+        <w:rPr>
+          <w:b/>
+          <w:sz w:val="21"/>
+        </w:rPr>
+        <w:t xml:space="preserve"> Verification: </w:t>
+      </w:r>
+      <w:r>
+        <w:rPr>
+          <w:sz w:val="21"/>
+        </w:rPr>
+        <w:t>Security test of allowed and denied actions for each role</w:t>
+      </w:r>
+    </w:p>
+    <w:p>
+      <w:pPr>
+        <w:spacing w:after="60" w:line="240" w:lineRule="exact"/>
+      </w:pPr>
+      <w:r>
+        <w:rPr>
+          <w:b/>
+          <w:sz w:val="21"/>
+        </w:rPr>
+        <w:t>NFR-SEC-</w:t>
+      </w:r>
+      <w:proofErr w:type="gramStart"/>
+      <w:r>
+        <w:rPr>
+          <w:b/>
+          <w:sz w:val="21"/>
+        </w:rPr>
+        <w:t xml:space="preserve">002  </w:t>
+      </w:r>
+      <w:r>
+        <w:rPr>
+          <w:sz w:val="21"/>
+        </w:rPr>
+        <w:t>Passwords</w:t>
+      </w:r>
+      <w:proofErr w:type="gramEnd"/>
+      <w:r>
+        <w:rPr>
+          <w:sz w:val="21"/>
+        </w:rPr>
+        <w:t xml:space="preserve"> shall not be stored in plaintext, and network access shall use encrypted connections (Phase 1, Req. 59).</w:t>
+      </w:r>
+      <w:r>
+        <w:rPr>
+          <w:b/>
+          <w:sz w:val="21"/>
+        </w:rPr>
+        <w:t xml:space="preserve"> Verification: </w:t>
+      </w:r>
+      <w:r>
+        <w:rPr>
+          <w:sz w:val="21"/>
+        </w:rPr>
+        <w:t>Configuration review and test</w:t>
+      </w:r>
+    </w:p>
+    <w:p>
+      <w:pPr>
+        <w:spacing w:after="60" w:line="240" w:lineRule="exact"/>
+      </w:pPr>
+      <w:r>
+        <w:rPr>
+          <w:b/>
+          <w:sz w:val="21"/>
+        </w:rPr>
+        <w:t>NFR-SEC-</w:t>
+      </w:r>
+      <w:proofErr w:type="gramStart"/>
+      <w:r>
+        <w:rPr>
+          <w:b/>
+          <w:sz w:val="21"/>
+        </w:rPr>
+        <w:t xml:space="preserve">003  </w:t>
+      </w:r>
+      <w:r>
+        <w:rPr>
+          <w:sz w:val="21"/>
+        </w:rPr>
+        <w:t>Credentials</w:t>
+      </w:r>
+      <w:proofErr w:type="gramEnd"/>
+      <w:r>
+        <w:rPr>
+          <w:sz w:val="21"/>
+        </w:rPr>
+        <w:t xml:space="preserve"> and sensitive configuration shall be excluded from the shared source repository and shall not be exposed to users’ browsers (Phase 1, Req. 59; Phase 2, Section 4.1).</w:t>
+      </w:r>
+      <w:r>
+        <w:rPr>
+          <w:b/>
+          <w:sz w:val="21"/>
+        </w:rPr>
+        <w:t xml:space="preserve"> Verification: </w:t>
+      </w:r>
+      <w:r>
+        <w:rPr>
+          <w:sz w:val="21"/>
+        </w:rPr>
+        <w:t>Repository and code review</w:t>
+      </w:r>
+    </w:p>
+    <w:p>
+      <w:pPr>
+        <w:spacing w:after="60" w:line="240" w:lineRule="exact"/>
+      </w:pPr>
+      <w:r>
+        <w:rPr>
+          <w:b/>
+          <w:sz w:val="21"/>
+        </w:rPr>
+        <w:t>NFR-SEC-</w:t>
+      </w:r>
+      <w:proofErr w:type="gramStart"/>
+      <w:r>
+        <w:rPr>
+          <w:b/>
+          <w:sz w:val="21"/>
+        </w:rPr>
+        <w:t xml:space="preserve">004  </w:t>
+      </w:r>
+      <w:r>
+        <w:rPr>
+          <w:sz w:val="21"/>
+        </w:rPr>
+        <w:t>Access</w:t>
+      </w:r>
+      <w:proofErr w:type="gramEnd"/>
+      <w:r>
+        <w:rPr>
+          <w:sz w:val="21"/>
+        </w:rPr>
+        <w:t xml:space="preserve"> to financial and operational information shall be limited to roles authorized for it (project description; Section 2.3).</w:t>
+      </w:r>
+      <w:r>
+        <w:rPr>
+          <w:b/>
+          <w:sz w:val="21"/>
+        </w:rPr>
+        <w:t xml:space="preserve"> Verification: </w:t>
+      </w:r>
+      <w:r>
+        <w:rPr>
+          <w:sz w:val="21"/>
+        </w:rPr>
+        <w:t>Security test</w:t>
+      </w:r>
+    </w:p>
+    <w:p>
+      <w:pPr>
+        <w:spacing w:after="60" w:line="240" w:lineRule="exact"/>
+      </w:pPr>
+      <w:r>
+        <w:rPr>
+          <w:b/>
+          <w:sz w:val="21"/>
+        </w:rPr>
+        <w:t>NFR-PRIV-</w:t>
+      </w:r>
+      <w:proofErr w:type="gramStart"/>
+      <w:r>
+        <w:rPr>
+          <w:b/>
+          <w:sz w:val="21"/>
+        </w:rPr>
+        <w:t xml:space="preserve">001  </w:t>
+      </w:r>
+      <w:r>
+        <w:rPr>
+          <w:sz w:val="21"/>
+        </w:rPr>
+        <w:t>The</w:t>
+      </w:r>
+      <w:proofErr w:type="gramEnd"/>
+      <w:r>
+        <w:rPr>
+          <w:sz w:val="21"/>
+        </w:rPr>
+        <w:t xml:space="preserve"> system shall not send confidential data to an AI service without authorization.</w:t>
+      </w:r>
+      <w:r>
+        <w:rPr>
+          <w:b/>
+          <w:sz w:val="21"/>
+        </w:rPr>
+        <w:t xml:space="preserve"> Verification: </w:t>
+      </w:r>
+      <w:r>
+        <w:rPr>
+          <w:sz w:val="21"/>
+        </w:rPr>
+        <w:t>Review/test</w:t>
+      </w:r>
+    </w:p>
+    <w:p>
+      <w:pPr>
+        <w:spacing w:after="60" w:line="240" w:lineRule="exact"/>
+      </w:pPr>
+      <w:r>
+        <w:rPr>
+          <w:b/>
+          <w:sz w:val="21"/>
+        </w:rPr>
+        <w:t>NFR-PRIV-</w:t>
+      </w:r>
+      <w:proofErr w:type="gramStart"/>
+      <w:r>
+        <w:rPr>
+          <w:b/>
+          <w:sz w:val="21"/>
+        </w:rPr>
+        <w:t xml:space="preserve">002  </w:t>
+      </w:r>
+      <w:r>
+        <w:rPr>
+          <w:sz w:val="21"/>
+        </w:rPr>
+        <w:t>Only</w:t>
+      </w:r>
+      <w:proofErr w:type="gramEnd"/>
+      <w:r>
+        <w:rPr>
+          <w:sz w:val="21"/>
+        </w:rPr>
+        <w:t xml:space="preserve"> the information needed for a task shall be sent to an AI service, and the prototype shall use synthetic data only (Phase 2, Sections 4.2 and 6.2).</w:t>
+      </w:r>
+      <w:r>
+        <w:rPr>
+          <w:b/>
+          <w:sz w:val="21"/>
+        </w:rPr>
+        <w:t xml:space="preserve"> Verification: </w:t>
+      </w:r>
+      <w:r>
+        <w:rPr>
+          <w:sz w:val="21"/>
+        </w:rPr>
+        <w:t>Review of AI request content</w:t>
+      </w:r>
+    </w:p>
+    <w:p>
+      <w:pPr>
+        <w:pStyle w:val="Heading2"/>
+      </w:pPr>
+      <w:bookmarkStart w:id="35" w:name="SRS_1035"/>
+      <w:r>
+        <w:t>5.4 Software Quality Attributes</w:t>
+      </w:r>
+      <w:bookmarkEnd w:id="35"/>
+    </w:p>
+    <w:p>
+      <w:pPr>
+        <w:spacing w:after="60" w:line="240" w:lineRule="exact"/>
+      </w:pPr>
+      <w:r>
+        <w:rPr>
+          <w:b/>
+          <w:sz w:val="21"/>
+        </w:rPr>
+        <w:t xml:space="preserve">NFR-QUAL-001 </w:t>
+      </w:r>
+      <w:proofErr w:type="gramStart"/>
+      <w:r>
+        <w:rPr>
+          <w:b/>
+          <w:sz w:val="21"/>
+        </w:rPr>
+        <w:t xml:space="preserve">Usability  </w:t>
+      </w:r>
+      <w:r>
+        <w:rPr>
+          <w:sz w:val="21"/>
+        </w:rPr>
+        <w:t>Core</w:t>
+      </w:r>
+      <w:proofErr w:type="gramEnd"/>
+      <w:r>
+        <w:rPr>
+          <w:sz w:val="21"/>
+        </w:rPr>
+        <w:t xml:space="preserve"> publication, request, approval, and receipt tasks shall be completable using on-screen guidance without developer intervention (Phase 1, Req. 60).</w:t>
+      </w:r>
+      <w:r>
+        <w:rPr>
+          <w:b/>
+          <w:sz w:val="21"/>
+        </w:rPr>
+        <w:t xml:space="preserve"> Verification: </w:t>
+      </w:r>
+      <w:r>
+        <w:rPr>
+          <w:sz w:val="21"/>
+        </w:rPr>
+        <w:t>User-acceptance test with reviewers who did not build the task (Phase 1, Section 6)</w:t>
+      </w:r>
+    </w:p>
+    <w:p>
+      <w:pPr>
+        <w:spacing w:after="60" w:line="240" w:lineRule="exact"/>
+      </w:pPr>
+      <w:r>
+        <w:rPr>
+          <w:b/>
+          <w:sz w:val="21"/>
+        </w:rPr>
+        <w:lastRenderedPageBreak/>
+        <w:t xml:space="preserve">NFR-QUAL-002 </w:t>
+      </w:r>
+      <w:proofErr w:type="gramStart"/>
+      <w:r>
+        <w:rPr>
+          <w:b/>
+          <w:sz w:val="21"/>
+        </w:rPr>
+        <w:t xml:space="preserve">Usability  </w:t>
+      </w:r>
+      <w:r>
+        <w:rPr>
+          <w:sz w:val="21"/>
+        </w:rPr>
+        <w:t>Forms</w:t>
+      </w:r>
+      <w:proofErr w:type="gramEnd"/>
+      <w:r>
+        <w:rPr>
+          <w:sz w:val="21"/>
+        </w:rPr>
+        <w:t xml:space="preserve"> shall support keyboard operation, identify errors clearly, and preserve entered information when validation fails (Phase 1, Req. 60).</w:t>
+      </w:r>
+      <w:r>
+        <w:rPr>
+          <w:b/>
+          <w:sz w:val="21"/>
+        </w:rPr>
+        <w:t xml:space="preserve"> Verification: </w:t>
+      </w:r>
+      <w:r>
+        <w:rPr>
+          <w:sz w:val="21"/>
+        </w:rPr>
+        <w:t>Usability test</w:t>
+      </w:r>
+    </w:p>
+    <w:p>
+      <w:pPr>
+        <w:spacing w:after="60" w:line="240" w:lineRule="exact"/>
+      </w:pPr>
+      <w:r>
+        <w:rPr>
+          <w:b/>
+          <w:sz w:val="21"/>
+        </w:rPr>
+        <w:t xml:space="preserve">NFR-QUAL-003 </w:t>
+      </w:r>
+      <w:proofErr w:type="gramStart"/>
+      <w:r>
+        <w:rPr>
+          <w:b/>
+          <w:sz w:val="21"/>
+        </w:rPr>
+        <w:t xml:space="preserve">Reliability  </w:t>
+      </w:r>
+      <w:r>
+        <w:rPr>
+          <w:sz w:val="21"/>
+        </w:rPr>
+        <w:t>Confirmed</w:t>
+      </w:r>
+      <w:proofErr w:type="gramEnd"/>
+      <w:r>
+        <w:rPr>
+          <w:sz w:val="21"/>
+        </w:rPr>
+        <w:t xml:space="preserve"> records shall survive an application restart, and failed operations shall not leave partially applied reservations or transfers (Phase 1, Req. 61).</w:t>
+      </w:r>
+      <w:r>
+        <w:rPr>
+          <w:b/>
+          <w:sz w:val="21"/>
+        </w:rPr>
+        <w:t xml:space="preserve"> Verification: </w:t>
+      </w:r>
+      <w:r>
+        <w:rPr>
+          <w:sz w:val="21"/>
+        </w:rPr>
+        <w:t>System test</w:t>
+      </w:r>
+    </w:p>
+    <w:p>
+      <w:pPr>
+        <w:spacing w:after="60" w:line="240" w:lineRule="exact"/>
+      </w:pPr>
+      <w:r>
+        <w:rPr>
+          <w:b/>
+          <w:sz w:val="21"/>
+        </w:rPr>
+        <w:t xml:space="preserve">NFR-QUAL-004 </w:t>
+      </w:r>
+      <w:proofErr w:type="gramStart"/>
+      <w:r>
+        <w:rPr>
+          <w:b/>
+          <w:sz w:val="21"/>
+        </w:rPr>
+        <w:t xml:space="preserve">Recoverability  </w:t>
+      </w:r>
+      <w:r>
+        <w:rPr>
+          <w:sz w:val="21"/>
+        </w:rPr>
+        <w:t>Database</w:t>
+      </w:r>
+      <w:proofErr w:type="gramEnd"/>
+      <w:r>
+        <w:rPr>
+          <w:sz w:val="21"/>
+        </w:rPr>
+        <w:t xml:space="preserve"> records and uploaded files shall be capable of being backed up and restored (Phase 2, Section 4.4).</w:t>
+      </w:r>
+      <w:r>
+        <w:rPr>
+          <w:b/>
+          <w:sz w:val="21"/>
+        </w:rPr>
+        <w:t xml:space="preserve"> Verification: </w:t>
+      </w:r>
+      <w:r>
+        <w:rPr>
+          <w:sz w:val="21"/>
+        </w:rPr>
+        <w:t>Backup and restore test</w:t>
+      </w:r>
+    </w:p>
+    <w:p>
+      <w:pPr>
+        <w:spacing w:after="60" w:line="240" w:lineRule="exact"/>
+      </w:pPr>
+      <w:r>
+        <w:rPr>
+          <w:b/>
+          <w:sz w:val="21"/>
+        </w:rPr>
+        <w:t xml:space="preserve">NFR-QUAL-005 </w:t>
+      </w:r>
+      <w:proofErr w:type="spellStart"/>
+      <w:r>
+        <w:rPr>
+          <w:b/>
+          <w:sz w:val="21"/>
+        </w:rPr>
+        <w:t>Maintainabilit</w:t>
+      </w:r>
+      <w:proofErr w:type="spellEnd"/>
+      <w:r>
+        <w:rPr>
+          <w:b/>
+          <w:sz w:val="21"/>
+        </w:rPr>
+        <w:t xml:space="preserve"> </w:t>
+      </w:r>
+      <w:proofErr w:type="gramStart"/>
+      <w:r>
+        <w:rPr>
+          <w:b/>
+          <w:sz w:val="21"/>
+        </w:rPr>
+        <w:t xml:space="preserve">y  </w:t>
+      </w:r>
+      <w:r>
+        <w:rPr>
+          <w:sz w:val="21"/>
+        </w:rPr>
+        <w:t>Setup</w:t>
+      </w:r>
+      <w:proofErr w:type="gramEnd"/>
+      <w:r>
+        <w:rPr>
+          <w:sz w:val="21"/>
+        </w:rPr>
+        <w:t xml:space="preserve"> instructions, configuration, and component interfaces shall be documented so another team member can run and maintain the prototype; AI integrations shall remain separable from the rules controlling authorization and asset transactions (Phase 1, Req. 62).</w:t>
+      </w:r>
+      <w:r>
+        <w:rPr>
+          <w:b/>
+          <w:sz w:val="21"/>
+        </w:rPr>
+        <w:t xml:space="preserve"> Verification: </w:t>
+      </w:r>
+      <w:r>
+        <w:rPr>
+          <w:sz w:val="21"/>
+        </w:rPr>
+        <w:t>Peer review; setup by a second member</w:t>
+      </w:r>
+    </w:p>
+    <w:p>
+      <w:pPr>
+        <w:spacing w:after="60" w:line="240" w:lineRule="exact"/>
+      </w:pPr>
+      <w:r>
+        <w:rPr>
+          <w:b/>
+          <w:sz w:val="21"/>
+        </w:rPr>
+        <w:t xml:space="preserve">NFR-QUAL-006 Resource </w:t>
+      </w:r>
+      <w:proofErr w:type="gramStart"/>
+      <w:r>
+        <w:rPr>
+          <w:b/>
+          <w:sz w:val="21"/>
+        </w:rPr>
+        <w:t xml:space="preserve">efficiency  </w:t>
+      </w:r>
+      <w:r>
+        <w:rPr>
+          <w:sz w:val="21"/>
+        </w:rPr>
+        <w:t>Conventional</w:t>
+      </w:r>
+      <w:proofErr w:type="gramEnd"/>
+      <w:r>
+        <w:rPr>
+          <w:sz w:val="21"/>
+        </w:rPr>
+        <w:t xml:space="preserve"> operations shall not invoke AI merely to enforce fixed business rules, and AI-assisted operations shall record call counts, processing time, and estimated service cost where pricing information is available (Phase 1, Req. 63).</w:t>
+      </w:r>
+      <w:r>
+        <w:rPr>
+          <w:b/>
+          <w:sz w:val="21"/>
+        </w:rPr>
+        <w:t xml:space="preserve"> Verification: </w:t>
+      </w:r>
+      <w:r>
+        <w:rPr>
+          <w:sz w:val="21"/>
+        </w:rPr>
+        <w:t>Log review</w:t>
+      </w:r>
+    </w:p>
+    <w:p>
+      <w:pPr>
+        <w:spacing w:after="60" w:line="240" w:lineRule="exact"/>
+      </w:pPr>
+      <w:r>
+        <w:rPr>
+          <w:b/>
+          <w:sz w:val="21"/>
+        </w:rPr>
+        <w:t xml:space="preserve">NFR-AI-001 </w:t>
+      </w:r>
+      <w:proofErr w:type="gramStart"/>
+      <w:r>
+        <w:rPr>
+          <w:b/>
+          <w:sz w:val="21"/>
+        </w:rPr>
+        <w:t xml:space="preserve">Explainability  </w:t>
+      </w:r>
+      <w:r>
+        <w:rPr>
+          <w:sz w:val="21"/>
+        </w:rPr>
+        <w:t>AI</w:t>
+      </w:r>
+      <w:proofErr w:type="gramEnd"/>
+      <w:r>
+        <w:rPr>
+          <w:sz w:val="21"/>
+        </w:rPr>
+        <w:t xml:space="preserve"> recommendations shall display their main influencing factors and allow human override.</w:t>
+      </w:r>
+      <w:r>
+        <w:rPr>
+          <w:b/>
+          <w:sz w:val="21"/>
+        </w:rPr>
+        <w:t xml:space="preserve"> Verification: </w:t>
+      </w:r>
+      <w:r>
+        <w:rPr>
+          <w:sz w:val="21"/>
+        </w:rPr>
+        <w:t>AI evaluation</w:t>
+      </w:r>
+    </w:p>
+    <w:p>
+      <w:pPr>
+        <w:pStyle w:val="Heading2"/>
+      </w:pPr>
+      <w:bookmarkStart w:id="36" w:name="SRS_1036"/>
+      <w:r>
+        <w:t>5.5 Business Rules</w:t>
+      </w:r>
+      <w:bookmarkEnd w:id="36"/>
+    </w:p>
+    <w:tbl>
+      <w:tblPr>
+        <w:tblW w:w="0" w:type="auto"/>
+        <w:jc w:val="center"/>
+        <w:tblBorders>
+          <w:top w:val="single" w:sz="4" w:space="0" w:color="B8B8B8"/>
+          <w:left w:val="single" w:sz="4" w:space="0" w:color="B8B8B8"/>
+          <w:bottom w:val="single" w:sz="4" w:space="0" w:color="B8B8B8"/>
+          <w:right w:val="single" w:sz="4" w:space="0" w:color="B8B8B8"/>
+          <w:insideH w:val="single" w:sz="4" w:space="0" w:color="B8B8B8"/>
+          <w:insideV w:val="single" w:sz="4" w:space="0" w:color="B8B8B8"/>
+        </w:tblBorders>
+        <w:tblLayout w:type="fixed"/>
+        <w:tblLook w:val="04A0" w:firstRow="1" w:lastRow="0" w:firstColumn="1" w:lastColumn="0" w:noHBand="0" w:noVBand="1"/>
+      </w:tblPr>
+      <w:tblGrid>
+        <w:gridCol w:w="936"/>
+        <w:gridCol w:w="6552"/>
+        <w:gridCol w:w="1872"/>
+      </w:tblGrid>
+      <w:tr>
+        <w:trPr>
+          <w:cantSplit/>
+          <w:tblHeader/>
+          <w:jc w:val="center"/>
+        </w:trPr>
+        <w:tc>
+          <w:tcPr>
+            <w:tcW w:w="936" w:type="dxa"/>
+            <w:shd w:val="clear" w:color="auto" w:fill="EDEDED"/>
+            <w:tcMar>
+              <w:top w:w="55" w:type="dxa"/>
+              <w:left w:w="90" w:type="dxa"/>
+              <w:bottom w:w="55" w:type="dxa"/>
+              <w:right w:w="90" w:type="dxa"/>
+            </w:tcMar>
+            <w:vAlign w:val="center"/>
+          </w:tcPr>
+          <w:p>
+            <w:pPr>
+              <w:keepNext/>
+              <w:spacing w:line="240" w:lineRule="exact"/>
+            </w:pPr>
+            <w:r>
+              <w:rPr>
+                <w:b/>
+                <w:sz w:val="20"/>
+              </w:rPr>
+              <w:t>ID</w:t>
+            </w:r>
+          </w:p>
+        </w:tc>
+        <w:tc>
+          <w:tcPr>
+            <w:tcW w:w="6552" w:type="dxa"/>
+            <w:shd w:val="clear" w:color="auto" w:fill="EDEDED"/>
+            <w:tcMar>
+              <w:top w:w="55" w:type="dxa"/>
+              <w:left w:w="90" w:type="dxa"/>
+              <w:bottom w:w="55" w:type="dxa"/>
+              <w:right w:w="90" w:type="dxa"/>
+            </w:tcMar>
+            <w:vAlign w:val="center"/>
+          </w:tcPr>
+          <w:p>
+            <w:pPr>
+              <w:keepNext/>
+              <w:spacing w:line="240" w:lineRule="exact"/>
+            </w:pPr>
+            <w:r>
+              <w:rPr>
+                <w:b/>
+                <w:sz w:val="20"/>
+              </w:rPr>
+              <w:t>Business rule</w:t>
+            </w:r>
+          </w:p>
+        </w:tc>
+        <w:tc>
+          <w:tcPr>
+            <w:tcW w:w="1872" w:type="dxa"/>
+            <w:shd w:val="clear" w:color="auto" w:fill="EDEDED"/>
+            <w:tcMar>
+              <w:top w:w="55" w:type="dxa"/>
+              <w:left w:w="90" w:type="dxa"/>
+              <w:bottom w:w="55" w:type="dxa"/>
+              <w:right w:w="90" w:type="dxa"/>
+            </w:tcMar>
+            <w:vAlign w:val="center"/>
+          </w:tcPr>
+          <w:p>
+            <w:pPr>
+              <w:keepNext/>
+              <w:spacing w:line="240" w:lineRule="exact"/>
+            </w:pPr>
+            <w:r>
+              <w:rPr>
+                <w:b/>
+                <w:sz w:val="20"/>
+              </w:rPr>
+              <w:t>Rationale</w:t>
+            </w:r>
+          </w:p>
+        </w:tc>
+      </w:tr>
+      <w:tr>
+        <w:trPr>
+          <w:cantSplit/>
+          <w:jc w:val="center"/>
+        </w:trPr>
+        <w:tc>
+          <w:tcPr>
+            <w:tcW w:w="936" w:type="dxa"/>
+            <w:tcMar>
+              <w:top w:w="55" w:type="dxa"/>
+              <w:left w:w="90" w:type="dxa"/>
+              <w:bottom w:w="55" w:type="dxa"/>
+              <w:right w:w="90" w:type="dxa"/>
+            </w:tcMar>
+            <w:vAlign w:val="center"/>
+          </w:tcPr>
+          <w:p>
+            <w:pPr>
+              <w:spacing w:line="240" w:lineRule="exact"/>
+            </w:pPr>
+            <w:r>
+              <w:rPr>
+                <w:sz w:val="20"/>
+              </w:rPr>
+              <w:t>BR-001</w:t>
+            </w:r>
+          </w:p>
+        </w:tc>
+        <w:tc>
+          <w:tcPr>
+            <w:tcW w:w="6552" w:type="dxa"/>
+            <w:tcMar>
+              <w:top w:w="55" w:type="dxa"/>
+              <w:left w:w="90" w:type="dxa"/>
+              <w:bottom w:w="55" w:type="dxa"/>
+              <w:right w:w="90" w:type="dxa"/>
+            </w:tcMar>
+            <w:vAlign w:val="center"/>
+          </w:tcPr>
+          <w:p>
+            <w:pPr>
+              <w:spacing w:line="240" w:lineRule="exact"/>
+            </w:pPr>
+            <w:r>
+              <w:rPr>
+                <w:sz w:val="20"/>
+              </w:rPr>
+              <w:t>Only an authorized department representative or asset custodian may publish or withdraw an asset of their department (Phase 1, Req. 7).</w:t>
+            </w:r>
+          </w:p>
+        </w:tc>
+        <w:tc>
+          <w:tcPr>
+            <w:tcW w:w="1872" w:type="dxa"/>
+            <w:tcMar>
+              <w:top w:w="55" w:type="dxa"/>
+              <w:left w:w="90" w:type="dxa"/>
+              <w:bottom w:w="55" w:type="dxa"/>
+              <w:right w:w="90" w:type="dxa"/>
+            </w:tcMar>
+            <w:vAlign w:val="center"/>
+          </w:tcPr>
+          <w:p>
+            <w:pPr>
+              <w:spacing w:line="240" w:lineRule="exact"/>
+            </w:pPr>
+            <w:r>
+              <w:rPr>
+                <w:sz w:val="20"/>
+              </w:rPr>
+              <w:t>Accountability for records</w:t>
+            </w:r>
+          </w:p>
+        </w:tc>
+      </w:tr>
+      <w:tr>
+        <w:trPr>
+          <w:cantSplit/>
+          <w:jc w:val="center"/>
+        </w:trPr>
+        <w:tc>
+          <w:tcPr>
+            <w:tcW w:w="936" w:type="dxa"/>
+            <w:tcMar>
+              <w:top w:w="55" w:type="dxa"/>
+              <w:left w:w="90" w:type="dxa"/>
+              <w:bottom w:w="55" w:type="dxa"/>
+              <w:right w:w="90" w:type="dxa"/>
+            </w:tcMar>
+            <w:vAlign w:val="center"/>
+          </w:tcPr>
+          <w:p>
+            <w:pPr>
+              <w:spacing w:line="240" w:lineRule="exact"/>
+            </w:pPr>
+            <w:r>
+              <w:rPr>
+                <w:sz w:val="20"/>
+              </w:rPr>
+              <w:t>BR-002</w:t>
+            </w:r>
+          </w:p>
+        </w:tc>
+        <w:tc>
+          <w:tcPr>
+            <w:tcW w:w="6552" w:type="dxa"/>
+            <w:tcMar>
+              <w:top w:w="55" w:type="dxa"/>
+              <w:left w:w="90" w:type="dxa"/>
+              <w:bottom w:w="55" w:type="dxa"/>
+              <w:right w:w="90" w:type="dxa"/>
+            </w:tcMar>
+            <w:vAlign w:val="center"/>
+          </w:tcPr>
+          <w:p>
+            <w:pPr>
+              <w:spacing w:line="240" w:lineRule="exact"/>
+            </w:pPr>
+            <w:r>
+              <w:rPr>
+                <w:sz w:val="20"/>
+              </w:rPr>
+              <w:t>AI recommendations shall not automatically approve reservations, transfers, disposal, donation, or recycling (Phase 1, Section 2).</w:t>
+            </w:r>
+          </w:p>
+        </w:tc>
+        <w:tc>
+          <w:tcPr>
+            <w:tcW w:w="1872" w:type="dxa"/>
+            <w:tcMar>
+              <w:top w:w="55" w:type="dxa"/>
+              <w:left w:w="90" w:type="dxa"/>
+              <w:bottom w:w="55" w:type="dxa"/>
+              <w:right w:w="90" w:type="dxa"/>
+            </w:tcMar>
+            <w:vAlign w:val="center"/>
+          </w:tcPr>
+          <w:p>
+            <w:pPr>
+              <w:spacing w:line="240" w:lineRule="exact"/>
+            </w:pPr>
+            <w:r>
+              <w:rPr>
+                <w:sz w:val="20"/>
+              </w:rPr>
+              <w:t>Human oversight</w:t>
+            </w:r>
+          </w:p>
+        </w:tc>
+      </w:tr>
+      <w:tr>
+        <w:trPr>
+          <w:cantSplit/>
+          <w:jc w:val="center"/>
+        </w:trPr>
+        <w:tc>
+          <w:tcPr>
+            <w:tcW w:w="936" w:type="dxa"/>
+            <w:tcMar>
+              <w:top w:w="55" w:type="dxa"/>
+              <w:left w:w="90" w:type="dxa"/>
+              <w:bottom w:w="55" w:type="dxa"/>
+              <w:right w:w="90" w:type="dxa"/>
+            </w:tcMar>
+            <w:vAlign w:val="center"/>
+          </w:tcPr>
+          <w:p>
+            <w:pPr>
+              <w:spacing w:line="240" w:lineRule="exact"/>
+            </w:pPr>
+            <w:r>
+              <w:rPr>
+                <w:sz w:val="20"/>
+              </w:rPr>
+              <w:t>BR-003</w:t>
+            </w:r>
+          </w:p>
+        </w:tc>
+        <w:tc>
+          <w:tcPr>
+            <w:tcW w:w="6552" w:type="dxa"/>
+            <w:tcMar>
+              <w:top w:w="55" w:type="dxa"/>
+              <w:left w:w="90" w:type="dxa"/>
+              <w:bottom w:w="55" w:type="dxa"/>
+              <w:right w:w="90" w:type="dxa"/>
+            </w:tcMar>
+            <w:vAlign w:val="center"/>
+          </w:tcPr>
+          <w:p>
+            <w:pPr>
+              <w:spacing w:line="240" w:lineRule="exact"/>
+            </w:pPr>
+            <w:r>
+              <w:rPr>
+                <w:sz w:val="20"/>
+              </w:rPr>
+              <w:t>A requester shall not approve their own transfer request unless explicitly authorized.</w:t>
+            </w:r>
+          </w:p>
+        </w:tc>
+        <w:tc>
+          <w:tcPr>
+            <w:tcW w:w="1872" w:type="dxa"/>
+            <w:tcMar>
+              <w:top w:w="55" w:type="dxa"/>
+              <w:left w:w="90" w:type="dxa"/>
+              <w:bottom w:w="55" w:type="dxa"/>
+              <w:right w:w="90" w:type="dxa"/>
+            </w:tcMar>
+            <w:vAlign w:val="center"/>
+          </w:tcPr>
+          <w:p>
+            <w:pPr>
+              <w:spacing w:line="240" w:lineRule="exact"/>
+            </w:pPr>
+            <w:r>
+              <w:rPr>
+                <w:sz w:val="20"/>
+              </w:rPr>
+              <w:t>Separation of duties</w:t>
+            </w:r>
+          </w:p>
+        </w:tc>
+      </w:tr>
+      <w:tr>
+        <w:trPr>
+          <w:cantSplit/>
+          <w:jc w:val="center"/>
+        </w:trPr>
+        <w:tc>
+          <w:tcPr>
+            <w:tcW w:w="936" w:type="dxa"/>
+            <w:tcMar>
+              <w:top w:w="55" w:type="dxa"/>
+              <w:left w:w="90" w:type="dxa"/>
+              <w:bottom w:w="55" w:type="dxa"/>
+              <w:right w:w="90" w:type="dxa"/>
+            </w:tcMar>
+            <w:vAlign w:val="center"/>
+          </w:tcPr>
+          <w:p>
+            <w:pPr>
+              <w:spacing w:line="240" w:lineRule="exact"/>
+            </w:pPr>
+            <w:r>
+              <w:rPr>
+                <w:sz w:val="20"/>
+              </w:rPr>
+              <w:t>BR-004</w:t>
+            </w:r>
+          </w:p>
+        </w:tc>
+        <w:tc>
+          <w:tcPr>
+            <w:tcW w:w="6552" w:type="dxa"/>
+            <w:tcMar>
+              <w:top w:w="55" w:type="dxa"/>
+              <w:left w:w="90" w:type="dxa"/>
+              <w:bottom w:w="55" w:type="dxa"/>
+              <w:right w:w="90" w:type="dxa"/>
+            </w:tcMar>
+            <w:vAlign w:val="center"/>
+          </w:tcPr>
+          <w:p>
+            <w:pPr>
+              <w:spacing w:line="240" w:lineRule="exact"/>
+            </w:pPr>
+            <w:r>
+              <w:rPr>
+                <w:sz w:val="20"/>
+              </w:rPr>
+              <w:t xml:space="preserve">Publication does not require central pre-approval, and publication alone does not approve a transfer (Phase 1, </w:t>
+            </w:r>
+            <w:proofErr w:type="spellStart"/>
+            <w:r>
+              <w:rPr>
+                <w:sz w:val="20"/>
+              </w:rPr>
+              <w:t>Reqs</w:t>
+            </w:r>
+            <w:proofErr w:type="spellEnd"/>
+            <w:r>
+              <w:rPr>
+                <w:sz w:val="20"/>
+              </w:rPr>
+              <w:t>. 7 and 10).</w:t>
+            </w:r>
+          </w:p>
+        </w:tc>
+        <w:tc>
+          <w:tcPr>
+            <w:tcW w:w="1872" w:type="dxa"/>
+            <w:tcMar>
+              <w:top w:w="55" w:type="dxa"/>
+              <w:left w:w="90" w:type="dxa"/>
+              <w:bottom w:w="55" w:type="dxa"/>
+              <w:right w:w="90" w:type="dxa"/>
+            </w:tcMar>
+            <w:vAlign w:val="center"/>
+          </w:tcPr>
+          <w:p>
+            <w:pPr>
+              <w:spacing w:line="240" w:lineRule="exact"/>
+            </w:pPr>
+            <w:r>
+              <w:rPr>
+                <w:sz w:val="20"/>
+              </w:rPr>
+              <w:t>Low-effort listing without weakening control</w:t>
+            </w:r>
+          </w:p>
+        </w:tc>
+      </w:tr>
+      <w:tr>
+        <w:trPr>
+          <w:cantSplit/>
+          <w:jc w:val="center"/>
+        </w:trPr>
+        <w:tc>
+          <w:tcPr>
+            <w:tcW w:w="936" w:type="dxa"/>
+            <w:tcMar>
+              <w:top w:w="55" w:type="dxa"/>
+              <w:left w:w="90" w:type="dxa"/>
+              <w:bottom w:w="55" w:type="dxa"/>
+              <w:right w:w="90" w:type="dxa"/>
+            </w:tcMar>
+            <w:vAlign w:val="center"/>
+          </w:tcPr>
+          <w:p>
+            <w:pPr>
+              <w:spacing w:line="240" w:lineRule="exact"/>
+            </w:pPr>
+            <w:r>
+              <w:rPr>
+                <w:sz w:val="20"/>
+              </w:rPr>
+              <w:t>BR-005</w:t>
+            </w:r>
+          </w:p>
+        </w:tc>
+        <w:tc>
+          <w:tcPr>
+            <w:tcW w:w="6552" w:type="dxa"/>
+            <w:tcMar>
+              <w:top w:w="55" w:type="dxa"/>
+              <w:left w:w="90" w:type="dxa"/>
+              <w:bottom w:w="55" w:type="dxa"/>
+              <w:right w:w="90" w:type="dxa"/>
+            </w:tcMar>
+            <w:vAlign w:val="center"/>
+          </w:tcPr>
+          <w:p>
+            <w:pPr>
+              <w:spacing w:line="240" w:lineRule="exact"/>
+            </w:pPr>
+            <w:r>
+              <w:rPr>
+                <w:sz w:val="20"/>
+              </w:rPr>
+              <w:t>Competing eligible requests are normally considered in submission order; exceptions based on urgency, suitability, or timing require a recorded reason (Phase 1, Section 5.5).</w:t>
+            </w:r>
+          </w:p>
+        </w:tc>
+        <w:tc>
+          <w:tcPr>
+            <w:tcW w:w="1872" w:type="dxa"/>
+            <w:tcMar>
+              <w:top w:w="55" w:type="dxa"/>
+              <w:left w:w="90" w:type="dxa"/>
+              <w:bottom w:w="55" w:type="dxa"/>
+              <w:right w:w="90" w:type="dxa"/>
+            </w:tcMar>
+            <w:vAlign w:val="center"/>
+          </w:tcPr>
+          <w:p>
+            <w:pPr>
+              <w:spacing w:line="240" w:lineRule="exact"/>
+            </w:pPr>
+            <w:r>
+              <w:rPr>
+                <w:sz w:val="20"/>
+              </w:rPr>
+              <w:t>Fairness and traceability</w:t>
+            </w:r>
+          </w:p>
+        </w:tc>
+      </w:tr>
+      <w:tr>
+        <w:trPr>
+          <w:cantSplit/>
+          <w:jc w:val="center"/>
+        </w:trPr>
+        <w:tc>
+          <w:tcPr>
+            <w:tcW w:w="936" w:type="dxa"/>
+            <w:tcMar>
+              <w:top w:w="55" w:type="dxa"/>
+              <w:left w:w="90" w:type="dxa"/>
+              <w:bottom w:w="55" w:type="dxa"/>
+              <w:right w:w="90" w:type="dxa"/>
+            </w:tcMar>
+            <w:vAlign w:val="center"/>
+          </w:tcPr>
+          <w:p>
+            <w:pPr>
+              <w:spacing w:line="240" w:lineRule="exact"/>
+            </w:pPr>
+            <w:r>
+              <w:rPr>
+                <w:sz w:val="20"/>
+              </w:rPr>
+              <w:t>BR-006</w:t>
+            </w:r>
+          </w:p>
+        </w:tc>
+        <w:tc>
+          <w:tcPr>
+            <w:tcW w:w="6552" w:type="dxa"/>
+            <w:tcMar>
+              <w:top w:w="55" w:type="dxa"/>
+              <w:left w:w="90" w:type="dxa"/>
+              <w:bottom w:w="55" w:type="dxa"/>
+              <w:right w:w="90" w:type="dxa"/>
+            </w:tcMar>
+            <w:vAlign w:val="center"/>
+          </w:tcPr>
+          <w:p>
+            <w:pPr>
+              <w:spacing w:line="240" w:lineRule="exact"/>
+            </w:pPr>
+            <w:r>
+              <w:rPr>
+                <w:sz w:val="20"/>
+              </w:rPr>
+              <w:t>Related approvals may be combined only within the representative’s authority (Phase 1, Section 5.5).</w:t>
+            </w:r>
+          </w:p>
+        </w:tc>
+        <w:tc>
+          <w:tcPr>
+            <w:tcW w:w="1872" w:type="dxa"/>
+            <w:tcMar>
+              <w:top w:w="55" w:type="dxa"/>
+              <w:left w:w="90" w:type="dxa"/>
+              <w:bottom w:w="55" w:type="dxa"/>
+              <w:right w:w="90" w:type="dxa"/>
+            </w:tcMar>
+            <w:vAlign w:val="center"/>
+          </w:tcPr>
+          <w:p>
+            <w:pPr>
+              <w:spacing w:line="240" w:lineRule="exact"/>
+            </w:pPr>
+            <w:r>
+              <w:rPr>
+                <w:sz w:val="20"/>
+              </w:rPr>
+              <w:t>Delegated authority</w:t>
+            </w:r>
+          </w:p>
+        </w:tc>
+      </w:tr>
+      <w:tr>
+        <w:trPr>
+          <w:cantSplit/>
+          <w:jc w:val="center"/>
+        </w:trPr>
+        <w:tc>
+          <w:tcPr>
+            <w:tcW w:w="936" w:type="dxa"/>
+            <w:tcMar>
+              <w:top w:w="55" w:type="dxa"/>
+              <w:left w:w="90" w:type="dxa"/>
+              <w:bottom w:w="55" w:type="dxa"/>
+              <w:right w:w="90" w:type="dxa"/>
+            </w:tcMar>
+            <w:vAlign w:val="center"/>
+          </w:tcPr>
+          <w:p>
+            <w:pPr>
+              <w:spacing w:line="240" w:lineRule="exact"/>
+            </w:pPr>
+            <w:r>
+              <w:rPr>
+                <w:sz w:val="20"/>
+              </w:rPr>
+              <w:t>BR-007</w:t>
+            </w:r>
+          </w:p>
+        </w:tc>
+        <w:tc>
+          <w:tcPr>
+            <w:tcW w:w="6552" w:type="dxa"/>
+            <w:tcMar>
+              <w:top w:w="55" w:type="dxa"/>
+              <w:left w:w="90" w:type="dxa"/>
+              <w:bottom w:w="55" w:type="dxa"/>
+              <w:right w:w="90" w:type="dxa"/>
+            </w:tcMar>
+            <w:vAlign w:val="center"/>
+          </w:tcPr>
+          <w:p>
+            <w:pPr>
+              <w:spacing w:line="240" w:lineRule="exact"/>
+            </w:pPr>
+            <w:r>
+              <w:rPr>
+                <w:sz w:val="20"/>
+              </w:rPr>
+              <w:t>A transfer is complete only after the receiving representative accepts receipt of the approved quantity. Formal departmental custody changes at completion; actual physical holder and location are tracked during movement and discrepancies (Phase 1, Req. 22).</w:t>
+            </w:r>
+          </w:p>
+        </w:tc>
+        <w:tc>
+          <w:tcPr>
+            <w:tcW w:w="1872" w:type="dxa"/>
+            <w:tcMar>
+              <w:top w:w="55" w:type="dxa"/>
+              <w:left w:w="90" w:type="dxa"/>
+              <w:bottom w:w="55" w:type="dxa"/>
+              <w:right w:w="90" w:type="dxa"/>
+            </w:tcMar>
+            <w:vAlign w:val="center"/>
+          </w:tcPr>
+          <w:p>
+            <w:pPr>
+              <w:spacing w:line="240" w:lineRule="exact"/>
+            </w:pPr>
+            <w:r>
+              <w:rPr>
+                <w:sz w:val="20"/>
+              </w:rPr>
+              <w:t>Custody accuracy</w:t>
+            </w:r>
+          </w:p>
+        </w:tc>
+      </w:tr>
+      <w:tr>
+        <w:trPr>
+          <w:cantSplit/>
+          <w:jc w:val="center"/>
+        </w:trPr>
+        <w:tc>
+          <w:tcPr>
+            <w:tcW w:w="936" w:type="dxa"/>
+            <w:tcMar>
+              <w:top w:w="55" w:type="dxa"/>
+              <w:left w:w="90" w:type="dxa"/>
+              <w:bottom w:w="55" w:type="dxa"/>
+              <w:right w:w="90" w:type="dxa"/>
+            </w:tcMar>
+            <w:vAlign w:val="center"/>
+          </w:tcPr>
+          <w:p>
+            <w:pPr>
+              <w:spacing w:line="240" w:lineRule="exact"/>
+            </w:pPr>
+            <w:r>
+              <w:rPr>
+                <w:sz w:val="20"/>
+              </w:rPr>
+              <w:t>BR-008</w:t>
+            </w:r>
+          </w:p>
+        </w:tc>
+        <w:tc>
+          <w:tcPr>
+            <w:tcW w:w="6552" w:type="dxa"/>
+            <w:tcMar>
+              <w:top w:w="55" w:type="dxa"/>
+              <w:left w:w="90" w:type="dxa"/>
+              <w:bottom w:w="55" w:type="dxa"/>
+              <w:right w:w="90" w:type="dxa"/>
+            </w:tcMar>
+            <w:vAlign w:val="center"/>
+          </w:tcPr>
+          <w:p>
+            <w:pPr>
+              <w:spacing w:line="240" w:lineRule="exact"/>
+            </w:pPr>
+            <w:r>
+              <w:rPr>
+                <w:sz w:val="20"/>
+              </w:rPr>
+              <w:t>Donation, component recovery, recycling, and disposal require authorized approval before being recorded as completed (Phase 1, Req. 27; Phase 2, Section 2.1).</w:t>
+            </w:r>
+          </w:p>
+        </w:tc>
+        <w:tc>
+          <w:tcPr>
+            <w:tcW w:w="1872" w:type="dxa"/>
+            <w:tcMar>
+              <w:top w:w="55" w:type="dxa"/>
+              <w:left w:w="90" w:type="dxa"/>
+              <w:bottom w:w="55" w:type="dxa"/>
+              <w:right w:w="90" w:type="dxa"/>
+            </w:tcMar>
+            <w:vAlign w:val="center"/>
+          </w:tcPr>
+          <w:p>
+            <w:pPr>
+              <w:spacing w:line="240" w:lineRule="exact"/>
+            </w:pPr>
+            <w:r>
+              <w:rPr>
+                <w:sz w:val="20"/>
+              </w:rPr>
+              <w:t>Delegated authority</w:t>
+            </w:r>
+          </w:p>
+        </w:tc>
+      </w:tr>
+      <w:tr>
+        <w:trPr>
+          <w:cantSplit/>
+          <w:jc w:val="center"/>
+        </w:trPr>
+        <w:tc>
+          <w:tcPr>
+            <w:tcW w:w="936" w:type="dxa"/>
+            <w:tcMar>
+              <w:top w:w="55" w:type="dxa"/>
+              <w:left w:w="90" w:type="dxa"/>
+              <w:bottom w:w="55" w:type="dxa"/>
+              <w:right w:w="90" w:type="dxa"/>
+            </w:tcMar>
+            <w:vAlign w:val="center"/>
+          </w:tcPr>
+          <w:p>
+            <w:pPr>
+              <w:spacing w:line="240" w:lineRule="exact"/>
+            </w:pPr>
+            <w:r>
+              <w:rPr>
+                <w:sz w:val="20"/>
+              </w:rPr>
+              <w:t>BR-009</w:t>
+            </w:r>
+          </w:p>
+        </w:tc>
+        <w:tc>
+          <w:tcPr>
+            <w:tcW w:w="6552" w:type="dxa"/>
+            <w:tcMar>
+              <w:top w:w="55" w:type="dxa"/>
+              <w:left w:w="90" w:type="dxa"/>
+              <w:bottom w:w="55" w:type="dxa"/>
+              <w:right w:w="90" w:type="dxa"/>
+            </w:tcMar>
+            <w:vAlign w:val="center"/>
+          </w:tcPr>
+          <w:p>
+            <w:pPr>
+              <w:spacing w:line="240" w:lineRule="exact"/>
+            </w:pPr>
+            <w:r>
+              <w:rPr>
+                <w:sz w:val="20"/>
+              </w:rPr>
+              <w:t>Lack of demand or elapsed storage time does not automatically authorize disposal (Phase 1, Section 5.5).</w:t>
+            </w:r>
+          </w:p>
+        </w:tc>
+        <w:tc>
+          <w:tcPr>
+            <w:tcW w:w="1872" w:type="dxa"/>
+            <w:tcMar>
+              <w:top w:w="55" w:type="dxa"/>
+              <w:left w:w="90" w:type="dxa"/>
+              <w:bottom w:w="55" w:type="dxa"/>
+              <w:right w:w="90" w:type="dxa"/>
+            </w:tcMar>
+            <w:vAlign w:val="center"/>
+          </w:tcPr>
+          <w:p>
+            <w:pPr>
+              <w:spacing w:line="240" w:lineRule="exact"/>
+            </w:pPr>
+            <w:r>
+              <w:rPr>
+                <w:sz w:val="20"/>
+              </w:rPr>
+              <w:t>Reuse before disposal</w:t>
+            </w:r>
+          </w:p>
+        </w:tc>
+      </w:tr>
+      <w:tr>
+        <w:trPr>
+          <w:cantSplit/>
+          <w:jc w:val="center"/>
+        </w:trPr>
+        <w:tc>
+          <w:tcPr>
+            <w:tcW w:w="936" w:type="dxa"/>
+            <w:tcMar>
+              <w:top w:w="55" w:type="dxa"/>
+              <w:left w:w="90" w:type="dxa"/>
+              <w:bottom w:w="55" w:type="dxa"/>
+              <w:right w:w="90" w:type="dxa"/>
+            </w:tcMar>
+            <w:vAlign w:val="center"/>
+          </w:tcPr>
+          <w:p>
+            <w:pPr>
+              <w:spacing w:line="240" w:lineRule="exact"/>
+            </w:pPr>
+            <w:r>
+              <w:rPr>
+                <w:sz w:val="20"/>
+              </w:rPr>
+              <w:t>BR-010</w:t>
+            </w:r>
+          </w:p>
+        </w:tc>
+        <w:tc>
+          <w:tcPr>
+            <w:tcW w:w="6552" w:type="dxa"/>
+            <w:tcMar>
+              <w:top w:w="55" w:type="dxa"/>
+              <w:left w:w="90" w:type="dxa"/>
+              <w:bottom w:w="55" w:type="dxa"/>
+              <w:right w:w="90" w:type="dxa"/>
+            </w:tcMar>
+            <w:vAlign w:val="center"/>
+          </w:tcPr>
+          <w:p>
+            <w:pPr>
+              <w:spacing w:line="240" w:lineRule="exact"/>
+            </w:pPr>
+            <w:r>
+              <w:rPr>
+                <w:sz w:val="20"/>
+              </w:rPr>
+              <w:t>Assets recorded as unfit remain unavailable for ordinary-use reservation until an authorized condition assessment establishes suitability. Rejecting an end-of-life proposal does not make an unfit asset usable (Phase 1, Req. 26).</w:t>
+            </w:r>
+          </w:p>
+        </w:tc>
+        <w:tc>
+          <w:tcPr>
+            <w:tcW w:w="1872" w:type="dxa"/>
+            <w:tcMar>
+              <w:top w:w="55" w:type="dxa"/>
+              <w:left w:w="90" w:type="dxa"/>
+              <w:bottom w:w="55" w:type="dxa"/>
+              <w:right w:w="90" w:type="dxa"/>
+            </w:tcMar>
+            <w:vAlign w:val="center"/>
+          </w:tcPr>
+          <w:p>
+            <w:pPr>
+              <w:spacing w:line="240" w:lineRule="exact"/>
+            </w:pPr>
+            <w:r>
+              <w:rPr>
+                <w:sz w:val="20"/>
+              </w:rPr>
+              <w:t>Safety</w:t>
+            </w:r>
+          </w:p>
+        </w:tc>
+      </w:tr>
+      <w:tr>
+        <w:trPr>
+          <w:cantSplit/>
+          <w:jc w:val="center"/>
+        </w:trPr>
+        <w:tc>
+          <w:tcPr>
+            <w:tcW w:w="936" w:type="dxa"/>
+            <w:tcMar>
+              <w:top w:w="55" w:type="dxa"/>
+              <w:left w:w="90" w:type="dxa"/>
+              <w:bottom w:w="55" w:type="dxa"/>
+              <w:right w:w="90" w:type="dxa"/>
+            </w:tcMar>
+            <w:vAlign w:val="center"/>
+          </w:tcPr>
+          <w:p>
+            <w:pPr>
+              <w:spacing w:line="240" w:lineRule="exact"/>
+            </w:pPr>
+            <w:r>
+              <w:rPr>
+                <w:sz w:val="20"/>
+              </w:rPr>
+              <w:lastRenderedPageBreak/>
+              <w:t>BR-011</w:t>
+            </w:r>
+          </w:p>
+        </w:tc>
+        <w:tc>
+          <w:tcPr>
+            <w:tcW w:w="6552" w:type="dxa"/>
+            <w:tcMar>
+              <w:top w:w="55" w:type="dxa"/>
+              <w:left w:w="90" w:type="dxa"/>
+              <w:bottom w:w="55" w:type="dxa"/>
+              <w:right w:w="90" w:type="dxa"/>
+            </w:tcMar>
+            <w:vAlign w:val="center"/>
+          </w:tcPr>
+          <w:p>
+            <w:pPr>
+              <w:spacing w:line="240" w:lineRule="exact"/>
+            </w:pPr>
+            <w:r>
+              <w:rPr>
+                <w:sz w:val="20"/>
+              </w:rPr>
+              <w:t>Technical administration privileges do not grant business approval authority (Phase 1, Req. 4; Phase 2, Section 2.1).</w:t>
+            </w:r>
+          </w:p>
+        </w:tc>
+        <w:tc>
+          <w:tcPr>
+            <w:tcW w:w="1872" w:type="dxa"/>
+            <w:tcMar>
+              <w:top w:w="55" w:type="dxa"/>
+              <w:left w:w="90" w:type="dxa"/>
+              <w:bottom w:w="55" w:type="dxa"/>
+              <w:right w:w="90" w:type="dxa"/>
+            </w:tcMar>
+            <w:vAlign w:val="center"/>
+          </w:tcPr>
+          <w:p>
+            <w:pPr>
+              <w:spacing w:line="240" w:lineRule="exact"/>
+            </w:pPr>
+            <w:r>
+              <w:rPr>
+                <w:sz w:val="20"/>
+              </w:rPr>
+              <w:t>Separation of duties</w:t>
+            </w:r>
+          </w:p>
+        </w:tc>
+      </w:tr>
+    </w:tbl>
+    <w:p>
+      <w:pPr>
+        <w:spacing w:after="40" w:line="240" w:lineRule="exact"/>
+      </w:pPr>
+    </w:p>
+    <w:p>
+      <w:pPr>
+        <w:spacing w:after="60" w:line="260" w:lineRule="exact"/>
+      </w:pPr>
+      <w:r>
+        <w:rPr>
+          <w:sz w:val="22"/>
+        </w:rPr>
+        <w:t>The role scopes in Section 2.3 implement these rules. Detailed delegation, retention and exception policies remain TBD-006; an AI suggestion, technical role or expired storage period cannot supply missing approval authority.</w:t>
+      </w:r>
+    </w:p>
+    <w:p>
+      <w:pPr>
+        <w:spacing w:after="60" w:line="240" w:lineRule="exact"/>
+      </w:pPr>
     </w:p>
     <w:sectPr>
       <w:headerReference w:type="default" r:id="rId10"/>
@@ -7031,7 +11240,7 @@
 </file>
 
 <file path=word/endnotes.xml><?xml version="1.0" encoding="utf-8"?>
-<w:endnotes xmlns:wpc="http://schemas.microsoft.com/office/word/2010/wordprocessingCanvas" xmlns:cx="http://schemas.microsoft.com/office/drawing/2014/chartex" xmlns:cx1="http://schemas.microsoft.com/office/drawing/2015/9/8/chartex" xmlns:cx2="http://schemas.microsoft.com/office/drawing/2015/10/21/chartex" xmlns:cx3="http://schemas.microsoft.com/office/drawing/2016/5/9/chartex" xmlns:cx4="http://schemas.microsoft.com/office/drawing/2016/5/10/chartex" xmlns:cx5="http://schemas.microsoft.com/office/drawing/2016/5/11/chartex" xmlns:cx6="http://schemas.microsoft.com/office/drawing/2016/5/12/chartex" xmlns:cx7="http://schemas.microsoft.com/office/drawing/2016/5/13/chartex" xmlns:cx8="http://schemas.microsoft.com/office/drawing/2016/5/14/chartex" xmlns:mc="http://schemas.openxmlformats.org/markup-compatibility/2006" xmlns:aink="http://schemas.microsoft.com/office/drawing/2016/ink" xmlns:am3d="http://schemas.microsoft.com/office/drawing/2017/model3d" xmlns:o="urn:schemas-microsoft-com:office:office" xmlns:oel="http://schemas.microsoft.com/office/2019/extlst" xmlns:r="http://schemas.openxmlformats.org/officeDocument/2006/relationships" xmlns:m="http://schemas.openxmlformats.org/officeDocument/2006/math" xmlns:v="urn:schemas-microsoft-com:vml" xmlns:wp14="http://schemas.microsoft.com/office/word/2010/wordprocessingDrawing" xmlns:wp="http://schemas.openxmlformats.org/drawingml/2006/wordprocessingDrawing" xmlns:w10="urn:schemas-microsoft-com:office:word" xmlns:w="http://schemas.openxmlformats.org/wordprocessingml/2006/main" xmlns:w14="http://schemas.microsoft.com/office/word/2010/wordml" xmlns:w15="http://schemas.microsoft.com/office/word/2012/wordml" xmlns:w16cex="http://schemas.microsoft.com/office/word/2018/wordml/cex" xmlns:w16cid="http://schemas.microsoft.com/office/word/2016/wordml/cid" xmlns:w16="http://schemas.microsoft.com/office/word/2018/wordml" xmlns:w16du="http://schemas.microsoft.com/office/word/2023/wordml/word16du" xmlns:w16sdtdh="http://schemas.microsoft.com/office/word/2020/wordml/sdtdatahash" xmlns:w16sdtfl="http://schemas.microsoft.com/office/word/2024/wordml/sdtformatlock" xmlns:w16se="http://schemas.microsoft.com/office/word/2015/wordml/symex" xmlns:wpg="http://schemas.microsoft.com/office/word/2010/wordprocessingGroup" xmlns:wpi="http://schemas.microsoft.com/office/word/2010/wordprocessingInk" xmlns:wne="http://schemas.microsoft.com/office/word/2006/wordml" xmlns:wps="http://schemas.microsoft.com/office/word/2010/wordprocessingShape" mc:Ignorable="w14 w15 w16se w16cid w16 w16cex w16sdtdh w16sdtfl w16du wp14">
+<w:endnotes xmlns:wpc="http://schemas.microsoft.com/office/word/2010/wordprocessingCanvas" xmlns:cx="http://schemas.microsoft.com/office/drawing/2014/chartex" xmlns:cx1="http://schemas.microsoft.com/office/drawing/2015/9/8/chartex" xmlns:cx2="http://schemas.microsoft.com/office/drawing/2015/10/21/chartex" xmlns:cx3="http://schemas.microsoft.com/office/drawing/2016/5/9/chartex" xmlns:cx4="http://schemas.microsoft.com/office/drawing/2016/5/10/chartex" xmlns:cx5="http://schemas.microsoft.com/office/drawing/2016/5/11/chartex" xmlns:cx6="http://schemas.microsoft.com/office/drawing/2016/5/12/chartex" xmlns:cx7="http://schemas.microsoft.com/office/drawing/2016/5/13/chartex" xmlns:cx8="http://schemas.microsoft.com/office/drawing/2016/5/14/chartex" xmlns:mc="http://schemas.openxmlformats.org/markup-compatibility/2006" xmlns:m="http://schemas.openxmlformats.org/officeDocument/2006/math" xmlns:aink="http://schemas.microsoft.com/office/drawing/2016/ink" xmlns:am3d="http://schemas.microsoft.com/office/drawing/2017/model3d" xmlns:oel="http://schemas.microsoft.com/office/2019/extlst" xmlns:r="http://schemas.openxmlformats.org/officeDocument/2006/relationships" xmlns:wp14="http://schemas.microsoft.com/office/word/2010/wordprocessingDrawing" xmlns:wp="http://schemas.openxmlformats.org/drawingml/2006/wordprocessingDrawing" xmlns:wpg="http://schemas.microsoft.com/office/word/2010/wordprocessingGroup" xmlns:wpi="http://schemas.microsoft.com/office/word/2010/wordprocessingInk" xmlns:wps="http://schemas.microsoft.com/office/word/2010/wordprocessingShape" xmlns:o="urn:schemas-microsoft-com:office:office" xmlns:v="urn:schemas-microsoft-com:vml" xmlns:w10="urn:schemas-microsoft-com:office:word" xmlns:w="http://schemas.openxmlformats.org/wordprocessingml/2006/main" xmlns:w14="http://schemas.microsoft.com/office/word/2010/wordml" xmlns:w15="http://schemas.microsoft.com/office/word/2012/wordml" xmlns:w16cex="http://schemas.microsoft.com/office/word/2018/wordml/cex" xmlns:w16cid="http://schemas.microsoft.com/office/word/2016/wordml/cid" xmlns:w16="http://schemas.microsoft.com/office/word/2018/wordml" xmlns:w16sdtdh="http://schemas.microsoft.com/office/word/2020/wordml/sdtdatahash" xmlns:w16sdtfl="http://schemas.microsoft.com/office/word/2024/wordml/sdtformatlock" xmlns:w16se="http://schemas.microsoft.com/office/word/2015/wordml/symex" xmlns:w16du="http://schemas.microsoft.com/office/word/2023/wordml/word16du" xmlns:wne="http://schemas.microsoft.com/office/word/2006/wordml" mc:Ignorable="w14 w15 w16se w16cid w16 w16cex w16sdtdh w16sdtfl w16du wp14">
   <w:endnote w:type="separator" w:id="-1">
     <w:p>
       <w:r>
@@ -7050,7 +11259,7 @@
 </file>
 
 <file path=word/footer1.xml><?xml version="1.0" encoding="utf-8"?>
-<w:ftr xmlns:wpc="http://schemas.microsoft.com/office/word/2010/wordprocessingCanvas" xmlns:cx="http://schemas.microsoft.com/office/drawing/2014/chartex" xmlns:cx1="http://schemas.microsoft.com/office/drawing/2015/9/8/chartex" xmlns:cx2="http://schemas.microsoft.com/office/drawing/2015/10/21/chartex" xmlns:cx3="http://schemas.microsoft.com/office/drawing/2016/5/9/chartex" xmlns:cx4="http://schemas.microsoft.com/office/drawing/2016/5/10/chartex" xmlns:cx5="http://schemas.microsoft.com/office/drawing/2016/5/11/chartex" xmlns:cx6="http://schemas.microsoft.com/office/drawing/2016/5/12/chartex" xmlns:cx7="http://schemas.microsoft.com/office/drawing/2016/5/13/chartex" xmlns:cx8="http://schemas.microsoft.com/office/drawing/2016/5/14/chartex" xmlns:mc="http://schemas.openxmlformats.org/markup-compatibility/2006" xmlns:aink="http://schemas.microsoft.com/office/drawing/2016/ink" xmlns:am3d="http://schemas.microsoft.com/office/drawing/2017/model3d" xmlns:o="urn:schemas-microsoft-com:office:office" xmlns:oel="http://schemas.microsoft.com/office/2019/extlst" xmlns:r="http://schemas.openxmlformats.org/officeDocument/2006/relationships" xmlns:m="http://schemas.openxmlformats.org/officeDocument/2006/math" xmlns:v="urn:schemas-microsoft-com:vml" xmlns:wp14="http://schemas.microsoft.com/office/word/2010/wordprocessingDrawing" xmlns:wp="http://schemas.openxmlformats.org/drawingml/2006/wordprocessingDrawing" xmlns:w10="urn:schemas-microsoft-com:office:word" xmlns:w="http://schemas.openxmlformats.org/wordprocessingml/2006/main" xmlns:w14="http://schemas.microsoft.com/office/word/2010/wordml" xmlns:w15="http://schemas.microsoft.com/office/word/2012/wordml" xmlns:w16cex="http://schemas.microsoft.com/office/word/2018/wordml/cex" xmlns:w16cid="http://schemas.microsoft.com/office/word/2016/wordml/cid" xmlns:w16="http://schemas.microsoft.com/office/word/2018/wordml" xmlns:w16du="http://schemas.microsoft.com/office/word/2023/wordml/word16du" xmlns:w16sdtdh="http://schemas.microsoft.com/office/word/2020/wordml/sdtdatahash" xmlns:w16sdtfl="http://schemas.microsoft.com/office/word/2024/wordml/sdtformatlock" xmlns:w16se="http://schemas.microsoft.com/office/word/2015/wordml/symex" xmlns:wpg="http://schemas.microsoft.com/office/word/2010/wordprocessingGroup" xmlns:wpi="http://schemas.microsoft.com/office/word/2010/wordprocessingInk" xmlns:wne="http://schemas.microsoft.com/office/word/2006/wordml" xmlns:wps="http://schemas.microsoft.com/office/word/2010/wordprocessingShape" mc:Ignorable="w14 w15 w16se w16cid w16 w16cex w16sdtdh w16sdtfl w16du wp14">
+<w:ftr xmlns:wpc="http://schemas.microsoft.com/office/word/2010/wordprocessingCanvas" xmlns:cx="http://schemas.microsoft.com/office/drawing/2014/chartex" xmlns:cx1="http://schemas.microsoft.com/office/drawing/2015/9/8/chartex" xmlns:cx2="http://schemas.microsoft.com/office/drawing/2015/10/21/chartex" xmlns:cx3="http://schemas.microsoft.com/office/drawing/2016/5/9/chartex" xmlns:cx4="http://schemas.microsoft.com/office/drawing/2016/5/10/chartex" xmlns:cx5="http://schemas.microsoft.com/office/drawing/2016/5/11/chartex" xmlns:cx6="http://schemas.microsoft.com/office/drawing/2016/5/12/chartex" xmlns:cx7="http://schemas.microsoft.com/office/drawing/2016/5/13/chartex" xmlns:cx8="http://schemas.microsoft.com/office/drawing/2016/5/14/chartex" xmlns:mc="http://schemas.openxmlformats.org/markup-compatibility/2006" xmlns:m="http://schemas.openxmlformats.org/officeDocument/2006/math" xmlns:aink="http://schemas.microsoft.com/office/drawing/2016/ink" xmlns:am3d="http://schemas.microsoft.com/office/drawing/2017/model3d" xmlns:oel="http://schemas.microsoft.com/office/2019/extlst" xmlns:r="http://schemas.openxmlformats.org/officeDocument/2006/relationships" xmlns:wp14="http://schemas.microsoft.com/office/word/2010/wordprocessingDrawing" xmlns:wp="http://schemas.openxmlformats.org/drawingml/2006/wordprocessingDrawing" xmlns:wpg="http://schemas.microsoft.com/office/word/2010/wordprocessingGroup" xmlns:wpi="http://schemas.microsoft.com/office/word/2010/wordprocessingInk" xmlns:wps="http://schemas.microsoft.com/office/word/2010/wordprocessingShape" xmlns:o="urn:schemas-microsoft-com:office:office" xmlns:v="urn:schemas-microsoft-com:vml" xmlns:w10="urn:schemas-microsoft-com:office:word" xmlns:w="http://schemas.openxmlformats.org/wordprocessingml/2006/main" xmlns:w14="http://schemas.microsoft.com/office/word/2010/wordml" xmlns:w15="http://schemas.microsoft.com/office/word/2012/wordml" xmlns:w16cex="http://schemas.microsoft.com/office/word/2018/wordml/cex" xmlns:w16cid="http://schemas.microsoft.com/office/word/2016/wordml/cid" xmlns:w16="http://schemas.microsoft.com/office/word/2018/wordml" xmlns:w16sdtdh="http://schemas.microsoft.com/office/word/2020/wordml/sdtdatahash" xmlns:w16sdtfl="http://schemas.microsoft.com/office/word/2024/wordml/sdtformatlock" xmlns:w16se="http://schemas.microsoft.com/office/word/2015/wordml/symex" xmlns:w16du="http://schemas.microsoft.com/office/word/2023/wordml/word16du" xmlns:wne="http://schemas.microsoft.com/office/word/2006/wordml" mc:Ignorable="w14 w15 w16se w16cid w16 w16cex w16sdtdh w16sdtfl w16du wp14">
   <w:p>
     <w:pPr>
       <w:pStyle w:val="Footer"/>
@@ -7061,7 +11270,7 @@
 </file>
 
 <file path=word/footer2.xml><?xml version="1.0" encoding="utf-8"?>
-<w:ftr xmlns:wpc="http://schemas.microsoft.com/office/word/2010/wordprocessingCanvas" xmlns:cx="http://schemas.microsoft.com/office/drawing/2014/chartex" xmlns:cx1="http://schemas.microsoft.com/office/drawing/2015/9/8/chartex" xmlns:cx2="http://schemas.microsoft.com/office/drawing/2015/10/21/chartex" xmlns:cx3="http://schemas.microsoft.com/office/drawing/2016/5/9/chartex" xmlns:cx4="http://schemas.microsoft.com/office/drawing/2016/5/10/chartex" xmlns:cx5="http://schemas.microsoft.com/office/drawing/2016/5/11/chartex" xmlns:cx6="http://schemas.microsoft.com/office/drawing/2016/5/12/chartex" xmlns:cx7="http://schemas.microsoft.com/office/drawing/2016/5/13/chartex" xmlns:cx8="http://schemas.microsoft.com/office/drawing/2016/5/14/chartex" xmlns:mc="http://schemas.openxmlformats.org/markup-compatibility/2006" xmlns:aink="http://schemas.microsoft.com/office/drawing/2016/ink" xmlns:am3d="http://schemas.microsoft.com/office/drawing/2017/model3d" xmlns:o="urn:schemas-microsoft-com:office:office" xmlns:oel="http://schemas.microsoft.com/office/2019/extlst" xmlns:r="http://schemas.openxmlformats.org/officeDocument/2006/relationships" xmlns:m="http://schemas.openxmlformats.org/officeDocument/2006/math" xmlns:v="urn:schemas-microsoft-com:vml" xmlns:wp14="http://schemas.microsoft.com/office/word/2010/wordprocessingDrawing" xmlns:wp="http://schemas.openxmlformats.org/drawingml/2006/wordprocessingDrawing" xmlns:w10="urn:schemas-microsoft-com:office:word" xmlns:w="http://schemas.openxmlformats.org/wordprocessingml/2006/main" xmlns:w14="http://schemas.microsoft.com/office/word/2010/wordml" xmlns:w15="http://schemas.microsoft.com/office/word/2012/wordml" xmlns:w16cex="http://schemas.microsoft.com/office/word/2018/wordml/cex" xmlns:w16cid="http://schemas.microsoft.com/office/word/2016/wordml/cid" xmlns:w16="http://schemas.microsoft.com/office/word/2018/wordml" xmlns:w16du="http://schemas.microsoft.com/office/word/2023/wordml/word16du" xmlns:w16sdtdh="http://schemas.microsoft.com/office/word/2020/wordml/sdtdatahash" xmlns:w16sdtfl="http://schemas.microsoft.com/office/word/2024/wordml/sdtformatlock" xmlns:w16se="http://schemas.microsoft.com/office/word/2015/wordml/symex" xmlns:wpg="http://schemas.microsoft.com/office/word/2010/wordprocessingGroup" xmlns:wpi="http://schemas.microsoft.com/office/word/2010/wordprocessingInk" xmlns:wne="http://schemas.microsoft.com/office/word/2006/wordml" xmlns:wps="http://schemas.microsoft.com/office/word/2010/wordprocessingShape" mc:Ignorable="w14 w15 w16se w16cid w16 w16cex w16sdtdh w16sdtfl w16du wp14">
+<w:ftr xmlns:wpc="http://schemas.microsoft.com/office/word/2010/wordprocessingCanvas" xmlns:cx="http://schemas.microsoft.com/office/drawing/2014/chartex" xmlns:cx1="http://schemas.microsoft.com/office/drawing/2015/9/8/chartex" xmlns:cx2="http://schemas.microsoft.com/office/drawing/2015/10/21/chartex" xmlns:cx3="http://schemas.microsoft.com/office/drawing/2016/5/9/chartex" xmlns:cx4="http://schemas.microsoft.com/office/drawing/2016/5/10/chartex" xmlns:cx5="http://schemas.microsoft.com/office/drawing/2016/5/11/chartex" xmlns:cx6="http://schemas.microsoft.com/office/drawing/2016/5/12/chartex" xmlns:cx7="http://schemas.microsoft.com/office/drawing/2016/5/13/chartex" xmlns:cx8="http://schemas.microsoft.com/office/drawing/2016/5/14/chartex" xmlns:mc="http://schemas.openxmlformats.org/markup-compatibility/2006" xmlns:m="http://schemas.openxmlformats.org/officeDocument/2006/math" xmlns:aink="http://schemas.microsoft.com/office/drawing/2016/ink" xmlns:am3d="http://schemas.microsoft.com/office/drawing/2017/model3d" xmlns:oel="http://schemas.microsoft.com/office/2019/extlst" xmlns:r="http://schemas.openxmlformats.org/officeDocument/2006/relationships" xmlns:wp14="http://schemas.microsoft.com/office/word/2010/wordprocessingDrawing" xmlns:wp="http://schemas.openxmlformats.org/drawingml/2006/wordprocessingDrawing" xmlns:wpg="http://schemas.microsoft.com/office/word/2010/wordprocessingGroup" xmlns:wpi="http://schemas.microsoft.com/office/word/2010/wordprocessingInk" xmlns:wps="http://schemas.microsoft.com/office/word/2010/wordprocessingShape" xmlns:o="urn:schemas-microsoft-com:office:office" xmlns:v="urn:schemas-microsoft-com:vml" xmlns:w10="urn:schemas-microsoft-com:office:word" xmlns:w="http://schemas.openxmlformats.org/wordprocessingml/2006/main" xmlns:w14="http://schemas.microsoft.com/office/word/2010/wordml" xmlns:w15="http://schemas.microsoft.com/office/word/2012/wordml" xmlns:w16cex="http://schemas.microsoft.com/office/word/2018/wordml/cex" xmlns:w16cid="http://schemas.microsoft.com/office/word/2016/wordml/cid" xmlns:w16="http://schemas.microsoft.com/office/word/2018/wordml" xmlns:w16sdtdh="http://schemas.microsoft.com/office/word/2020/wordml/sdtdatahash" xmlns:w16sdtfl="http://schemas.microsoft.com/office/word/2024/wordml/sdtformatlock" xmlns:w16se="http://schemas.microsoft.com/office/word/2015/wordml/symex" xmlns:w16du="http://schemas.microsoft.com/office/word/2023/wordml/word16du" xmlns:wne="http://schemas.microsoft.com/office/word/2006/wordml" mc:Ignorable="w14 w15 w16se w16cid w16 w16cex w16sdtdh w16sdtfl w16du wp14">
   <w:p>
     <w:pPr>
       <w:pStyle w:val="Footer"/>
@@ -7135,7 +11344,7 @@
 </file>
 
 <file path=word/footnotes.xml><?xml version="1.0" encoding="utf-8"?>
-<w:footnotes xmlns:wpc="http://schemas.microsoft.com/office/word/2010/wordprocessingCanvas" xmlns:cx="http://schemas.microsoft.com/office/drawing/2014/chartex" xmlns:cx1="http://schemas.microsoft.com/office/drawing/2015/9/8/chartex" xmlns:cx2="http://schemas.microsoft.com/office/drawing/2015/10/21/chartex" xmlns:cx3="http://schemas.microsoft.com/office/drawing/2016/5/9/chartex" xmlns:cx4="http://schemas.microsoft.com/office/drawing/2016/5/10/chartex" xmlns:cx5="http://schemas.microsoft.com/office/drawing/2016/5/11/chartex" xmlns:cx6="http://schemas.microsoft.com/office/drawing/2016/5/12/chartex" xmlns:cx7="http://schemas.microsoft.com/office/drawing/2016/5/13/chartex" xmlns:cx8="http://schemas.microsoft.com/office/drawing/2016/5/14/chartex" xmlns:mc="http://schemas.openxmlformats.org/markup-compatibility/2006" xmlns:aink="http://schemas.microsoft.com/office/drawing/2016/ink" xmlns:am3d="http://schemas.microsoft.com/office/drawing/2017/model3d" xmlns:o="urn:schemas-microsoft-com:office:office" xmlns:oel="http://schemas.microsoft.com/office/2019/extlst" xmlns:r="http://schemas.openxmlformats.org/officeDocument/2006/relationships" xmlns:m="http://schemas.openxmlformats.org/officeDocument/2006/math" xmlns:v="urn:schemas-microsoft-com:vml" xmlns:wp14="http://schemas.microsoft.com/office/word/2010/wordprocessingDrawing" xmlns:wp="http://schemas.openxmlformats.org/drawingml/2006/wordprocessingDrawing" xmlns:w10="urn:schemas-microsoft-com:office:word" xmlns:w="http://schemas.openxmlformats.org/wordprocessingml/2006/main" xmlns:w14="http://schemas.microsoft.com/office/word/2010/wordml" xmlns:w15="http://schemas.microsoft.com/office/word/2012/wordml" xmlns:w16cex="http://schemas.microsoft.com/office/word/2018/wordml/cex" xmlns:w16cid="http://schemas.microsoft.com/office/word/2016/wordml/cid" xmlns:w16="http://schemas.microsoft.com/office/word/2018/wordml" xmlns:w16du="http://schemas.microsoft.com/office/word/2023/wordml/word16du" xmlns:w16sdtdh="http://schemas.microsoft.com/office/word/2020/wordml/sdtdatahash" xmlns:w16sdtfl="http://schemas.microsoft.com/office/word/2024/wordml/sdtformatlock" xmlns:w16se="http://schemas.microsoft.com/office/word/2015/wordml/symex" xmlns:wpg="http://schemas.microsoft.com/office/word/2010/wordprocessingGroup" xmlns:wpi="http://schemas.microsoft.com/office/word/2010/wordprocessingInk" xmlns:wne="http://schemas.microsoft.com/office/word/2006/wordml" xmlns:wps="http://schemas.microsoft.com/office/word/2010/wordprocessingShape" mc:Ignorable="w14 w15 w16se w16cid w16 w16cex w16sdtdh w16sdtfl w16du wp14">
+<w:footnotes xmlns:wpc="http://schemas.microsoft.com/office/word/2010/wordprocessingCanvas" xmlns:cx="http://schemas.microsoft.com/office/drawing/2014/chartex" xmlns:cx1="http://schemas.microsoft.com/office/drawing/2015/9/8/chartex" xmlns:cx2="http://schemas.microsoft.com/office/drawing/2015/10/21/chartex" xmlns:cx3="http://schemas.microsoft.com/office/drawing/2016/5/9/chartex" xmlns:cx4="http://schemas.microsoft.com/office/drawing/2016/5/10/chartex" xmlns:cx5="http://schemas.microsoft.com/office/drawing/2016/5/11/chartex" xmlns:cx6="http://schemas.microsoft.com/office/drawing/2016/5/12/chartex" xmlns:cx7="http://schemas.microsoft.com/office/drawing/2016/5/13/chartex" xmlns:cx8="http://schemas.microsoft.com/office/drawing/2016/5/14/chartex" xmlns:mc="http://schemas.openxmlformats.org/markup-compatibility/2006" xmlns:m="http://schemas.openxmlformats.org/officeDocument/2006/math" xmlns:aink="http://schemas.microsoft.com/office/drawing/2016/ink" xmlns:am3d="http://schemas.microsoft.com/office/drawing/2017/model3d" xmlns:oel="http://schemas.microsoft.com/office/2019/extlst" xmlns:r="http://schemas.openxmlformats.org/officeDocument/2006/relationships" xmlns:wp14="http://schemas.microsoft.com/office/word/2010/wordprocessingDrawing" xmlns:wp="http://schemas.openxmlformats.org/drawingml/2006/wordprocessingDrawing" xmlns:wpg="http://schemas.microsoft.com/office/word/2010/wordprocessingGroup" xmlns:wpi="http://schemas.microsoft.com/office/word/2010/wordprocessingInk" xmlns:wps="http://schemas.microsoft.com/office/word/2010/wordprocessingShape" xmlns:o="urn:schemas-microsoft-com:office:office" xmlns:v="urn:schemas-microsoft-com:vml" xmlns:w10="urn:schemas-microsoft-com:office:word" xmlns:w="http://schemas.openxmlformats.org/wordprocessingml/2006/main" xmlns:w14="http://schemas.microsoft.com/office/word/2010/wordml" xmlns:w15="http://schemas.microsoft.com/office/word/2012/wordml" xmlns:w16cex="http://schemas.microsoft.com/office/word/2018/wordml/cex" xmlns:w16cid="http://schemas.microsoft.com/office/word/2016/wordml/cid" xmlns:w16="http://schemas.microsoft.com/office/word/2018/wordml" xmlns:w16sdtdh="http://schemas.microsoft.com/office/word/2020/wordml/sdtdatahash" xmlns:w16sdtfl="http://schemas.microsoft.com/office/word/2024/wordml/sdtformatlock" xmlns:w16se="http://schemas.microsoft.com/office/word/2015/wordml/symex" xmlns:w16du="http://schemas.microsoft.com/office/word/2023/wordml/word16du" xmlns:wne="http://schemas.microsoft.com/office/word/2006/wordml" mc:Ignorable="w14 w15 w16se w16cid w16 w16cex w16sdtdh w16sdtfl w16du wp14">
   <w:footnote w:type="separator" w:id="-1">
     <w:p>
       <w:r>
@@ -7154,7 +11363,7 @@
 </file>
 
 <file path=word/header1.xml><?xml version="1.0" encoding="utf-8"?>
-<w:hdr xmlns:wpc="http://schemas.microsoft.com/office/word/2010/wordprocessingCanvas" xmlns:cx="http://schemas.microsoft.com/office/drawing/2014/chartex" xmlns:cx1="http://schemas.microsoft.com/office/drawing/2015/9/8/chartex" xmlns:cx2="http://schemas.microsoft.com/office/drawing/2015/10/21/chartex" xmlns:cx3="http://schemas.microsoft.com/office/drawing/2016/5/9/chartex" xmlns:cx4="http://schemas.microsoft.com/office/drawing/2016/5/10/chartex" xmlns:cx5="http://schemas.microsoft.com/office/drawing/2016/5/11/chartex" xmlns:cx6="http://schemas.microsoft.com/office/drawing/2016/5/12/chartex" xmlns:cx7="http://schemas.microsoft.com/office/drawing/2016/5/13/chartex" xmlns:cx8="http://schemas.microsoft.com/office/drawing/2016/5/14/chartex" xmlns:mc="http://schemas.openxmlformats.org/markup-compatibility/2006" xmlns:aink="http://schemas.microsoft.com/office/drawing/2016/ink" xmlns:am3d="http://schemas.microsoft.com/office/drawing/2017/model3d" xmlns:o="urn:schemas-microsoft-com:office:office" xmlns:oel="http://schemas.microsoft.com/office/2019/extlst" xmlns:r="http://schemas.openxmlformats.org/officeDocument/2006/relationships" xmlns:m="http://schemas.openxmlformats.org/officeDocument/2006/math" xmlns:v="urn:schemas-microsoft-com:vml" xmlns:wp14="http://schemas.microsoft.com/office/word/2010/wordprocessingDrawing" xmlns:wp="http://schemas.openxmlformats.org/drawingml/2006/wordprocessingDrawing" xmlns:w10="urn:schemas-microsoft-com:office:word" xmlns:w="http://schemas.openxmlformats.org/wordprocessingml/2006/main" xmlns:w14="http://schemas.microsoft.com/office/word/2010/wordml" xmlns:w15="http://schemas.microsoft.com/office/word/2012/wordml" xmlns:w16cex="http://schemas.microsoft.com/office/word/2018/wordml/cex" xmlns:w16cid="http://schemas.microsoft.com/office/word/2016/wordml/cid" xmlns:w16="http://schemas.microsoft.com/office/word/2018/wordml" xmlns:w16du="http://schemas.microsoft.com/office/word/2023/wordml/word16du" xmlns:w16sdtdh="http://schemas.microsoft.com/office/word/2020/wordml/sdtdatahash" xmlns:w16sdtfl="http://schemas.microsoft.com/office/word/2024/wordml/sdtformatlock" xmlns:w16se="http://schemas.microsoft.com/office/word/2015/wordml/symex" xmlns:wpg="http://schemas.microsoft.com/office/word/2010/wordprocessingGroup" xmlns:wpi="http://schemas.microsoft.com/office/word/2010/wordprocessingInk" xmlns:wne="http://schemas.microsoft.com/office/word/2006/wordml" xmlns:wps="http://schemas.microsoft.com/office/word/2010/wordprocessingShape" mc:Ignorable="w14 w15 w16se w16cid w16 w16cex w16sdtdh w16sdtfl w16du wp14">
+<w:hdr xmlns:wpc="http://schemas.microsoft.com/office/word/2010/wordprocessingCanvas" xmlns:cx="http://schemas.microsoft.com/office/drawing/2014/chartex" xmlns:cx1="http://schemas.microsoft.com/office/drawing/2015/9/8/chartex" xmlns:cx2="http://schemas.microsoft.com/office/drawing/2015/10/21/chartex" xmlns:cx3="http://schemas.microsoft.com/office/drawing/2016/5/9/chartex" xmlns:cx4="http://schemas.microsoft.com/office/drawing/2016/5/10/chartex" xmlns:cx5="http://schemas.microsoft.com/office/drawing/2016/5/11/chartex" xmlns:cx6="http://schemas.microsoft.com/office/drawing/2016/5/12/chartex" xmlns:cx7="http://schemas.microsoft.com/office/drawing/2016/5/13/chartex" xmlns:cx8="http://schemas.microsoft.com/office/drawing/2016/5/14/chartex" xmlns:mc="http://schemas.openxmlformats.org/markup-compatibility/2006" xmlns:m="http://schemas.openxmlformats.org/officeDocument/2006/math" xmlns:aink="http://schemas.microsoft.com/office/drawing/2016/ink" xmlns:am3d="http://schemas.microsoft.com/office/drawing/2017/model3d" xmlns:oel="http://schemas.microsoft.com/office/2019/extlst" xmlns:r="http://schemas.openxmlformats.org/officeDocument/2006/relationships" xmlns:wp14="http://schemas.microsoft.com/office/word/2010/wordprocessingDrawing" xmlns:wp="http://schemas.openxmlformats.org/drawingml/2006/wordprocessingDrawing" xmlns:wpg="http://schemas.microsoft.com/office/word/2010/wordprocessingGroup" xmlns:wpi="http://schemas.microsoft.com/office/word/2010/wordprocessingInk" xmlns:wps="http://schemas.microsoft.com/office/word/2010/wordprocessingShape" xmlns:o="urn:schemas-microsoft-com:office:office" xmlns:v="urn:schemas-microsoft-com:vml" xmlns:w10="urn:schemas-microsoft-com:office:word" xmlns:w="http://schemas.openxmlformats.org/wordprocessingml/2006/main" xmlns:w14="http://schemas.microsoft.com/office/word/2010/wordml" xmlns:w15="http://schemas.microsoft.com/office/word/2012/wordml" xmlns:w16cex="http://schemas.microsoft.com/office/word/2018/wordml/cex" xmlns:w16cid="http://schemas.microsoft.com/office/word/2016/wordml/cid" xmlns:w16="http://schemas.microsoft.com/office/word/2018/wordml" xmlns:w16sdtdh="http://schemas.microsoft.com/office/word/2020/wordml/sdtdatahash" xmlns:w16sdtfl="http://schemas.microsoft.com/office/word/2024/wordml/sdtformatlock" xmlns:w16se="http://schemas.microsoft.com/office/word/2015/wordml/symex" xmlns:w16du="http://schemas.microsoft.com/office/word/2023/wordml/word16du" xmlns:wne="http://schemas.microsoft.com/office/word/2006/wordml" mc:Ignorable="w14 w15 w16se w16cid w16 w16cex w16sdtdh w16sdtfl w16du wp14">
   <w:p>
     <w:pPr>
       <w:pStyle w:val="Header"/>
@@ -7164,7 +11373,7 @@
 </file>
 
 <file path=word/header2.xml><?xml version="1.0" encoding="utf-8"?>
-<w:hdr xmlns:wpc="http://schemas.microsoft.com/office/word/2010/wordprocessingCanvas" xmlns:cx="http://schemas.microsoft.com/office/drawing/2014/chartex" xmlns:cx1="http://schemas.microsoft.com/office/drawing/2015/9/8/chartex" xmlns:cx2="http://schemas.microsoft.com/office/drawing/2015/10/21/chartex" xmlns:cx3="http://schemas.microsoft.com/office/drawing/2016/5/9/chartex" xmlns:cx4="http://schemas.microsoft.com/office/drawing/2016/5/10/chartex" xmlns:cx5="http://schemas.microsoft.com/office/drawing/2016/5/11/chartex" xmlns:cx6="http://schemas.microsoft.com/office/drawing/2016/5/12/chartex" xmlns:cx7="http://schemas.microsoft.com/office/drawing/2016/5/13/chartex" xmlns:cx8="http://schemas.microsoft.com/office/drawing/2016/5/14/chartex" xmlns:mc="http://schemas.openxmlformats.org/markup-compatibility/2006" xmlns:aink="http://schemas.microsoft.com/office/drawing/2016/ink" xmlns:am3d="http://schemas.microsoft.com/office/drawing/2017/model3d" xmlns:o="urn:schemas-microsoft-com:office:office" xmlns:oel="http://schemas.microsoft.com/office/2019/extlst" xmlns:r="http://schemas.openxmlformats.org/officeDocument/2006/relationships" xmlns:m="http://schemas.openxmlformats.org/officeDocument/2006/math" xmlns:v="urn:schemas-microsoft-com:vml" xmlns:wp14="http://schemas.microsoft.com/office/word/2010/wordprocessingDrawing" xmlns:wp="http://schemas.openxmlformats.org/drawingml/2006/wordprocessingDrawing" xmlns:w10="urn:schemas-microsoft-com:office:word" xmlns:w="http://schemas.openxmlformats.org/wordprocessingml/2006/main" xmlns:w14="http://schemas.microsoft.com/office/word/2010/wordml" xmlns:w15="http://schemas.microsoft.com/office/word/2012/wordml" xmlns:w16cex="http://schemas.microsoft.com/office/word/2018/wordml/cex" xmlns:w16cid="http://schemas.microsoft.com/office/word/2016/wordml/cid" xmlns:w16="http://schemas.microsoft.com/office/word/2018/wordml" xmlns:w16du="http://schemas.microsoft.com/office/word/2023/wordml/word16du" xmlns:w16sdtdh="http://schemas.microsoft.com/office/word/2020/wordml/sdtdatahash" xmlns:w16sdtfl="http://schemas.microsoft.com/office/word/2024/wordml/sdtformatlock" xmlns:w16se="http://schemas.microsoft.com/office/word/2015/wordml/symex" xmlns:wpg="http://schemas.microsoft.com/office/word/2010/wordprocessingGroup" xmlns:wpi="http://schemas.microsoft.com/office/word/2010/wordprocessingInk" xmlns:wne="http://schemas.microsoft.com/office/word/2006/wordml" xmlns:wps="http://schemas.microsoft.com/office/word/2010/wordprocessingShape" mc:Ignorable="w14 w15 w16se w16cid w16 w16cex w16sdtdh w16sdtfl w16du wp14">
+<w:hdr xmlns:wpc="http://schemas.microsoft.com/office/word/2010/wordprocessingCanvas" xmlns:cx="http://schemas.microsoft.com/office/drawing/2014/chartex" xmlns:cx1="http://schemas.microsoft.com/office/drawing/2015/9/8/chartex" xmlns:cx2="http://schemas.microsoft.com/office/drawing/2015/10/21/chartex" xmlns:cx3="http://schemas.microsoft.com/office/drawing/2016/5/9/chartex" xmlns:cx4="http://schemas.microsoft.com/office/drawing/2016/5/10/chartex" xmlns:cx5="http://schemas.microsoft.com/office/drawing/2016/5/11/chartex" xmlns:cx6="http://schemas.microsoft.com/office/drawing/2016/5/12/chartex" xmlns:cx7="http://schemas.microsoft.com/office/drawing/2016/5/13/chartex" xmlns:cx8="http://schemas.microsoft.com/office/drawing/2016/5/14/chartex" xmlns:mc="http://schemas.openxmlformats.org/markup-compatibility/2006" xmlns:m="http://schemas.openxmlformats.org/officeDocument/2006/math" xmlns:aink="http://schemas.microsoft.com/office/drawing/2016/ink" xmlns:am3d="http://schemas.microsoft.com/office/drawing/2017/model3d" xmlns:oel="http://schemas.microsoft.com/office/2019/extlst" xmlns:r="http://schemas.openxmlformats.org/officeDocument/2006/relationships" xmlns:wp14="http://schemas.microsoft.com/office/word/2010/wordprocessingDrawing" xmlns:wp="http://schemas.openxmlformats.org/drawingml/2006/wordprocessingDrawing" xmlns:wpg="http://schemas.microsoft.com/office/word/2010/wordprocessingGroup" xmlns:wpi="http://schemas.microsoft.com/office/word/2010/wordprocessingInk" xmlns:wps="http://schemas.microsoft.com/office/word/2010/wordprocessingShape" xmlns:o="urn:schemas-microsoft-com:office:office" xmlns:v="urn:schemas-microsoft-com:vml" xmlns:w10="urn:schemas-microsoft-com:office:word" xmlns:w="http://schemas.openxmlformats.org/wordprocessingml/2006/main" xmlns:w14="http://schemas.microsoft.com/office/word/2010/wordml" xmlns:w15="http://schemas.microsoft.com/office/word/2012/wordml" xmlns:w16cex="http://schemas.microsoft.com/office/word/2018/wordml/cex" xmlns:w16cid="http://schemas.microsoft.com/office/word/2016/wordml/cid" xmlns:w16="http://schemas.microsoft.com/office/word/2018/wordml" xmlns:w16sdtdh="http://schemas.microsoft.com/office/word/2020/wordml/sdtdatahash" xmlns:w16sdtfl="http://schemas.microsoft.com/office/word/2024/wordml/sdtformatlock" xmlns:w16se="http://schemas.microsoft.com/office/word/2015/wordml/symex" xmlns:w16du="http://schemas.microsoft.com/office/word/2023/wordml/word16du" xmlns:wne="http://schemas.microsoft.com/office/word/2006/wordml" mc:Ignorable="w14 w15 w16se w16cid w16 w16cex w16sdtdh w16sdtfl w16du wp14">
   <w:p>
     <w:pPr>
       <w:pStyle w:val="Header"/>
@@ -7224,7 +11433,7 @@
 </file>
 
 <file path=word/header3.xml><?xml version="1.0" encoding="utf-8"?>
-<w:hdr xmlns:wpc="http://schemas.microsoft.com/office/word/2010/wordprocessingCanvas" xmlns:cx="http://schemas.microsoft.com/office/drawing/2014/chartex" xmlns:cx1="http://schemas.microsoft.com/office/drawing/2015/9/8/chartex" xmlns:cx2="http://schemas.microsoft.com/office/drawing/2015/10/21/chartex" xmlns:cx3="http://schemas.microsoft.com/office/drawing/2016/5/9/chartex" xmlns:cx4="http://schemas.microsoft.com/office/drawing/2016/5/10/chartex" xmlns:cx5="http://schemas.microsoft.com/office/drawing/2016/5/11/chartex" xmlns:cx6="http://schemas.microsoft.com/office/drawing/2016/5/12/chartex" xmlns:cx7="http://schemas.microsoft.com/office/drawing/2016/5/13/chartex" xmlns:cx8="http://schemas.microsoft.com/office/drawing/2016/5/14/chartex" xmlns:mc="http://schemas.openxmlformats.org/markup-compatibility/2006" xmlns:aink="http://schemas.microsoft.com/office/drawing/2016/ink" xmlns:am3d="http://schemas.microsoft.com/office/drawing/2017/model3d" xmlns:o="urn:schemas-microsoft-com:office:office" xmlns:oel="http://schemas.microsoft.com/office/2019/extlst" xmlns:r="http://schemas.openxmlformats.org/officeDocument/2006/relationships" xmlns:m="http://schemas.openxmlformats.org/officeDocument/2006/math" xmlns:v="urn:schemas-microsoft-com:vml" xmlns:wp14="http://schemas.microsoft.com/office/word/2010/wordprocessingDrawing" xmlns:wp="http://schemas.openxmlformats.org/drawingml/2006/wordprocessingDrawing" xmlns:w10="urn:schemas-microsoft-com:office:word" xmlns:w="http://schemas.openxmlformats.org/wordprocessingml/2006/main" xmlns:w14="http://schemas.microsoft.com/office/word/2010/wordml" xmlns:w15="http://schemas.microsoft.com/office/word/2012/wordml" xmlns:w16cex="http://schemas.microsoft.com/office/word/2018/wordml/cex" xmlns:w16cid="http://schemas.microsoft.com/office/word/2016/wordml/cid" xmlns:w16="http://schemas.microsoft.com/office/word/2018/wordml" xmlns:w16du="http://schemas.microsoft.com/office/word/2023/wordml/word16du" xmlns:w16sdtdh="http://schemas.microsoft.com/office/word/2020/wordml/sdtdatahash" xmlns:w16sdtfl="http://schemas.microsoft.com/office/word/2024/wordml/sdtformatlock" xmlns:w16se="http://schemas.microsoft.com/office/word/2015/wordml/symex" xmlns:wpg="http://schemas.microsoft.com/office/word/2010/wordprocessingGroup" xmlns:wpi="http://schemas.microsoft.com/office/word/2010/wordprocessingInk" xmlns:wne="http://schemas.microsoft.com/office/word/2006/wordml" xmlns:wps="http://schemas.microsoft.com/office/word/2010/wordprocessingShape" mc:Ignorable="w14 w15 w16se w16cid w16 w16cex w16sdtdh w16sdtfl w16du wp14">
+<w:hdr xmlns:wpc="http://schemas.microsoft.com/office/word/2010/wordprocessingCanvas" xmlns:cx="http://schemas.microsoft.com/office/drawing/2014/chartex" xmlns:cx1="http://schemas.microsoft.com/office/drawing/2015/9/8/chartex" xmlns:cx2="http://schemas.microsoft.com/office/drawing/2015/10/21/chartex" xmlns:cx3="http://schemas.microsoft.com/office/drawing/2016/5/9/chartex" xmlns:cx4="http://schemas.microsoft.com/office/drawing/2016/5/10/chartex" xmlns:cx5="http://schemas.microsoft.com/office/drawing/2016/5/11/chartex" xmlns:cx6="http://schemas.microsoft.com/office/drawing/2016/5/12/chartex" xmlns:cx7="http://schemas.microsoft.com/office/drawing/2016/5/13/chartex" xmlns:cx8="http://schemas.microsoft.com/office/drawing/2016/5/14/chartex" xmlns:mc="http://schemas.openxmlformats.org/markup-compatibility/2006" xmlns:m="http://schemas.openxmlformats.org/officeDocument/2006/math" xmlns:aink="http://schemas.microsoft.com/office/drawing/2016/ink" xmlns:am3d="http://schemas.microsoft.com/office/drawing/2017/model3d" xmlns:oel="http://schemas.microsoft.com/office/2019/extlst" xmlns:r="http://schemas.openxmlformats.org/officeDocument/2006/relationships" xmlns:wp14="http://schemas.microsoft.com/office/word/2010/wordprocessingDrawing" xmlns:wp="http://schemas.openxmlformats.org/drawingml/2006/wordprocessingDrawing" xmlns:wpg="http://schemas.microsoft.com/office/word/2010/wordprocessingGroup" xmlns:wpi="http://schemas.microsoft.com/office/word/2010/wordprocessingInk" xmlns:wps="http://schemas.microsoft.com/office/word/2010/wordprocessingShape" xmlns:o="urn:schemas-microsoft-com:office:office" xmlns:v="urn:schemas-microsoft-com:vml" xmlns:w10="urn:schemas-microsoft-com:office:word" xmlns:w="http://schemas.openxmlformats.org/wordprocessingml/2006/main" xmlns:w14="http://schemas.microsoft.com/office/word/2010/wordml" xmlns:w15="http://schemas.microsoft.com/office/word/2012/wordml" xmlns:w16cex="http://schemas.microsoft.com/office/word/2018/wordml/cex" xmlns:w16cid="http://schemas.microsoft.com/office/word/2016/wordml/cid" xmlns:w16="http://schemas.microsoft.com/office/word/2018/wordml" xmlns:w16sdtdh="http://schemas.microsoft.com/office/word/2020/wordml/sdtdatahash" xmlns:w16sdtfl="http://schemas.microsoft.com/office/word/2024/wordml/sdtformatlock" xmlns:w16se="http://schemas.microsoft.com/office/word/2015/wordml/symex" xmlns:w16du="http://schemas.microsoft.com/office/word/2023/wordml/word16du" xmlns:wne="http://schemas.microsoft.com/office/word/2006/wordml" mc:Ignorable="w14 w15 w16se w16cid w16 w16cex w16sdtdh w16sdtfl w16du wp14">
   <w:p>
     <w:pPr>
       <w:pStyle w:val="Header"/>
@@ -7272,7 +11481,7 @@
 </file>
 
 <file path=word/styles.xml><?xml version="1.0" encoding="utf-8"?>
-<w:styles xmlns:mc="http://schemas.openxmlformats.org/markup-compatibility/2006" xmlns:r="http://schemas.openxmlformats.org/officeDocument/2006/relationships" xmlns:w="http://schemas.openxmlformats.org/wordprocessingml/2006/main" xmlns:w14="http://schemas.microsoft.com/office/word/2010/wordml" xmlns:w15="http://schemas.microsoft.com/office/word/2012/wordml" xmlns:w16cex="http://schemas.microsoft.com/office/word/2018/wordml/cex" xmlns:w16cid="http://schemas.microsoft.com/office/word/2016/wordml/cid" xmlns:w16="http://schemas.microsoft.com/office/word/2018/wordml" xmlns:w16du="http://schemas.microsoft.com/office/word/2023/wordml/word16du" xmlns:w16sdtdh="http://schemas.microsoft.com/office/word/2020/wordml/sdtdatahash" xmlns:w16sdtfl="http://schemas.microsoft.com/office/word/2024/wordml/sdtformatlock" xmlns:w16se="http://schemas.microsoft.com/office/word/2015/wordml/symex" mc:Ignorable="w14 w15 w16se w16cid w16 w16cex w16sdtdh w16sdtfl w16du">
+<w:styles xmlns:mc="http://schemas.openxmlformats.org/markup-compatibility/2006" xmlns:r="http://schemas.openxmlformats.org/officeDocument/2006/relationships" xmlns:w="http://schemas.openxmlformats.org/wordprocessingml/2006/main" xmlns:w14="http://schemas.microsoft.com/office/word/2010/wordml" xmlns:w15="http://schemas.microsoft.com/office/word/2012/wordml" xmlns:w16cex="http://schemas.microsoft.com/office/word/2018/wordml/cex" xmlns:w16cid="http://schemas.microsoft.com/office/word/2016/wordml/cid" xmlns:w16="http://schemas.microsoft.com/office/word/2018/wordml" xmlns:w16sdtdh="http://schemas.microsoft.com/office/word/2020/wordml/sdtdatahash" xmlns:w16sdtfl="http://schemas.microsoft.com/office/word/2024/wordml/sdtformatlock" xmlns:w16se="http://schemas.microsoft.com/office/word/2015/wordml/symex" xmlns:w16du="http://schemas.microsoft.com/office/word/2023/wordml/word16du" mc:Ignorable="w14 w15 w16se w16cid w16 w16cex w16sdtdh w16sdtfl w16du">
   <w:docDefaults>
     <w:rPrDefault>
       <w:rPr>

</xml_diff>

<commit_message>
Added section 6 and use case diagrams
</commit_message>
<xml_diff>
--- a/docs/phase-3/COSC336_Group6_Phase3_SRS_v1.1 part1.docx
+++ b/docs/phase-3/COSC336_Group6_Phase3_SRS_v1.1 part1.docx
@@ -1,6 +1,6 @@
 
 <file path=word/document.xml><?xml version="1.0" encoding="utf-8"?>
-<w:document xmlns:wpc="http://schemas.microsoft.com/office/word/2010/wordprocessingCanvas" xmlns:cx="http://schemas.microsoft.com/office/drawing/2014/chartex" xmlns:cx1="http://schemas.microsoft.com/office/drawing/2015/9/8/chartex" xmlns:cx2="http://schemas.microsoft.com/office/drawing/2015/10/21/chartex" xmlns:cx3="http://schemas.microsoft.com/office/drawing/2016/5/9/chartex" xmlns:cx4="http://schemas.microsoft.com/office/drawing/2016/5/10/chartex" xmlns:cx5="http://schemas.microsoft.com/office/drawing/2016/5/11/chartex" xmlns:cx6="http://schemas.microsoft.com/office/drawing/2016/5/12/chartex" xmlns:cx7="http://schemas.microsoft.com/office/drawing/2016/5/13/chartex" xmlns:cx8="http://schemas.microsoft.com/office/drawing/2016/5/14/chartex" xmlns:mc="http://schemas.openxmlformats.org/markup-compatibility/2006" xmlns:m="http://schemas.openxmlformats.org/officeDocument/2006/math" xmlns:aink="http://schemas.microsoft.com/office/drawing/2016/ink" xmlns:am3d="http://schemas.microsoft.com/office/drawing/2017/model3d" xmlns:oel="http://schemas.microsoft.com/office/2019/extlst" xmlns:r="http://schemas.openxmlformats.org/officeDocument/2006/relationships" xmlns:wp14="http://schemas.microsoft.com/office/word/2010/wordprocessingDrawing" xmlns:wp="http://schemas.openxmlformats.org/drawingml/2006/wordprocessingDrawing" xmlns:wpg="http://schemas.microsoft.com/office/word/2010/wordprocessingGroup" xmlns:wpi="http://schemas.microsoft.com/office/word/2010/wordprocessingInk" xmlns:wps="http://schemas.microsoft.com/office/word/2010/wordprocessingShape" xmlns:o="urn:schemas-microsoft-com:office:office" xmlns:v="urn:schemas-microsoft-com:vml" xmlns:w10="urn:schemas-microsoft-com:office:word" xmlns:w="http://schemas.openxmlformats.org/wordprocessingml/2006/main" xmlns:w14="http://schemas.microsoft.com/office/word/2010/wordml" xmlns:w15="http://schemas.microsoft.com/office/word/2012/wordml" xmlns:w16cex="http://schemas.microsoft.com/office/word/2018/wordml/cex" xmlns:w16cid="http://schemas.microsoft.com/office/word/2016/wordml/cid" xmlns:w16="http://schemas.microsoft.com/office/word/2018/wordml" xmlns:w16sdtdh="http://schemas.microsoft.com/office/word/2020/wordml/sdtdatahash" xmlns:w16sdtfl="http://schemas.microsoft.com/office/word/2024/wordml/sdtformatlock" xmlns:w16se="http://schemas.microsoft.com/office/word/2015/wordml/symex" xmlns:w16du="http://schemas.microsoft.com/office/word/2023/wordml/word16du" xmlns:wne="http://schemas.microsoft.com/office/word/2006/wordml" mc:Ignorable="w14 w15 w16se w16cid w16 w16cex w16sdtdh w16sdtfl w16du wp14">
+<w:document xmlns:wpc="http://schemas.microsoft.com/office/word/2010/wordprocessingCanvas" xmlns:cx="http://schemas.microsoft.com/office/drawing/2014/chartex" xmlns:cx1="http://schemas.microsoft.com/office/drawing/2015/9/8/chartex" xmlns:cx2="http://schemas.microsoft.com/office/drawing/2015/10/21/chartex" xmlns:cx3="http://schemas.microsoft.com/office/drawing/2016/5/9/chartex" xmlns:cx4="http://schemas.microsoft.com/office/drawing/2016/5/10/chartex" xmlns:cx5="http://schemas.microsoft.com/office/drawing/2016/5/11/chartex" xmlns:cx6="http://schemas.microsoft.com/office/drawing/2016/5/12/chartex" xmlns:cx7="http://schemas.microsoft.com/office/drawing/2016/5/13/chartex" xmlns:cx8="http://schemas.microsoft.com/office/drawing/2016/5/14/chartex" xmlns:mc="http://schemas.openxmlformats.org/markup-compatibility/2006" xmlns:aink="http://schemas.microsoft.com/office/drawing/2016/ink" xmlns:am3d="http://schemas.microsoft.com/office/drawing/2017/model3d" xmlns:o="urn:schemas-microsoft-com:office:office" xmlns:oel="http://schemas.microsoft.com/office/2019/extlst" xmlns:r="http://schemas.openxmlformats.org/officeDocument/2006/relationships" xmlns:m="http://schemas.openxmlformats.org/officeDocument/2006/math" xmlns:v="urn:schemas-microsoft-com:vml" xmlns:wp14="http://schemas.microsoft.com/office/word/2010/wordprocessingDrawing" xmlns:wp="http://schemas.openxmlformats.org/drawingml/2006/wordprocessingDrawing" xmlns:w10="urn:schemas-microsoft-com:office:word" xmlns:w="http://schemas.openxmlformats.org/wordprocessingml/2006/main" xmlns:w14="http://schemas.microsoft.com/office/word/2010/wordml" xmlns:w15="http://schemas.microsoft.com/office/word/2012/wordml" xmlns:w16cex="http://schemas.microsoft.com/office/word/2018/wordml/cex" xmlns:w16cid="http://schemas.microsoft.com/office/word/2016/wordml/cid" xmlns:w16="http://schemas.microsoft.com/office/word/2018/wordml" xmlns:w16du="http://schemas.microsoft.com/office/word/2023/wordml/word16du" xmlns:w16sdtdh="http://schemas.microsoft.com/office/word/2020/wordml/sdtdatahash" xmlns:w16sdtfl="http://schemas.microsoft.com/office/word/2024/wordml/sdtformatlock" xmlns:w16se="http://schemas.microsoft.com/office/word/2015/wordml/symex" xmlns:wpg="http://schemas.microsoft.com/office/word/2010/wordprocessingGroup" xmlns:wpi="http://schemas.microsoft.com/office/word/2010/wordprocessingInk" xmlns:wne="http://schemas.microsoft.com/office/word/2006/wordml" xmlns:wps="http://schemas.microsoft.com/office/word/2010/wordprocessingShape" mc:Ignorable="w14 w15 w16se w16cid w16 w16cex w16sdtdh w16sdtfl w16du wp14">
   <w:body>
     <w:p>
       <w:pPr>
@@ -11214,21 +11214,4411 @@
     <w:p>
       <w:pPr>
         <w:spacing w:after="60" w:line="260" w:lineRule="exact"/>
-      </w:pPr>
-      <w:r>
         <w:rPr>
           <w:sz w:val="22"/>
         </w:rPr>
+      </w:pPr>
+      <w:r>
+        <w:rPr>
+          <w:sz w:val="22"/>
+        </w:rPr>
         <w:t>The role scopes in Section 2.3 implement these rules. Detailed delegation, retention and exception policies remain TBD-006; an AI suggestion, technical role or expired storage period cannot supply missing approval authority.</w:t>
       </w:r>
     </w:p>
     <w:p>
       <w:pPr>
+        <w:spacing w:after="60" w:line="260" w:lineRule="exact"/>
+        <w:rPr>
+          <w:sz w:val="22"/>
+        </w:rPr>
+      </w:pPr>
+    </w:p>
+    <w:p>
+      <w:pPr>
+        <w:pStyle w:val="Heading1"/>
+      </w:pPr>
+      <w:bookmarkStart w:id="37" w:name="SRS_1037"/>
+      <w:r>
+        <w:t>6 Other Requirements</w:t>
+      </w:r>
+      <w:bookmarkEnd w:id="37"/>
+    </w:p>
+    <w:p>
+      <w:pPr>
+        <w:pStyle w:val="Heading2"/>
+      </w:pPr>
+      <w:bookmarkStart w:id="38" w:name="SRS_1038"/>
+      <w:r>
+        <w:t>6.1 AI Requirements and Evaluation</w:t>
+      </w:r>
+      <w:bookmarkEnd w:id="38"/>
+    </w:p>
+    <w:p>
+      <w:pPr>
+        <w:spacing w:after="60" w:line="260" w:lineRule="exact"/>
+      </w:pPr>
+      <w:r>
+        <w:rPr>
+          <w:sz w:val="22"/>
+        </w:rPr>
+        <w:t>These controls apply to every AI feature in Section 4. AI remains advisory; people retain authority for consequential actions. Confidence labels shall not imply calibrated probabilities unless the method has been validated (TBD-004).</w:t>
+      </w:r>
+    </w:p>
+    <w:p>
+      <w:pPr>
         <w:spacing w:after="60" w:line="240" w:lineRule="exact"/>
       </w:pPr>
+      <w:r>
+        <w:rPr>
+          <w:b/>
+          <w:sz w:val="21"/>
+        </w:rPr>
+        <w:t>AI-REQ-</w:t>
+      </w:r>
+      <w:proofErr w:type="gramStart"/>
+      <w:r>
+        <w:rPr>
+          <w:b/>
+          <w:sz w:val="21"/>
+        </w:rPr>
+        <w:t xml:space="preserve">001  </w:t>
+      </w:r>
+      <w:r>
+        <w:rPr>
+          <w:sz w:val="21"/>
+        </w:rPr>
+        <w:t>The</w:t>
+      </w:r>
+      <w:proofErr w:type="gramEnd"/>
+      <w:r>
+        <w:rPr>
+          <w:sz w:val="21"/>
+        </w:rPr>
+        <w:t xml:space="preserve"> system shall record the AI model/version used for each AI output; if the provider does not expose an exact revision, it shall retain the exposed model identifier, application configuration/version and time, marking that limitation.</w:t>
+      </w:r>
+      <w:r>
+        <w:rPr>
+          <w:b/>
+          <w:sz w:val="21"/>
+        </w:rPr>
+        <w:t xml:space="preserve"> Verification: </w:t>
+      </w:r>
+      <w:r>
+        <w:rPr>
+          <w:sz w:val="21"/>
+        </w:rPr>
+        <w:t>Test</w:t>
+      </w:r>
+    </w:p>
+    <w:p>
+      <w:pPr>
+        <w:spacing w:after="60" w:line="240" w:lineRule="exact"/>
+      </w:pPr>
+      <w:r>
+        <w:rPr>
+          <w:b/>
+          <w:sz w:val="21"/>
+        </w:rPr>
+        <w:t>AI-REQ-</w:t>
+      </w:r>
+      <w:proofErr w:type="gramStart"/>
+      <w:r>
+        <w:rPr>
+          <w:b/>
+          <w:sz w:val="21"/>
+        </w:rPr>
+        <w:t xml:space="preserve">002  </w:t>
+      </w:r>
+      <w:r>
+        <w:rPr>
+          <w:sz w:val="21"/>
+        </w:rPr>
+        <w:t>The</w:t>
+      </w:r>
+      <w:proofErr w:type="gramEnd"/>
+      <w:r>
+        <w:rPr>
+          <w:sz w:val="21"/>
+        </w:rPr>
+        <w:t xml:space="preserve"> system shall provide a non-AI fallback for search and approval workflows.</w:t>
+      </w:r>
+      <w:r>
+        <w:rPr>
+          <w:b/>
+          <w:sz w:val="21"/>
+        </w:rPr>
+        <w:t xml:space="preserve"> Verification: </w:t>
+      </w:r>
+      <w:r>
+        <w:rPr>
+          <w:sz w:val="21"/>
+        </w:rPr>
+        <w:t>Test with AI services disabled</w:t>
+      </w:r>
+    </w:p>
+    <w:p>
+      <w:pPr>
+        <w:spacing w:after="60" w:line="240" w:lineRule="exact"/>
+      </w:pPr>
+      <w:r>
+        <w:rPr>
+          <w:b/>
+          <w:sz w:val="21"/>
+        </w:rPr>
+        <w:t>AI-REQ-</w:t>
+      </w:r>
+      <w:proofErr w:type="gramStart"/>
+      <w:r>
+        <w:rPr>
+          <w:b/>
+          <w:sz w:val="21"/>
+        </w:rPr>
+        <w:t xml:space="preserve">003  </w:t>
+      </w:r>
+      <w:r>
+        <w:rPr>
+          <w:sz w:val="21"/>
+        </w:rPr>
+        <w:t>AI</w:t>
+      </w:r>
+      <w:proofErr w:type="gramEnd"/>
+      <w:r>
+        <w:rPr>
+          <w:sz w:val="21"/>
+        </w:rPr>
+        <w:t xml:space="preserve"> output shall not approve, reserve, release, transfer, change ownership of, or record the donation, recycling, or disposal of an asset; these actions shall require an authorized user (Phase 1, Section 2; BR-002).</w:t>
+      </w:r>
+      <w:r>
+        <w:rPr>
+          <w:b/>
+          <w:sz w:val="21"/>
+        </w:rPr>
+        <w:t xml:space="preserve"> Verification: </w:t>
+      </w:r>
+      <w:r>
+        <w:rPr>
+          <w:sz w:val="21"/>
+        </w:rPr>
+        <w:t>Workflow test</w:t>
+      </w:r>
+    </w:p>
+    <w:p>
+      <w:pPr>
+        <w:spacing w:after="60" w:line="240" w:lineRule="exact"/>
+      </w:pPr>
+      <w:r>
+        <w:rPr>
+          <w:b/>
+          <w:sz w:val="21"/>
+        </w:rPr>
+        <w:t>AI-REQ-</w:t>
+      </w:r>
+      <w:proofErr w:type="gramStart"/>
+      <w:r>
+        <w:rPr>
+          <w:b/>
+          <w:sz w:val="21"/>
+        </w:rPr>
+        <w:t xml:space="preserve">004  </w:t>
+      </w:r>
+      <w:r>
+        <w:rPr>
+          <w:sz w:val="21"/>
+        </w:rPr>
+        <w:t>The</w:t>
+      </w:r>
+      <w:proofErr w:type="gramEnd"/>
+      <w:r>
+        <w:rPr>
+          <w:sz w:val="21"/>
+        </w:rPr>
+        <w:t xml:space="preserve"> system shall distinguish AI suggestions from confirmed information and show their confidence or uncertainty (project description, Phase 3; Phase 1, </w:t>
+      </w:r>
+      <w:proofErr w:type="spellStart"/>
+      <w:r>
+        <w:rPr>
+          <w:sz w:val="21"/>
+        </w:rPr>
+        <w:t>Reqs</w:t>
+      </w:r>
+      <w:proofErr w:type="spellEnd"/>
+      <w:r>
+        <w:rPr>
+          <w:sz w:val="21"/>
+        </w:rPr>
+        <w:t>. 30-31 and 36).</w:t>
+      </w:r>
+      <w:r>
+        <w:rPr>
+          <w:b/>
+          <w:sz w:val="21"/>
+        </w:rPr>
+        <w:t xml:space="preserve"> Verification: </w:t>
+      </w:r>
+      <w:r>
+        <w:rPr>
+          <w:sz w:val="21"/>
+        </w:rPr>
+        <w:t>Test</w:t>
+      </w:r>
+    </w:p>
+    <w:p>
+      <w:pPr>
+        <w:spacing w:after="60" w:line="240" w:lineRule="exact"/>
+      </w:pPr>
+      <w:r>
+        <w:rPr>
+          <w:b/>
+          <w:sz w:val="21"/>
+        </w:rPr>
+        <w:t>AI-REQ-</w:t>
+      </w:r>
+      <w:proofErr w:type="gramStart"/>
+      <w:r>
+        <w:rPr>
+          <w:b/>
+          <w:sz w:val="21"/>
+        </w:rPr>
+        <w:t xml:space="preserve">005  </w:t>
+      </w:r>
+      <w:r>
+        <w:rPr>
+          <w:sz w:val="21"/>
+        </w:rPr>
+        <w:t>The</w:t>
+      </w:r>
+      <w:proofErr w:type="gramEnd"/>
+      <w:r>
+        <w:rPr>
+          <w:sz w:val="21"/>
+        </w:rPr>
+        <w:t xml:space="preserve"> system shall record each user’s acceptance, correction, rejection, or override of an AI output (Phase 1, </w:t>
+      </w:r>
+      <w:proofErr w:type="spellStart"/>
+      <w:r>
+        <w:rPr>
+          <w:sz w:val="21"/>
+        </w:rPr>
+        <w:t>Reqs</w:t>
+      </w:r>
+      <w:proofErr w:type="spellEnd"/>
+      <w:r>
+        <w:rPr>
+          <w:sz w:val="21"/>
+        </w:rPr>
+        <w:t>. 31, 37, and 42).</w:t>
+      </w:r>
+      <w:r>
+        <w:rPr>
+          <w:b/>
+          <w:sz w:val="21"/>
+        </w:rPr>
+        <w:t xml:space="preserve"> Verification: </w:t>
+      </w:r>
+      <w:r>
+        <w:rPr>
+          <w:sz w:val="21"/>
+        </w:rPr>
+        <w:t>Test</w:t>
+      </w:r>
+    </w:p>
+    <w:p>
+      <w:pPr>
+        <w:spacing w:after="60" w:line="240" w:lineRule="exact"/>
+      </w:pPr>
+      <w:r>
+        <w:rPr>
+          <w:b/>
+          <w:sz w:val="21"/>
+        </w:rPr>
+        <w:t>AI-REQ-</w:t>
+      </w:r>
+      <w:proofErr w:type="gramStart"/>
+      <w:r>
+        <w:rPr>
+          <w:b/>
+          <w:sz w:val="21"/>
+        </w:rPr>
+        <w:t xml:space="preserve">006  </w:t>
+      </w:r>
+      <w:r>
+        <w:rPr>
+          <w:sz w:val="21"/>
+        </w:rPr>
+        <w:t>The</w:t>
+      </w:r>
+      <w:proofErr w:type="gramEnd"/>
+      <w:r>
+        <w:rPr>
+          <w:sz w:val="21"/>
+        </w:rPr>
+        <w:t xml:space="preserve"> application shall check required fields, suitability, available quantities, and permissions before acting on AI output (Phase 2, Section 4.3).</w:t>
+      </w:r>
+      <w:r>
+        <w:rPr>
+          <w:b/>
+          <w:sz w:val="21"/>
+        </w:rPr>
+        <w:t xml:space="preserve"> Verification: </w:t>
+      </w:r>
+      <w:r>
+        <w:rPr>
+          <w:sz w:val="21"/>
+        </w:rPr>
+        <w:t>Test with invalid AI output</w:t>
+      </w:r>
+    </w:p>
+    <w:p>
+      <w:pPr>
+        <w:spacing w:after="60" w:line="240" w:lineRule="exact"/>
+      </w:pPr>
+      <w:r>
+        <w:rPr>
+          <w:b/>
+          <w:sz w:val="21"/>
+        </w:rPr>
+        <w:t>AI-REQ-</w:t>
+      </w:r>
+      <w:proofErr w:type="gramStart"/>
+      <w:r>
+        <w:rPr>
+          <w:b/>
+          <w:sz w:val="21"/>
+        </w:rPr>
+        <w:t xml:space="preserve">007  </w:t>
+      </w:r>
+      <w:r>
+        <w:rPr>
+          <w:sz w:val="21"/>
+        </w:rPr>
+        <w:t>AI</w:t>
+      </w:r>
+      <w:proofErr w:type="gramEnd"/>
+      <w:r>
+        <w:rPr>
+          <w:sz w:val="21"/>
+        </w:rPr>
+        <w:t xml:space="preserve"> matching shall be compared with keyword and category search on the same requests and listings, reporting suitable matches within the first three results and unsuitable suggestions. Before testing, reviewers shall label suitability against the request’s mandatory constraints, independently of the AI output. Classification shall be checked against supplied metadata; sustainable actions, assistant answers and report summaries shall be checked against records, permitted workflows and calculation results.</w:t>
+      </w:r>
+      <w:r>
+        <w:rPr>
+          <w:b/>
+          <w:sz w:val="21"/>
+        </w:rPr>
+        <w:t xml:space="preserve"> Verification: </w:t>
+      </w:r>
+      <w:r>
+        <w:rPr>
+          <w:sz w:val="21"/>
+        </w:rPr>
+        <w:t>Evaluation report with fixed cases, expected outcomes, both result sets, model/configuration, uncertainty and limitations; no unsupported accuracy claim.</w:t>
+      </w:r>
+    </w:p>
+    <w:p>
+      <w:pPr>
+        <w:spacing w:after="60" w:line="240" w:lineRule="exact"/>
+      </w:pPr>
+      <w:r>
+        <w:rPr>
+          <w:b/>
+          <w:sz w:val="21"/>
+        </w:rPr>
+        <w:t>AI-REQ-</w:t>
+      </w:r>
+      <w:proofErr w:type="gramStart"/>
+      <w:r>
+        <w:rPr>
+          <w:b/>
+          <w:sz w:val="21"/>
+        </w:rPr>
+        <w:t xml:space="preserve">008  </w:t>
+      </w:r>
+      <w:r>
+        <w:rPr>
+          <w:sz w:val="21"/>
+        </w:rPr>
+        <w:t>Testing</w:t>
+      </w:r>
+      <w:proofErr w:type="gramEnd"/>
+      <w:r>
+        <w:rPr>
+          <w:sz w:val="21"/>
+        </w:rPr>
+        <w:t xml:space="preserve"> shall check whether recommendations favor </w:t>
+      </w:r>
+      <w:proofErr w:type="gramStart"/>
+      <w:r>
+        <w:rPr>
+          <w:sz w:val="21"/>
+        </w:rPr>
+        <w:t>particular departments</w:t>
+      </w:r>
+      <w:proofErr w:type="gramEnd"/>
+      <w:r>
+        <w:rPr>
+          <w:sz w:val="21"/>
+        </w:rPr>
+        <w:t xml:space="preserve"> without a justified reason (Phase 2, Section 6.2).</w:t>
+      </w:r>
+      <w:r>
+        <w:rPr>
+          <w:b/>
+          <w:sz w:val="21"/>
+        </w:rPr>
+        <w:t xml:space="preserve"> Verification: </w:t>
+      </w:r>
+      <w:r>
+        <w:rPr>
+          <w:sz w:val="21"/>
+        </w:rPr>
+        <w:t>AI evaluation report</w:t>
+      </w:r>
+    </w:p>
+    <w:p>
+      <w:pPr>
+        <w:pStyle w:val="Heading2"/>
+      </w:pPr>
+      <w:bookmarkStart w:id="39" w:name="SRS_1039"/>
+      <w:r>
+        <w:t>6.2 Sustainability Measurement Requirements</w:t>
+      </w:r>
+      <w:bookmarkEnd w:id="39"/>
+    </w:p>
+    <w:p>
+      <w:pPr>
+        <w:spacing w:after="60" w:line="260" w:lineRule="exact"/>
+      </w:pPr>
+      <w:r>
+        <w:rPr>
+          <w:sz w:val="22"/>
+        </w:rPr>
+        <w:t>Calculations use completed outcomes and declared inputs. Synthetic-data reports demonstrate calculation correctness, not actual campus-wide savings. Every report identifies its period, scope, unit and missing information. Quantities count physical units or measured mass, never a mixture of units or a count of database rows. Aggregation of unlike asset categories must show category totals or use a justified common unit.</w:t>
+      </w:r>
+    </w:p>
+    <w:p>
+      <w:pPr>
+        <w:keepLines/>
+        <w:spacing w:after="140" w:line="240" w:lineRule="exact"/>
+      </w:pPr>
+      <w:r>
+        <w:rPr>
+          <w:b/>
+          <w:sz w:val="21"/>
+        </w:rPr>
+        <w:lastRenderedPageBreak/>
+        <w:t xml:space="preserve">SUS-001 Avoided </w:t>
+      </w:r>
+      <w:proofErr w:type="gramStart"/>
+      <w:r>
+        <w:rPr>
+          <w:b/>
+          <w:sz w:val="21"/>
+        </w:rPr>
+        <w:t xml:space="preserve">purchases  </w:t>
+      </w:r>
+      <w:r>
+        <w:rPr>
+          <w:sz w:val="21"/>
+        </w:rPr>
+        <w:t>Count</w:t>
+      </w:r>
+      <w:proofErr w:type="gramEnd"/>
+      <w:r>
+        <w:rPr>
+          <w:sz w:val="21"/>
+        </w:rPr>
+        <w:t xml:space="preserve"> accepted transferred units that fulfil a need explicitly identified by the requester or test scenario as otherwise requiring purchase. Gross avoided-purchase value = eligible units × stated replacement unit value. Do not assume every reuse prevented a purchase. Verify with worked cases including no purchase basis and partial receipt.</w:t>
+      </w:r>
+    </w:p>
+    <w:p>
+      <w:pPr>
+        <w:keepLines/>
+        <w:spacing w:after="140" w:line="240" w:lineRule="exact"/>
+      </w:pPr>
+      <w:r>
+        <w:rPr>
+          <w:b/>
+          <w:sz w:val="21"/>
+        </w:rPr>
+        <w:t xml:space="preserve">SUS-002 Waste </w:t>
+      </w:r>
+      <w:proofErr w:type="gramStart"/>
+      <w:r>
+        <w:rPr>
+          <w:b/>
+          <w:sz w:val="21"/>
+        </w:rPr>
+        <w:t xml:space="preserve">diversion  </w:t>
+      </w:r>
+      <w:r>
+        <w:rPr>
+          <w:sz w:val="21"/>
+        </w:rPr>
+        <w:t>For</w:t>
+      </w:r>
+      <w:proofErr w:type="gramEnd"/>
+      <w:r>
+        <w:rPr>
+          <w:sz w:val="21"/>
+        </w:rPr>
+        <w:t xml:space="preserve"> a declared disposal-risk cohort and period, count units or mass with a completed reuse, repair, donation, component-recovery or recycling outcome that avoids the disposal baseline. Diversion rate = diverted quantity ÷ (diverted + disposed quantity) × 100 for completed outcomes in that same cohort/period. Pending outcomes are reported separately and excluded from this denominator. Use one unit consistently; a zero denominator is N/A. Count each quantity once, even if repaired then transferred. Verify mixed, duplicate and pending outcomes.</w:t>
+      </w:r>
+    </w:p>
+    <w:p>
+      <w:pPr>
+        <w:keepLines/>
+        <w:spacing w:after="140" w:line="240" w:lineRule="exact"/>
+      </w:pPr>
+      <w:r>
+        <w:rPr>
+          <w:b/>
+          <w:sz w:val="21"/>
+        </w:rPr>
+        <w:t xml:space="preserve">SUS-003 Estimated carbon </w:t>
+      </w:r>
+      <w:proofErr w:type="gramStart"/>
+      <w:r>
+        <w:rPr>
+          <w:b/>
+          <w:sz w:val="21"/>
+        </w:rPr>
+        <w:t xml:space="preserve">reduction  </w:t>
+      </w:r>
+      <w:r>
+        <w:rPr>
+          <w:sz w:val="21"/>
+        </w:rPr>
+        <w:t>Estimate</w:t>
+      </w:r>
+      <w:proofErr w:type="gramEnd"/>
+      <w:r>
+        <w:rPr>
+          <w:sz w:val="21"/>
+        </w:rPr>
+        <w:t xml:space="preserve"> avoided new-purchase emissions for eligible reuse units using stated replacement/emission factors; subtract relevant repair/transfer emissions where data exists and the selected method requires them. Declare boundary, units, factor sources, omissions and uncertainty. Missing essential factors produce unavailable results. Factor sources and values remain TBD-002. Verify against independently calculated examples; do not label an estimate as measured impact.</w:t>
+      </w:r>
+    </w:p>
+    <w:p>
+      <w:pPr>
+        <w:keepLines/>
+        <w:spacing w:after="140" w:line="240" w:lineRule="exact"/>
+      </w:pPr>
+      <w:r>
+        <w:rPr>
+          <w:b/>
+          <w:sz w:val="21"/>
+        </w:rPr>
+        <w:t xml:space="preserve">SUS-004 Net financial </w:t>
+      </w:r>
+      <w:proofErr w:type="gramStart"/>
+      <w:r>
+        <w:rPr>
+          <w:b/>
+          <w:sz w:val="21"/>
+        </w:rPr>
+        <w:t xml:space="preserve">savings  </w:t>
+      </w:r>
+      <w:r>
+        <w:rPr>
+          <w:sz w:val="21"/>
+        </w:rPr>
+        <w:t>Net</w:t>
+      </w:r>
+      <w:proofErr w:type="gramEnd"/>
+      <w:r>
+        <w:rPr>
+          <w:sz w:val="21"/>
+        </w:rPr>
+        <w:t xml:space="preserve"> savings = gross avoided-purchase value (SUS-001) minus relevant repair and handling/transport costs for that fulfilment. Allocate shared costs explicitly and once. Do not subtract unrelated costs or count the same avoided purchase twice. Verify single and partial-transfer examples, including negative savings.</w:t>
+      </w:r>
+    </w:p>
+    <w:p>
+      <w:pPr>
+        <w:keepLines/>
+        <w:spacing w:after="140" w:line="240" w:lineRule="exact"/>
+      </w:pPr>
+      <w:r>
+        <w:rPr>
+          <w:b/>
+          <w:sz w:val="21"/>
+        </w:rPr>
+        <w:t xml:space="preserve">SUS-005 Reuse and repair </w:t>
+      </w:r>
+      <w:proofErr w:type="gramStart"/>
+      <w:r>
+        <w:rPr>
+          <w:b/>
+          <w:sz w:val="21"/>
+        </w:rPr>
+        <w:t xml:space="preserve">activity  </w:t>
+      </w:r>
+      <w:r>
+        <w:rPr>
+          <w:sz w:val="21"/>
+        </w:rPr>
+        <w:t>Show</w:t>
+      </w:r>
+      <w:proofErr w:type="gramEnd"/>
+      <w:r>
+        <w:rPr>
+          <w:sz w:val="21"/>
+        </w:rPr>
+        <w:t xml:space="preserve"> completed transfer-event counts separately from accepted reused-unit counts, and completed repair-event counts separately from units restored to service. For a selected listing cohort, reuse rate = distinct eligible units whose internal transfer receipt is accepted during the reporting period ÷ distinct eligible units available for reuse during that period × 100. State the cohort and count each unit once; zero denominator is N/A. Repair does not count as reuse until a transfer is completed. Verify rates and counts against labelled activity data.</w:t>
+      </w:r>
+    </w:p>
+    <w:p>
+      <w:pPr>
+        <w:keepLines/>
+        <w:spacing w:after="140" w:line="240" w:lineRule="exact"/>
+      </w:pPr>
+      <w:r>
+        <w:rPr>
+          <w:b/>
+          <w:sz w:val="21"/>
+        </w:rPr>
+        <w:t xml:space="preserve">SUS-006 Asset life </w:t>
+      </w:r>
+      <w:proofErr w:type="gramStart"/>
+      <w:r>
+        <w:rPr>
+          <w:b/>
+          <w:sz w:val="21"/>
+        </w:rPr>
+        <w:t xml:space="preserve">extension  </w:t>
+      </w:r>
+      <w:r>
+        <w:rPr>
+          <w:sz w:val="21"/>
+        </w:rPr>
+        <w:t>Estimate</w:t>
+      </w:r>
+      <w:proofErr w:type="gramEnd"/>
+      <w:r>
+        <w:rPr>
+          <w:sz w:val="21"/>
+        </w:rPr>
+        <w:t xml:space="preserve"> added service life through reuse/repair using declared assumptions and a stated baseline. The metric remains in prototype scope; its method is TBD-003. Display unavailable where the method or required inputs are </w:t>
+      </w:r>
+      <w:proofErr w:type="gramStart"/>
+      <w:r>
+        <w:rPr>
+          <w:sz w:val="21"/>
+        </w:rPr>
+        <w:t>absent, and</w:t>
+      </w:r>
+      <w:proofErr w:type="gramEnd"/>
+      <w:r>
+        <w:rPr>
+          <w:sz w:val="21"/>
+        </w:rPr>
+        <w:t xml:space="preserve"> keep service-life estimates distinct from measured outcomes. Verify the selected method and examples after design.</w:t>
+      </w:r>
+    </w:p>
+    <w:p>
+      <w:pPr>
+        <w:keepLines/>
+        <w:spacing w:after="140" w:line="240" w:lineRule="exact"/>
+      </w:pPr>
+      <w:r>
+        <w:rPr>
+          <w:b/>
+          <w:sz w:val="21"/>
+        </w:rPr>
+        <w:t xml:space="preserve">SUS-007 Calculation </w:t>
+      </w:r>
+      <w:proofErr w:type="gramStart"/>
+      <w:r>
+        <w:rPr>
+          <w:b/>
+          <w:sz w:val="21"/>
+        </w:rPr>
+        <w:t xml:space="preserve">rules  </w:t>
+      </w:r>
+      <w:r>
+        <w:rPr>
+          <w:sz w:val="21"/>
+        </w:rPr>
+        <w:t>Retain</w:t>
+      </w:r>
+      <w:proofErr w:type="gramEnd"/>
+      <w:r>
+        <w:rPr>
+          <w:sz w:val="21"/>
+        </w:rPr>
+        <w:t xml:space="preserve"> inputs, methods, units, factors, sources and assumptions with results. Identify missing inputs rather than inventing values. Deduplicate unit/outcome cohorts and avoided purchases; retain links to supporting records. Distinguish event counts, physical quantities, rates and estimates. Verify </w:t>
+      </w:r>
+      <w:proofErr w:type="gramStart"/>
+      <w:r>
+        <w:rPr>
+          <w:sz w:val="21"/>
+        </w:rPr>
+        <w:t>missing-input</w:t>
+      </w:r>
+      <w:proofErr w:type="gramEnd"/>
+      <w:r>
+        <w:rPr>
+          <w:sz w:val="21"/>
+        </w:rPr>
+        <w:t>, duplicate and denominator cases independently.</w:t>
+      </w:r>
+    </w:p>
+    <w:p>
+      <w:pPr>
+        <w:pStyle w:val="Heading2"/>
+      </w:pPr>
+      <w:bookmarkStart w:id="40" w:name="SRS_1040"/>
+      <w:r>
+        <w:t>6.3 Data Documentation and Delivery Requirements</w:t>
+      </w:r>
+      <w:bookmarkEnd w:id="40"/>
+    </w:p>
+    <w:p>
+      <w:pPr>
+        <w:spacing w:after="60" w:line="260" w:lineRule="exact"/>
+      </w:pPr>
+      <w:r>
+        <w:rPr>
+          <w:sz w:val="22"/>
+        </w:rPr>
+        <w:t>The prototype shall include a reproducible synthetic starting dataset with consistent links among users, departments, assets, batch quantities, requests, allocations, approvals, transfers, maintenance and audit records. It shall support independently reproducible report and AI-evaluation examples, including partial allocations, returned/unfit items, missing inputs and competing approvals. Verification: reload the dataset and reproduce the declared test outcomes.</w:t>
+      </w:r>
+    </w:p>
+    <w:p>
+      <w:pPr>
+        <w:spacing w:after="60" w:line="260" w:lineRule="exact"/>
+      </w:pPr>
+      <w:r>
+        <w:rPr>
+          <w:sz w:val="22"/>
+        </w:rPr>
+        <w:t>Setup and user documentation shall accompany the prototype as specified in Section 2.6 and NFR-QUAL-005. Dependency licences and hosted-service terms shall be respected; example photographs/documents shall be team-created or used with permission (Phase 2, Section 6.1). Verification: delivery checklist and licence/asset-source review. Any future use of real personal data requires institutional and applicable data-protection review; it is outside this synthetic-data submission.</w:t>
+      </w:r>
+    </w:p>
+    <w:p>
+      <w:pPr>
+        <w:pStyle w:val="Heading1"/>
+      </w:pPr>
+      <w:bookmarkStart w:id="41" w:name="SRS_1041"/>
+      <w:r>
+        <w:lastRenderedPageBreak/>
+        <w:t>Appendix A: Glossary</w:t>
+      </w:r>
+      <w:bookmarkEnd w:id="41"/>
+    </w:p>
+    <w:tbl>
+      <w:tblPr>
+        <w:tblW w:w="0" w:type="auto"/>
+        <w:jc w:val="center"/>
+        <w:tblBorders>
+          <w:top w:val="single" w:sz="4" w:space="0" w:color="B8B8B8"/>
+          <w:left w:val="single" w:sz="4" w:space="0" w:color="B8B8B8"/>
+          <w:bottom w:val="single" w:sz="4" w:space="0" w:color="B8B8B8"/>
+          <w:right w:val="single" w:sz="4" w:space="0" w:color="B8B8B8"/>
+          <w:insideH w:val="single" w:sz="4" w:space="0" w:color="B8B8B8"/>
+          <w:insideV w:val="single" w:sz="4" w:space="0" w:color="B8B8B8"/>
+        </w:tblBorders>
+        <w:tblLayout w:type="fixed"/>
+        <w:tblLook w:val="04A0" w:firstRow="1" w:lastRow="0" w:firstColumn="1" w:lastColumn="0" w:noHBand="0" w:noVBand="1"/>
+      </w:tblPr>
+      <w:tblGrid>
+        <w:gridCol w:w="2376"/>
+        <w:gridCol w:w="6984"/>
+      </w:tblGrid>
+      <w:tr>
+        <w:trPr>
+          <w:cantSplit/>
+          <w:tblHeader/>
+          <w:jc w:val="center"/>
+        </w:trPr>
+        <w:tc>
+          <w:tcPr>
+            <w:tcW w:w="2376" w:type="dxa"/>
+            <w:shd w:val="clear" w:color="auto" w:fill="EDEDED"/>
+            <w:tcMar>
+              <w:top w:w="55" w:type="dxa"/>
+              <w:left w:w="90" w:type="dxa"/>
+              <w:bottom w:w="55" w:type="dxa"/>
+              <w:right w:w="90" w:type="dxa"/>
+            </w:tcMar>
+            <w:vAlign w:val="center"/>
+          </w:tcPr>
+          <w:p>
+            <w:pPr>
+              <w:keepNext/>
+              <w:spacing w:line="240" w:lineRule="exact"/>
+            </w:pPr>
+            <w:r>
+              <w:rPr>
+                <w:b/>
+                <w:sz w:val="20"/>
+              </w:rPr>
+              <w:t>Term</w:t>
+            </w:r>
+          </w:p>
+        </w:tc>
+        <w:tc>
+          <w:tcPr>
+            <w:tcW w:w="6984" w:type="dxa"/>
+            <w:shd w:val="clear" w:color="auto" w:fill="EDEDED"/>
+            <w:tcMar>
+              <w:top w:w="55" w:type="dxa"/>
+              <w:left w:w="90" w:type="dxa"/>
+              <w:bottom w:w="55" w:type="dxa"/>
+              <w:right w:w="90" w:type="dxa"/>
+            </w:tcMar>
+            <w:vAlign w:val="center"/>
+          </w:tcPr>
+          <w:p>
+            <w:pPr>
+              <w:keepNext/>
+              <w:spacing w:line="240" w:lineRule="exact"/>
+            </w:pPr>
+            <w:r>
+              <w:rPr>
+                <w:b/>
+                <w:sz w:val="20"/>
+              </w:rPr>
+              <w:t>Definition</w:t>
+            </w:r>
+          </w:p>
+        </w:tc>
+      </w:tr>
+      <w:tr>
+        <w:trPr>
+          <w:cantSplit/>
+          <w:jc w:val="center"/>
+        </w:trPr>
+        <w:tc>
+          <w:tcPr>
+            <w:tcW w:w="2376" w:type="dxa"/>
+            <w:tcMar>
+              <w:top w:w="55" w:type="dxa"/>
+              <w:left w:w="90" w:type="dxa"/>
+              <w:bottom w:w="55" w:type="dxa"/>
+              <w:right w:w="90" w:type="dxa"/>
+            </w:tcMar>
+            <w:vAlign w:val="center"/>
+          </w:tcPr>
+          <w:p>
+            <w:pPr>
+              <w:spacing w:line="240" w:lineRule="exact"/>
+            </w:pPr>
+            <w:r>
+              <w:rPr>
+                <w:sz w:val="20"/>
+              </w:rPr>
+              <w:t>AI</w:t>
+            </w:r>
+          </w:p>
+        </w:tc>
+        <w:tc>
+          <w:tcPr>
+            <w:tcW w:w="6984" w:type="dxa"/>
+            <w:tcMar>
+              <w:top w:w="55" w:type="dxa"/>
+              <w:left w:w="90" w:type="dxa"/>
+              <w:bottom w:w="55" w:type="dxa"/>
+              <w:right w:w="90" w:type="dxa"/>
+            </w:tcMar>
+            <w:vAlign w:val="center"/>
+          </w:tcPr>
+          <w:p>
+            <w:pPr>
+              <w:spacing w:line="240" w:lineRule="exact"/>
+            </w:pPr>
+            <w:r>
+              <w:rPr>
+                <w:sz w:val="20"/>
+              </w:rPr>
+              <w:t>Artificial intelligence. In this system, AI suggests and explains; authorized people decide.</w:t>
+            </w:r>
+          </w:p>
+        </w:tc>
+      </w:tr>
+      <w:tr>
+        <w:trPr>
+          <w:cantSplit/>
+          <w:jc w:val="center"/>
+        </w:trPr>
+        <w:tc>
+          <w:tcPr>
+            <w:tcW w:w="2376" w:type="dxa"/>
+            <w:tcMar>
+              <w:top w:w="55" w:type="dxa"/>
+              <w:left w:w="90" w:type="dxa"/>
+              <w:bottom w:w="55" w:type="dxa"/>
+              <w:right w:w="90" w:type="dxa"/>
+            </w:tcMar>
+            <w:vAlign w:val="center"/>
+          </w:tcPr>
+          <w:p>
+            <w:pPr>
+              <w:spacing w:line="240" w:lineRule="exact"/>
+            </w:pPr>
+            <w:r>
+              <w:rPr>
+                <w:sz w:val="20"/>
+              </w:rPr>
+              <w:t>Asset</w:t>
+            </w:r>
+          </w:p>
+        </w:tc>
+        <w:tc>
+          <w:tcPr>
+            <w:tcW w:w="6984" w:type="dxa"/>
+            <w:tcMar>
+              <w:top w:w="55" w:type="dxa"/>
+              <w:left w:w="90" w:type="dxa"/>
+              <w:bottom w:w="55" w:type="dxa"/>
+              <w:right w:w="90" w:type="dxa"/>
+            </w:tcMar>
+            <w:vAlign w:val="center"/>
+          </w:tcPr>
+          <w:p>
+            <w:pPr>
+              <w:spacing w:line="240" w:lineRule="exact"/>
+            </w:pPr>
+            <w:r>
+              <w:rPr>
+                <w:sz w:val="20"/>
+              </w:rPr>
+              <w:t>A campus resource recorded in the system, either an individually tracked item or a quantity-based batch.</w:t>
+            </w:r>
+          </w:p>
+        </w:tc>
+      </w:tr>
+      <w:tr>
+        <w:trPr>
+          <w:cantSplit/>
+          <w:jc w:val="center"/>
+        </w:trPr>
+        <w:tc>
+          <w:tcPr>
+            <w:tcW w:w="2376" w:type="dxa"/>
+            <w:tcMar>
+              <w:top w:w="55" w:type="dxa"/>
+              <w:left w:w="90" w:type="dxa"/>
+              <w:bottom w:w="55" w:type="dxa"/>
+              <w:right w:w="90" w:type="dxa"/>
+            </w:tcMar>
+            <w:vAlign w:val="center"/>
+          </w:tcPr>
+          <w:p>
+            <w:pPr>
+              <w:spacing w:line="240" w:lineRule="exact"/>
+            </w:pPr>
+            <w:r>
+              <w:rPr>
+                <w:sz w:val="20"/>
+              </w:rPr>
+              <w:t>Asset Custodian</w:t>
+            </w:r>
+          </w:p>
+        </w:tc>
+        <w:tc>
+          <w:tcPr>
+            <w:tcW w:w="6984" w:type="dxa"/>
+            <w:tcMar>
+              <w:top w:w="55" w:type="dxa"/>
+              <w:left w:w="90" w:type="dxa"/>
+              <w:bottom w:w="55" w:type="dxa"/>
+              <w:right w:w="90" w:type="dxa"/>
+            </w:tcMar>
+            <w:vAlign w:val="center"/>
+          </w:tcPr>
+          <w:p>
+            <w:pPr>
+              <w:spacing w:line="240" w:lineRule="exact"/>
+            </w:pPr>
+            <w:r>
+              <w:rPr>
+                <w:sz w:val="20"/>
+              </w:rPr>
+              <w:t>The person responsible for the day-to-day care, records, and availability of an asset.</w:t>
+            </w:r>
+          </w:p>
+        </w:tc>
+      </w:tr>
+      <w:tr>
+        <w:trPr>
+          <w:cantSplit/>
+          <w:jc w:val="center"/>
+        </w:trPr>
+        <w:tc>
+          <w:tcPr>
+            <w:tcW w:w="2376" w:type="dxa"/>
+            <w:tcMar>
+              <w:top w:w="55" w:type="dxa"/>
+              <w:left w:w="90" w:type="dxa"/>
+              <w:bottom w:w="55" w:type="dxa"/>
+              <w:right w:w="90" w:type="dxa"/>
+            </w:tcMar>
+            <w:vAlign w:val="center"/>
+          </w:tcPr>
+          <w:p>
+            <w:pPr>
+              <w:spacing w:line="240" w:lineRule="exact"/>
+            </w:pPr>
+            <w:r>
+              <w:rPr>
+                <w:sz w:val="20"/>
+              </w:rPr>
+              <w:t>Avoided purchase</w:t>
+            </w:r>
+          </w:p>
+        </w:tc>
+        <w:tc>
+          <w:tcPr>
+            <w:tcW w:w="6984" w:type="dxa"/>
+            <w:tcMar>
+              <w:top w:w="55" w:type="dxa"/>
+              <w:left w:w="90" w:type="dxa"/>
+              <w:bottom w:w="55" w:type="dxa"/>
+              <w:right w:w="90" w:type="dxa"/>
+            </w:tcMar>
+            <w:vAlign w:val="center"/>
+          </w:tcPr>
+          <w:p>
+            <w:pPr>
+              <w:spacing w:line="240" w:lineRule="exact"/>
+            </w:pPr>
+            <w:r>
+              <w:rPr>
+                <w:sz w:val="20"/>
+              </w:rPr>
+              <w:t>A purchase that did not occur because an internal transfer fulfilled the need.</w:t>
+            </w:r>
+          </w:p>
+        </w:tc>
+      </w:tr>
+      <w:tr>
+        <w:trPr>
+          <w:cantSplit/>
+          <w:jc w:val="center"/>
+        </w:trPr>
+        <w:tc>
+          <w:tcPr>
+            <w:tcW w:w="2376" w:type="dxa"/>
+            <w:tcMar>
+              <w:top w:w="55" w:type="dxa"/>
+              <w:left w:w="90" w:type="dxa"/>
+              <w:bottom w:w="55" w:type="dxa"/>
+              <w:right w:w="90" w:type="dxa"/>
+            </w:tcMar>
+            <w:vAlign w:val="center"/>
+          </w:tcPr>
+          <w:p>
+            <w:pPr>
+              <w:spacing w:line="240" w:lineRule="exact"/>
+            </w:pPr>
+            <w:r>
+              <w:rPr>
+                <w:sz w:val="20"/>
+              </w:rPr>
+              <w:t>Circular Campus</w:t>
+            </w:r>
+          </w:p>
+        </w:tc>
+        <w:tc>
+          <w:tcPr>
+            <w:tcW w:w="6984" w:type="dxa"/>
+            <w:tcMar>
+              <w:top w:w="55" w:type="dxa"/>
+              <w:left w:w="90" w:type="dxa"/>
+              <w:bottom w:w="55" w:type="dxa"/>
+              <w:right w:w="90" w:type="dxa"/>
+            </w:tcMar>
+            <w:vAlign w:val="center"/>
+          </w:tcPr>
+          <w:p>
+            <w:pPr>
+              <w:spacing w:line="240" w:lineRule="exact"/>
+            </w:pPr>
+            <w:r>
+              <w:rPr>
+                <w:sz w:val="20"/>
+              </w:rPr>
+              <w:t>A campus that keeps resources in use through reuse, repair, refurbishment, and recycling before disposal.</w:t>
+            </w:r>
+          </w:p>
+        </w:tc>
+      </w:tr>
+      <w:tr>
+        <w:trPr>
+          <w:cantSplit/>
+          <w:jc w:val="center"/>
+        </w:trPr>
+        <w:tc>
+          <w:tcPr>
+            <w:tcW w:w="2376" w:type="dxa"/>
+            <w:tcMar>
+              <w:top w:w="55" w:type="dxa"/>
+              <w:left w:w="90" w:type="dxa"/>
+              <w:bottom w:w="55" w:type="dxa"/>
+              <w:right w:w="90" w:type="dxa"/>
+            </w:tcMar>
+            <w:vAlign w:val="center"/>
+          </w:tcPr>
+          <w:p>
+            <w:pPr>
+              <w:spacing w:line="240" w:lineRule="exact"/>
+            </w:pPr>
+            <w:r>
+              <w:rPr>
+                <w:sz w:val="20"/>
+              </w:rPr>
+              <w:t>Compatibility score</w:t>
+            </w:r>
+          </w:p>
+        </w:tc>
+        <w:tc>
+          <w:tcPr>
+            <w:tcW w:w="6984" w:type="dxa"/>
+            <w:tcMar>
+              <w:top w:w="55" w:type="dxa"/>
+              <w:left w:w="90" w:type="dxa"/>
+              <w:bottom w:w="55" w:type="dxa"/>
+              <w:right w:w="90" w:type="dxa"/>
+            </w:tcMar>
+            <w:vAlign w:val="center"/>
+          </w:tcPr>
+          <w:p>
+            <w:pPr>
+              <w:spacing w:line="240" w:lineRule="exact"/>
+            </w:pPr>
+            <w:r>
+              <w:rPr>
+                <w:sz w:val="20"/>
+              </w:rPr>
+              <w:t>A score showing how well a listed asset suits a departmental request.</w:t>
+            </w:r>
+          </w:p>
+        </w:tc>
+      </w:tr>
+      <w:tr>
+        <w:trPr>
+          <w:cantSplit/>
+          <w:jc w:val="center"/>
+        </w:trPr>
+        <w:tc>
+          <w:tcPr>
+            <w:tcW w:w="2376" w:type="dxa"/>
+            <w:tcMar>
+              <w:top w:w="55" w:type="dxa"/>
+              <w:left w:w="90" w:type="dxa"/>
+              <w:bottom w:w="55" w:type="dxa"/>
+              <w:right w:w="90" w:type="dxa"/>
+            </w:tcMar>
+            <w:vAlign w:val="center"/>
+          </w:tcPr>
+          <w:p>
+            <w:pPr>
+              <w:spacing w:line="240" w:lineRule="exact"/>
+            </w:pPr>
+            <w:r>
+              <w:rPr>
+                <w:sz w:val="20"/>
+              </w:rPr>
+              <w:t>Component recovery</w:t>
+            </w:r>
+          </w:p>
+        </w:tc>
+        <w:tc>
+          <w:tcPr>
+            <w:tcW w:w="6984" w:type="dxa"/>
+            <w:tcMar>
+              <w:top w:w="55" w:type="dxa"/>
+              <w:left w:w="90" w:type="dxa"/>
+              <w:bottom w:w="55" w:type="dxa"/>
+              <w:right w:w="90" w:type="dxa"/>
+            </w:tcMar>
+            <w:vAlign w:val="center"/>
+          </w:tcPr>
+          <w:p>
+            <w:pPr>
+              <w:spacing w:line="240" w:lineRule="exact"/>
+            </w:pPr>
+            <w:r>
+              <w:rPr>
+                <w:sz w:val="20"/>
+              </w:rPr>
+              <w:t>Disassembling an asset to reuse its working parts.</w:t>
+            </w:r>
+          </w:p>
+        </w:tc>
+      </w:tr>
+      <w:tr>
+        <w:trPr>
+          <w:cantSplit/>
+          <w:jc w:val="center"/>
+        </w:trPr>
+        <w:tc>
+          <w:tcPr>
+            <w:tcW w:w="2376" w:type="dxa"/>
+            <w:tcMar>
+              <w:top w:w="55" w:type="dxa"/>
+              <w:left w:w="90" w:type="dxa"/>
+              <w:bottom w:w="55" w:type="dxa"/>
+              <w:right w:w="90" w:type="dxa"/>
+            </w:tcMar>
+            <w:vAlign w:val="center"/>
+          </w:tcPr>
+          <w:p>
+            <w:pPr>
+              <w:spacing w:line="240" w:lineRule="exact"/>
+            </w:pPr>
+            <w:r>
+              <w:rPr>
+                <w:sz w:val="20"/>
+              </w:rPr>
+              <w:t>End-of-life action</w:t>
+            </w:r>
+          </w:p>
+        </w:tc>
+        <w:tc>
+          <w:tcPr>
+            <w:tcW w:w="6984" w:type="dxa"/>
+            <w:tcMar>
+              <w:top w:w="55" w:type="dxa"/>
+              <w:left w:w="90" w:type="dxa"/>
+              <w:bottom w:w="55" w:type="dxa"/>
+              <w:right w:w="90" w:type="dxa"/>
+            </w:tcMar>
+            <w:vAlign w:val="center"/>
+          </w:tcPr>
+          <w:p>
+            <w:pPr>
+              <w:spacing w:line="240" w:lineRule="exact"/>
+            </w:pPr>
+            <w:r>
+              <w:rPr>
+                <w:sz w:val="20"/>
+              </w:rPr>
+              <w:t>Donation, component recovery, recycling, retirement, or disposal of an asset.</w:t>
+            </w:r>
+          </w:p>
+        </w:tc>
+      </w:tr>
+      <w:tr>
+        <w:trPr>
+          <w:cantSplit/>
+          <w:jc w:val="center"/>
+        </w:trPr>
+        <w:tc>
+          <w:tcPr>
+            <w:tcW w:w="2376" w:type="dxa"/>
+            <w:tcMar>
+              <w:top w:w="55" w:type="dxa"/>
+              <w:left w:w="90" w:type="dxa"/>
+              <w:bottom w:w="55" w:type="dxa"/>
+              <w:right w:w="90" w:type="dxa"/>
+            </w:tcMar>
+            <w:vAlign w:val="center"/>
+          </w:tcPr>
+          <w:p>
+            <w:pPr>
+              <w:spacing w:line="240" w:lineRule="exact"/>
+            </w:pPr>
+            <w:r>
+              <w:rPr>
+                <w:sz w:val="20"/>
+              </w:rPr>
+              <w:t>Expression of interest</w:t>
+            </w:r>
+          </w:p>
+        </w:tc>
+        <w:tc>
+          <w:tcPr>
+            <w:tcW w:w="6984" w:type="dxa"/>
+            <w:tcMar>
+              <w:top w:w="55" w:type="dxa"/>
+              <w:left w:w="90" w:type="dxa"/>
+              <w:bottom w:w="55" w:type="dxa"/>
+              <w:right w:w="90" w:type="dxa"/>
+            </w:tcMar>
+            <w:vAlign w:val="center"/>
+          </w:tcPr>
+          <w:p>
+            <w:pPr>
+              <w:spacing w:line="240" w:lineRule="exact"/>
+            </w:pPr>
+            <w:r>
+              <w:rPr>
+                <w:sz w:val="20"/>
+              </w:rPr>
+              <w:t>A requester’s request for a listed asset; it does not reserve any quantity.</w:t>
+            </w:r>
+          </w:p>
+        </w:tc>
+      </w:tr>
+      <w:tr>
+        <w:trPr>
+          <w:cantSplit/>
+          <w:jc w:val="center"/>
+        </w:trPr>
+        <w:tc>
+          <w:tcPr>
+            <w:tcW w:w="2376" w:type="dxa"/>
+            <w:tcMar>
+              <w:top w:w="55" w:type="dxa"/>
+              <w:left w:w="90" w:type="dxa"/>
+              <w:bottom w:w="55" w:type="dxa"/>
+              <w:right w:w="90" w:type="dxa"/>
+            </w:tcMar>
+            <w:vAlign w:val="center"/>
+          </w:tcPr>
+          <w:p>
+            <w:pPr>
+              <w:spacing w:line="240" w:lineRule="exact"/>
+            </w:pPr>
+            <w:r>
+              <w:rPr>
+                <w:sz w:val="20"/>
+              </w:rPr>
+              <w:t>LLM</w:t>
+            </w:r>
+          </w:p>
+        </w:tc>
+        <w:tc>
+          <w:tcPr>
+            <w:tcW w:w="6984" w:type="dxa"/>
+            <w:tcMar>
+              <w:top w:w="55" w:type="dxa"/>
+              <w:left w:w="90" w:type="dxa"/>
+              <w:bottom w:w="55" w:type="dxa"/>
+              <w:right w:w="90" w:type="dxa"/>
+            </w:tcMar>
+            <w:vAlign w:val="center"/>
+          </w:tcPr>
+          <w:p>
+            <w:pPr>
+              <w:spacing w:line="240" w:lineRule="exact"/>
+            </w:pPr>
+            <w:r>
+              <w:rPr>
+                <w:sz w:val="20"/>
+              </w:rPr>
+              <w:t>Large language model; the type of AI used by the conversational assistant and report summaries.</w:t>
+            </w:r>
+          </w:p>
+        </w:tc>
+      </w:tr>
+      <w:tr>
+        <w:trPr>
+          <w:cantSplit/>
+          <w:jc w:val="center"/>
+        </w:trPr>
+        <w:tc>
+          <w:tcPr>
+            <w:tcW w:w="2376" w:type="dxa"/>
+            <w:tcMar>
+              <w:top w:w="55" w:type="dxa"/>
+              <w:left w:w="90" w:type="dxa"/>
+              <w:bottom w:w="55" w:type="dxa"/>
+              <w:right w:w="90" w:type="dxa"/>
+            </w:tcMar>
+            <w:vAlign w:val="center"/>
+          </w:tcPr>
+          <w:p>
+            <w:pPr>
+              <w:spacing w:line="240" w:lineRule="exact"/>
+            </w:pPr>
+            <w:r>
+              <w:rPr>
+                <w:sz w:val="20"/>
+              </w:rPr>
+              <w:t>Semantic Matching</w:t>
+            </w:r>
+          </w:p>
+        </w:tc>
+        <w:tc>
+          <w:tcPr>
+            <w:tcW w:w="6984" w:type="dxa"/>
+            <w:tcMar>
+              <w:top w:w="55" w:type="dxa"/>
+              <w:left w:w="90" w:type="dxa"/>
+              <w:bottom w:w="55" w:type="dxa"/>
+              <w:right w:w="90" w:type="dxa"/>
+            </w:tcMar>
+            <w:vAlign w:val="center"/>
+          </w:tcPr>
+          <w:p>
+            <w:pPr>
+              <w:spacing w:line="240" w:lineRule="exact"/>
+            </w:pPr>
+            <w:r>
+              <w:rPr>
+                <w:sz w:val="20"/>
+              </w:rPr>
+              <w:t>Matching requests with listings by meaning rather than by identical keywords.</w:t>
+            </w:r>
+          </w:p>
+        </w:tc>
+      </w:tr>
+      <w:tr>
+        <w:trPr>
+          <w:cantSplit/>
+          <w:jc w:val="center"/>
+        </w:trPr>
+        <w:tc>
+          <w:tcPr>
+            <w:tcW w:w="2376" w:type="dxa"/>
+            <w:tcMar>
+              <w:top w:w="55" w:type="dxa"/>
+              <w:left w:w="90" w:type="dxa"/>
+              <w:bottom w:w="55" w:type="dxa"/>
+              <w:right w:w="90" w:type="dxa"/>
+            </w:tcMar>
+            <w:vAlign w:val="center"/>
+          </w:tcPr>
+          <w:p>
+            <w:pPr>
+              <w:spacing w:line="240" w:lineRule="exact"/>
+            </w:pPr>
+            <w:r>
+              <w:rPr>
+                <w:sz w:val="20"/>
+              </w:rPr>
+              <w:t>Synthetic data</w:t>
+            </w:r>
+          </w:p>
+        </w:tc>
+        <w:tc>
+          <w:tcPr>
+            <w:tcW w:w="6984" w:type="dxa"/>
+            <w:tcMar>
+              <w:top w:w="55" w:type="dxa"/>
+              <w:left w:w="90" w:type="dxa"/>
+              <w:bottom w:w="55" w:type="dxa"/>
+              <w:right w:w="90" w:type="dxa"/>
+            </w:tcMar>
+            <w:vAlign w:val="center"/>
+          </w:tcPr>
+          <w:p>
+            <w:pPr>
+              <w:spacing w:line="240" w:lineRule="exact"/>
+            </w:pPr>
+            <w:r>
+              <w:rPr>
+                <w:sz w:val="20"/>
+              </w:rPr>
+              <w:t>Realistic but artificial records used to build and test the prototype without real university data.</w:t>
+            </w:r>
+          </w:p>
+        </w:tc>
+      </w:tr>
+      <w:tr>
+        <w:trPr>
+          <w:cantSplit/>
+          <w:jc w:val="center"/>
+        </w:trPr>
+        <w:tc>
+          <w:tcPr>
+            <w:tcW w:w="2376" w:type="dxa"/>
+            <w:tcMar>
+              <w:top w:w="55" w:type="dxa"/>
+              <w:left w:w="90" w:type="dxa"/>
+              <w:bottom w:w="55" w:type="dxa"/>
+              <w:right w:w="90" w:type="dxa"/>
+            </w:tcMar>
+            <w:vAlign w:val="center"/>
+          </w:tcPr>
+          <w:p>
+            <w:pPr>
+              <w:spacing w:line="240" w:lineRule="exact"/>
+            </w:pPr>
+            <w:r>
+              <w:rPr>
+                <w:sz w:val="20"/>
+              </w:rPr>
+              <w:t>Waste diversion</w:t>
+            </w:r>
+          </w:p>
+        </w:tc>
+        <w:tc>
+          <w:tcPr>
+            <w:tcW w:w="6984" w:type="dxa"/>
+            <w:tcMar>
+              <w:top w:w="55" w:type="dxa"/>
+              <w:left w:w="90" w:type="dxa"/>
+              <w:bottom w:w="55" w:type="dxa"/>
+              <w:right w:w="90" w:type="dxa"/>
+            </w:tcMar>
+            <w:vAlign w:val="center"/>
+          </w:tcPr>
+          <w:p>
+            <w:pPr>
+              <w:spacing w:line="240" w:lineRule="exact"/>
+            </w:pPr>
+            <w:r>
+              <w:rPr>
+                <w:sz w:val="20"/>
+              </w:rPr>
+              <w:t>Keeping assets or materials from disposal through reuse, repair, donation, component recovery, or recycling.</w:t>
+            </w:r>
+          </w:p>
+        </w:tc>
+      </w:tr>
+      <w:tr>
+        <w:trPr>
+          <w:cantSplit/>
+          <w:jc w:val="center"/>
+        </w:trPr>
+        <w:tc>
+          <w:tcPr>
+            <w:tcW w:w="2376" w:type="dxa"/>
+            <w:tcMar>
+              <w:top w:w="55" w:type="dxa"/>
+              <w:left w:w="90" w:type="dxa"/>
+              <w:bottom w:w="55" w:type="dxa"/>
+              <w:right w:w="90" w:type="dxa"/>
+            </w:tcMar>
+            <w:vAlign w:val="center"/>
+          </w:tcPr>
+          <w:p>
+            <w:pPr>
+              <w:spacing w:line="240" w:lineRule="exact"/>
+            </w:pPr>
+            <w:r>
+              <w:rPr>
+                <w:sz w:val="20"/>
+              </w:rPr>
+              <w:t>Formal departmental custody</w:t>
+            </w:r>
+          </w:p>
+        </w:tc>
+        <w:tc>
+          <w:tcPr>
+            <w:tcW w:w="6984" w:type="dxa"/>
+            <w:tcMar>
+              <w:top w:w="55" w:type="dxa"/>
+              <w:left w:w="90" w:type="dxa"/>
+              <w:bottom w:w="55" w:type="dxa"/>
+              <w:right w:w="90" w:type="dxa"/>
+            </w:tcMar>
+            <w:vAlign w:val="center"/>
+          </w:tcPr>
+          <w:p>
+            <w:pPr>
+              <w:spacing w:line="240" w:lineRule="exact"/>
+            </w:pPr>
+            <w:r>
+              <w:rPr>
+                <w:sz w:val="20"/>
+              </w:rPr>
+              <w:t>Accountable departmental/custodian assignment; a transfer changes this only after accepted receipt.</w:t>
+            </w:r>
+          </w:p>
+        </w:tc>
+      </w:tr>
+      <w:tr>
+        <w:trPr>
+          <w:cantSplit/>
+          <w:jc w:val="center"/>
+        </w:trPr>
+        <w:tc>
+          <w:tcPr>
+            <w:tcW w:w="2376" w:type="dxa"/>
+            <w:tcMar>
+              <w:top w:w="55" w:type="dxa"/>
+              <w:left w:w="90" w:type="dxa"/>
+              <w:bottom w:w="55" w:type="dxa"/>
+              <w:right w:w="90" w:type="dxa"/>
+            </w:tcMar>
+            <w:vAlign w:val="center"/>
+          </w:tcPr>
+          <w:p>
+            <w:pPr>
+              <w:spacing w:line="240" w:lineRule="exact"/>
+            </w:pPr>
+            <w:r>
+              <w:rPr>
+                <w:sz w:val="20"/>
+              </w:rPr>
+              <w:t>Physical holder and location</w:t>
+            </w:r>
+          </w:p>
+        </w:tc>
+        <w:tc>
+          <w:tcPr>
+            <w:tcW w:w="6984" w:type="dxa"/>
+            <w:tcMar>
+              <w:top w:w="55" w:type="dxa"/>
+              <w:left w:w="90" w:type="dxa"/>
+              <w:bottom w:w="55" w:type="dxa"/>
+              <w:right w:w="90" w:type="dxa"/>
+            </w:tcMar>
+            <w:vAlign w:val="center"/>
+          </w:tcPr>
+          <w:p>
+            <w:pPr>
+              <w:spacing w:line="240" w:lineRule="exact"/>
+            </w:pPr>
+            <w:r>
+              <w:rPr>
+                <w:sz w:val="20"/>
+              </w:rPr>
+              <w:t>The person or unit holding an asset and its actual location during handover, transit, discrepancy or return.</w:t>
+            </w:r>
+          </w:p>
+        </w:tc>
+      </w:tr>
+      <w:tr>
+        <w:trPr>
+          <w:cantSplit/>
+          <w:jc w:val="center"/>
+        </w:trPr>
+        <w:tc>
+          <w:tcPr>
+            <w:tcW w:w="2376" w:type="dxa"/>
+            <w:tcMar>
+              <w:top w:w="55" w:type="dxa"/>
+              <w:left w:w="90" w:type="dxa"/>
+              <w:bottom w:w="55" w:type="dxa"/>
+              <w:right w:w="90" w:type="dxa"/>
+            </w:tcMar>
+            <w:vAlign w:val="center"/>
+          </w:tcPr>
+          <w:p>
+            <w:pPr>
+              <w:spacing w:line="240" w:lineRule="exact"/>
+            </w:pPr>
+            <w:r>
+              <w:rPr>
+                <w:sz w:val="20"/>
+              </w:rPr>
+              <w:t>Actively allocated quantity</w:t>
+            </w:r>
+          </w:p>
+        </w:tc>
+        <w:tc>
+          <w:tcPr>
+            <w:tcW w:w="6984" w:type="dxa"/>
+            <w:tcMar>
+              <w:top w:w="55" w:type="dxa"/>
+              <w:left w:w="90" w:type="dxa"/>
+              <w:bottom w:w="55" w:type="dxa"/>
+              <w:right w:w="90" w:type="dxa"/>
+            </w:tcMar>
+            <w:vAlign w:val="center"/>
+          </w:tcPr>
+          <w:p>
+            <w:pPr>
+              <w:spacing w:line="240" w:lineRule="exact"/>
+            </w:pPr>
+            <w:r>
+              <w:rPr>
+                <w:sz w:val="20"/>
+              </w:rPr>
+              <w:t>Quantity tied to confirmed reservations or unresolved transfers and not yet accepted or reconciled as returned/cancelled.</w:t>
+            </w:r>
+          </w:p>
+        </w:tc>
+      </w:tr>
+      <w:tr>
+        <w:trPr>
+          <w:cantSplit/>
+          <w:jc w:val="center"/>
+        </w:trPr>
+        <w:tc>
+          <w:tcPr>
+            <w:tcW w:w="2376" w:type="dxa"/>
+            <w:tcMar>
+              <w:top w:w="55" w:type="dxa"/>
+              <w:left w:w="90" w:type="dxa"/>
+              <w:bottom w:w="55" w:type="dxa"/>
+              <w:right w:w="90" w:type="dxa"/>
+            </w:tcMar>
+            <w:vAlign w:val="center"/>
+          </w:tcPr>
+          <w:p>
+            <w:pPr>
+              <w:spacing w:line="240" w:lineRule="exact"/>
+            </w:pPr>
+            <w:r>
+              <w:rPr>
+                <w:sz w:val="20"/>
+              </w:rPr>
+              <w:t>Unallocated outstanding quantity</w:t>
+            </w:r>
+          </w:p>
+        </w:tc>
+        <w:tc>
+          <w:tcPr>
+            <w:tcW w:w="6984" w:type="dxa"/>
+            <w:tcMar>
+              <w:top w:w="55" w:type="dxa"/>
+              <w:left w:w="90" w:type="dxa"/>
+              <w:bottom w:w="55" w:type="dxa"/>
+              <w:right w:w="90" w:type="dxa"/>
+            </w:tcMar>
+            <w:vAlign w:val="center"/>
+          </w:tcPr>
+          <w:p>
+            <w:pPr>
+              <w:spacing w:line="240" w:lineRule="exact"/>
+            </w:pPr>
+            <w:r>
+              <w:rPr>
+                <w:sz w:val="20"/>
+              </w:rPr>
+              <w:t>Requested quantity minus accepted fulfilment and active allocations; the quantity eligible for a further reservation.</w:t>
+            </w:r>
+          </w:p>
+        </w:tc>
+      </w:tr>
+      <w:tr>
+        <w:trPr>
+          <w:cantSplit/>
+          <w:jc w:val="center"/>
+        </w:trPr>
+        <w:tc>
+          <w:tcPr>
+            <w:tcW w:w="2376" w:type="dxa"/>
+            <w:tcMar>
+              <w:top w:w="55" w:type="dxa"/>
+              <w:left w:w="90" w:type="dxa"/>
+              <w:bottom w:w="55" w:type="dxa"/>
+              <w:right w:w="90" w:type="dxa"/>
+            </w:tcMar>
+            <w:vAlign w:val="center"/>
+          </w:tcPr>
+          <w:p>
+            <w:pPr>
+              <w:spacing w:line="240" w:lineRule="exact"/>
+            </w:pPr>
+            <w:r>
+              <w:rPr>
+                <w:sz w:val="20"/>
+              </w:rPr>
+              <w:t>Batch portion</w:t>
+            </w:r>
+          </w:p>
+        </w:tc>
+        <w:tc>
+          <w:tcPr>
+            <w:tcW w:w="6984" w:type="dxa"/>
+            <w:tcMar>
+              <w:top w:w="55" w:type="dxa"/>
+              <w:left w:w="90" w:type="dxa"/>
+              <w:bottom w:w="55" w:type="dxa"/>
+              <w:right w:w="90" w:type="dxa"/>
+            </w:tcMar>
+            <w:vAlign w:val="center"/>
+          </w:tcPr>
+          <w:p>
+            <w:pPr>
+              <w:spacing w:line="240" w:lineRule="exact"/>
+            </w:pPr>
+            <w:r>
+              <w:rPr>
+                <w:sz w:val="20"/>
+              </w:rPr>
+              <w:t>An allocated quantity of a batch with its own condition/status tracking; other portions may remain available.</w:t>
+            </w:r>
+          </w:p>
+        </w:tc>
+      </w:tr>
+    </w:tbl>
+    <w:p>
+      <w:pPr>
+        <w:spacing w:after="40" w:line="240" w:lineRule="exact"/>
+      </w:pPr>
+    </w:p>
+    <w:p>
+      <w:pPr>
+        <w:pStyle w:val="Heading1"/>
+      </w:pPr>
+      <w:bookmarkStart w:id="42" w:name="SRS_1042"/>
+      <w:r>
+        <w:t>Appendix B: Analysis Models</w:t>
+      </w:r>
+      <w:bookmarkEnd w:id="42"/>
+    </w:p>
+    <w:p>
+      <w:pPr>
+        <w:spacing w:after="60" w:line="260" w:lineRule="exact"/>
+      </w:pPr>
+      <w:r>
+        <w:rPr>
+          <w:sz w:val="22"/>
+        </w:rPr>
+        <w:t>These Phase 3 models specify participation and controlled workflows. Sign-in and role authorization apply throughout; AI cannot approve transactions. Section 2.3 controls exact permissions. Detailed design models follow in later phases.</w:t>
+      </w:r>
+    </w:p>
+    <w:p>
+      <w:pPr>
+        <w:pStyle w:val="Heading2"/>
+      </w:pPr>
+      <w:bookmarkStart w:id="43" w:name="SRS_1043"/>
+      <w:r>
+        <w:lastRenderedPageBreak/>
+        <w:t>B.1 Use Case Diagram</w:t>
+      </w:r>
+      <w:bookmarkEnd w:id="43"/>
+    </w:p>
+    <w:p>
+      <w:pPr>
+        <w:keepNext/>
+        <w:spacing w:after="60"/>
+      </w:pPr>
+      <w:r>
+        <w:rPr>
+          <w:noProof/>
+        </w:rPr>
+        <w:drawing>
+          <wp:inline distT="0" distB="0" distL="0" distR="0" wp14:anchorId="5D3B2778" wp14:editId="416601A2">
+            <wp:extent cx="5760720" cy="6315728"/>
+            <wp:effectExtent l="0" t="0" r="0" b="0"/>
+            <wp:docPr id="1" name="Picture 1" descr="Figure 1 Use case diagram with system boundary and supporting actors"/>
+            <wp:cNvGraphicFramePr>
+              <a:graphicFrameLocks xmlns:a="http://schemas.openxmlformats.org/drawingml/2006/main" noChangeAspect="1"/>
+            </wp:cNvGraphicFramePr>
+            <a:graphic xmlns:a="http://schemas.openxmlformats.org/drawingml/2006/main">
+              <a:graphicData uri="http://schemas.openxmlformats.org/drawingml/2006/picture">
+                <pic:pic xmlns:pic="http://schemas.openxmlformats.org/drawingml/2006/picture">
+                  <pic:nvPicPr>
+                    <pic:cNvPr id="0" name="usecase-model.png"/>
+                    <pic:cNvPicPr/>
+                  </pic:nvPicPr>
+                  <pic:blipFill>
+                    <a:blip r:embed="rId10"/>
+                    <a:stretch>
+                      <a:fillRect/>
+                    </a:stretch>
+                  </pic:blipFill>
+                  <pic:spPr>
+                    <a:xfrm>
+                      <a:off x="0" y="0"/>
+                      <a:ext cx="5760720" cy="6315728"/>
+                    </a:xfrm>
+                    <a:prstGeom prst="rect">
+                      <a:avLst/>
+                    </a:prstGeom>
+                  </pic:spPr>
+                </pic:pic>
+              </a:graphicData>
+            </a:graphic>
+          </wp:inline>
+        </w:drawing>
+      </w:r>
+    </w:p>
+    <w:p>
+      <w:pPr>
+        <w:spacing w:after="120" w:line="240" w:lineRule="exact"/>
+      </w:pPr>
+      <w:r>
+        <w:rPr>
+          <w:i/>
+          <w:sz w:val="20"/>
+        </w:rPr>
+        <w:t>Figure 1 Use case diagram with system boundary and supporting actors</w:t>
+      </w:r>
+    </w:p>
+    <w:p>
+      <w:pPr>
+        <w:spacing w:after="60" w:line="240" w:lineRule="exact"/>
+      </w:pPr>
+      <w:r>
+        <w:rPr>
+          <w:sz w:val="22"/>
+        </w:rPr>
+        <w:t>UC-06 extends UC-04 when matching is used; UC-10 extends UC-09 after an unfit outcome and can also start independently. UC-11 serves every signed-in human role. Representatives may perform requester actions. Exact permissions remain in Section 2.3.</w:t>
+      </w:r>
+    </w:p>
+    <w:p>
+      <w:pPr>
+        <w:pStyle w:val="Heading2"/>
+      </w:pPr>
+      <w:bookmarkStart w:id="44" w:name="SRS_1045"/>
+      <w:r>
+        <w:lastRenderedPageBreak/>
+        <w:t>B.2 Asset Life Cycle State Model</w:t>
+      </w:r>
+      <w:bookmarkEnd w:id="44"/>
+    </w:p>
+    <w:p>
+      <w:pPr>
+        <w:keepNext/>
+        <w:spacing w:after="60"/>
+      </w:pPr>
+      <w:r>
+        <w:rPr>
+          <w:noProof/>
+        </w:rPr>
+        <w:drawing>
+          <wp:inline distT="0" distB="0" distL="0" distR="0" wp14:anchorId="015971EE" wp14:editId="5F747546">
+            <wp:extent cx="5760720" cy="5479872"/>
+            <wp:effectExtent l="0" t="0" r="0" b="0"/>
+            <wp:docPr id="2" name="Picture 2" descr="Figure 2 Asset state model with guarded receipt return and prior-state rejection outcomes"/>
+            <wp:cNvGraphicFramePr>
+              <a:graphicFrameLocks xmlns:a="http://schemas.openxmlformats.org/drawingml/2006/main" noChangeAspect="1"/>
+            </wp:cNvGraphicFramePr>
+            <a:graphic xmlns:a="http://schemas.openxmlformats.org/drawingml/2006/main">
+              <a:graphicData uri="http://schemas.openxmlformats.org/drawingml/2006/picture">
+                <pic:pic xmlns:pic="http://schemas.openxmlformats.org/drawingml/2006/picture">
+                  <pic:nvPicPr>
+                    <pic:cNvPr id="0" name="asset-state-model.png"/>
+                    <pic:cNvPicPr/>
+                  </pic:nvPicPr>
+                  <pic:blipFill>
+                    <a:blip r:embed="rId11"/>
+                    <a:stretch>
+                      <a:fillRect/>
+                    </a:stretch>
+                  </pic:blipFill>
+                  <pic:spPr>
+                    <a:xfrm>
+                      <a:off x="0" y="0"/>
+                      <a:ext cx="5760720" cy="5479872"/>
+                    </a:xfrm>
+                    <a:prstGeom prst="rect">
+                      <a:avLst/>
+                    </a:prstGeom>
+                  </pic:spPr>
+                </pic:pic>
+              </a:graphicData>
+            </a:graphic>
+          </wp:inline>
+        </w:drawing>
+      </w:r>
+    </w:p>
+    <w:p>
+      <w:pPr>
+        <w:spacing w:after="120" w:line="240" w:lineRule="exact"/>
+      </w:pPr>
+      <w:r>
+        <w:rPr>
+          <w:i/>
+          <w:sz w:val="20"/>
+        </w:rPr>
+        <w:t>Figure 2 Asset state model with guarded receipt return and prior-state rejection outcomes</w:t>
+      </w:r>
+    </w:p>
+    <w:p>
+      <w:pPr>
+        <w:spacing w:after="60" w:line="240" w:lineRule="exact"/>
+      </w:pPr>
+      <w:r>
+        <w:rPr>
+          <w:sz w:val="21"/>
+        </w:rPr>
+        <w:t>This overview groups final end-of-life outcomes and shows the principal service/reuse paths. The complete permitted transitions, including condition failures in Available/Reserved, restored availability after maintenance and coordinated return quantities, are specified in B.3.1. A rejection restores the pre-proposal state; it does not certify safety or restore availability by itself.</w:t>
+      </w:r>
+    </w:p>
+    <w:p>
+      <w:pPr>
+        <w:pStyle w:val="Heading2"/>
+      </w:pPr>
+      <w:bookmarkStart w:id="45" w:name="SRS_1044"/>
+      <w:r>
+        <w:t>B.3 Workflow States and Approval Stages</w:t>
+      </w:r>
+      <w:bookmarkEnd w:id="45"/>
+    </w:p>
+    <w:p>
+      <w:pPr>
+        <w:spacing w:after="60" w:line="260" w:lineRule="exact"/>
+      </w:pPr>
+      <w:r>
+        <w:rPr>
+          <w:sz w:val="22"/>
+        </w:rPr>
+        <w:t xml:space="preserve">States apply to an individually tracked asset or a defined batch portion, not automatically to every unit in a batch. Different portions may occupy different states. A batch of 10 with 3 Reserved therefore retains 7 Available. Preserve quantity totals and allocation links after every transition. Transitions not listed are invalid. Final end-of-life units remain in history but are excluded from stock. Tables and diagrams use the same transition guards. Role scopes, safety gates and allocation controls in Sections 4 and 5.5 and the use </w:t>
+      </w:r>
+      <w:r>
+        <w:rPr>
+          <w:sz w:val="22"/>
+        </w:rPr>
+        <w:lastRenderedPageBreak/>
+        <w:t>cases remain binding: unsafe/disputed stock stays unavailable, cancellation does not clear safety flags, and end-of-life proposals require no active allocation.</w:t>
+      </w:r>
+    </w:p>
+    <w:p>
+      <w:pPr>
+        <w:pStyle w:val="Heading3"/>
+      </w:pPr>
+      <w:r>
+        <w:t>B.3.1 Asset States</w:t>
+      </w:r>
+    </w:p>
+    <w:tbl>
+      <w:tblPr>
+        <w:tblW w:w="0" w:type="auto"/>
+        <w:jc w:val="center"/>
+        <w:tblBorders>
+          <w:top w:val="single" w:sz="4" w:space="0" w:color="B8B8B8"/>
+          <w:left w:val="single" w:sz="4" w:space="0" w:color="B8B8B8"/>
+          <w:bottom w:val="single" w:sz="4" w:space="0" w:color="B8B8B8"/>
+          <w:right w:val="single" w:sz="4" w:space="0" w:color="B8B8B8"/>
+          <w:insideH w:val="single" w:sz="4" w:space="0" w:color="B8B8B8"/>
+          <w:insideV w:val="single" w:sz="4" w:space="0" w:color="B8B8B8"/>
+        </w:tblBorders>
+        <w:tblLayout w:type="fixed"/>
+        <w:tblLook w:val="04A0" w:firstRow="1" w:lastRow="0" w:firstColumn="1" w:lastColumn="0" w:noHBand="0" w:noVBand="1"/>
+      </w:tblPr>
+      <w:tblGrid>
+        <w:gridCol w:w="1728"/>
+        <w:gridCol w:w="5328"/>
+        <w:gridCol w:w="2304"/>
+      </w:tblGrid>
+      <w:tr>
+        <w:trPr>
+          <w:cantSplit/>
+          <w:tblHeader/>
+          <w:jc w:val="center"/>
+        </w:trPr>
+        <w:tc>
+          <w:tcPr>
+            <w:tcW w:w="1728" w:type="dxa"/>
+            <w:shd w:val="clear" w:color="auto" w:fill="EDEDED"/>
+            <w:tcMar>
+              <w:top w:w="55" w:type="dxa"/>
+              <w:left w:w="90" w:type="dxa"/>
+              <w:bottom w:w="55" w:type="dxa"/>
+              <w:right w:w="90" w:type="dxa"/>
+            </w:tcMar>
+            <w:vAlign w:val="center"/>
+          </w:tcPr>
+          <w:p>
+            <w:pPr>
+              <w:keepNext/>
+              <w:spacing w:line="240" w:lineRule="exact"/>
+            </w:pPr>
+            <w:r>
+              <w:rPr>
+                <w:b/>
+                <w:sz w:val="20"/>
+              </w:rPr>
+              <w:t>State</w:t>
+            </w:r>
+          </w:p>
+        </w:tc>
+        <w:tc>
+          <w:tcPr>
+            <w:tcW w:w="5328" w:type="dxa"/>
+            <w:shd w:val="clear" w:color="auto" w:fill="EDEDED"/>
+            <w:tcMar>
+              <w:top w:w="55" w:type="dxa"/>
+              <w:left w:w="90" w:type="dxa"/>
+              <w:bottom w:w="55" w:type="dxa"/>
+              <w:right w:w="90" w:type="dxa"/>
+            </w:tcMar>
+            <w:vAlign w:val="center"/>
+          </w:tcPr>
+          <w:p>
+            <w:pPr>
+              <w:keepNext/>
+              <w:spacing w:line="240" w:lineRule="exact"/>
+            </w:pPr>
+            <w:r>
+              <w:rPr>
+                <w:b/>
+                <w:sz w:val="20"/>
+              </w:rPr>
+              <w:t>Permitted next states and conditions</w:t>
+            </w:r>
+          </w:p>
+        </w:tc>
+        <w:tc>
+          <w:tcPr>
+            <w:tcW w:w="2304" w:type="dxa"/>
+            <w:shd w:val="clear" w:color="auto" w:fill="EDEDED"/>
+            <w:tcMar>
+              <w:top w:w="55" w:type="dxa"/>
+              <w:left w:w="90" w:type="dxa"/>
+              <w:bottom w:w="55" w:type="dxa"/>
+              <w:right w:w="90" w:type="dxa"/>
+            </w:tcMar>
+            <w:vAlign w:val="center"/>
+          </w:tcPr>
+          <w:p>
+            <w:pPr>
+              <w:keepNext/>
+              <w:spacing w:line="240" w:lineRule="exact"/>
+            </w:pPr>
+            <w:r>
+              <w:rPr>
+                <w:b/>
+                <w:sz w:val="20"/>
+              </w:rPr>
+              <w:t>Responsible role or control</w:t>
+            </w:r>
+          </w:p>
+        </w:tc>
+      </w:tr>
+      <w:tr>
+        <w:trPr>
+          <w:cantSplit/>
+          <w:jc w:val="center"/>
+        </w:trPr>
+        <w:tc>
+          <w:tcPr>
+            <w:tcW w:w="1728" w:type="dxa"/>
+            <w:tcMar>
+              <w:top w:w="55" w:type="dxa"/>
+              <w:left w:w="90" w:type="dxa"/>
+              <w:bottom w:w="55" w:type="dxa"/>
+              <w:right w:w="90" w:type="dxa"/>
+            </w:tcMar>
+            <w:vAlign w:val="center"/>
+          </w:tcPr>
+          <w:p>
+            <w:pPr>
+              <w:spacing w:line="240" w:lineRule="exact"/>
+            </w:pPr>
+            <w:r>
+              <w:rPr>
+                <w:sz w:val="20"/>
+              </w:rPr>
+              <w:t>Registered</w:t>
+            </w:r>
+          </w:p>
+        </w:tc>
+        <w:tc>
+          <w:tcPr>
+            <w:tcW w:w="5328" w:type="dxa"/>
+            <w:tcMar>
+              <w:top w:w="55" w:type="dxa"/>
+              <w:left w:w="90" w:type="dxa"/>
+              <w:bottom w:w="55" w:type="dxa"/>
+              <w:right w:w="90" w:type="dxa"/>
+            </w:tcMar>
+            <w:vAlign w:val="center"/>
+          </w:tcPr>
+          <w:p>
+            <w:pPr>
+              <w:spacing w:line="240" w:lineRule="exact"/>
+            </w:pPr>
+            <w:r>
+              <w:rPr>
+                <w:sz w:val="20"/>
+              </w:rPr>
+              <w:t>In Use (allocated); Available (published).</w:t>
+            </w:r>
+          </w:p>
+        </w:tc>
+        <w:tc>
+          <w:tcPr>
+            <w:tcW w:w="2304" w:type="dxa"/>
+            <w:tcMar>
+              <w:top w:w="55" w:type="dxa"/>
+              <w:left w:w="90" w:type="dxa"/>
+              <w:bottom w:w="55" w:type="dxa"/>
+              <w:right w:w="90" w:type="dxa"/>
+            </w:tcMar>
+            <w:vAlign w:val="center"/>
+          </w:tcPr>
+          <w:p>
+            <w:pPr>
+              <w:spacing w:line="240" w:lineRule="exact"/>
+            </w:pPr>
+            <w:r>
+              <w:rPr>
+                <w:sz w:val="20"/>
+              </w:rPr>
+              <w:t>Department Representative / Asset Custodian.</w:t>
+            </w:r>
+          </w:p>
+        </w:tc>
+      </w:tr>
+      <w:tr>
+        <w:trPr>
+          <w:cantSplit/>
+          <w:jc w:val="center"/>
+        </w:trPr>
+        <w:tc>
+          <w:tcPr>
+            <w:tcW w:w="1728" w:type="dxa"/>
+            <w:tcMar>
+              <w:top w:w="55" w:type="dxa"/>
+              <w:left w:w="90" w:type="dxa"/>
+              <w:bottom w:w="55" w:type="dxa"/>
+              <w:right w:w="90" w:type="dxa"/>
+            </w:tcMar>
+            <w:vAlign w:val="center"/>
+          </w:tcPr>
+          <w:p>
+            <w:pPr>
+              <w:spacing w:line="240" w:lineRule="exact"/>
+            </w:pPr>
+            <w:r>
+              <w:rPr>
+                <w:sz w:val="20"/>
+              </w:rPr>
+              <w:t>In Use</w:t>
+            </w:r>
+          </w:p>
+        </w:tc>
+        <w:tc>
+          <w:tcPr>
+            <w:tcW w:w="5328" w:type="dxa"/>
+            <w:tcMar>
+              <w:top w:w="55" w:type="dxa"/>
+              <w:left w:w="90" w:type="dxa"/>
+              <w:bottom w:w="55" w:type="dxa"/>
+              <w:right w:w="90" w:type="dxa"/>
+            </w:tcMar>
+            <w:vAlign w:val="center"/>
+          </w:tcPr>
+          <w:p>
+            <w:pPr>
+              <w:spacing w:line="240" w:lineRule="exact"/>
+            </w:pPr>
+            <w:r>
+              <w:rPr>
+                <w:sz w:val="20"/>
+              </w:rPr>
+              <w:t>Available (published); Under Maintenance; Unfit; Pending End-of-Life.</w:t>
+            </w:r>
+          </w:p>
+        </w:tc>
+        <w:tc>
+          <w:tcPr>
+            <w:tcW w:w="2304" w:type="dxa"/>
+            <w:tcMar>
+              <w:top w:w="55" w:type="dxa"/>
+              <w:left w:w="90" w:type="dxa"/>
+              <w:bottom w:w="55" w:type="dxa"/>
+              <w:right w:w="90" w:type="dxa"/>
+            </w:tcMar>
+            <w:vAlign w:val="center"/>
+          </w:tcPr>
+          <w:p>
+            <w:pPr>
+              <w:spacing w:line="240" w:lineRule="exact"/>
+            </w:pPr>
+            <w:r>
+              <w:rPr>
+                <w:sz w:val="20"/>
+              </w:rPr>
+              <w:t>Custodian; Maintenance Staff assess condition.</w:t>
+            </w:r>
+          </w:p>
+        </w:tc>
+      </w:tr>
+      <w:tr>
+        <w:trPr>
+          <w:cantSplit/>
+          <w:jc w:val="center"/>
+        </w:trPr>
+        <w:tc>
+          <w:tcPr>
+            <w:tcW w:w="1728" w:type="dxa"/>
+            <w:tcMar>
+              <w:top w:w="55" w:type="dxa"/>
+              <w:left w:w="90" w:type="dxa"/>
+              <w:bottom w:w="55" w:type="dxa"/>
+              <w:right w:w="90" w:type="dxa"/>
+            </w:tcMar>
+            <w:vAlign w:val="center"/>
+          </w:tcPr>
+          <w:p>
+            <w:pPr>
+              <w:spacing w:line="240" w:lineRule="exact"/>
+            </w:pPr>
+            <w:r>
+              <w:rPr>
+                <w:sz w:val="20"/>
+              </w:rPr>
+              <w:t>Available</w:t>
+            </w:r>
+          </w:p>
+        </w:tc>
+        <w:tc>
+          <w:tcPr>
+            <w:tcW w:w="5328" w:type="dxa"/>
+            <w:tcMar>
+              <w:top w:w="55" w:type="dxa"/>
+              <w:left w:w="90" w:type="dxa"/>
+              <w:bottom w:w="55" w:type="dxa"/>
+              <w:right w:w="90" w:type="dxa"/>
+            </w:tcMar>
+            <w:vAlign w:val="center"/>
+          </w:tcPr>
+          <w:p>
+            <w:pPr>
+              <w:spacing w:line="240" w:lineRule="exact"/>
+            </w:pPr>
+            <w:r>
+              <w:rPr>
+                <w:sz w:val="20"/>
+              </w:rPr>
+              <w:t>Reserved; In Use (withdrawn); Under Maintenance; Unfit when unsafe condition is confirmed.</w:t>
+            </w:r>
+          </w:p>
+        </w:tc>
+        <w:tc>
+          <w:tcPr>
+            <w:tcW w:w="2304" w:type="dxa"/>
+            <w:tcMar>
+              <w:top w:w="55" w:type="dxa"/>
+              <w:left w:w="90" w:type="dxa"/>
+              <w:bottom w:w="55" w:type="dxa"/>
+              <w:right w:w="90" w:type="dxa"/>
+            </w:tcMar>
+            <w:vAlign w:val="center"/>
+          </w:tcPr>
+          <w:p>
+            <w:pPr>
+              <w:spacing w:line="240" w:lineRule="exact"/>
+            </w:pPr>
+            <w:r>
+              <w:rPr>
+                <w:sz w:val="20"/>
+              </w:rPr>
+              <w:t>Supplying representative; authorized condition assessor.</w:t>
+            </w:r>
+          </w:p>
+        </w:tc>
+      </w:tr>
+      <w:tr>
+        <w:trPr>
+          <w:cantSplit/>
+          <w:jc w:val="center"/>
+        </w:trPr>
+        <w:tc>
+          <w:tcPr>
+            <w:tcW w:w="1728" w:type="dxa"/>
+            <w:tcMar>
+              <w:top w:w="55" w:type="dxa"/>
+              <w:left w:w="90" w:type="dxa"/>
+              <w:bottom w:w="55" w:type="dxa"/>
+              <w:right w:w="90" w:type="dxa"/>
+            </w:tcMar>
+            <w:vAlign w:val="center"/>
+          </w:tcPr>
+          <w:p>
+            <w:pPr>
+              <w:spacing w:line="240" w:lineRule="exact"/>
+            </w:pPr>
+            <w:r>
+              <w:rPr>
+                <w:sz w:val="20"/>
+              </w:rPr>
+              <w:t>Reserved</w:t>
+            </w:r>
+          </w:p>
+        </w:tc>
+        <w:tc>
+          <w:tcPr>
+            <w:tcW w:w="5328" w:type="dxa"/>
+            <w:tcMar>
+              <w:top w:w="55" w:type="dxa"/>
+              <w:left w:w="90" w:type="dxa"/>
+              <w:bottom w:w="55" w:type="dxa"/>
+              <w:right w:w="90" w:type="dxa"/>
+            </w:tcMar>
+            <w:vAlign w:val="center"/>
+          </w:tcPr>
+          <w:p>
+            <w:pPr>
+              <w:spacing w:line="240" w:lineRule="exact"/>
+            </w:pPr>
+            <w:r>
+              <w:rPr>
+                <w:sz w:val="20"/>
+              </w:rPr>
+              <w:t>In Transfer (dispatch); Available (cancelled before dispatch); Under Maintenance or Unfit after a condition failure, with allocation released and need restored.</w:t>
+            </w:r>
+          </w:p>
+        </w:tc>
+        <w:tc>
+          <w:tcPr>
+            <w:tcW w:w="2304" w:type="dxa"/>
+            <w:tcMar>
+              <w:top w:w="55" w:type="dxa"/>
+              <w:left w:w="90" w:type="dxa"/>
+              <w:bottom w:w="55" w:type="dxa"/>
+              <w:right w:w="90" w:type="dxa"/>
+            </w:tcMar>
+            <w:vAlign w:val="center"/>
+          </w:tcPr>
+          <w:p>
+            <w:pPr>
+              <w:spacing w:line="240" w:lineRule="exact"/>
+            </w:pPr>
+            <w:r>
+              <w:rPr>
+                <w:sz w:val="20"/>
+              </w:rPr>
+              <w:t>Supplying representative / Facilities Staff; condition assessor.</w:t>
+            </w:r>
+          </w:p>
+        </w:tc>
+      </w:tr>
+      <w:tr>
+        <w:trPr>
+          <w:cantSplit/>
+          <w:jc w:val="center"/>
+        </w:trPr>
+        <w:tc>
+          <w:tcPr>
+            <w:tcW w:w="1728" w:type="dxa"/>
+            <w:tcMar>
+              <w:top w:w="55" w:type="dxa"/>
+              <w:left w:w="90" w:type="dxa"/>
+              <w:bottom w:w="55" w:type="dxa"/>
+              <w:right w:w="90" w:type="dxa"/>
+            </w:tcMar>
+            <w:vAlign w:val="center"/>
+          </w:tcPr>
+          <w:p>
+            <w:pPr>
+              <w:spacing w:line="240" w:lineRule="exact"/>
+            </w:pPr>
+            <w:r>
+              <w:rPr>
+                <w:sz w:val="20"/>
+              </w:rPr>
+              <w:t>In Transfer</w:t>
+            </w:r>
+          </w:p>
+        </w:tc>
+        <w:tc>
+          <w:tcPr>
+            <w:tcW w:w="5328" w:type="dxa"/>
+            <w:tcMar>
+              <w:top w:w="55" w:type="dxa"/>
+              <w:left w:w="90" w:type="dxa"/>
+              <w:bottom w:w="55" w:type="dxa"/>
+              <w:right w:w="90" w:type="dxa"/>
+            </w:tcMar>
+            <w:vAlign w:val="center"/>
+          </w:tcPr>
+          <w:p>
+            <w:pPr>
+              <w:spacing w:line="240" w:lineRule="exact"/>
+            </w:pPr>
+            <w:r>
+              <w:rPr>
+                <w:sz w:val="20"/>
+              </w:rPr>
+              <w:t>In Use at receiver (accepted receipt); Available or In Use at supplier (confirmed suitable return); Unfit or Under Maintenance (confirmed unsafe/inspection-required return).</w:t>
+            </w:r>
+          </w:p>
+        </w:tc>
+        <w:tc>
+          <w:tcPr>
+            <w:tcW w:w="2304" w:type="dxa"/>
+            <w:tcMar>
+              <w:top w:w="55" w:type="dxa"/>
+              <w:left w:w="90" w:type="dxa"/>
+              <w:bottom w:w="55" w:type="dxa"/>
+              <w:right w:w="90" w:type="dxa"/>
+            </w:tcMar>
+            <w:vAlign w:val="center"/>
+          </w:tcPr>
+          <w:p>
+            <w:pPr>
+              <w:spacing w:line="240" w:lineRule="exact"/>
+            </w:pPr>
+            <w:r>
+              <w:rPr>
+                <w:sz w:val="20"/>
+              </w:rPr>
+              <w:t>Receiver accepts; supplier confirms return/condition.</w:t>
+            </w:r>
+          </w:p>
+        </w:tc>
+      </w:tr>
+      <w:tr>
+        <w:trPr>
+          <w:cantSplit/>
+          <w:jc w:val="center"/>
+        </w:trPr>
+        <w:tc>
+          <w:tcPr>
+            <w:tcW w:w="1728" w:type="dxa"/>
+            <w:tcMar>
+              <w:top w:w="55" w:type="dxa"/>
+              <w:left w:w="90" w:type="dxa"/>
+              <w:bottom w:w="55" w:type="dxa"/>
+              <w:right w:w="90" w:type="dxa"/>
+            </w:tcMar>
+            <w:vAlign w:val="center"/>
+          </w:tcPr>
+          <w:p>
+            <w:pPr>
+              <w:spacing w:line="240" w:lineRule="exact"/>
+            </w:pPr>
+            <w:r>
+              <w:rPr>
+                <w:sz w:val="20"/>
+              </w:rPr>
+              <w:t>Under Maintenance</w:t>
+            </w:r>
+          </w:p>
+        </w:tc>
+        <w:tc>
+          <w:tcPr>
+            <w:tcW w:w="5328" w:type="dxa"/>
+            <w:tcMar>
+              <w:top w:w="55" w:type="dxa"/>
+              <w:left w:w="90" w:type="dxa"/>
+              <w:bottom w:w="55" w:type="dxa"/>
+              <w:right w:w="90" w:type="dxa"/>
+            </w:tcMar>
+            <w:vAlign w:val="center"/>
+          </w:tcPr>
+          <w:p>
+            <w:pPr>
+              <w:spacing w:line="240" w:lineRule="exact"/>
+            </w:pPr>
+            <w:r>
+              <w:rPr>
+                <w:sz w:val="20"/>
+              </w:rPr>
+              <w:t>In Use or Available (safe restoration to prior service/listing context); Unfit (unsuitable outcome).</w:t>
+            </w:r>
+          </w:p>
+        </w:tc>
+        <w:tc>
+          <w:tcPr>
+            <w:tcW w:w="2304" w:type="dxa"/>
+            <w:tcMar>
+              <w:top w:w="55" w:type="dxa"/>
+              <w:left w:w="90" w:type="dxa"/>
+              <w:bottom w:w="55" w:type="dxa"/>
+              <w:right w:w="90" w:type="dxa"/>
+            </w:tcMar>
+            <w:vAlign w:val="center"/>
+          </w:tcPr>
+          <w:p>
+            <w:pPr>
+              <w:spacing w:line="240" w:lineRule="exact"/>
+            </w:pPr>
+            <w:r>
+              <w:rPr>
+                <w:sz w:val="20"/>
+              </w:rPr>
+              <w:t>Maintenance Staff; authorized condition update.</w:t>
+            </w:r>
+          </w:p>
+        </w:tc>
+      </w:tr>
+      <w:tr>
+        <w:trPr>
+          <w:cantSplit/>
+          <w:jc w:val="center"/>
+        </w:trPr>
+        <w:tc>
+          <w:tcPr>
+            <w:tcW w:w="1728" w:type="dxa"/>
+            <w:tcMar>
+              <w:top w:w="55" w:type="dxa"/>
+              <w:left w:w="90" w:type="dxa"/>
+              <w:bottom w:w="55" w:type="dxa"/>
+              <w:right w:w="90" w:type="dxa"/>
+            </w:tcMar>
+            <w:vAlign w:val="center"/>
+          </w:tcPr>
+          <w:p>
+            <w:pPr>
+              <w:spacing w:line="240" w:lineRule="exact"/>
+            </w:pPr>
+            <w:r>
+              <w:rPr>
+                <w:sz w:val="20"/>
+              </w:rPr>
+              <w:t>Unfit</w:t>
+            </w:r>
+          </w:p>
+        </w:tc>
+        <w:tc>
+          <w:tcPr>
+            <w:tcW w:w="5328" w:type="dxa"/>
+            <w:tcMar>
+              <w:top w:w="55" w:type="dxa"/>
+              <w:left w:w="90" w:type="dxa"/>
+              <w:bottom w:w="55" w:type="dxa"/>
+              <w:right w:w="90" w:type="dxa"/>
+            </w:tcMar>
+            <w:vAlign w:val="center"/>
+          </w:tcPr>
+          <w:p>
+            <w:pPr>
+              <w:spacing w:line="240" w:lineRule="exact"/>
+            </w:pPr>
+            <w:r>
+              <w:rPr>
+                <w:sz w:val="20"/>
+              </w:rPr>
+              <w:t>Under Maintenance; Pending End-of-Life.</w:t>
+            </w:r>
+          </w:p>
+        </w:tc>
+        <w:tc>
+          <w:tcPr>
+            <w:tcW w:w="2304" w:type="dxa"/>
+            <w:tcMar>
+              <w:top w:w="55" w:type="dxa"/>
+              <w:left w:w="90" w:type="dxa"/>
+              <w:bottom w:w="55" w:type="dxa"/>
+              <w:right w:w="90" w:type="dxa"/>
+            </w:tcMar>
+            <w:vAlign w:val="center"/>
+          </w:tcPr>
+          <w:p>
+            <w:pPr>
+              <w:spacing w:line="240" w:lineRule="exact"/>
+            </w:pPr>
+            <w:r>
+              <w:rPr>
+                <w:sz w:val="20"/>
+              </w:rPr>
+              <w:t>Custodian / Maintenance Staff.</w:t>
+            </w:r>
+          </w:p>
+        </w:tc>
+      </w:tr>
+      <w:tr>
+        <w:trPr>
+          <w:cantSplit/>
+          <w:jc w:val="center"/>
+        </w:trPr>
+        <w:tc>
+          <w:tcPr>
+            <w:tcW w:w="1728" w:type="dxa"/>
+            <w:tcMar>
+              <w:top w:w="55" w:type="dxa"/>
+              <w:left w:w="90" w:type="dxa"/>
+              <w:bottom w:w="55" w:type="dxa"/>
+              <w:right w:w="90" w:type="dxa"/>
+            </w:tcMar>
+            <w:vAlign w:val="center"/>
+          </w:tcPr>
+          <w:p>
+            <w:pPr>
+              <w:spacing w:line="240" w:lineRule="exact"/>
+            </w:pPr>
+            <w:r>
+              <w:rPr>
+                <w:sz w:val="20"/>
+              </w:rPr>
+              <w:t>Pending End-of-Life</w:t>
+            </w:r>
+          </w:p>
+        </w:tc>
+        <w:tc>
+          <w:tcPr>
+            <w:tcW w:w="5328" w:type="dxa"/>
+            <w:tcMar>
+              <w:top w:w="55" w:type="dxa"/>
+              <w:left w:w="90" w:type="dxa"/>
+              <w:bottom w:w="55" w:type="dxa"/>
+              <w:right w:w="90" w:type="dxa"/>
+            </w:tcMar>
+            <w:vAlign w:val="center"/>
+          </w:tcPr>
+          <w:p>
+            <w:pPr>
+              <w:spacing w:line="240" w:lineRule="exact"/>
+            </w:pPr>
+            <w:r>
+              <w:rPr>
+                <w:sz w:val="20"/>
+              </w:rPr>
+              <w:t>Retired after authorized retirement; Donated/Recycled/Dismantled/Disposed after authorized completed action; restore prior In Use, Unfit or Retired state if rejected.</w:t>
+            </w:r>
+          </w:p>
+        </w:tc>
+        <w:tc>
+          <w:tcPr>
+            <w:tcW w:w="2304" w:type="dxa"/>
+            <w:tcMar>
+              <w:top w:w="55" w:type="dxa"/>
+              <w:left w:w="90" w:type="dxa"/>
+              <w:bottom w:w="55" w:type="dxa"/>
+              <w:right w:w="90" w:type="dxa"/>
+            </w:tcMar>
+            <w:vAlign w:val="center"/>
+          </w:tcPr>
+          <w:p>
+            <w:pPr>
+              <w:spacing w:line="240" w:lineRule="exact"/>
+            </w:pPr>
+            <w:r>
+              <w:rPr>
+                <w:sz w:val="20"/>
+              </w:rPr>
+              <w:t>Business Administrator approves; staff record completion.</w:t>
+            </w:r>
+          </w:p>
+        </w:tc>
+      </w:tr>
+      <w:tr>
+        <w:trPr>
+          <w:cantSplit/>
+          <w:jc w:val="center"/>
+        </w:trPr>
+        <w:tc>
+          <w:tcPr>
+            <w:tcW w:w="1728" w:type="dxa"/>
+            <w:tcMar>
+              <w:top w:w="55" w:type="dxa"/>
+              <w:left w:w="90" w:type="dxa"/>
+              <w:bottom w:w="55" w:type="dxa"/>
+              <w:right w:w="90" w:type="dxa"/>
+            </w:tcMar>
+            <w:vAlign w:val="center"/>
+          </w:tcPr>
+          <w:p>
+            <w:pPr>
+              <w:spacing w:line="240" w:lineRule="exact"/>
+            </w:pPr>
+            <w:r>
+              <w:rPr>
+                <w:sz w:val="20"/>
+              </w:rPr>
+              <w:t>Retired</w:t>
+            </w:r>
+          </w:p>
+        </w:tc>
+        <w:tc>
+          <w:tcPr>
+            <w:tcW w:w="5328" w:type="dxa"/>
+            <w:tcMar>
+              <w:top w:w="55" w:type="dxa"/>
+              <w:left w:w="90" w:type="dxa"/>
+              <w:bottom w:w="55" w:type="dxa"/>
+              <w:right w:w="90" w:type="dxa"/>
+            </w:tcMar>
+            <w:vAlign w:val="center"/>
+          </w:tcPr>
+          <w:p>
+            <w:pPr>
+              <w:spacing w:line="240" w:lineRule="exact"/>
+            </w:pPr>
+            <w:r>
+              <w:rPr>
+                <w:sz w:val="20"/>
+              </w:rPr>
+              <w:t>Pending End-of-Life for a proposed final action.</w:t>
+            </w:r>
+          </w:p>
+        </w:tc>
+        <w:tc>
+          <w:tcPr>
+            <w:tcW w:w="2304" w:type="dxa"/>
+            <w:tcMar>
+              <w:top w:w="55" w:type="dxa"/>
+              <w:left w:w="90" w:type="dxa"/>
+              <w:bottom w:w="55" w:type="dxa"/>
+              <w:right w:w="90" w:type="dxa"/>
+            </w:tcMar>
+            <w:vAlign w:val="center"/>
+          </w:tcPr>
+          <w:p>
+            <w:pPr>
+              <w:spacing w:line="240" w:lineRule="exact"/>
+            </w:pPr>
+            <w:r>
+              <w:rPr>
+                <w:sz w:val="20"/>
+              </w:rPr>
+              <w:t>Custodian.</w:t>
+            </w:r>
+          </w:p>
+        </w:tc>
+      </w:tr>
+      <w:tr>
+        <w:trPr>
+          <w:cantSplit/>
+          <w:jc w:val="center"/>
+        </w:trPr>
+        <w:tc>
+          <w:tcPr>
+            <w:tcW w:w="1728" w:type="dxa"/>
+            <w:tcMar>
+              <w:top w:w="55" w:type="dxa"/>
+              <w:left w:w="90" w:type="dxa"/>
+              <w:bottom w:w="55" w:type="dxa"/>
+              <w:right w:w="90" w:type="dxa"/>
+            </w:tcMar>
+            <w:vAlign w:val="center"/>
+          </w:tcPr>
+          <w:p>
+            <w:pPr>
+              <w:spacing w:line="240" w:lineRule="exact"/>
+            </w:pPr>
+            <w:r>
+              <w:rPr>
+                <w:sz w:val="20"/>
+              </w:rPr>
+              <w:t>Donated / Recycled / Dismantled / Disposed</w:t>
+            </w:r>
+          </w:p>
+        </w:tc>
+        <w:tc>
+          <w:tcPr>
+            <w:tcW w:w="5328" w:type="dxa"/>
+            <w:tcMar>
+              <w:top w:w="55" w:type="dxa"/>
+              <w:left w:w="90" w:type="dxa"/>
+              <w:bottom w:w="55" w:type="dxa"/>
+              <w:right w:w="90" w:type="dxa"/>
+            </w:tcMar>
+            <w:vAlign w:val="center"/>
+          </w:tcPr>
+          <w:p>
+            <w:pPr>
+              <w:spacing w:line="240" w:lineRule="exact"/>
+            </w:pPr>
+            <w:r>
+              <w:rPr>
+                <w:sz w:val="20"/>
+              </w:rPr>
+              <w:t>No further transition; retain history.</w:t>
+            </w:r>
+          </w:p>
+        </w:tc>
+        <w:tc>
+          <w:tcPr>
+            <w:tcW w:w="2304" w:type="dxa"/>
+            <w:tcMar>
+              <w:top w:w="55" w:type="dxa"/>
+              <w:left w:w="90" w:type="dxa"/>
+              <w:bottom w:w="55" w:type="dxa"/>
+              <w:right w:w="90" w:type="dxa"/>
+            </w:tcMar>
+            <w:vAlign w:val="center"/>
+          </w:tcPr>
+          <w:p>
+            <w:pPr>
+              <w:spacing w:line="240" w:lineRule="exact"/>
+            </w:pPr>
+            <w:r>
+              <w:rPr>
+                <w:sz w:val="20"/>
+              </w:rPr>
+              <w:t>Final; history retained.</w:t>
+            </w:r>
+          </w:p>
+        </w:tc>
+      </w:tr>
+    </w:tbl>
+    <w:p>
+      <w:pPr>
+        <w:spacing w:after="40" w:line="240" w:lineRule="exact"/>
+      </w:pPr>
+    </w:p>
+    <w:p>
+      <w:pPr>
+        <w:pStyle w:val="Heading3"/>
+      </w:pPr>
+      <w:r>
+        <w:t>B.3.2 Request States</w:t>
+      </w:r>
+    </w:p>
+    <w:p>
+      <w:pPr>
+        <w:spacing w:after="60" w:line="240" w:lineRule="exact"/>
+      </w:pPr>
+      <w:r>
+        <w:rPr>
+          <w:sz w:val="21"/>
+        </w:rPr>
+        <w:t>Requested, accepted, active-allocation and unallocated-outstanding quantities are maintained separately. Reserved means active allocation exists without accepted fulfilment; Partially Fulfilled means some but not all units were accepted, with or without further active allocation. Either state permits further reservation of unallocated outstanding need. Returned quantity is not accepted fulfilment. Final closure does not imply that all requested units were received.</w:t>
+      </w:r>
+    </w:p>
+    <w:tbl>
+      <w:tblPr>
+        <w:tblW w:w="0" w:type="auto"/>
+        <w:jc w:val="center"/>
+        <w:tblBorders>
+          <w:top w:val="single" w:sz="4" w:space="0" w:color="B8B8B8"/>
+          <w:left w:val="single" w:sz="4" w:space="0" w:color="B8B8B8"/>
+          <w:bottom w:val="single" w:sz="4" w:space="0" w:color="B8B8B8"/>
+          <w:right w:val="single" w:sz="4" w:space="0" w:color="B8B8B8"/>
+          <w:insideH w:val="single" w:sz="4" w:space="0" w:color="B8B8B8"/>
+          <w:insideV w:val="single" w:sz="4" w:space="0" w:color="B8B8B8"/>
+        </w:tblBorders>
+        <w:tblLayout w:type="fixed"/>
+        <w:tblLook w:val="04A0" w:firstRow="1" w:lastRow="0" w:firstColumn="1" w:lastColumn="0" w:noHBand="0" w:noVBand="1"/>
+      </w:tblPr>
+      <w:tblGrid>
+        <w:gridCol w:w="1728"/>
+        <w:gridCol w:w="5328"/>
+        <w:gridCol w:w="2304"/>
+      </w:tblGrid>
+      <w:tr>
+        <w:trPr>
+          <w:cantSplit/>
+          <w:tblHeader/>
+          <w:jc w:val="center"/>
+        </w:trPr>
+        <w:tc>
+          <w:tcPr>
+            <w:tcW w:w="1728" w:type="dxa"/>
+            <w:shd w:val="clear" w:color="auto" w:fill="EDEDED"/>
+            <w:tcMar>
+              <w:top w:w="55" w:type="dxa"/>
+              <w:left w:w="90" w:type="dxa"/>
+              <w:bottom w:w="55" w:type="dxa"/>
+              <w:right w:w="90" w:type="dxa"/>
+            </w:tcMar>
+            <w:vAlign w:val="center"/>
+          </w:tcPr>
+          <w:p>
+            <w:pPr>
+              <w:keepNext/>
+              <w:spacing w:line="240" w:lineRule="exact"/>
+            </w:pPr>
+            <w:r>
+              <w:rPr>
+                <w:b/>
+                <w:sz w:val="20"/>
+              </w:rPr>
+              <w:lastRenderedPageBreak/>
+              <w:t>State</w:t>
+            </w:r>
+          </w:p>
+        </w:tc>
+        <w:tc>
+          <w:tcPr>
+            <w:tcW w:w="5328" w:type="dxa"/>
+            <w:shd w:val="clear" w:color="auto" w:fill="EDEDED"/>
+            <w:tcMar>
+              <w:top w:w="55" w:type="dxa"/>
+              <w:left w:w="90" w:type="dxa"/>
+              <w:bottom w:w="55" w:type="dxa"/>
+              <w:right w:w="90" w:type="dxa"/>
+            </w:tcMar>
+            <w:vAlign w:val="center"/>
+          </w:tcPr>
+          <w:p>
+            <w:pPr>
+              <w:keepNext/>
+              <w:spacing w:line="240" w:lineRule="exact"/>
+            </w:pPr>
+            <w:r>
+              <w:rPr>
+                <w:b/>
+                <w:sz w:val="20"/>
+              </w:rPr>
+              <w:t>Permitted progression</w:t>
+            </w:r>
+          </w:p>
+        </w:tc>
+        <w:tc>
+          <w:tcPr>
+            <w:tcW w:w="2304" w:type="dxa"/>
+            <w:shd w:val="clear" w:color="auto" w:fill="EDEDED"/>
+            <w:tcMar>
+              <w:top w:w="55" w:type="dxa"/>
+              <w:left w:w="90" w:type="dxa"/>
+              <w:bottom w:w="55" w:type="dxa"/>
+              <w:right w:w="90" w:type="dxa"/>
+            </w:tcMar>
+            <w:vAlign w:val="center"/>
+          </w:tcPr>
+          <w:p>
+            <w:pPr>
+              <w:keepNext/>
+              <w:spacing w:line="240" w:lineRule="exact"/>
+            </w:pPr>
+            <w:r>
+              <w:rPr>
+                <w:b/>
+                <w:sz w:val="20"/>
+              </w:rPr>
+              <w:t>Role or condition</w:t>
+            </w:r>
+          </w:p>
+        </w:tc>
+      </w:tr>
+      <w:tr>
+        <w:trPr>
+          <w:cantSplit/>
+          <w:jc w:val="center"/>
+        </w:trPr>
+        <w:tc>
+          <w:tcPr>
+            <w:tcW w:w="1728" w:type="dxa"/>
+            <w:tcMar>
+              <w:top w:w="55" w:type="dxa"/>
+              <w:left w:w="90" w:type="dxa"/>
+              <w:bottom w:w="55" w:type="dxa"/>
+              <w:right w:w="90" w:type="dxa"/>
+            </w:tcMar>
+            <w:vAlign w:val="center"/>
+          </w:tcPr>
+          <w:p>
+            <w:pPr>
+              <w:spacing w:line="240" w:lineRule="exact"/>
+            </w:pPr>
+            <w:r>
+              <w:rPr>
+                <w:sz w:val="20"/>
+              </w:rPr>
+              <w:t>Open</w:t>
+            </w:r>
+          </w:p>
+        </w:tc>
+        <w:tc>
+          <w:tcPr>
+            <w:tcW w:w="5328" w:type="dxa"/>
+            <w:tcMar>
+              <w:top w:w="55" w:type="dxa"/>
+              <w:left w:w="90" w:type="dxa"/>
+              <w:bottom w:w="55" w:type="dxa"/>
+              <w:right w:w="90" w:type="dxa"/>
+            </w:tcMar>
+            <w:vAlign w:val="center"/>
+          </w:tcPr>
+          <w:p>
+            <w:pPr>
+              <w:spacing w:line="240" w:lineRule="exact"/>
+            </w:pPr>
+            <w:r>
+              <w:rPr>
+                <w:sz w:val="20"/>
+              </w:rPr>
+              <w:t>Reserved; Cancelled.</w:t>
+            </w:r>
+          </w:p>
+        </w:tc>
+        <w:tc>
+          <w:tcPr>
+            <w:tcW w:w="2304" w:type="dxa"/>
+            <w:tcMar>
+              <w:top w:w="55" w:type="dxa"/>
+              <w:left w:w="90" w:type="dxa"/>
+              <w:bottom w:w="55" w:type="dxa"/>
+              <w:right w:w="90" w:type="dxa"/>
+            </w:tcMar>
+            <w:vAlign w:val="center"/>
+          </w:tcPr>
+          <w:p>
+            <w:pPr>
+              <w:spacing w:line="240" w:lineRule="exact"/>
+            </w:pPr>
+            <w:r>
+              <w:rPr>
+                <w:sz w:val="20"/>
+              </w:rPr>
+              <w:t>Requester submits/cancels; supplier approves allocation.</w:t>
+            </w:r>
+          </w:p>
+        </w:tc>
+      </w:tr>
+      <w:tr>
+        <w:trPr>
+          <w:cantSplit/>
+          <w:jc w:val="center"/>
+        </w:trPr>
+        <w:tc>
+          <w:tcPr>
+            <w:tcW w:w="1728" w:type="dxa"/>
+            <w:tcMar>
+              <w:top w:w="55" w:type="dxa"/>
+              <w:left w:w="90" w:type="dxa"/>
+              <w:bottom w:w="55" w:type="dxa"/>
+              <w:right w:w="90" w:type="dxa"/>
+            </w:tcMar>
+            <w:vAlign w:val="center"/>
+          </w:tcPr>
+          <w:p>
+            <w:pPr>
+              <w:spacing w:line="240" w:lineRule="exact"/>
+            </w:pPr>
+            <w:r>
+              <w:rPr>
+                <w:sz w:val="20"/>
+              </w:rPr>
+              <w:t>Reserved</w:t>
+            </w:r>
+          </w:p>
+        </w:tc>
+        <w:tc>
+          <w:tcPr>
+            <w:tcW w:w="5328" w:type="dxa"/>
+            <w:tcMar>
+              <w:top w:w="55" w:type="dxa"/>
+              <w:left w:w="90" w:type="dxa"/>
+              <w:bottom w:w="55" w:type="dxa"/>
+              <w:right w:w="90" w:type="dxa"/>
+            </w:tcMar>
+            <w:vAlign w:val="center"/>
+          </w:tcPr>
+          <w:p>
+            <w:pPr>
+              <w:spacing w:line="240" w:lineRule="exact"/>
+            </w:pPr>
+            <w:r>
+              <w:rPr>
+                <w:sz w:val="20"/>
+              </w:rPr>
+              <w:t>Reserved with additional eligible allocations; Partially Fulfilled; Fulfilled; Open if all allocations released; Cancelled before dispatch.</w:t>
+            </w:r>
+          </w:p>
+        </w:tc>
+        <w:tc>
+          <w:tcPr>
+            <w:tcW w:w="2304" w:type="dxa"/>
+            <w:tcMar>
+              <w:top w:w="55" w:type="dxa"/>
+              <w:left w:w="90" w:type="dxa"/>
+              <w:bottom w:w="55" w:type="dxa"/>
+              <w:right w:w="90" w:type="dxa"/>
+            </w:tcMar>
+            <w:vAlign w:val="center"/>
+          </w:tcPr>
+          <w:p>
+            <w:pPr>
+              <w:spacing w:line="240" w:lineRule="exact"/>
+            </w:pPr>
+            <w:r>
+              <w:rPr>
+                <w:sz w:val="20"/>
+              </w:rPr>
+              <w:t>Supplier allocates; receiver accepts receipt. Reconcile dispatch before cancellation.</w:t>
+            </w:r>
+          </w:p>
+        </w:tc>
+      </w:tr>
+      <w:tr>
+        <w:trPr>
+          <w:cantSplit/>
+          <w:jc w:val="center"/>
+        </w:trPr>
+        <w:tc>
+          <w:tcPr>
+            <w:tcW w:w="1728" w:type="dxa"/>
+            <w:tcMar>
+              <w:top w:w="55" w:type="dxa"/>
+              <w:left w:w="90" w:type="dxa"/>
+              <w:bottom w:w="55" w:type="dxa"/>
+              <w:right w:w="90" w:type="dxa"/>
+            </w:tcMar>
+            <w:vAlign w:val="center"/>
+          </w:tcPr>
+          <w:p>
+            <w:pPr>
+              <w:spacing w:line="240" w:lineRule="exact"/>
+            </w:pPr>
+            <w:r>
+              <w:rPr>
+                <w:sz w:val="20"/>
+              </w:rPr>
+              <w:t>Partially Fulfilled</w:t>
+            </w:r>
+          </w:p>
+        </w:tc>
+        <w:tc>
+          <w:tcPr>
+            <w:tcW w:w="5328" w:type="dxa"/>
+            <w:tcMar>
+              <w:top w:w="55" w:type="dxa"/>
+              <w:left w:w="90" w:type="dxa"/>
+              <w:bottom w:w="55" w:type="dxa"/>
+              <w:right w:w="90" w:type="dxa"/>
+            </w:tcMar>
+            <w:vAlign w:val="center"/>
+          </w:tcPr>
+          <w:p>
+            <w:pPr>
+              <w:spacing w:line="240" w:lineRule="exact"/>
+            </w:pPr>
+            <w:r>
+              <w:rPr>
+                <w:sz w:val="20"/>
+              </w:rPr>
+              <w:t>Partially Fulfilled with further allocations/receipts; Fulfilled; Closed.</w:t>
+            </w:r>
+          </w:p>
+        </w:tc>
+        <w:tc>
+          <w:tcPr>
+            <w:tcW w:w="2304" w:type="dxa"/>
+            <w:tcMar>
+              <w:top w:w="55" w:type="dxa"/>
+              <w:left w:w="90" w:type="dxa"/>
+              <w:bottom w:w="55" w:type="dxa"/>
+              <w:right w:w="90" w:type="dxa"/>
+            </w:tcMar>
+            <w:vAlign w:val="center"/>
+          </w:tcPr>
+          <w:p>
+            <w:pPr>
+              <w:spacing w:line="240" w:lineRule="exact"/>
+            </w:pPr>
+            <w:r>
+              <w:rPr>
+                <w:sz w:val="20"/>
+              </w:rPr>
+              <w:t>Receiver accepts; requester may close after allocations are reconciled.</w:t>
+            </w:r>
+          </w:p>
+        </w:tc>
+      </w:tr>
+      <w:tr>
+        <w:trPr>
+          <w:cantSplit/>
+          <w:jc w:val="center"/>
+        </w:trPr>
+        <w:tc>
+          <w:tcPr>
+            <w:tcW w:w="1728" w:type="dxa"/>
+            <w:tcMar>
+              <w:top w:w="55" w:type="dxa"/>
+              <w:left w:w="90" w:type="dxa"/>
+              <w:bottom w:w="55" w:type="dxa"/>
+              <w:right w:w="90" w:type="dxa"/>
+            </w:tcMar>
+            <w:vAlign w:val="center"/>
+          </w:tcPr>
+          <w:p>
+            <w:pPr>
+              <w:spacing w:line="240" w:lineRule="exact"/>
+            </w:pPr>
+            <w:r>
+              <w:rPr>
+                <w:sz w:val="20"/>
+              </w:rPr>
+              <w:t>Fulfilled / Closed / Cancelled</w:t>
+            </w:r>
+          </w:p>
+        </w:tc>
+        <w:tc>
+          <w:tcPr>
+            <w:tcW w:w="5328" w:type="dxa"/>
+            <w:tcMar>
+              <w:top w:w="55" w:type="dxa"/>
+              <w:left w:w="90" w:type="dxa"/>
+              <w:bottom w:w="55" w:type="dxa"/>
+              <w:right w:w="90" w:type="dxa"/>
+            </w:tcMar>
+            <w:vAlign w:val="center"/>
+          </w:tcPr>
+          <w:p>
+            <w:pPr>
+              <w:spacing w:line="240" w:lineRule="exact"/>
+            </w:pPr>
+            <w:r>
+              <w:rPr>
+                <w:sz w:val="20"/>
+              </w:rPr>
+              <w:t>No further allocations. History retained.</w:t>
+            </w:r>
+          </w:p>
+        </w:tc>
+        <w:tc>
+          <w:tcPr>
+            <w:tcW w:w="2304" w:type="dxa"/>
+            <w:tcMar>
+              <w:top w:w="55" w:type="dxa"/>
+              <w:left w:w="90" w:type="dxa"/>
+              <w:bottom w:w="55" w:type="dxa"/>
+              <w:right w:w="90" w:type="dxa"/>
+            </w:tcMar>
+            <w:vAlign w:val="center"/>
+          </w:tcPr>
+          <w:p>
+            <w:pPr>
+              <w:spacing w:line="240" w:lineRule="exact"/>
+            </w:pPr>
+            <w:r>
+              <w:rPr>
+                <w:sz w:val="20"/>
+              </w:rPr>
+              <w:t>All units accepted for Fulfilled; requester explicitly closes unmet need.</w:t>
+            </w:r>
+          </w:p>
+        </w:tc>
+      </w:tr>
+    </w:tbl>
+    <w:p>
+      <w:pPr>
+        <w:spacing w:after="40" w:line="240" w:lineRule="exact"/>
+      </w:pPr>
+    </w:p>
+    <w:p>
+      <w:pPr>
+        <w:pStyle w:val="Heading3"/>
+      </w:pPr>
+      <w:r>
+        <w:t>B.3.3 Transfer States</w:t>
+      </w:r>
+    </w:p>
+    <w:tbl>
+      <w:tblPr>
+        <w:tblW w:w="0" w:type="auto"/>
+        <w:jc w:val="center"/>
+        <w:tblBorders>
+          <w:top w:val="single" w:sz="4" w:space="0" w:color="B8B8B8"/>
+          <w:left w:val="single" w:sz="4" w:space="0" w:color="B8B8B8"/>
+          <w:bottom w:val="single" w:sz="4" w:space="0" w:color="B8B8B8"/>
+          <w:right w:val="single" w:sz="4" w:space="0" w:color="B8B8B8"/>
+          <w:insideH w:val="single" w:sz="4" w:space="0" w:color="B8B8B8"/>
+          <w:insideV w:val="single" w:sz="4" w:space="0" w:color="B8B8B8"/>
+        </w:tblBorders>
+        <w:tblLayout w:type="fixed"/>
+        <w:tblLook w:val="04A0" w:firstRow="1" w:lastRow="0" w:firstColumn="1" w:lastColumn="0" w:noHBand="0" w:noVBand="1"/>
+      </w:tblPr>
+      <w:tblGrid>
+        <w:gridCol w:w="1728"/>
+        <w:gridCol w:w="5328"/>
+        <w:gridCol w:w="2304"/>
+      </w:tblGrid>
+      <w:tr>
+        <w:trPr>
+          <w:cantSplit/>
+          <w:tblHeader/>
+          <w:jc w:val="center"/>
+        </w:trPr>
+        <w:tc>
+          <w:tcPr>
+            <w:tcW w:w="1728" w:type="dxa"/>
+            <w:shd w:val="clear" w:color="auto" w:fill="EDEDED"/>
+            <w:tcMar>
+              <w:top w:w="55" w:type="dxa"/>
+              <w:left w:w="90" w:type="dxa"/>
+              <w:bottom w:w="55" w:type="dxa"/>
+              <w:right w:w="90" w:type="dxa"/>
+            </w:tcMar>
+            <w:vAlign w:val="center"/>
+          </w:tcPr>
+          <w:p>
+            <w:pPr>
+              <w:keepNext/>
+              <w:spacing w:line="240" w:lineRule="exact"/>
+            </w:pPr>
+            <w:r>
+              <w:rPr>
+                <w:b/>
+                <w:sz w:val="20"/>
+              </w:rPr>
+              <w:t>State</w:t>
+            </w:r>
+          </w:p>
+        </w:tc>
+        <w:tc>
+          <w:tcPr>
+            <w:tcW w:w="5328" w:type="dxa"/>
+            <w:shd w:val="clear" w:color="auto" w:fill="EDEDED"/>
+            <w:tcMar>
+              <w:top w:w="55" w:type="dxa"/>
+              <w:left w:w="90" w:type="dxa"/>
+              <w:bottom w:w="55" w:type="dxa"/>
+              <w:right w:w="90" w:type="dxa"/>
+            </w:tcMar>
+            <w:vAlign w:val="center"/>
+          </w:tcPr>
+          <w:p>
+            <w:pPr>
+              <w:keepNext/>
+              <w:spacing w:line="240" w:lineRule="exact"/>
+            </w:pPr>
+            <w:r>
+              <w:rPr>
+                <w:b/>
+                <w:sz w:val="20"/>
+              </w:rPr>
+              <w:t>Permitted progression</w:t>
+            </w:r>
+          </w:p>
+        </w:tc>
+        <w:tc>
+          <w:tcPr>
+            <w:tcW w:w="2304" w:type="dxa"/>
+            <w:shd w:val="clear" w:color="auto" w:fill="EDEDED"/>
+            <w:tcMar>
+              <w:top w:w="55" w:type="dxa"/>
+              <w:left w:w="90" w:type="dxa"/>
+              <w:bottom w:w="55" w:type="dxa"/>
+              <w:right w:w="90" w:type="dxa"/>
+            </w:tcMar>
+            <w:vAlign w:val="center"/>
+          </w:tcPr>
+          <w:p>
+            <w:pPr>
+              <w:keepNext/>
+              <w:spacing w:line="240" w:lineRule="exact"/>
+            </w:pPr>
+            <w:r>
+              <w:rPr>
+                <w:b/>
+                <w:sz w:val="20"/>
+              </w:rPr>
+              <w:t>Responsible role or control</w:t>
+            </w:r>
+          </w:p>
+        </w:tc>
+      </w:tr>
+      <w:tr>
+        <w:trPr>
+          <w:cantSplit/>
+          <w:jc w:val="center"/>
+        </w:trPr>
+        <w:tc>
+          <w:tcPr>
+            <w:tcW w:w="1728" w:type="dxa"/>
+            <w:tcMar>
+              <w:top w:w="55" w:type="dxa"/>
+              <w:left w:w="90" w:type="dxa"/>
+              <w:bottom w:w="55" w:type="dxa"/>
+              <w:right w:w="90" w:type="dxa"/>
+            </w:tcMar>
+            <w:vAlign w:val="center"/>
+          </w:tcPr>
+          <w:p>
+            <w:pPr>
+              <w:spacing w:line="240" w:lineRule="exact"/>
+            </w:pPr>
+            <w:r>
+              <w:rPr>
+                <w:sz w:val="20"/>
+              </w:rPr>
+              <w:t>Pending Approval</w:t>
+            </w:r>
+          </w:p>
+        </w:tc>
+        <w:tc>
+          <w:tcPr>
+            <w:tcW w:w="5328" w:type="dxa"/>
+            <w:tcMar>
+              <w:top w:w="55" w:type="dxa"/>
+              <w:left w:w="90" w:type="dxa"/>
+              <w:bottom w:w="55" w:type="dxa"/>
+              <w:right w:w="90" w:type="dxa"/>
+            </w:tcMar>
+            <w:vAlign w:val="center"/>
+          </w:tcPr>
+          <w:p>
+            <w:pPr>
+              <w:spacing w:line="240" w:lineRule="exact"/>
+            </w:pPr>
+            <w:r>
+              <w:rPr>
+                <w:sz w:val="20"/>
+              </w:rPr>
+              <w:t>Approved; Cancelled.</w:t>
+            </w:r>
+          </w:p>
+        </w:tc>
+        <w:tc>
+          <w:tcPr>
+            <w:tcW w:w="2304" w:type="dxa"/>
+            <w:tcMar>
+              <w:top w:w="55" w:type="dxa"/>
+              <w:left w:w="90" w:type="dxa"/>
+              <w:bottom w:w="55" w:type="dxa"/>
+              <w:right w:w="90" w:type="dxa"/>
+            </w:tcMar>
+            <w:vAlign w:val="center"/>
+          </w:tcPr>
+          <w:p>
+            <w:pPr>
+              <w:spacing w:line="240" w:lineRule="exact"/>
+            </w:pPr>
+            <w:r>
+              <w:rPr>
+                <w:sz w:val="20"/>
+              </w:rPr>
+              <w:t>Supplying representative; rejection reconciles allocation.</w:t>
+            </w:r>
+          </w:p>
+        </w:tc>
+      </w:tr>
+      <w:tr>
+        <w:trPr>
+          <w:cantSplit/>
+          <w:jc w:val="center"/>
+        </w:trPr>
+        <w:tc>
+          <w:tcPr>
+            <w:tcW w:w="1728" w:type="dxa"/>
+            <w:tcMar>
+              <w:top w:w="55" w:type="dxa"/>
+              <w:left w:w="90" w:type="dxa"/>
+              <w:bottom w:w="55" w:type="dxa"/>
+              <w:right w:w="90" w:type="dxa"/>
+            </w:tcMar>
+            <w:vAlign w:val="center"/>
+          </w:tcPr>
+          <w:p>
+            <w:pPr>
+              <w:spacing w:line="240" w:lineRule="exact"/>
+            </w:pPr>
+            <w:r>
+              <w:rPr>
+                <w:sz w:val="20"/>
+              </w:rPr>
+              <w:t>Approved</w:t>
+            </w:r>
+          </w:p>
+        </w:tc>
+        <w:tc>
+          <w:tcPr>
+            <w:tcW w:w="5328" w:type="dxa"/>
+            <w:tcMar>
+              <w:top w:w="55" w:type="dxa"/>
+              <w:left w:w="90" w:type="dxa"/>
+              <w:bottom w:w="55" w:type="dxa"/>
+              <w:right w:w="90" w:type="dxa"/>
+            </w:tcMar>
+            <w:vAlign w:val="center"/>
+          </w:tcPr>
+          <w:p>
+            <w:pPr>
+              <w:spacing w:line="240" w:lineRule="exact"/>
+            </w:pPr>
+            <w:r>
+              <w:rPr>
+                <w:sz w:val="20"/>
+              </w:rPr>
+              <w:t>Scheduled; Cancelled before dispatch.</w:t>
+            </w:r>
+          </w:p>
+        </w:tc>
+        <w:tc>
+          <w:tcPr>
+            <w:tcW w:w="2304" w:type="dxa"/>
+            <w:tcMar>
+              <w:top w:w="55" w:type="dxa"/>
+              <w:left w:w="90" w:type="dxa"/>
+              <w:bottom w:w="55" w:type="dxa"/>
+              <w:right w:w="90" w:type="dxa"/>
+            </w:tcMar>
+            <w:vAlign w:val="center"/>
+          </w:tcPr>
+          <w:p>
+            <w:pPr>
+              <w:spacing w:line="240" w:lineRule="exact"/>
+            </w:pPr>
+            <w:r>
+              <w:rPr>
+                <w:sz w:val="20"/>
+              </w:rPr>
+              <w:t>Facilities Staff / supplying representative.</w:t>
+            </w:r>
+          </w:p>
+        </w:tc>
+      </w:tr>
+      <w:tr>
+        <w:trPr>
+          <w:cantSplit/>
+          <w:jc w:val="center"/>
+        </w:trPr>
+        <w:tc>
+          <w:tcPr>
+            <w:tcW w:w="1728" w:type="dxa"/>
+            <w:tcMar>
+              <w:top w:w="55" w:type="dxa"/>
+              <w:left w:w="90" w:type="dxa"/>
+              <w:bottom w:w="55" w:type="dxa"/>
+              <w:right w:w="90" w:type="dxa"/>
+            </w:tcMar>
+            <w:vAlign w:val="center"/>
+          </w:tcPr>
+          <w:p>
+            <w:pPr>
+              <w:spacing w:line="240" w:lineRule="exact"/>
+            </w:pPr>
+            <w:r>
+              <w:rPr>
+                <w:sz w:val="20"/>
+              </w:rPr>
+              <w:t>Scheduled</w:t>
+            </w:r>
+          </w:p>
+        </w:tc>
+        <w:tc>
+          <w:tcPr>
+            <w:tcW w:w="5328" w:type="dxa"/>
+            <w:tcMar>
+              <w:top w:w="55" w:type="dxa"/>
+              <w:left w:w="90" w:type="dxa"/>
+              <w:bottom w:w="55" w:type="dxa"/>
+              <w:right w:w="90" w:type="dxa"/>
+            </w:tcMar>
+            <w:vAlign w:val="center"/>
+          </w:tcPr>
+          <w:p>
+            <w:pPr>
+              <w:spacing w:line="240" w:lineRule="exact"/>
+            </w:pPr>
+            <w:r>
+              <w:rPr>
+                <w:sz w:val="20"/>
+              </w:rPr>
+              <w:t>In Transit on dispatch; Cancelled before dispatch.</w:t>
+            </w:r>
+          </w:p>
+        </w:tc>
+        <w:tc>
+          <w:tcPr>
+            <w:tcW w:w="2304" w:type="dxa"/>
+            <w:tcMar>
+              <w:top w:w="55" w:type="dxa"/>
+              <w:left w:w="90" w:type="dxa"/>
+              <w:bottom w:w="55" w:type="dxa"/>
+              <w:right w:w="90" w:type="dxa"/>
+            </w:tcMar>
+            <w:vAlign w:val="center"/>
+          </w:tcPr>
+          <w:p>
+            <w:pPr>
+              <w:spacing w:line="240" w:lineRule="exact"/>
+            </w:pPr>
+            <w:r>
+              <w:rPr>
+                <w:sz w:val="20"/>
+              </w:rPr>
+              <w:t xml:space="preserve">Facilities </w:t>
+            </w:r>
+            <w:proofErr w:type="gramStart"/>
+            <w:r>
+              <w:rPr>
+                <w:sz w:val="20"/>
+              </w:rPr>
+              <w:t>records</w:t>
+            </w:r>
+            <w:proofErr w:type="gramEnd"/>
+            <w:r>
+              <w:rPr>
+                <w:sz w:val="20"/>
+              </w:rPr>
+              <w:t xml:space="preserve"> physical holder/location.</w:t>
+            </w:r>
+          </w:p>
+        </w:tc>
+      </w:tr>
+      <w:tr>
+        <w:trPr>
+          <w:cantSplit/>
+          <w:jc w:val="center"/>
+        </w:trPr>
+        <w:tc>
+          <w:tcPr>
+            <w:tcW w:w="1728" w:type="dxa"/>
+            <w:tcMar>
+              <w:top w:w="55" w:type="dxa"/>
+              <w:left w:w="90" w:type="dxa"/>
+              <w:bottom w:w="55" w:type="dxa"/>
+              <w:right w:w="90" w:type="dxa"/>
+            </w:tcMar>
+            <w:vAlign w:val="center"/>
+          </w:tcPr>
+          <w:p>
+            <w:pPr>
+              <w:spacing w:line="240" w:lineRule="exact"/>
+            </w:pPr>
+            <w:r>
+              <w:rPr>
+                <w:sz w:val="20"/>
+              </w:rPr>
+              <w:t>In Transit</w:t>
+            </w:r>
+          </w:p>
+        </w:tc>
+        <w:tc>
+          <w:tcPr>
+            <w:tcW w:w="5328" w:type="dxa"/>
+            <w:tcMar>
+              <w:top w:w="55" w:type="dxa"/>
+              <w:left w:w="90" w:type="dxa"/>
+              <w:bottom w:w="55" w:type="dxa"/>
+              <w:right w:w="90" w:type="dxa"/>
+            </w:tcMar>
+            <w:vAlign w:val="center"/>
+          </w:tcPr>
+          <w:p>
+            <w:pPr>
+              <w:spacing w:line="240" w:lineRule="exact"/>
+            </w:pPr>
+            <w:r>
+              <w:rPr>
+                <w:sz w:val="20"/>
+              </w:rPr>
+              <w:t>Completed after accepted receipt; Disputed after discrepancy.</w:t>
+            </w:r>
+          </w:p>
+        </w:tc>
+        <w:tc>
+          <w:tcPr>
+            <w:tcW w:w="2304" w:type="dxa"/>
+            <w:tcMar>
+              <w:top w:w="55" w:type="dxa"/>
+              <w:left w:w="90" w:type="dxa"/>
+              <w:bottom w:w="55" w:type="dxa"/>
+              <w:right w:w="90" w:type="dxa"/>
+            </w:tcMar>
+            <w:vAlign w:val="center"/>
+          </w:tcPr>
+          <w:p>
+            <w:pPr>
+              <w:spacing w:line="240" w:lineRule="exact"/>
+            </w:pPr>
+            <w:r>
+              <w:rPr>
+                <w:sz w:val="20"/>
+              </w:rPr>
+              <w:t>Receiving representative.</w:t>
+            </w:r>
+          </w:p>
+        </w:tc>
+      </w:tr>
+      <w:tr>
+        <w:trPr>
+          <w:cantSplit/>
+          <w:jc w:val="center"/>
+        </w:trPr>
+        <w:tc>
+          <w:tcPr>
+            <w:tcW w:w="1728" w:type="dxa"/>
+            <w:tcMar>
+              <w:top w:w="55" w:type="dxa"/>
+              <w:left w:w="90" w:type="dxa"/>
+              <w:bottom w:w="55" w:type="dxa"/>
+              <w:right w:w="90" w:type="dxa"/>
+            </w:tcMar>
+            <w:vAlign w:val="center"/>
+          </w:tcPr>
+          <w:p>
+            <w:pPr>
+              <w:spacing w:line="240" w:lineRule="exact"/>
+            </w:pPr>
+            <w:r>
+              <w:rPr>
+                <w:sz w:val="20"/>
+              </w:rPr>
+              <w:t>Disputed</w:t>
+            </w:r>
+          </w:p>
+        </w:tc>
+        <w:tc>
+          <w:tcPr>
+            <w:tcW w:w="5328" w:type="dxa"/>
+            <w:tcMar>
+              <w:top w:w="55" w:type="dxa"/>
+              <w:left w:w="90" w:type="dxa"/>
+              <w:bottom w:w="55" w:type="dxa"/>
+              <w:right w:w="90" w:type="dxa"/>
+            </w:tcMar>
+            <w:vAlign w:val="center"/>
+          </w:tcPr>
+          <w:p>
+            <w:pPr>
+              <w:spacing w:line="240" w:lineRule="exact"/>
+            </w:pPr>
+            <w:r>
+              <w:rPr>
+                <w:sz w:val="20"/>
+              </w:rPr>
+              <w:t>Completed after reconciled accepted receipt; Returned after confirmed return receipt and condition.</w:t>
+            </w:r>
+          </w:p>
+        </w:tc>
+        <w:tc>
+          <w:tcPr>
+            <w:tcW w:w="2304" w:type="dxa"/>
+            <w:tcMar>
+              <w:top w:w="55" w:type="dxa"/>
+              <w:left w:w="90" w:type="dxa"/>
+              <w:bottom w:w="55" w:type="dxa"/>
+              <w:right w:w="90" w:type="dxa"/>
+            </w:tcMar>
+            <w:vAlign w:val="center"/>
+          </w:tcPr>
+          <w:p>
+            <w:pPr>
+              <w:spacing w:line="240" w:lineRule="exact"/>
+            </w:pPr>
+            <w:r>
+              <w:rPr>
+                <w:sz w:val="20"/>
+              </w:rPr>
+              <w:t>Representatives; Business Administrator handles escalation.</w:t>
+            </w:r>
+          </w:p>
+        </w:tc>
+      </w:tr>
+      <w:tr>
+        <w:trPr>
+          <w:cantSplit/>
+          <w:jc w:val="center"/>
+        </w:trPr>
+        <w:tc>
+          <w:tcPr>
+            <w:tcW w:w="1728" w:type="dxa"/>
+            <w:tcMar>
+              <w:top w:w="55" w:type="dxa"/>
+              <w:left w:w="90" w:type="dxa"/>
+              <w:bottom w:w="55" w:type="dxa"/>
+              <w:right w:w="90" w:type="dxa"/>
+            </w:tcMar>
+            <w:vAlign w:val="center"/>
+          </w:tcPr>
+          <w:p>
+            <w:pPr>
+              <w:spacing w:line="240" w:lineRule="exact"/>
+            </w:pPr>
+            <w:r>
+              <w:rPr>
+                <w:sz w:val="20"/>
+              </w:rPr>
+              <w:t>Completed / Returned / Cancelled</w:t>
+            </w:r>
+          </w:p>
+        </w:tc>
+        <w:tc>
+          <w:tcPr>
+            <w:tcW w:w="5328" w:type="dxa"/>
+            <w:tcMar>
+              <w:top w:w="55" w:type="dxa"/>
+              <w:left w:w="90" w:type="dxa"/>
+              <w:bottom w:w="55" w:type="dxa"/>
+              <w:right w:w="90" w:type="dxa"/>
+            </w:tcMar>
+            <w:vAlign w:val="center"/>
+          </w:tcPr>
+          <w:p>
+            <w:pPr>
+              <w:spacing w:line="240" w:lineRule="exact"/>
+            </w:pPr>
+            <w:r>
+              <w:rPr>
+                <w:sz w:val="20"/>
+              </w:rPr>
+              <w:t>No further transfer transition; history retained.</w:t>
+            </w:r>
+          </w:p>
+        </w:tc>
+        <w:tc>
+          <w:tcPr>
+            <w:tcW w:w="2304" w:type="dxa"/>
+            <w:tcMar>
+              <w:top w:w="55" w:type="dxa"/>
+              <w:left w:w="90" w:type="dxa"/>
+              <w:bottom w:w="55" w:type="dxa"/>
+              <w:right w:w="90" w:type="dxa"/>
+            </w:tcMar>
+            <w:vAlign w:val="center"/>
+          </w:tcPr>
+          <w:p>
+            <w:pPr>
+              <w:spacing w:line="240" w:lineRule="exact"/>
+            </w:pPr>
+            <w:r>
+              <w:rPr>
+                <w:sz w:val="20"/>
+              </w:rPr>
+              <w:t>Update stock, allocation and request together; returned stock follows condition.</w:t>
+            </w:r>
+          </w:p>
+        </w:tc>
+      </w:tr>
+    </w:tbl>
+    <w:p>
+      <w:pPr>
+        <w:spacing w:after="40" w:line="240" w:lineRule="exact"/>
+      </w:pPr>
+    </w:p>
+    <w:p>
+      <w:pPr>
+        <w:pStyle w:val="Heading3"/>
+      </w:pPr>
+      <w:r>
+        <w:t>B.3.4 Maintenance States</w:t>
+      </w:r>
+    </w:p>
+    <w:tbl>
+      <w:tblPr>
+        <w:tblW w:w="0" w:type="auto"/>
+        <w:jc w:val="center"/>
+        <w:tblBorders>
+          <w:top w:val="single" w:sz="4" w:space="0" w:color="B8B8B8"/>
+          <w:left w:val="single" w:sz="4" w:space="0" w:color="B8B8B8"/>
+          <w:bottom w:val="single" w:sz="4" w:space="0" w:color="B8B8B8"/>
+          <w:right w:val="single" w:sz="4" w:space="0" w:color="B8B8B8"/>
+          <w:insideH w:val="single" w:sz="4" w:space="0" w:color="B8B8B8"/>
+          <w:insideV w:val="single" w:sz="4" w:space="0" w:color="B8B8B8"/>
+        </w:tblBorders>
+        <w:tblLayout w:type="fixed"/>
+        <w:tblLook w:val="04A0" w:firstRow="1" w:lastRow="0" w:firstColumn="1" w:lastColumn="0" w:noHBand="0" w:noVBand="1"/>
+      </w:tblPr>
+      <w:tblGrid>
+        <w:gridCol w:w="1728"/>
+        <w:gridCol w:w="5328"/>
+        <w:gridCol w:w="2304"/>
+      </w:tblGrid>
+      <w:tr>
+        <w:trPr>
+          <w:cantSplit/>
+          <w:tblHeader/>
+          <w:jc w:val="center"/>
+        </w:trPr>
+        <w:tc>
+          <w:tcPr>
+            <w:tcW w:w="1728" w:type="dxa"/>
+            <w:shd w:val="clear" w:color="auto" w:fill="EDEDED"/>
+            <w:tcMar>
+              <w:top w:w="55" w:type="dxa"/>
+              <w:left w:w="90" w:type="dxa"/>
+              <w:bottom w:w="55" w:type="dxa"/>
+              <w:right w:w="90" w:type="dxa"/>
+            </w:tcMar>
+            <w:vAlign w:val="center"/>
+          </w:tcPr>
+          <w:p>
+            <w:pPr>
+              <w:keepNext/>
+              <w:spacing w:line="240" w:lineRule="exact"/>
+            </w:pPr>
+            <w:r>
+              <w:rPr>
+                <w:b/>
+                <w:sz w:val="20"/>
+              </w:rPr>
+              <w:t>State</w:t>
+            </w:r>
+          </w:p>
+        </w:tc>
+        <w:tc>
+          <w:tcPr>
+            <w:tcW w:w="5328" w:type="dxa"/>
+            <w:shd w:val="clear" w:color="auto" w:fill="EDEDED"/>
+            <w:tcMar>
+              <w:top w:w="55" w:type="dxa"/>
+              <w:left w:w="90" w:type="dxa"/>
+              <w:bottom w:w="55" w:type="dxa"/>
+              <w:right w:w="90" w:type="dxa"/>
+            </w:tcMar>
+            <w:vAlign w:val="center"/>
+          </w:tcPr>
+          <w:p>
+            <w:pPr>
+              <w:keepNext/>
+              <w:spacing w:line="240" w:lineRule="exact"/>
+            </w:pPr>
+            <w:r>
+              <w:rPr>
+                <w:b/>
+                <w:sz w:val="20"/>
+              </w:rPr>
+              <w:t>Permitted progression</w:t>
+            </w:r>
+          </w:p>
+        </w:tc>
+        <w:tc>
+          <w:tcPr>
+            <w:tcW w:w="2304" w:type="dxa"/>
+            <w:shd w:val="clear" w:color="auto" w:fill="EDEDED"/>
+            <w:tcMar>
+              <w:top w:w="55" w:type="dxa"/>
+              <w:left w:w="90" w:type="dxa"/>
+              <w:bottom w:w="55" w:type="dxa"/>
+              <w:right w:w="90" w:type="dxa"/>
+            </w:tcMar>
+            <w:vAlign w:val="center"/>
+          </w:tcPr>
+          <w:p>
+            <w:pPr>
+              <w:keepNext/>
+              <w:spacing w:line="240" w:lineRule="exact"/>
+            </w:pPr>
+            <w:r>
+              <w:rPr>
+                <w:b/>
+                <w:sz w:val="20"/>
+              </w:rPr>
+              <w:t>Responsible role or control</w:t>
+            </w:r>
+          </w:p>
+        </w:tc>
+      </w:tr>
+      <w:tr>
+        <w:trPr>
+          <w:cantSplit/>
+          <w:jc w:val="center"/>
+        </w:trPr>
+        <w:tc>
+          <w:tcPr>
+            <w:tcW w:w="1728" w:type="dxa"/>
+            <w:tcMar>
+              <w:top w:w="55" w:type="dxa"/>
+              <w:left w:w="90" w:type="dxa"/>
+              <w:bottom w:w="55" w:type="dxa"/>
+              <w:right w:w="90" w:type="dxa"/>
+            </w:tcMar>
+            <w:vAlign w:val="center"/>
+          </w:tcPr>
+          <w:p>
+            <w:pPr>
+              <w:spacing w:line="240" w:lineRule="exact"/>
+            </w:pPr>
+            <w:r>
+              <w:rPr>
+                <w:sz w:val="20"/>
+              </w:rPr>
+              <w:t>Reported</w:t>
+            </w:r>
+          </w:p>
+        </w:tc>
+        <w:tc>
+          <w:tcPr>
+            <w:tcW w:w="5328" w:type="dxa"/>
+            <w:tcMar>
+              <w:top w:w="55" w:type="dxa"/>
+              <w:left w:w="90" w:type="dxa"/>
+              <w:bottom w:w="55" w:type="dxa"/>
+              <w:right w:w="90" w:type="dxa"/>
+            </w:tcMar>
+            <w:vAlign w:val="center"/>
+          </w:tcPr>
+          <w:p>
+            <w:pPr>
+              <w:spacing w:line="240" w:lineRule="exact"/>
+            </w:pPr>
+            <w:r>
+              <w:rPr>
+                <w:sz w:val="20"/>
+              </w:rPr>
+              <w:t>Under Inspection; Cancelled.</w:t>
+            </w:r>
+          </w:p>
+        </w:tc>
+        <w:tc>
+          <w:tcPr>
+            <w:tcW w:w="2304" w:type="dxa"/>
+            <w:tcMar>
+              <w:top w:w="55" w:type="dxa"/>
+              <w:left w:w="90" w:type="dxa"/>
+              <w:bottom w:w="55" w:type="dxa"/>
+              <w:right w:w="90" w:type="dxa"/>
+            </w:tcMar>
+            <w:vAlign w:val="center"/>
+          </w:tcPr>
+          <w:p>
+            <w:pPr>
+              <w:spacing w:line="240" w:lineRule="exact"/>
+            </w:pPr>
+            <w:r>
+              <w:rPr>
+                <w:sz w:val="20"/>
+              </w:rPr>
+              <w:t>Requester/custodian reports; Maintenance Staff accepts.</w:t>
+            </w:r>
+          </w:p>
+        </w:tc>
+      </w:tr>
+      <w:tr>
+        <w:trPr>
+          <w:cantSplit/>
+          <w:jc w:val="center"/>
+        </w:trPr>
+        <w:tc>
+          <w:tcPr>
+            <w:tcW w:w="1728" w:type="dxa"/>
+            <w:tcMar>
+              <w:top w:w="55" w:type="dxa"/>
+              <w:left w:w="90" w:type="dxa"/>
+              <w:bottom w:w="55" w:type="dxa"/>
+              <w:right w:w="90" w:type="dxa"/>
+            </w:tcMar>
+            <w:vAlign w:val="center"/>
+          </w:tcPr>
+          <w:p>
+            <w:pPr>
+              <w:spacing w:line="240" w:lineRule="exact"/>
+            </w:pPr>
+            <w:r>
+              <w:rPr>
+                <w:sz w:val="20"/>
+              </w:rPr>
+              <w:t>Under Inspection</w:t>
+            </w:r>
+          </w:p>
+        </w:tc>
+        <w:tc>
+          <w:tcPr>
+            <w:tcW w:w="5328" w:type="dxa"/>
+            <w:tcMar>
+              <w:top w:w="55" w:type="dxa"/>
+              <w:left w:w="90" w:type="dxa"/>
+              <w:bottom w:w="55" w:type="dxa"/>
+              <w:right w:w="90" w:type="dxa"/>
+            </w:tcMar>
+            <w:vAlign w:val="center"/>
+          </w:tcPr>
+          <w:p>
+            <w:pPr>
+              <w:spacing w:line="240" w:lineRule="exact"/>
+            </w:pPr>
+            <w:r>
+              <w:rPr>
+                <w:sz w:val="20"/>
+              </w:rPr>
+              <w:t>Under Repair; Completed if no repair needed.</w:t>
+            </w:r>
+          </w:p>
+        </w:tc>
+        <w:tc>
+          <w:tcPr>
+            <w:tcW w:w="2304" w:type="dxa"/>
+            <w:tcMar>
+              <w:top w:w="55" w:type="dxa"/>
+              <w:left w:w="90" w:type="dxa"/>
+              <w:bottom w:w="55" w:type="dxa"/>
+              <w:right w:w="90" w:type="dxa"/>
+            </w:tcMar>
+            <w:vAlign w:val="center"/>
+          </w:tcPr>
+          <w:p>
+            <w:pPr>
+              <w:spacing w:line="240" w:lineRule="exact"/>
+            </w:pPr>
+            <w:r>
+              <w:rPr>
+                <w:sz w:val="20"/>
+              </w:rPr>
+              <w:t>Maintenance Staff.</w:t>
+            </w:r>
+          </w:p>
+        </w:tc>
+      </w:tr>
+      <w:tr>
+        <w:trPr>
+          <w:cantSplit/>
+          <w:jc w:val="center"/>
+        </w:trPr>
+        <w:tc>
+          <w:tcPr>
+            <w:tcW w:w="1728" w:type="dxa"/>
+            <w:tcMar>
+              <w:top w:w="55" w:type="dxa"/>
+              <w:left w:w="90" w:type="dxa"/>
+              <w:bottom w:w="55" w:type="dxa"/>
+              <w:right w:w="90" w:type="dxa"/>
+            </w:tcMar>
+            <w:vAlign w:val="center"/>
+          </w:tcPr>
+          <w:p>
+            <w:pPr>
+              <w:spacing w:line="240" w:lineRule="exact"/>
+            </w:pPr>
+            <w:r>
+              <w:rPr>
+                <w:sz w:val="20"/>
+              </w:rPr>
+              <w:lastRenderedPageBreak/>
+              <w:t>Under Repair</w:t>
+            </w:r>
+          </w:p>
+        </w:tc>
+        <w:tc>
+          <w:tcPr>
+            <w:tcW w:w="5328" w:type="dxa"/>
+            <w:tcMar>
+              <w:top w:w="55" w:type="dxa"/>
+              <w:left w:w="90" w:type="dxa"/>
+              <w:bottom w:w="55" w:type="dxa"/>
+              <w:right w:w="90" w:type="dxa"/>
+            </w:tcMar>
+            <w:vAlign w:val="center"/>
+          </w:tcPr>
+          <w:p>
+            <w:pPr>
+              <w:spacing w:line="240" w:lineRule="exact"/>
+            </w:pPr>
+            <w:r>
+              <w:rPr>
+                <w:sz w:val="20"/>
+              </w:rPr>
+              <w:t>Completed with restored or unsuitable outcome.</w:t>
+            </w:r>
+          </w:p>
+        </w:tc>
+        <w:tc>
+          <w:tcPr>
+            <w:tcW w:w="2304" w:type="dxa"/>
+            <w:tcMar>
+              <w:top w:w="55" w:type="dxa"/>
+              <w:left w:w="90" w:type="dxa"/>
+              <w:bottom w:w="55" w:type="dxa"/>
+              <w:right w:w="90" w:type="dxa"/>
+            </w:tcMar>
+            <w:vAlign w:val="center"/>
+          </w:tcPr>
+          <w:p>
+            <w:pPr>
+              <w:spacing w:line="240" w:lineRule="exact"/>
+            </w:pPr>
+            <w:r>
+              <w:rPr>
+                <w:sz w:val="20"/>
+              </w:rPr>
+              <w:t>Maintenance Staff.</w:t>
+            </w:r>
+          </w:p>
+        </w:tc>
+      </w:tr>
+      <w:tr>
+        <w:trPr>
+          <w:cantSplit/>
+          <w:jc w:val="center"/>
+        </w:trPr>
+        <w:tc>
+          <w:tcPr>
+            <w:tcW w:w="1728" w:type="dxa"/>
+            <w:tcMar>
+              <w:top w:w="55" w:type="dxa"/>
+              <w:left w:w="90" w:type="dxa"/>
+              <w:bottom w:w="55" w:type="dxa"/>
+              <w:right w:w="90" w:type="dxa"/>
+            </w:tcMar>
+            <w:vAlign w:val="center"/>
+          </w:tcPr>
+          <w:p>
+            <w:pPr>
+              <w:spacing w:line="240" w:lineRule="exact"/>
+            </w:pPr>
+            <w:r>
+              <w:rPr>
+                <w:sz w:val="20"/>
+              </w:rPr>
+              <w:t>Completed</w:t>
+            </w:r>
+          </w:p>
+        </w:tc>
+        <w:tc>
+          <w:tcPr>
+            <w:tcW w:w="5328" w:type="dxa"/>
+            <w:tcMar>
+              <w:top w:w="55" w:type="dxa"/>
+              <w:left w:w="90" w:type="dxa"/>
+              <w:bottom w:w="55" w:type="dxa"/>
+              <w:right w:w="90" w:type="dxa"/>
+            </w:tcMar>
+            <w:vAlign w:val="center"/>
+          </w:tcPr>
+          <w:p>
+            <w:pPr>
+              <w:spacing w:line="240" w:lineRule="exact"/>
+            </w:pPr>
+            <w:r>
+              <w:rPr>
+                <w:sz w:val="20"/>
+              </w:rPr>
+              <w:t>Closed after authorized condition/state update.</w:t>
+            </w:r>
+          </w:p>
+        </w:tc>
+        <w:tc>
+          <w:tcPr>
+            <w:tcW w:w="2304" w:type="dxa"/>
+            <w:tcMar>
+              <w:top w:w="55" w:type="dxa"/>
+              <w:left w:w="90" w:type="dxa"/>
+              <w:bottom w:w="55" w:type="dxa"/>
+              <w:right w:w="90" w:type="dxa"/>
+            </w:tcMar>
+            <w:vAlign w:val="center"/>
+          </w:tcPr>
+          <w:p>
+            <w:pPr>
+              <w:spacing w:line="240" w:lineRule="exact"/>
+            </w:pPr>
+            <w:r>
+              <w:rPr>
+                <w:sz w:val="20"/>
+              </w:rPr>
+              <w:t>Custodian / Maintenance Staff update condition.</w:t>
+            </w:r>
+          </w:p>
+        </w:tc>
+      </w:tr>
+      <w:tr>
+        <w:trPr>
+          <w:cantSplit/>
+          <w:jc w:val="center"/>
+        </w:trPr>
+        <w:tc>
+          <w:tcPr>
+            <w:tcW w:w="1728" w:type="dxa"/>
+            <w:tcMar>
+              <w:top w:w="55" w:type="dxa"/>
+              <w:left w:w="90" w:type="dxa"/>
+              <w:bottom w:w="55" w:type="dxa"/>
+              <w:right w:w="90" w:type="dxa"/>
+            </w:tcMar>
+            <w:vAlign w:val="center"/>
+          </w:tcPr>
+          <w:p>
+            <w:pPr>
+              <w:spacing w:line="240" w:lineRule="exact"/>
+            </w:pPr>
+            <w:r>
+              <w:rPr>
+                <w:sz w:val="20"/>
+              </w:rPr>
+              <w:t>Closed / Cancelled</w:t>
+            </w:r>
+          </w:p>
+        </w:tc>
+        <w:tc>
+          <w:tcPr>
+            <w:tcW w:w="5328" w:type="dxa"/>
+            <w:tcMar>
+              <w:top w:w="55" w:type="dxa"/>
+              <w:left w:w="90" w:type="dxa"/>
+              <w:bottom w:w="55" w:type="dxa"/>
+              <w:right w:w="90" w:type="dxa"/>
+            </w:tcMar>
+            <w:vAlign w:val="center"/>
+          </w:tcPr>
+          <w:p>
+            <w:pPr>
+              <w:spacing w:line="240" w:lineRule="exact"/>
+            </w:pPr>
+            <w:r>
+              <w:rPr>
+                <w:sz w:val="20"/>
+              </w:rPr>
+              <w:t>No further maintenance transition.</w:t>
+            </w:r>
+          </w:p>
+        </w:tc>
+        <w:tc>
+          <w:tcPr>
+            <w:tcW w:w="2304" w:type="dxa"/>
+            <w:tcMar>
+              <w:top w:w="55" w:type="dxa"/>
+              <w:left w:w="90" w:type="dxa"/>
+              <w:bottom w:w="55" w:type="dxa"/>
+              <w:right w:w="90" w:type="dxa"/>
+            </w:tcMar>
+            <w:vAlign w:val="center"/>
+          </w:tcPr>
+          <w:p>
+            <w:pPr>
+              <w:spacing w:line="240" w:lineRule="exact"/>
+            </w:pPr>
+            <w:r>
+              <w:rPr>
+                <w:sz w:val="20"/>
+              </w:rPr>
+              <w:t>Retain history and safety assessment.</w:t>
+            </w:r>
+          </w:p>
+        </w:tc>
+      </w:tr>
+    </w:tbl>
+    <w:p>
+      <w:pPr>
+        <w:spacing w:after="60" w:line="260" w:lineRule="exact"/>
+      </w:pPr>
+    </w:p>
+    <w:p>
+      <w:pPr>
+        <w:spacing w:after="60" w:line="240" w:lineRule="exact"/>
+      </w:pPr>
     </w:p>
     <w:sectPr>
-      <w:headerReference w:type="default" r:id="rId10"/>
+      <w:headerReference w:type="default" r:id="rId12"/>
       <w:pgSz w:w="12240" w:h="15840"/>
       <w:pgMar w:top="1780" w:right="1440" w:bottom="1440" w:left="1440" w:header="708" w:footer="708" w:gutter="0"/>
       <w:pgNumType w:start="1"/>
@@ -11240,7 +15630,7 @@
 </file>
 
 <file path=word/endnotes.xml><?xml version="1.0" encoding="utf-8"?>
-<w:endnotes xmlns:wpc="http://schemas.microsoft.com/office/word/2010/wordprocessingCanvas" xmlns:cx="http://schemas.microsoft.com/office/drawing/2014/chartex" xmlns:cx1="http://schemas.microsoft.com/office/drawing/2015/9/8/chartex" xmlns:cx2="http://schemas.microsoft.com/office/drawing/2015/10/21/chartex" xmlns:cx3="http://schemas.microsoft.com/office/drawing/2016/5/9/chartex" xmlns:cx4="http://schemas.microsoft.com/office/drawing/2016/5/10/chartex" xmlns:cx5="http://schemas.microsoft.com/office/drawing/2016/5/11/chartex" xmlns:cx6="http://schemas.microsoft.com/office/drawing/2016/5/12/chartex" xmlns:cx7="http://schemas.microsoft.com/office/drawing/2016/5/13/chartex" xmlns:cx8="http://schemas.microsoft.com/office/drawing/2016/5/14/chartex" xmlns:mc="http://schemas.openxmlformats.org/markup-compatibility/2006" xmlns:m="http://schemas.openxmlformats.org/officeDocument/2006/math" xmlns:aink="http://schemas.microsoft.com/office/drawing/2016/ink" xmlns:am3d="http://schemas.microsoft.com/office/drawing/2017/model3d" xmlns:oel="http://schemas.microsoft.com/office/2019/extlst" xmlns:r="http://schemas.openxmlformats.org/officeDocument/2006/relationships" xmlns:wp14="http://schemas.microsoft.com/office/word/2010/wordprocessingDrawing" xmlns:wp="http://schemas.openxmlformats.org/drawingml/2006/wordprocessingDrawing" xmlns:wpg="http://schemas.microsoft.com/office/word/2010/wordprocessingGroup" xmlns:wpi="http://schemas.microsoft.com/office/word/2010/wordprocessingInk" xmlns:wps="http://schemas.microsoft.com/office/word/2010/wordprocessingShape" xmlns:o="urn:schemas-microsoft-com:office:office" xmlns:v="urn:schemas-microsoft-com:vml" xmlns:w10="urn:schemas-microsoft-com:office:word" xmlns:w="http://schemas.openxmlformats.org/wordprocessingml/2006/main" xmlns:w14="http://schemas.microsoft.com/office/word/2010/wordml" xmlns:w15="http://schemas.microsoft.com/office/word/2012/wordml" xmlns:w16cex="http://schemas.microsoft.com/office/word/2018/wordml/cex" xmlns:w16cid="http://schemas.microsoft.com/office/word/2016/wordml/cid" xmlns:w16="http://schemas.microsoft.com/office/word/2018/wordml" xmlns:w16sdtdh="http://schemas.microsoft.com/office/word/2020/wordml/sdtdatahash" xmlns:w16sdtfl="http://schemas.microsoft.com/office/word/2024/wordml/sdtformatlock" xmlns:w16se="http://schemas.microsoft.com/office/word/2015/wordml/symex" xmlns:w16du="http://schemas.microsoft.com/office/word/2023/wordml/word16du" xmlns:wne="http://schemas.microsoft.com/office/word/2006/wordml" mc:Ignorable="w14 w15 w16se w16cid w16 w16cex w16sdtdh w16sdtfl w16du wp14">
+<w:endnotes xmlns:wpc="http://schemas.microsoft.com/office/word/2010/wordprocessingCanvas" xmlns:cx="http://schemas.microsoft.com/office/drawing/2014/chartex" xmlns:cx1="http://schemas.microsoft.com/office/drawing/2015/9/8/chartex" xmlns:cx2="http://schemas.microsoft.com/office/drawing/2015/10/21/chartex" xmlns:cx3="http://schemas.microsoft.com/office/drawing/2016/5/9/chartex" xmlns:cx4="http://schemas.microsoft.com/office/drawing/2016/5/10/chartex" xmlns:cx5="http://schemas.microsoft.com/office/drawing/2016/5/11/chartex" xmlns:cx6="http://schemas.microsoft.com/office/drawing/2016/5/12/chartex" xmlns:cx7="http://schemas.microsoft.com/office/drawing/2016/5/13/chartex" xmlns:cx8="http://schemas.microsoft.com/office/drawing/2016/5/14/chartex" xmlns:mc="http://schemas.openxmlformats.org/markup-compatibility/2006" xmlns:aink="http://schemas.microsoft.com/office/drawing/2016/ink" xmlns:am3d="http://schemas.microsoft.com/office/drawing/2017/model3d" xmlns:o="urn:schemas-microsoft-com:office:office" xmlns:oel="http://schemas.microsoft.com/office/2019/extlst" xmlns:r="http://schemas.openxmlformats.org/officeDocument/2006/relationships" xmlns:m="http://schemas.openxmlformats.org/officeDocument/2006/math" xmlns:v="urn:schemas-microsoft-com:vml" xmlns:wp14="http://schemas.microsoft.com/office/word/2010/wordprocessingDrawing" xmlns:wp="http://schemas.openxmlformats.org/drawingml/2006/wordprocessingDrawing" xmlns:w10="urn:schemas-microsoft-com:office:word" xmlns:w="http://schemas.openxmlformats.org/wordprocessingml/2006/main" xmlns:w14="http://schemas.microsoft.com/office/word/2010/wordml" xmlns:w15="http://schemas.microsoft.com/office/word/2012/wordml" xmlns:w16cex="http://schemas.microsoft.com/office/word/2018/wordml/cex" xmlns:w16cid="http://schemas.microsoft.com/office/word/2016/wordml/cid" xmlns:w16="http://schemas.microsoft.com/office/word/2018/wordml" xmlns:w16du="http://schemas.microsoft.com/office/word/2023/wordml/word16du" xmlns:w16sdtdh="http://schemas.microsoft.com/office/word/2020/wordml/sdtdatahash" xmlns:w16sdtfl="http://schemas.microsoft.com/office/word/2024/wordml/sdtformatlock" xmlns:w16se="http://schemas.microsoft.com/office/word/2015/wordml/symex" xmlns:wpg="http://schemas.microsoft.com/office/word/2010/wordprocessingGroup" xmlns:wpi="http://schemas.microsoft.com/office/word/2010/wordprocessingInk" xmlns:wne="http://schemas.microsoft.com/office/word/2006/wordml" xmlns:wps="http://schemas.microsoft.com/office/word/2010/wordprocessingShape" mc:Ignorable="w14 w15 w16se w16cid w16 w16cex w16sdtdh w16sdtfl w16du wp14">
   <w:endnote w:type="separator" w:id="-1">
     <w:p>
       <w:r>
@@ -11259,7 +15649,7 @@
 </file>
 
 <file path=word/footer1.xml><?xml version="1.0" encoding="utf-8"?>
-<w:ftr xmlns:wpc="http://schemas.microsoft.com/office/word/2010/wordprocessingCanvas" xmlns:cx="http://schemas.microsoft.com/office/drawing/2014/chartex" xmlns:cx1="http://schemas.microsoft.com/office/drawing/2015/9/8/chartex" xmlns:cx2="http://schemas.microsoft.com/office/drawing/2015/10/21/chartex" xmlns:cx3="http://schemas.microsoft.com/office/drawing/2016/5/9/chartex" xmlns:cx4="http://schemas.microsoft.com/office/drawing/2016/5/10/chartex" xmlns:cx5="http://schemas.microsoft.com/office/drawing/2016/5/11/chartex" xmlns:cx6="http://schemas.microsoft.com/office/drawing/2016/5/12/chartex" xmlns:cx7="http://schemas.microsoft.com/office/drawing/2016/5/13/chartex" xmlns:cx8="http://schemas.microsoft.com/office/drawing/2016/5/14/chartex" xmlns:mc="http://schemas.openxmlformats.org/markup-compatibility/2006" xmlns:m="http://schemas.openxmlformats.org/officeDocument/2006/math" xmlns:aink="http://schemas.microsoft.com/office/drawing/2016/ink" xmlns:am3d="http://schemas.microsoft.com/office/drawing/2017/model3d" xmlns:oel="http://schemas.microsoft.com/office/2019/extlst" xmlns:r="http://schemas.openxmlformats.org/officeDocument/2006/relationships" xmlns:wp14="http://schemas.microsoft.com/office/word/2010/wordprocessingDrawing" xmlns:wp="http://schemas.openxmlformats.org/drawingml/2006/wordprocessingDrawing" xmlns:wpg="http://schemas.microsoft.com/office/word/2010/wordprocessingGroup" xmlns:wpi="http://schemas.microsoft.com/office/word/2010/wordprocessingInk" xmlns:wps="http://schemas.microsoft.com/office/word/2010/wordprocessingShape" xmlns:o="urn:schemas-microsoft-com:office:office" xmlns:v="urn:schemas-microsoft-com:vml" xmlns:w10="urn:schemas-microsoft-com:office:word" xmlns:w="http://schemas.openxmlformats.org/wordprocessingml/2006/main" xmlns:w14="http://schemas.microsoft.com/office/word/2010/wordml" xmlns:w15="http://schemas.microsoft.com/office/word/2012/wordml" xmlns:w16cex="http://schemas.microsoft.com/office/word/2018/wordml/cex" xmlns:w16cid="http://schemas.microsoft.com/office/word/2016/wordml/cid" xmlns:w16="http://schemas.microsoft.com/office/word/2018/wordml" xmlns:w16sdtdh="http://schemas.microsoft.com/office/word/2020/wordml/sdtdatahash" xmlns:w16sdtfl="http://schemas.microsoft.com/office/word/2024/wordml/sdtformatlock" xmlns:w16se="http://schemas.microsoft.com/office/word/2015/wordml/symex" xmlns:w16du="http://schemas.microsoft.com/office/word/2023/wordml/word16du" xmlns:wne="http://schemas.microsoft.com/office/word/2006/wordml" mc:Ignorable="w14 w15 w16se w16cid w16 w16cex w16sdtdh w16sdtfl w16du wp14">
+<w:ftr xmlns:wpc="http://schemas.microsoft.com/office/word/2010/wordprocessingCanvas" xmlns:cx="http://schemas.microsoft.com/office/drawing/2014/chartex" xmlns:cx1="http://schemas.microsoft.com/office/drawing/2015/9/8/chartex" xmlns:cx2="http://schemas.microsoft.com/office/drawing/2015/10/21/chartex" xmlns:cx3="http://schemas.microsoft.com/office/drawing/2016/5/9/chartex" xmlns:cx4="http://schemas.microsoft.com/office/drawing/2016/5/10/chartex" xmlns:cx5="http://schemas.microsoft.com/office/drawing/2016/5/11/chartex" xmlns:cx6="http://schemas.microsoft.com/office/drawing/2016/5/12/chartex" xmlns:cx7="http://schemas.microsoft.com/office/drawing/2016/5/13/chartex" xmlns:cx8="http://schemas.microsoft.com/office/drawing/2016/5/14/chartex" xmlns:mc="http://schemas.openxmlformats.org/markup-compatibility/2006" xmlns:aink="http://schemas.microsoft.com/office/drawing/2016/ink" xmlns:am3d="http://schemas.microsoft.com/office/drawing/2017/model3d" xmlns:o="urn:schemas-microsoft-com:office:office" xmlns:oel="http://schemas.microsoft.com/office/2019/extlst" xmlns:r="http://schemas.openxmlformats.org/officeDocument/2006/relationships" xmlns:m="http://schemas.openxmlformats.org/officeDocument/2006/math" xmlns:v="urn:schemas-microsoft-com:vml" xmlns:wp14="http://schemas.microsoft.com/office/word/2010/wordprocessingDrawing" xmlns:wp="http://schemas.openxmlformats.org/drawingml/2006/wordprocessingDrawing" xmlns:w10="urn:schemas-microsoft-com:office:word" xmlns:w="http://schemas.openxmlformats.org/wordprocessingml/2006/main" xmlns:w14="http://schemas.microsoft.com/office/word/2010/wordml" xmlns:w15="http://schemas.microsoft.com/office/word/2012/wordml" xmlns:w16cex="http://schemas.microsoft.com/office/word/2018/wordml/cex" xmlns:w16cid="http://schemas.microsoft.com/office/word/2016/wordml/cid" xmlns:w16="http://schemas.microsoft.com/office/word/2018/wordml" xmlns:w16du="http://schemas.microsoft.com/office/word/2023/wordml/word16du" xmlns:w16sdtdh="http://schemas.microsoft.com/office/word/2020/wordml/sdtdatahash" xmlns:w16sdtfl="http://schemas.microsoft.com/office/word/2024/wordml/sdtformatlock" xmlns:w16se="http://schemas.microsoft.com/office/word/2015/wordml/symex" xmlns:wpg="http://schemas.microsoft.com/office/word/2010/wordprocessingGroup" xmlns:wpi="http://schemas.microsoft.com/office/word/2010/wordprocessingInk" xmlns:wne="http://schemas.microsoft.com/office/word/2006/wordml" xmlns:wps="http://schemas.microsoft.com/office/word/2010/wordprocessingShape" mc:Ignorable="w14 w15 w16se w16cid w16 w16cex w16sdtdh w16sdtfl w16du wp14">
   <w:p>
     <w:pPr>
       <w:pStyle w:val="Footer"/>
@@ -11270,7 +15660,7 @@
 </file>
 
 <file path=word/footer2.xml><?xml version="1.0" encoding="utf-8"?>
-<w:ftr xmlns:wpc="http://schemas.microsoft.com/office/word/2010/wordprocessingCanvas" xmlns:cx="http://schemas.microsoft.com/office/drawing/2014/chartex" xmlns:cx1="http://schemas.microsoft.com/office/drawing/2015/9/8/chartex" xmlns:cx2="http://schemas.microsoft.com/office/drawing/2015/10/21/chartex" xmlns:cx3="http://schemas.microsoft.com/office/drawing/2016/5/9/chartex" xmlns:cx4="http://schemas.microsoft.com/office/drawing/2016/5/10/chartex" xmlns:cx5="http://schemas.microsoft.com/office/drawing/2016/5/11/chartex" xmlns:cx6="http://schemas.microsoft.com/office/drawing/2016/5/12/chartex" xmlns:cx7="http://schemas.microsoft.com/office/drawing/2016/5/13/chartex" xmlns:cx8="http://schemas.microsoft.com/office/drawing/2016/5/14/chartex" xmlns:mc="http://schemas.openxmlformats.org/markup-compatibility/2006" xmlns:m="http://schemas.openxmlformats.org/officeDocument/2006/math" xmlns:aink="http://schemas.microsoft.com/office/drawing/2016/ink" xmlns:am3d="http://schemas.microsoft.com/office/drawing/2017/model3d" xmlns:oel="http://schemas.microsoft.com/office/2019/extlst" xmlns:r="http://schemas.openxmlformats.org/officeDocument/2006/relationships" xmlns:wp14="http://schemas.microsoft.com/office/word/2010/wordprocessingDrawing" xmlns:wp="http://schemas.openxmlformats.org/drawingml/2006/wordprocessingDrawing" xmlns:wpg="http://schemas.microsoft.com/office/word/2010/wordprocessingGroup" xmlns:wpi="http://schemas.microsoft.com/office/word/2010/wordprocessingInk" xmlns:wps="http://schemas.microsoft.com/office/word/2010/wordprocessingShape" xmlns:o="urn:schemas-microsoft-com:office:office" xmlns:v="urn:schemas-microsoft-com:vml" xmlns:w10="urn:schemas-microsoft-com:office:word" xmlns:w="http://schemas.openxmlformats.org/wordprocessingml/2006/main" xmlns:w14="http://schemas.microsoft.com/office/word/2010/wordml" xmlns:w15="http://schemas.microsoft.com/office/word/2012/wordml" xmlns:w16cex="http://schemas.microsoft.com/office/word/2018/wordml/cex" xmlns:w16cid="http://schemas.microsoft.com/office/word/2016/wordml/cid" xmlns:w16="http://schemas.microsoft.com/office/word/2018/wordml" xmlns:w16sdtdh="http://schemas.microsoft.com/office/word/2020/wordml/sdtdatahash" xmlns:w16sdtfl="http://schemas.microsoft.com/office/word/2024/wordml/sdtformatlock" xmlns:w16se="http://schemas.microsoft.com/office/word/2015/wordml/symex" xmlns:w16du="http://schemas.microsoft.com/office/word/2023/wordml/word16du" xmlns:wne="http://schemas.microsoft.com/office/word/2006/wordml" mc:Ignorable="w14 w15 w16se w16cid w16 w16cex w16sdtdh w16sdtfl w16du wp14">
+<w:ftr xmlns:wpc="http://schemas.microsoft.com/office/word/2010/wordprocessingCanvas" xmlns:cx="http://schemas.microsoft.com/office/drawing/2014/chartex" xmlns:cx1="http://schemas.microsoft.com/office/drawing/2015/9/8/chartex" xmlns:cx2="http://schemas.microsoft.com/office/drawing/2015/10/21/chartex" xmlns:cx3="http://schemas.microsoft.com/office/drawing/2016/5/9/chartex" xmlns:cx4="http://schemas.microsoft.com/office/drawing/2016/5/10/chartex" xmlns:cx5="http://schemas.microsoft.com/office/drawing/2016/5/11/chartex" xmlns:cx6="http://schemas.microsoft.com/office/drawing/2016/5/12/chartex" xmlns:cx7="http://schemas.microsoft.com/office/drawing/2016/5/13/chartex" xmlns:cx8="http://schemas.microsoft.com/office/drawing/2016/5/14/chartex" xmlns:mc="http://schemas.openxmlformats.org/markup-compatibility/2006" xmlns:aink="http://schemas.microsoft.com/office/drawing/2016/ink" xmlns:am3d="http://schemas.microsoft.com/office/drawing/2017/model3d" xmlns:o="urn:schemas-microsoft-com:office:office" xmlns:oel="http://schemas.microsoft.com/office/2019/extlst" xmlns:r="http://schemas.openxmlformats.org/officeDocument/2006/relationships" xmlns:m="http://schemas.openxmlformats.org/officeDocument/2006/math" xmlns:v="urn:schemas-microsoft-com:vml" xmlns:wp14="http://schemas.microsoft.com/office/word/2010/wordprocessingDrawing" xmlns:wp="http://schemas.openxmlformats.org/drawingml/2006/wordprocessingDrawing" xmlns:w10="urn:schemas-microsoft-com:office:word" xmlns:w="http://schemas.openxmlformats.org/wordprocessingml/2006/main" xmlns:w14="http://schemas.microsoft.com/office/word/2010/wordml" xmlns:w15="http://schemas.microsoft.com/office/word/2012/wordml" xmlns:w16cex="http://schemas.microsoft.com/office/word/2018/wordml/cex" xmlns:w16cid="http://schemas.microsoft.com/office/word/2016/wordml/cid" xmlns:w16="http://schemas.microsoft.com/office/word/2018/wordml" xmlns:w16du="http://schemas.microsoft.com/office/word/2023/wordml/word16du" xmlns:w16sdtdh="http://schemas.microsoft.com/office/word/2020/wordml/sdtdatahash" xmlns:w16sdtfl="http://schemas.microsoft.com/office/word/2024/wordml/sdtformatlock" xmlns:w16se="http://schemas.microsoft.com/office/word/2015/wordml/symex" xmlns:wpg="http://schemas.microsoft.com/office/word/2010/wordprocessingGroup" xmlns:wpi="http://schemas.microsoft.com/office/word/2010/wordprocessingInk" xmlns:wne="http://schemas.microsoft.com/office/word/2006/wordml" xmlns:wps="http://schemas.microsoft.com/office/word/2010/wordprocessingShape" mc:Ignorable="w14 w15 w16se w16cid w16 w16cex w16sdtdh w16sdtfl w16du wp14">
   <w:p>
     <w:pPr>
       <w:pStyle w:val="Footer"/>
@@ -11344,7 +15734,7 @@
 </file>
 
 <file path=word/footnotes.xml><?xml version="1.0" encoding="utf-8"?>
-<w:footnotes xmlns:wpc="http://schemas.microsoft.com/office/word/2010/wordprocessingCanvas" xmlns:cx="http://schemas.microsoft.com/office/drawing/2014/chartex" xmlns:cx1="http://schemas.microsoft.com/office/drawing/2015/9/8/chartex" xmlns:cx2="http://schemas.microsoft.com/office/drawing/2015/10/21/chartex" xmlns:cx3="http://schemas.microsoft.com/office/drawing/2016/5/9/chartex" xmlns:cx4="http://schemas.microsoft.com/office/drawing/2016/5/10/chartex" xmlns:cx5="http://schemas.microsoft.com/office/drawing/2016/5/11/chartex" xmlns:cx6="http://schemas.microsoft.com/office/drawing/2016/5/12/chartex" xmlns:cx7="http://schemas.microsoft.com/office/drawing/2016/5/13/chartex" xmlns:cx8="http://schemas.microsoft.com/office/drawing/2016/5/14/chartex" xmlns:mc="http://schemas.openxmlformats.org/markup-compatibility/2006" xmlns:m="http://schemas.openxmlformats.org/officeDocument/2006/math" xmlns:aink="http://schemas.microsoft.com/office/drawing/2016/ink" xmlns:am3d="http://schemas.microsoft.com/office/drawing/2017/model3d" xmlns:oel="http://schemas.microsoft.com/office/2019/extlst" xmlns:r="http://schemas.openxmlformats.org/officeDocument/2006/relationships" xmlns:wp14="http://schemas.microsoft.com/office/word/2010/wordprocessingDrawing" xmlns:wp="http://schemas.openxmlformats.org/drawingml/2006/wordprocessingDrawing" xmlns:wpg="http://schemas.microsoft.com/office/word/2010/wordprocessingGroup" xmlns:wpi="http://schemas.microsoft.com/office/word/2010/wordprocessingInk" xmlns:wps="http://schemas.microsoft.com/office/word/2010/wordprocessingShape" xmlns:o="urn:schemas-microsoft-com:office:office" xmlns:v="urn:schemas-microsoft-com:vml" xmlns:w10="urn:schemas-microsoft-com:office:word" xmlns:w="http://schemas.openxmlformats.org/wordprocessingml/2006/main" xmlns:w14="http://schemas.microsoft.com/office/word/2010/wordml" xmlns:w15="http://schemas.microsoft.com/office/word/2012/wordml" xmlns:w16cex="http://schemas.microsoft.com/office/word/2018/wordml/cex" xmlns:w16cid="http://schemas.microsoft.com/office/word/2016/wordml/cid" xmlns:w16="http://schemas.microsoft.com/office/word/2018/wordml" xmlns:w16sdtdh="http://schemas.microsoft.com/office/word/2020/wordml/sdtdatahash" xmlns:w16sdtfl="http://schemas.microsoft.com/office/word/2024/wordml/sdtformatlock" xmlns:w16se="http://schemas.microsoft.com/office/word/2015/wordml/symex" xmlns:w16du="http://schemas.microsoft.com/office/word/2023/wordml/word16du" xmlns:wne="http://schemas.microsoft.com/office/word/2006/wordml" mc:Ignorable="w14 w15 w16se w16cid w16 w16cex w16sdtdh w16sdtfl w16du wp14">
+<w:footnotes xmlns:wpc="http://schemas.microsoft.com/office/word/2010/wordprocessingCanvas" xmlns:cx="http://schemas.microsoft.com/office/drawing/2014/chartex" xmlns:cx1="http://schemas.microsoft.com/office/drawing/2015/9/8/chartex" xmlns:cx2="http://schemas.microsoft.com/office/drawing/2015/10/21/chartex" xmlns:cx3="http://schemas.microsoft.com/office/drawing/2016/5/9/chartex" xmlns:cx4="http://schemas.microsoft.com/office/drawing/2016/5/10/chartex" xmlns:cx5="http://schemas.microsoft.com/office/drawing/2016/5/11/chartex" xmlns:cx6="http://schemas.microsoft.com/office/drawing/2016/5/12/chartex" xmlns:cx7="http://schemas.microsoft.com/office/drawing/2016/5/13/chartex" xmlns:cx8="http://schemas.microsoft.com/office/drawing/2016/5/14/chartex" xmlns:mc="http://schemas.openxmlformats.org/markup-compatibility/2006" xmlns:aink="http://schemas.microsoft.com/office/drawing/2016/ink" xmlns:am3d="http://schemas.microsoft.com/office/drawing/2017/model3d" xmlns:o="urn:schemas-microsoft-com:office:office" xmlns:oel="http://schemas.microsoft.com/office/2019/extlst" xmlns:r="http://schemas.openxmlformats.org/officeDocument/2006/relationships" xmlns:m="http://schemas.openxmlformats.org/officeDocument/2006/math" xmlns:v="urn:schemas-microsoft-com:vml" xmlns:wp14="http://schemas.microsoft.com/office/word/2010/wordprocessingDrawing" xmlns:wp="http://schemas.openxmlformats.org/drawingml/2006/wordprocessingDrawing" xmlns:w10="urn:schemas-microsoft-com:office:word" xmlns:w="http://schemas.openxmlformats.org/wordprocessingml/2006/main" xmlns:w14="http://schemas.microsoft.com/office/word/2010/wordml" xmlns:w15="http://schemas.microsoft.com/office/word/2012/wordml" xmlns:w16cex="http://schemas.microsoft.com/office/word/2018/wordml/cex" xmlns:w16cid="http://schemas.microsoft.com/office/word/2016/wordml/cid" xmlns:w16="http://schemas.microsoft.com/office/word/2018/wordml" xmlns:w16du="http://schemas.microsoft.com/office/word/2023/wordml/word16du" xmlns:w16sdtdh="http://schemas.microsoft.com/office/word/2020/wordml/sdtdatahash" xmlns:w16sdtfl="http://schemas.microsoft.com/office/word/2024/wordml/sdtformatlock" xmlns:w16se="http://schemas.microsoft.com/office/word/2015/wordml/symex" xmlns:wpg="http://schemas.microsoft.com/office/word/2010/wordprocessingGroup" xmlns:wpi="http://schemas.microsoft.com/office/word/2010/wordprocessingInk" xmlns:wne="http://schemas.microsoft.com/office/word/2006/wordml" xmlns:wps="http://schemas.microsoft.com/office/word/2010/wordprocessingShape" mc:Ignorable="w14 w15 w16se w16cid w16 w16cex w16sdtdh w16sdtfl w16du wp14">
   <w:footnote w:type="separator" w:id="-1">
     <w:p>
       <w:r>
@@ -11363,7 +15753,7 @@
 </file>
 
 <file path=word/header1.xml><?xml version="1.0" encoding="utf-8"?>
-<w:hdr xmlns:wpc="http://schemas.microsoft.com/office/word/2010/wordprocessingCanvas" xmlns:cx="http://schemas.microsoft.com/office/drawing/2014/chartex" xmlns:cx1="http://schemas.microsoft.com/office/drawing/2015/9/8/chartex" xmlns:cx2="http://schemas.microsoft.com/office/drawing/2015/10/21/chartex" xmlns:cx3="http://schemas.microsoft.com/office/drawing/2016/5/9/chartex" xmlns:cx4="http://schemas.microsoft.com/office/drawing/2016/5/10/chartex" xmlns:cx5="http://schemas.microsoft.com/office/drawing/2016/5/11/chartex" xmlns:cx6="http://schemas.microsoft.com/office/drawing/2016/5/12/chartex" xmlns:cx7="http://schemas.microsoft.com/office/drawing/2016/5/13/chartex" xmlns:cx8="http://schemas.microsoft.com/office/drawing/2016/5/14/chartex" xmlns:mc="http://schemas.openxmlformats.org/markup-compatibility/2006" xmlns:m="http://schemas.openxmlformats.org/officeDocument/2006/math" xmlns:aink="http://schemas.microsoft.com/office/drawing/2016/ink" xmlns:am3d="http://schemas.microsoft.com/office/drawing/2017/model3d" xmlns:oel="http://schemas.microsoft.com/office/2019/extlst" xmlns:r="http://schemas.openxmlformats.org/officeDocument/2006/relationships" xmlns:wp14="http://schemas.microsoft.com/office/word/2010/wordprocessingDrawing" xmlns:wp="http://schemas.openxmlformats.org/drawingml/2006/wordprocessingDrawing" xmlns:wpg="http://schemas.microsoft.com/office/word/2010/wordprocessingGroup" xmlns:wpi="http://schemas.microsoft.com/office/word/2010/wordprocessingInk" xmlns:wps="http://schemas.microsoft.com/office/word/2010/wordprocessingShape" xmlns:o="urn:schemas-microsoft-com:office:office" xmlns:v="urn:schemas-microsoft-com:vml" xmlns:w10="urn:schemas-microsoft-com:office:word" xmlns:w="http://schemas.openxmlformats.org/wordprocessingml/2006/main" xmlns:w14="http://schemas.microsoft.com/office/word/2010/wordml" xmlns:w15="http://schemas.microsoft.com/office/word/2012/wordml" xmlns:w16cex="http://schemas.microsoft.com/office/word/2018/wordml/cex" xmlns:w16cid="http://schemas.microsoft.com/office/word/2016/wordml/cid" xmlns:w16="http://schemas.microsoft.com/office/word/2018/wordml" xmlns:w16sdtdh="http://schemas.microsoft.com/office/word/2020/wordml/sdtdatahash" xmlns:w16sdtfl="http://schemas.microsoft.com/office/word/2024/wordml/sdtformatlock" xmlns:w16se="http://schemas.microsoft.com/office/word/2015/wordml/symex" xmlns:w16du="http://schemas.microsoft.com/office/word/2023/wordml/word16du" xmlns:wne="http://schemas.microsoft.com/office/word/2006/wordml" mc:Ignorable="w14 w15 w16se w16cid w16 w16cex w16sdtdh w16sdtfl w16du wp14">
+<w:hdr xmlns:wpc="http://schemas.microsoft.com/office/word/2010/wordprocessingCanvas" xmlns:cx="http://schemas.microsoft.com/office/drawing/2014/chartex" xmlns:cx1="http://schemas.microsoft.com/office/drawing/2015/9/8/chartex" xmlns:cx2="http://schemas.microsoft.com/office/drawing/2015/10/21/chartex" xmlns:cx3="http://schemas.microsoft.com/office/drawing/2016/5/9/chartex" xmlns:cx4="http://schemas.microsoft.com/office/drawing/2016/5/10/chartex" xmlns:cx5="http://schemas.microsoft.com/office/drawing/2016/5/11/chartex" xmlns:cx6="http://schemas.microsoft.com/office/drawing/2016/5/12/chartex" xmlns:cx7="http://schemas.microsoft.com/office/drawing/2016/5/13/chartex" xmlns:cx8="http://schemas.microsoft.com/office/drawing/2016/5/14/chartex" xmlns:mc="http://schemas.openxmlformats.org/markup-compatibility/2006" xmlns:aink="http://schemas.microsoft.com/office/drawing/2016/ink" xmlns:am3d="http://schemas.microsoft.com/office/drawing/2017/model3d" xmlns:o="urn:schemas-microsoft-com:office:office" xmlns:oel="http://schemas.microsoft.com/office/2019/extlst" xmlns:r="http://schemas.openxmlformats.org/officeDocument/2006/relationships" xmlns:m="http://schemas.openxmlformats.org/officeDocument/2006/math" xmlns:v="urn:schemas-microsoft-com:vml" xmlns:wp14="http://schemas.microsoft.com/office/word/2010/wordprocessingDrawing" xmlns:wp="http://schemas.openxmlformats.org/drawingml/2006/wordprocessingDrawing" xmlns:w10="urn:schemas-microsoft-com:office:word" xmlns:w="http://schemas.openxmlformats.org/wordprocessingml/2006/main" xmlns:w14="http://schemas.microsoft.com/office/word/2010/wordml" xmlns:w15="http://schemas.microsoft.com/office/word/2012/wordml" xmlns:w16cex="http://schemas.microsoft.com/office/word/2018/wordml/cex" xmlns:w16cid="http://schemas.microsoft.com/office/word/2016/wordml/cid" xmlns:w16="http://schemas.microsoft.com/office/word/2018/wordml" xmlns:w16du="http://schemas.microsoft.com/office/word/2023/wordml/word16du" xmlns:w16sdtdh="http://schemas.microsoft.com/office/word/2020/wordml/sdtdatahash" xmlns:w16sdtfl="http://schemas.microsoft.com/office/word/2024/wordml/sdtformatlock" xmlns:w16se="http://schemas.microsoft.com/office/word/2015/wordml/symex" xmlns:wpg="http://schemas.microsoft.com/office/word/2010/wordprocessingGroup" xmlns:wpi="http://schemas.microsoft.com/office/word/2010/wordprocessingInk" xmlns:wne="http://schemas.microsoft.com/office/word/2006/wordml" xmlns:wps="http://schemas.microsoft.com/office/word/2010/wordprocessingShape" mc:Ignorable="w14 w15 w16se w16cid w16 w16cex w16sdtdh w16sdtfl w16du wp14">
   <w:p>
     <w:pPr>
       <w:pStyle w:val="Header"/>
@@ -11373,7 +15763,7 @@
 </file>
 
 <file path=word/header2.xml><?xml version="1.0" encoding="utf-8"?>
-<w:hdr xmlns:wpc="http://schemas.microsoft.com/office/word/2010/wordprocessingCanvas" xmlns:cx="http://schemas.microsoft.com/office/drawing/2014/chartex" xmlns:cx1="http://schemas.microsoft.com/office/drawing/2015/9/8/chartex" xmlns:cx2="http://schemas.microsoft.com/office/drawing/2015/10/21/chartex" xmlns:cx3="http://schemas.microsoft.com/office/drawing/2016/5/9/chartex" xmlns:cx4="http://schemas.microsoft.com/office/drawing/2016/5/10/chartex" xmlns:cx5="http://schemas.microsoft.com/office/drawing/2016/5/11/chartex" xmlns:cx6="http://schemas.microsoft.com/office/drawing/2016/5/12/chartex" xmlns:cx7="http://schemas.microsoft.com/office/drawing/2016/5/13/chartex" xmlns:cx8="http://schemas.microsoft.com/office/drawing/2016/5/14/chartex" xmlns:mc="http://schemas.openxmlformats.org/markup-compatibility/2006" xmlns:m="http://schemas.openxmlformats.org/officeDocument/2006/math" xmlns:aink="http://schemas.microsoft.com/office/drawing/2016/ink" xmlns:am3d="http://schemas.microsoft.com/office/drawing/2017/model3d" xmlns:oel="http://schemas.microsoft.com/office/2019/extlst" xmlns:r="http://schemas.openxmlformats.org/officeDocument/2006/relationships" xmlns:wp14="http://schemas.microsoft.com/office/word/2010/wordprocessingDrawing" xmlns:wp="http://schemas.openxmlformats.org/drawingml/2006/wordprocessingDrawing" xmlns:wpg="http://schemas.microsoft.com/office/word/2010/wordprocessingGroup" xmlns:wpi="http://schemas.microsoft.com/office/word/2010/wordprocessingInk" xmlns:wps="http://schemas.microsoft.com/office/word/2010/wordprocessingShape" xmlns:o="urn:schemas-microsoft-com:office:office" xmlns:v="urn:schemas-microsoft-com:vml" xmlns:w10="urn:schemas-microsoft-com:office:word" xmlns:w="http://schemas.openxmlformats.org/wordprocessingml/2006/main" xmlns:w14="http://schemas.microsoft.com/office/word/2010/wordml" xmlns:w15="http://schemas.microsoft.com/office/word/2012/wordml" xmlns:w16cex="http://schemas.microsoft.com/office/word/2018/wordml/cex" xmlns:w16cid="http://schemas.microsoft.com/office/word/2016/wordml/cid" xmlns:w16="http://schemas.microsoft.com/office/word/2018/wordml" xmlns:w16sdtdh="http://schemas.microsoft.com/office/word/2020/wordml/sdtdatahash" xmlns:w16sdtfl="http://schemas.microsoft.com/office/word/2024/wordml/sdtformatlock" xmlns:w16se="http://schemas.microsoft.com/office/word/2015/wordml/symex" xmlns:w16du="http://schemas.microsoft.com/office/word/2023/wordml/word16du" xmlns:wne="http://schemas.microsoft.com/office/word/2006/wordml" mc:Ignorable="w14 w15 w16se w16cid w16 w16cex w16sdtdh w16sdtfl w16du wp14">
+<w:hdr xmlns:wpc="http://schemas.microsoft.com/office/word/2010/wordprocessingCanvas" xmlns:cx="http://schemas.microsoft.com/office/drawing/2014/chartex" xmlns:cx1="http://schemas.microsoft.com/office/drawing/2015/9/8/chartex" xmlns:cx2="http://schemas.microsoft.com/office/drawing/2015/10/21/chartex" xmlns:cx3="http://schemas.microsoft.com/office/drawing/2016/5/9/chartex" xmlns:cx4="http://schemas.microsoft.com/office/drawing/2016/5/10/chartex" xmlns:cx5="http://schemas.microsoft.com/office/drawing/2016/5/11/chartex" xmlns:cx6="http://schemas.microsoft.com/office/drawing/2016/5/12/chartex" xmlns:cx7="http://schemas.microsoft.com/office/drawing/2016/5/13/chartex" xmlns:cx8="http://schemas.microsoft.com/office/drawing/2016/5/14/chartex" xmlns:mc="http://schemas.openxmlformats.org/markup-compatibility/2006" xmlns:aink="http://schemas.microsoft.com/office/drawing/2016/ink" xmlns:am3d="http://schemas.microsoft.com/office/drawing/2017/model3d" xmlns:o="urn:schemas-microsoft-com:office:office" xmlns:oel="http://schemas.microsoft.com/office/2019/extlst" xmlns:r="http://schemas.openxmlformats.org/officeDocument/2006/relationships" xmlns:m="http://schemas.openxmlformats.org/officeDocument/2006/math" xmlns:v="urn:schemas-microsoft-com:vml" xmlns:wp14="http://schemas.microsoft.com/office/word/2010/wordprocessingDrawing" xmlns:wp="http://schemas.openxmlformats.org/drawingml/2006/wordprocessingDrawing" xmlns:w10="urn:schemas-microsoft-com:office:word" xmlns:w="http://schemas.openxmlformats.org/wordprocessingml/2006/main" xmlns:w14="http://schemas.microsoft.com/office/word/2010/wordml" xmlns:w15="http://schemas.microsoft.com/office/word/2012/wordml" xmlns:w16cex="http://schemas.microsoft.com/office/word/2018/wordml/cex" xmlns:w16cid="http://schemas.microsoft.com/office/word/2016/wordml/cid" xmlns:w16="http://schemas.microsoft.com/office/word/2018/wordml" xmlns:w16du="http://schemas.microsoft.com/office/word/2023/wordml/word16du" xmlns:w16sdtdh="http://schemas.microsoft.com/office/word/2020/wordml/sdtdatahash" xmlns:w16sdtfl="http://schemas.microsoft.com/office/word/2024/wordml/sdtformatlock" xmlns:w16se="http://schemas.microsoft.com/office/word/2015/wordml/symex" xmlns:wpg="http://schemas.microsoft.com/office/word/2010/wordprocessingGroup" xmlns:wpi="http://schemas.microsoft.com/office/word/2010/wordprocessingInk" xmlns:wne="http://schemas.microsoft.com/office/word/2006/wordml" xmlns:wps="http://schemas.microsoft.com/office/word/2010/wordprocessingShape" mc:Ignorable="w14 w15 w16se w16cid w16 w16cex w16sdtdh w16sdtfl w16du wp14">
   <w:p>
     <w:pPr>
       <w:pStyle w:val="Header"/>
@@ -11433,7 +15823,7 @@
 </file>
 
 <file path=word/header3.xml><?xml version="1.0" encoding="utf-8"?>
-<w:hdr xmlns:wpc="http://schemas.microsoft.com/office/word/2010/wordprocessingCanvas" xmlns:cx="http://schemas.microsoft.com/office/drawing/2014/chartex" xmlns:cx1="http://schemas.microsoft.com/office/drawing/2015/9/8/chartex" xmlns:cx2="http://schemas.microsoft.com/office/drawing/2015/10/21/chartex" xmlns:cx3="http://schemas.microsoft.com/office/drawing/2016/5/9/chartex" xmlns:cx4="http://schemas.microsoft.com/office/drawing/2016/5/10/chartex" xmlns:cx5="http://schemas.microsoft.com/office/drawing/2016/5/11/chartex" xmlns:cx6="http://schemas.microsoft.com/office/drawing/2016/5/12/chartex" xmlns:cx7="http://schemas.microsoft.com/office/drawing/2016/5/13/chartex" xmlns:cx8="http://schemas.microsoft.com/office/drawing/2016/5/14/chartex" xmlns:mc="http://schemas.openxmlformats.org/markup-compatibility/2006" xmlns:m="http://schemas.openxmlformats.org/officeDocument/2006/math" xmlns:aink="http://schemas.microsoft.com/office/drawing/2016/ink" xmlns:am3d="http://schemas.microsoft.com/office/drawing/2017/model3d" xmlns:oel="http://schemas.microsoft.com/office/2019/extlst" xmlns:r="http://schemas.openxmlformats.org/officeDocument/2006/relationships" xmlns:wp14="http://schemas.microsoft.com/office/word/2010/wordprocessingDrawing" xmlns:wp="http://schemas.openxmlformats.org/drawingml/2006/wordprocessingDrawing" xmlns:wpg="http://schemas.microsoft.com/office/word/2010/wordprocessingGroup" xmlns:wpi="http://schemas.microsoft.com/office/word/2010/wordprocessingInk" xmlns:wps="http://schemas.microsoft.com/office/word/2010/wordprocessingShape" xmlns:o="urn:schemas-microsoft-com:office:office" xmlns:v="urn:schemas-microsoft-com:vml" xmlns:w10="urn:schemas-microsoft-com:office:word" xmlns:w="http://schemas.openxmlformats.org/wordprocessingml/2006/main" xmlns:w14="http://schemas.microsoft.com/office/word/2010/wordml" xmlns:w15="http://schemas.microsoft.com/office/word/2012/wordml" xmlns:w16cex="http://schemas.microsoft.com/office/word/2018/wordml/cex" xmlns:w16cid="http://schemas.microsoft.com/office/word/2016/wordml/cid" xmlns:w16="http://schemas.microsoft.com/office/word/2018/wordml" xmlns:w16sdtdh="http://schemas.microsoft.com/office/word/2020/wordml/sdtdatahash" xmlns:w16sdtfl="http://schemas.microsoft.com/office/word/2024/wordml/sdtformatlock" xmlns:w16se="http://schemas.microsoft.com/office/word/2015/wordml/symex" xmlns:w16du="http://schemas.microsoft.com/office/word/2023/wordml/word16du" xmlns:wne="http://schemas.microsoft.com/office/word/2006/wordml" mc:Ignorable="w14 w15 w16se w16cid w16 w16cex w16sdtdh w16sdtfl w16du wp14">
+<w:hdr xmlns:wpc="http://schemas.microsoft.com/office/word/2010/wordprocessingCanvas" xmlns:cx="http://schemas.microsoft.com/office/drawing/2014/chartex" xmlns:cx1="http://schemas.microsoft.com/office/drawing/2015/9/8/chartex" xmlns:cx2="http://schemas.microsoft.com/office/drawing/2015/10/21/chartex" xmlns:cx3="http://schemas.microsoft.com/office/drawing/2016/5/9/chartex" xmlns:cx4="http://schemas.microsoft.com/office/drawing/2016/5/10/chartex" xmlns:cx5="http://schemas.microsoft.com/office/drawing/2016/5/11/chartex" xmlns:cx6="http://schemas.microsoft.com/office/drawing/2016/5/12/chartex" xmlns:cx7="http://schemas.microsoft.com/office/drawing/2016/5/13/chartex" xmlns:cx8="http://schemas.microsoft.com/office/drawing/2016/5/14/chartex" xmlns:mc="http://schemas.openxmlformats.org/markup-compatibility/2006" xmlns:aink="http://schemas.microsoft.com/office/drawing/2016/ink" xmlns:am3d="http://schemas.microsoft.com/office/drawing/2017/model3d" xmlns:o="urn:schemas-microsoft-com:office:office" xmlns:oel="http://schemas.microsoft.com/office/2019/extlst" xmlns:r="http://schemas.openxmlformats.org/officeDocument/2006/relationships" xmlns:m="http://schemas.openxmlformats.org/officeDocument/2006/math" xmlns:v="urn:schemas-microsoft-com:vml" xmlns:wp14="http://schemas.microsoft.com/office/word/2010/wordprocessingDrawing" xmlns:wp="http://schemas.openxmlformats.org/drawingml/2006/wordprocessingDrawing" xmlns:w10="urn:schemas-microsoft-com:office:word" xmlns:w="http://schemas.openxmlformats.org/wordprocessingml/2006/main" xmlns:w14="http://schemas.microsoft.com/office/word/2010/wordml" xmlns:w15="http://schemas.microsoft.com/office/word/2012/wordml" xmlns:w16cex="http://schemas.microsoft.com/office/word/2018/wordml/cex" xmlns:w16cid="http://schemas.microsoft.com/office/word/2016/wordml/cid" xmlns:w16="http://schemas.microsoft.com/office/word/2018/wordml" xmlns:w16du="http://schemas.microsoft.com/office/word/2023/wordml/word16du" xmlns:w16sdtdh="http://schemas.microsoft.com/office/word/2020/wordml/sdtdatahash" xmlns:w16sdtfl="http://schemas.microsoft.com/office/word/2024/wordml/sdtformatlock" xmlns:w16se="http://schemas.microsoft.com/office/word/2015/wordml/symex" xmlns:wpg="http://schemas.microsoft.com/office/word/2010/wordprocessingGroup" xmlns:wpi="http://schemas.microsoft.com/office/word/2010/wordprocessingInk" xmlns:wne="http://schemas.microsoft.com/office/word/2006/wordml" xmlns:wps="http://schemas.microsoft.com/office/word/2010/wordprocessingShape" mc:Ignorable="w14 w15 w16se w16cid w16 w16cex w16sdtdh w16sdtfl w16du wp14">
   <w:p>
     <w:pPr>
       <w:pStyle w:val="Header"/>
@@ -11481,7 +15871,7 @@
 </file>
 
 <file path=word/styles.xml><?xml version="1.0" encoding="utf-8"?>
-<w:styles xmlns:mc="http://schemas.openxmlformats.org/markup-compatibility/2006" xmlns:r="http://schemas.openxmlformats.org/officeDocument/2006/relationships" xmlns:w="http://schemas.openxmlformats.org/wordprocessingml/2006/main" xmlns:w14="http://schemas.microsoft.com/office/word/2010/wordml" xmlns:w15="http://schemas.microsoft.com/office/word/2012/wordml" xmlns:w16cex="http://schemas.microsoft.com/office/word/2018/wordml/cex" xmlns:w16cid="http://schemas.microsoft.com/office/word/2016/wordml/cid" xmlns:w16="http://schemas.microsoft.com/office/word/2018/wordml" xmlns:w16sdtdh="http://schemas.microsoft.com/office/word/2020/wordml/sdtdatahash" xmlns:w16sdtfl="http://schemas.microsoft.com/office/word/2024/wordml/sdtformatlock" xmlns:w16se="http://schemas.microsoft.com/office/word/2015/wordml/symex" xmlns:w16du="http://schemas.microsoft.com/office/word/2023/wordml/word16du" mc:Ignorable="w14 w15 w16se w16cid w16 w16cex w16sdtdh w16sdtfl w16du">
+<w:styles xmlns:mc="http://schemas.openxmlformats.org/markup-compatibility/2006" xmlns:r="http://schemas.openxmlformats.org/officeDocument/2006/relationships" xmlns:w="http://schemas.openxmlformats.org/wordprocessingml/2006/main" xmlns:w14="http://schemas.microsoft.com/office/word/2010/wordml" xmlns:w15="http://schemas.microsoft.com/office/word/2012/wordml" xmlns:w16cex="http://schemas.microsoft.com/office/word/2018/wordml/cex" xmlns:w16cid="http://schemas.microsoft.com/office/word/2016/wordml/cid" xmlns:w16="http://schemas.microsoft.com/office/word/2018/wordml" xmlns:w16du="http://schemas.microsoft.com/office/word/2023/wordml/word16du" xmlns:w16sdtdh="http://schemas.microsoft.com/office/word/2020/wordml/sdtdatahash" xmlns:w16sdtfl="http://schemas.microsoft.com/office/word/2024/wordml/sdtformatlock" xmlns:w16se="http://schemas.microsoft.com/office/word/2015/wordml/symex" mc:Ignorable="w14 w15 w16se w16cid w16 w16cex w16sdtdh w16sdtfl w16du">
   <w:docDefaults>
     <w:rPrDefault>
       <w:rPr>
@@ -12090,7 +16480,6 @@
   <w:style w:type="character" w:default="1" w:styleId="DefaultParagraphFont">
     <w:name w:val="Default Paragraph Font"/>
     <w:uiPriority w:val="1"/>
-    <w:semiHidden/>
     <w:unhideWhenUsed/>
   </w:style>
   <w:style w:type="table" w:default="1" w:styleId="TableNormal">

</xml_diff>